<commit_message>
L2 PRD v1.1: Add Section 9 (Workflow Engine) design
Section 9 content:
- Status model (5 statuses, stored with event-driven recalculation)
- Status calculation logic (automatic + administrator-driven transitions)
- Dependency graph construction (progressive build at 3 project milestones)
- Phase ordering rules (12 rules covering all 11 phases)
- Available work calculation (two-group dashboard: in_progress + ready)
- Status transitions with cascade regression on revision
- Blocked state handling with automatic/manual unblocking
- Domain Overview output document structure

Schema changes to WorkItem table:
- Added item_type values: domain_overview, crm_selection, crm_deployment,
  crm_configuration, verification
- Added status_before_blocked column (TEXT, nullable)

New decisions: DEC-009 through DEC-016
New open issues: ISS-005, ISS-006
</commit_message>
<xml_diff>
--- a/PRDs/product/crmbuilder-automation-PRD/crmbuilder-automation-l2-PRD.docx
+++ b/PRDs/product/crmbuilder-automation-PRD/crmbuilder-automation-l2-PRD.docx
@@ -363,7 +363,7 @@
                 <w:sz w:val="18"/>
                 <w:szCs w:val="18"/>
               </w:rPr>
-              <w:t xml:space="preserve">04-02-26 22:00</w:t>
+              <w:t xml:space="preserve">04-02-26 23:30</w:t>
             </w:r>
           </w:p>
         </w:tc>
@@ -19753,7 +19753,7 @@
                 <w:sz w:val="18"/>
                 <w:szCs w:val="18"/>
               </w:rPr>
-              <w:t xml:space="preserve">master_prd, business_object_discovery, entity_prd, process_definition, domain_reconciliation, yaml_generation, stakeholder_review</w:t>
+              <w:t xml:space="preserve">master_prd, business_object_discovery, entity_prd, domain_overview, process_definition, domain_reconciliation, stakeholder_review, yaml_generation, crm_selection, crm_deployment, crm_configuration, verification</w:t>
             </w:r>
           </w:p>
         </w:tc>
@@ -20309,6 +20309,97 @@
                 <w:szCs w:val="18"/>
               </w:rPr>
               <w:t xml:space="preserve">Why this item is blocked</w:t>
+            </w:r>
+          </w:p>
+        </w:tc>
+      </w:tr>
+      <w:tr>
+        <w:tc>
+          <w:tcPr>
+            <w:tcW w:type="dxa" w:w="2200"/>
+            <w:tcBorders>
+              <w:top w:val="single" w:color="AAAAAA" w:sz="1"/>
+              <w:left w:val="single" w:color="AAAAAA" w:sz="1"/>
+              <w:bottom w:val="single" w:color="AAAAAA" w:sz="1"/>
+              <w:right w:val="single" w:color="AAAAAA" w:sz="1"/>
+            </w:tcBorders>
+            <w:tcMar>
+              <w:top w:type="dxa" w:w="80"/>
+              <w:left w:type="dxa" w:w="120"/>
+              <w:bottom w:type="dxa" w:w="80"/>
+              <w:right w:type="dxa" w:w="120"/>
+            </w:tcMar>
+            <w:vAlign w:val="top"/>
+          </w:tcPr>
+          <w:p>
+            <w:r>
+              <w:rPr>
+                <w:rFonts w:ascii="Arial" w:cs="Arial" w:eastAsia="Arial" w:hAnsi="Arial"/>
+                <w:b/>
+                <w:bCs/>
+                <w:color w:val="000000"/>
+                <w:sz w:val="18"/>
+                <w:szCs w:val="18"/>
+              </w:rPr>
+              <w:t xml:space="preserve">status_before_blocked</w:t>
+            </w:r>
+          </w:p>
+        </w:tc>
+        <w:tc>
+          <w:tcPr>
+            <w:tcW w:type="dxa" w:w="2200"/>
+            <w:tcBorders>
+              <w:top w:val="single" w:color="AAAAAA" w:sz="1"/>
+              <w:left w:val="single" w:color="AAAAAA" w:sz="1"/>
+              <w:bottom w:val="single" w:color="AAAAAA" w:sz="1"/>
+              <w:right w:val="single" w:color="AAAAAA" w:sz="1"/>
+            </w:tcBorders>
+            <w:tcMar>
+              <w:top w:type="dxa" w:w="80"/>
+              <w:left w:type="dxa" w:w="120"/>
+              <w:bottom w:type="dxa" w:w="80"/>
+              <w:right w:type="dxa" w:w="120"/>
+            </w:tcMar>
+            <w:vAlign w:val="top"/>
+          </w:tcPr>
+          <w:p>
+            <w:r>
+              <w:rPr>
+                <w:rFonts w:ascii="Arial" w:cs="Arial" w:eastAsia="Arial" w:hAnsi="Arial"/>
+                <w:color w:val="000000"/>
+                <w:sz w:val="18"/>
+                <w:szCs w:val="18"/>
+              </w:rPr>
+              <w:t xml:space="preserve">TEXT</w:t>
+            </w:r>
+          </w:p>
+        </w:tc>
+        <w:tc>
+          <w:tcPr>
+            <w:tcW w:type="dxa" w:w="4960"/>
+            <w:tcBorders>
+              <w:top w:val="single" w:color="AAAAAA" w:sz="1"/>
+              <w:left w:val="single" w:color="AAAAAA" w:sz="1"/>
+              <w:bottom w:val="single" w:color="AAAAAA" w:sz="1"/>
+              <w:right w:val="single" w:color="AAAAAA" w:sz="1"/>
+            </w:tcBorders>
+            <w:tcMar>
+              <w:top w:type="dxa" w:w="80"/>
+              <w:left w:type="dxa" w:w="120"/>
+              <w:bottom w:type="dxa" w:w="80"/>
+              <w:right w:type="dxa" w:w="120"/>
+            </w:tcMar>
+            <w:vAlign w:val="top"/>
+          </w:tcPr>
+          <w:p>
+            <w:r>
+              <w:rPr>
+                <w:rFonts w:ascii="Arial" w:cs="Arial" w:eastAsia="Arial" w:hAnsi="Arial"/>
+                <w:color w:val="000000"/>
+                <w:sz w:val="18"/>
+                <w:szCs w:val="18"/>
+              </w:rPr>
+              <w:t xml:space="preserve">Status before blocking, for restoration when unblocked. Null when not blocked.</w:t>
             </w:r>
           </w:p>
         </w:tc>
@@ -27853,18 +27944,3975 @@
     </w:p>
     <w:p>
       <w:pPr>
+        <w:pStyle w:val="Heading2"/>
+        <w:spacing w:after="160" w:before="280"/>
+      </w:pPr>
+      <w:r>
+        <w:rPr>
+          <w:rFonts w:ascii="Arial" w:cs="Arial" w:eastAsia="Arial" w:hAnsi="Arial"/>
+          <w:b/>
+          <w:bCs/>
+          <w:color w:val="1F3864"/>
+          <w:sz w:val="24"/>
+          <w:szCs w:val="24"/>
+        </w:rPr>
+        <w:t xml:space="preserve">9.1 Overview</w:t>
+      </w:r>
+    </w:p>
+    <w:p>
+      <w:pPr>
         <w:spacing w:after="160"/>
       </w:pPr>
       <w:r>
         <w:rPr>
           <w:rFonts w:ascii="Arial" w:cs="Arial" w:eastAsia="Arial" w:hAnsi="Arial"/>
-          <w:i/>
-          <w:iCs/>
-          <w:color w:val="888888"/>
+          <w:color w:val="000000"/>
           <w:sz w:val="22"/>
           <w:szCs w:val="22"/>
         </w:rPr>
-        <w:t xml:space="preserve">This section will be defined in a subsequent revision. It will cover the logic for calculating work item status from dependencies, determining what work is available next, enforcing phase ordering, and handling status transitions.</w:t>
+        <w:t xml:space="preserve">The Workflow Engine manages the lifecycle of every work item in the system. It calculates status from dependencies, determines what work is available to the administrator, enforces phase ordering, handles status transitions and their downstream effects, and manages blocked states. The engine operates on the WorkItem and Dependency tables defined in Sections 6.3 and 6.4.</w:t>
+      </w:r>
+    </w:p>
+    <w:p>
+      <w:pPr>
+        <w:pStyle w:val="Heading2"/>
+        <w:spacing w:after="160" w:before="280"/>
+      </w:pPr>
+      <w:r>
+        <w:rPr>
+          <w:rFonts w:ascii="Arial" w:cs="Arial" w:eastAsia="Arial" w:hAnsi="Arial"/>
+          <w:b/>
+          <w:bCs/>
+          <w:color w:val="1F3864"/>
+          <w:sz w:val="24"/>
+          <w:szCs w:val="24"/>
+        </w:rPr>
+        <w:t xml:space="preserve">9.2 Status Model</w:t>
+      </w:r>
+    </w:p>
+    <w:p>
+      <w:pPr>
+        <w:spacing w:after="160"/>
+      </w:pPr>
+      <w:r>
+        <w:rPr>
+          <w:rFonts w:ascii="Arial" w:cs="Arial" w:eastAsia="Arial" w:hAnsi="Arial"/>
+          <w:color w:val="000000"/>
+          <w:sz w:val="22"/>
+          <w:szCs w:val="22"/>
+        </w:rPr>
+        <w:t xml:space="preserve">Each work item has one of five statuses: not_started, ready, in_progress, complete, or blocked. Status is stored on the WorkItem record and updated by the engine through event-driven recalculation  —  the engine recalculates downstream statuses whenever a work item transitions.</w:t>
+      </w:r>
+    </w:p>
+    <w:p>
+      <w:pPr>
+        <w:spacing w:after="120"/>
+      </w:pPr>
+      <w:r>
+        <w:rPr>
+          <w:rFonts w:ascii="Arial" w:cs="Arial" w:eastAsia="Arial" w:hAnsi="Arial"/>
+          <w:b/>
+          <w:bCs/>
+          <w:color w:val="000000"/>
+          <w:sz w:val="22"/>
+          <w:szCs w:val="22"/>
+        </w:rPr>
+        <w:t xml:space="preserve">Status definitions:</w:t>
+      </w:r>
+    </w:p>
+    <w:p>
+      <w:pPr>
+        <w:spacing w:after="160"/>
+      </w:pPr>
+      <w:r>
+        <w:rPr>
+          <w:rFonts w:ascii="Arial" w:cs="Arial" w:eastAsia="Arial" w:hAnsi="Arial"/>
+          <w:color w:val="000000"/>
+          <w:sz w:val="22"/>
+          <w:szCs w:val="22"/>
+        </w:rPr>
+        <w:t xml:space="preserve">not_started  —  The work item exists but at least one dependency has not yet completed. No work can begin.</w:t>
+      </w:r>
+    </w:p>
+    <w:p>
+      <w:pPr>
+        <w:spacing w:after="160"/>
+      </w:pPr>
+      <w:r>
+        <w:rPr>
+          <w:rFonts w:ascii="Arial" w:cs="Arial" w:eastAsia="Arial" w:hAnsi="Arial"/>
+          <w:color w:val="000000"/>
+          <w:sz w:val="22"/>
+          <w:szCs w:val="22"/>
+        </w:rPr>
+        <w:t xml:space="preserve">ready  —  All dependencies are complete. The administrator can begin work on this item.</w:t>
+      </w:r>
+    </w:p>
+    <w:p>
+      <w:pPr>
+        <w:spacing w:after="160"/>
+      </w:pPr>
+      <w:r>
+        <w:rPr>
+          <w:rFonts w:ascii="Arial" w:cs="Arial" w:eastAsia="Arial" w:hAnsi="Arial"/>
+          <w:color w:val="000000"/>
+          <w:sz w:val="22"/>
+          <w:szCs w:val="22"/>
+        </w:rPr>
+        <w:t xml:space="preserve">in_progress  —  The administrator has started work. For AI-session work items, this typically means a prompt has been generated. For tool-driven work items (CRM Configuration, Verification), this means the tool operation has been initiated.</w:t>
+      </w:r>
+    </w:p>
+    <w:p>
+      <w:pPr>
+        <w:spacing w:after="160"/>
+      </w:pPr>
+      <w:r>
+        <w:rPr>
+          <w:rFonts w:ascii="Arial" w:cs="Arial" w:eastAsia="Arial" w:hAnsi="Arial"/>
+          <w:color w:val="000000"/>
+          <w:sz w:val="22"/>
+          <w:szCs w:val="22"/>
+        </w:rPr>
+        <w:t xml:space="preserve">complete  —  The work item’s deliverable has been produced and accepted. For AI-session work items, this means session results have been imported. For Stakeholder Review, this means the domain’s documents have been approved. For tool-driven work items, this means the operation finished successfully.</w:t>
+      </w:r>
+    </w:p>
+    <w:p>
+      <w:pPr>
+        <w:spacing w:after="160"/>
+      </w:pPr>
+      <w:r>
+        <w:rPr>
+          <w:rFonts w:ascii="Arial" w:cs="Arial" w:eastAsia="Arial" w:hAnsi="Arial"/>
+          <w:color w:val="000000"/>
+          <w:sz w:val="22"/>
+          <w:szCs w:val="22"/>
+        </w:rPr>
+        <w:t xml:space="preserve">blocked  —  The work item cannot proceed for a reason recorded in blocked_reason. The status the item held before being blocked is stored in status_before_blocked for restoration when the block is cleared.</w:t>
+      </w:r>
+    </w:p>
+    <w:p>
+      <w:pPr>
+        <w:pStyle w:val="Heading2"/>
+        <w:spacing w:after="160" w:before="280"/>
+      </w:pPr>
+      <w:r>
+        <w:rPr>
+          <w:rFonts w:ascii="Arial" w:cs="Arial" w:eastAsia="Arial" w:hAnsi="Arial"/>
+          <w:b/>
+          <w:bCs/>
+          <w:color w:val="1F3864"/>
+          <w:sz w:val="24"/>
+          <w:szCs w:val="24"/>
+        </w:rPr>
+        <w:t xml:space="preserve">9.3 Status Calculation Logic</w:t>
+      </w:r>
+    </w:p>
+    <w:p>
+      <w:pPr>
+        <w:spacing w:after="160"/>
+      </w:pPr>
+      <w:r>
+        <w:rPr>
+          <w:rFonts w:ascii="Arial" w:cs="Arial" w:eastAsia="Arial" w:hAnsi="Arial"/>
+          <w:color w:val="000000"/>
+          <w:sz w:val="22"/>
+          <w:szCs w:val="22"/>
+        </w:rPr>
+        <w:t xml:space="preserve">The engine calculates status transitions using two mechanisms: automatic recalculation triggered by upstream completions, and administrator-driven transitions for starting and completing work.</w:t>
+      </w:r>
+    </w:p>
+    <w:p>
+      <w:pPr>
+        <w:spacing w:after="120"/>
+      </w:pPr>
+      <w:r>
+        <w:rPr>
+          <w:rFonts w:ascii="Arial" w:cs="Arial" w:eastAsia="Arial" w:hAnsi="Arial"/>
+          <w:b/>
+          <w:bCs/>
+          <w:color w:val="000000"/>
+          <w:sz w:val="22"/>
+          <w:szCs w:val="22"/>
+        </w:rPr>
+        <w:t xml:space="preserve">Automatic transitions:</w:t>
+      </w:r>
+    </w:p>
+    <w:p>
+      <w:pPr>
+        <w:spacing w:after="160"/>
+      </w:pPr>
+      <w:r>
+        <w:rPr>
+          <w:rFonts w:ascii="Arial" w:cs="Arial" w:eastAsia="Arial" w:hAnsi="Arial"/>
+          <w:color w:val="000000"/>
+          <w:sz w:val="22"/>
+          <w:szCs w:val="22"/>
+        </w:rPr>
+        <w:t xml:space="preserve">When a work item’s status changes to complete, the engine queries the Dependency table for all rows where depends_on_id equals that work item’s id. For each dependent work item found, the engine checks whether all of that item’s dependencies now have status complete. If all dependencies are complete and the item’s current status is not_started, the engine transitions it to ready.</w:t>
+      </w:r>
+    </w:p>
+    <w:p>
+      <w:pPr>
+        <w:spacing w:after="160"/>
+      </w:pPr>
+      <w:r>
+        <w:rPr>
+          <w:rFonts w:ascii="Arial" w:cs="Arial" w:eastAsia="Arial" w:hAnsi="Arial"/>
+          <w:color w:val="000000"/>
+          <w:sz w:val="22"/>
+          <w:szCs w:val="22"/>
+        </w:rPr>
+        <w:t xml:space="preserve">A work item with zero rows in the Dependency table (no dependencies) is set to ready immediately upon creation. In practice, only the Master PRD work item has this property.</w:t>
+      </w:r>
+    </w:p>
+    <w:p>
+      <w:pPr>
+        <w:spacing w:after="120"/>
+      </w:pPr>
+      <w:r>
+        <w:rPr>
+          <w:rFonts w:ascii="Arial" w:cs="Arial" w:eastAsia="Arial" w:hAnsi="Arial"/>
+          <w:b/>
+          <w:bCs/>
+          <w:color w:val="000000"/>
+          <w:sz w:val="22"/>
+          <w:szCs w:val="22"/>
+        </w:rPr>
+        <w:t xml:space="preserve">Administrator-driven transitions:</w:t>
+      </w:r>
+    </w:p>
+    <w:p>
+      <w:pPr>
+        <w:spacing w:after="160"/>
+      </w:pPr>
+      <w:r>
+        <w:rPr>
+          <w:rFonts w:ascii="Arial" w:cs="Arial" w:eastAsia="Arial" w:hAnsi="Arial"/>
+          <w:color w:val="000000"/>
+          <w:sz w:val="22"/>
+          <w:szCs w:val="22"/>
+        </w:rPr>
+        <w:t xml:space="preserve">ready → in_progress: The administrator explicitly starts work. The engine sets started_at to the current timestamp. For AI-session work items, the engine creates an AISession record with session_type "initial."</w:t>
+      </w:r>
+    </w:p>
+    <w:p>
+      <w:pPr>
+        <w:spacing w:after="160"/>
+      </w:pPr>
+      <w:r>
+        <w:rPr>
+          <w:rFonts w:ascii="Arial" w:cs="Arial" w:eastAsia="Arial" w:hAnsi="Arial"/>
+          <w:color w:val="000000"/>
+          <w:sz w:val="22"/>
+          <w:szCs w:val="22"/>
+        </w:rPr>
+        <w:t xml:space="preserve">in_progress → complete: The administrator marks the item complete. The engine sets completed_at to the current timestamp and triggers downstream recalculation as described above.</w:t>
+      </w:r>
+    </w:p>
+    <w:p>
+      <w:pPr>
+        <w:pStyle w:val="Heading2"/>
+        <w:spacing w:after="160" w:before="280"/>
+      </w:pPr>
+      <w:r>
+        <w:rPr>
+          <w:rFonts w:ascii="Arial" w:cs="Arial" w:eastAsia="Arial" w:hAnsi="Arial"/>
+          <w:b/>
+          <w:bCs/>
+          <w:color w:val="1F3864"/>
+          <w:sz w:val="24"/>
+          <w:szCs w:val="24"/>
+        </w:rPr>
+        <w:t xml:space="preserve">9.4 Dependency Graph Construction</w:t>
+      </w:r>
+    </w:p>
+    <w:p>
+      <w:pPr>
+        <w:spacing w:after="160"/>
+      </w:pPr>
+      <w:r>
+        <w:rPr>
+          <w:rFonts w:ascii="Arial" w:cs="Arial" w:eastAsia="Arial" w:hAnsi="Arial"/>
+          <w:color w:val="000000"/>
+          <w:sz w:val="22"/>
+          <w:szCs w:val="22"/>
+        </w:rPr>
+        <w:t xml:space="preserve">The engine builds the dependency graph progressively as the project advances. Work items and dependencies are created at three points in the project lifecycle.</w:t>
+      </w:r>
+    </w:p>
+    <w:p>
+      <w:pPr>
+        <w:pStyle w:val="Heading3"/>
+        <w:spacing w:after="120" w:before="240"/>
+      </w:pPr>
+      <w:r>
+        <w:rPr>
+          <w:rFonts w:ascii="Arial" w:cs="Arial" w:eastAsia="Arial" w:hAnsi="Arial"/>
+          <w:b/>
+          <w:bCs/>
+          <w:color w:val="1F3864"/>
+          <w:sz w:val="22"/>
+          <w:szCs w:val="22"/>
+        </w:rPr>
+        <w:t xml:space="preserve">9.4.1 Project Creation</w:t>
+      </w:r>
+    </w:p>
+    <w:p>
+      <w:pPr>
+        <w:spacing w:after="160"/>
+      </w:pPr>
+      <w:r>
+        <w:rPr>
+          <w:rFonts w:ascii="Arial" w:cs="Arial" w:eastAsia="Arial" w:hAnsi="Arial"/>
+          <w:color w:val="000000"/>
+          <w:sz w:val="22"/>
+          <w:szCs w:val="22"/>
+        </w:rPr>
+        <w:t xml:space="preserve">When the administrator creates a new client implementation, the engine creates a single work item:</w:t>
+      </w:r>
+    </w:p>
+    <w:tbl>
+      <w:tblPr>
+        <w:tblW w:type="dxa" w:w="9360"/>
+        <w:tblBorders>
+          <w:top w:val="single" w:color="auto" w:sz="4"/>
+          <w:left w:val="single" w:color="auto" w:sz="4"/>
+          <w:bottom w:val="single" w:color="auto" w:sz="4"/>
+          <w:right w:val="single" w:color="auto" w:sz="4"/>
+          <w:insideH w:val="single" w:color="auto" w:sz="4"/>
+          <w:insideV w:val="single" w:color="auto" w:sz="4"/>
+        </w:tblBorders>
+      </w:tblPr>
+      <w:tblGrid>
+        <w:gridCol w:w="2200"/>
+        <w:gridCol w:w="7160"/>
+      </w:tblGrid>
+      <w:tr>
+        <w:tc>
+          <w:tcPr>
+            <w:tcW w:type="dxa" w:w="2200"/>
+            <w:tcBorders>
+              <w:top w:val="single" w:color="AAAAAA" w:sz="1"/>
+              <w:left w:val="single" w:color="AAAAAA" w:sz="1"/>
+              <w:bottom w:val="single" w:color="AAAAAA" w:sz="1"/>
+              <w:right w:val="single" w:color="AAAAAA" w:sz="1"/>
+            </w:tcBorders>
+            <w:shd w:fill="1F3864" w:val="clear"/>
+            <w:tcMar>
+              <w:top w:type="dxa" w:w="80"/>
+              <w:left w:type="dxa" w:w="120"/>
+              <w:bottom w:type="dxa" w:w="80"/>
+              <w:right w:type="dxa" w:w="120"/>
+            </w:tcMar>
+            <w:vAlign w:val="center"/>
+          </w:tcPr>
+          <w:p>
+            <w:r>
+              <w:rPr>
+                <w:rFonts w:ascii="Arial" w:cs="Arial" w:eastAsia="Arial" w:hAnsi="Arial"/>
+                <w:b/>
+                <w:bCs/>
+                <w:color w:val="FFFFFF"/>
+                <w:sz w:val="18"/>
+                <w:szCs w:val="18"/>
+              </w:rPr>
+              <w:t xml:space="preserve">Field</w:t>
+            </w:r>
+          </w:p>
+        </w:tc>
+        <w:tc>
+          <w:tcPr>
+            <w:tcW w:type="dxa" w:w="7160"/>
+            <w:tcBorders>
+              <w:top w:val="single" w:color="AAAAAA" w:sz="1"/>
+              <w:left w:val="single" w:color="AAAAAA" w:sz="1"/>
+              <w:bottom w:val="single" w:color="AAAAAA" w:sz="1"/>
+              <w:right w:val="single" w:color="AAAAAA" w:sz="1"/>
+            </w:tcBorders>
+            <w:shd w:fill="1F3864" w:val="clear"/>
+            <w:tcMar>
+              <w:top w:type="dxa" w:w="80"/>
+              <w:left w:type="dxa" w:w="120"/>
+              <w:bottom w:type="dxa" w:w="80"/>
+              <w:right w:type="dxa" w:w="120"/>
+            </w:tcMar>
+            <w:vAlign w:val="center"/>
+          </w:tcPr>
+          <w:p>
+            <w:r>
+              <w:rPr>
+                <w:rFonts w:ascii="Arial" w:cs="Arial" w:eastAsia="Arial" w:hAnsi="Arial"/>
+                <w:b/>
+                <w:bCs/>
+                <w:color w:val="FFFFFF"/>
+                <w:sz w:val="18"/>
+                <w:szCs w:val="18"/>
+              </w:rPr>
+              <w:t xml:space="preserve">Value</w:t>
+            </w:r>
+          </w:p>
+        </w:tc>
+      </w:tr>
+      <w:tr>
+        <w:tc>
+          <w:tcPr>
+            <w:tcW w:type="dxa" w:w="2200"/>
+            <w:tcBorders>
+              <w:top w:val="single" w:color="AAAAAA" w:sz="1"/>
+              <w:left w:val="single" w:color="AAAAAA" w:sz="1"/>
+              <w:bottom w:val="single" w:color="AAAAAA" w:sz="1"/>
+              <w:right w:val="single" w:color="AAAAAA" w:sz="1"/>
+            </w:tcBorders>
+            <w:tcMar>
+              <w:top w:type="dxa" w:w="80"/>
+              <w:left w:type="dxa" w:w="120"/>
+              <w:bottom w:type="dxa" w:w="80"/>
+              <w:right w:type="dxa" w:w="120"/>
+            </w:tcMar>
+            <w:vAlign w:val="top"/>
+          </w:tcPr>
+          <w:p>
+            <w:r>
+              <w:rPr>
+                <w:rFonts w:ascii="Arial" w:cs="Arial" w:eastAsia="Arial" w:hAnsi="Arial"/>
+                <w:b/>
+                <w:bCs/>
+                <w:color w:val="000000"/>
+                <w:sz w:val="18"/>
+                <w:szCs w:val="18"/>
+              </w:rPr>
+              <w:t xml:space="preserve">item_type</w:t>
+            </w:r>
+          </w:p>
+        </w:tc>
+        <w:tc>
+          <w:tcPr>
+            <w:tcW w:type="dxa" w:w="7160"/>
+            <w:tcBorders>
+              <w:top w:val="single" w:color="AAAAAA" w:sz="1"/>
+              <w:left w:val="single" w:color="AAAAAA" w:sz="1"/>
+              <w:bottom w:val="single" w:color="AAAAAA" w:sz="1"/>
+              <w:right w:val="single" w:color="AAAAAA" w:sz="1"/>
+            </w:tcBorders>
+            <w:tcMar>
+              <w:top w:type="dxa" w:w="80"/>
+              <w:left w:type="dxa" w:w="120"/>
+              <w:bottom w:type="dxa" w:w="80"/>
+              <w:right w:type="dxa" w:w="120"/>
+            </w:tcMar>
+            <w:vAlign w:val="top"/>
+          </w:tcPr>
+          <w:p>
+            <w:r>
+              <w:rPr>
+                <w:rFonts w:ascii="Arial" w:cs="Arial" w:eastAsia="Arial" w:hAnsi="Arial"/>
+                <w:color w:val="000000"/>
+                <w:sz w:val="18"/>
+                <w:szCs w:val="18"/>
+              </w:rPr>
+              <w:t xml:space="preserve">master_prd</w:t>
+            </w:r>
+          </w:p>
+        </w:tc>
+      </w:tr>
+      <w:tr>
+        <w:tc>
+          <w:tcPr>
+            <w:tcW w:type="dxa" w:w="2200"/>
+            <w:tcBorders>
+              <w:top w:val="single" w:color="AAAAAA" w:sz="1"/>
+              <w:left w:val="single" w:color="AAAAAA" w:sz="1"/>
+              <w:bottom w:val="single" w:color="AAAAAA" w:sz="1"/>
+              <w:right w:val="single" w:color="AAAAAA" w:sz="1"/>
+            </w:tcBorders>
+            <w:shd w:fill="F2F7FB" w:val="clear"/>
+            <w:tcMar>
+              <w:top w:type="dxa" w:w="80"/>
+              <w:left w:type="dxa" w:w="120"/>
+              <w:bottom w:type="dxa" w:w="80"/>
+              <w:right w:type="dxa" w:w="120"/>
+            </w:tcMar>
+            <w:vAlign w:val="top"/>
+          </w:tcPr>
+          <w:p>
+            <w:r>
+              <w:rPr>
+                <w:rFonts w:ascii="Arial" w:cs="Arial" w:eastAsia="Arial" w:hAnsi="Arial"/>
+                <w:b/>
+                <w:bCs/>
+                <w:color w:val="000000"/>
+                <w:sz w:val="18"/>
+                <w:szCs w:val="18"/>
+              </w:rPr>
+              <w:t xml:space="preserve">phase</w:t>
+            </w:r>
+          </w:p>
+        </w:tc>
+        <w:tc>
+          <w:tcPr>
+            <w:tcW w:type="dxa" w:w="7160"/>
+            <w:tcBorders>
+              <w:top w:val="single" w:color="AAAAAA" w:sz="1"/>
+              <w:left w:val="single" w:color="AAAAAA" w:sz="1"/>
+              <w:bottom w:val="single" w:color="AAAAAA" w:sz="1"/>
+              <w:right w:val="single" w:color="AAAAAA" w:sz="1"/>
+            </w:tcBorders>
+            <w:shd w:fill="F2F7FB" w:val="clear"/>
+            <w:tcMar>
+              <w:top w:type="dxa" w:w="80"/>
+              <w:left w:type="dxa" w:w="120"/>
+              <w:bottom w:type="dxa" w:w="80"/>
+              <w:right w:type="dxa" w:w="120"/>
+            </w:tcMar>
+            <w:vAlign w:val="top"/>
+          </w:tcPr>
+          <w:p>
+            <w:r>
+              <w:rPr>
+                <w:rFonts w:ascii="Arial" w:cs="Arial" w:eastAsia="Arial" w:hAnsi="Arial"/>
+                <w:color w:val="000000"/>
+                <w:sz w:val="18"/>
+                <w:szCs w:val="18"/>
+              </w:rPr>
+              <w:t xml:space="preserve">Phase 1</w:t>
+            </w:r>
+          </w:p>
+        </w:tc>
+      </w:tr>
+      <w:tr>
+        <w:tc>
+          <w:tcPr>
+            <w:tcW w:type="dxa" w:w="2200"/>
+            <w:tcBorders>
+              <w:top w:val="single" w:color="AAAAAA" w:sz="1"/>
+              <w:left w:val="single" w:color="AAAAAA" w:sz="1"/>
+              <w:bottom w:val="single" w:color="AAAAAA" w:sz="1"/>
+              <w:right w:val="single" w:color="AAAAAA" w:sz="1"/>
+            </w:tcBorders>
+            <w:tcMar>
+              <w:top w:type="dxa" w:w="80"/>
+              <w:left w:type="dxa" w:w="120"/>
+              <w:bottom w:type="dxa" w:w="80"/>
+              <w:right w:type="dxa" w:w="120"/>
+            </w:tcMar>
+            <w:vAlign w:val="top"/>
+          </w:tcPr>
+          <w:p>
+            <w:r>
+              <w:rPr>
+                <w:rFonts w:ascii="Arial" w:cs="Arial" w:eastAsia="Arial" w:hAnsi="Arial"/>
+                <w:b/>
+                <w:bCs/>
+                <w:color w:val="000000"/>
+                <w:sz w:val="18"/>
+                <w:szCs w:val="18"/>
+              </w:rPr>
+              <w:t xml:space="preserve">status</w:t>
+            </w:r>
+          </w:p>
+        </w:tc>
+        <w:tc>
+          <w:tcPr>
+            <w:tcW w:type="dxa" w:w="7160"/>
+            <w:tcBorders>
+              <w:top w:val="single" w:color="AAAAAA" w:sz="1"/>
+              <w:left w:val="single" w:color="AAAAAA" w:sz="1"/>
+              <w:bottom w:val="single" w:color="AAAAAA" w:sz="1"/>
+              <w:right w:val="single" w:color="AAAAAA" w:sz="1"/>
+            </w:tcBorders>
+            <w:tcMar>
+              <w:top w:type="dxa" w:w="80"/>
+              <w:left w:type="dxa" w:w="120"/>
+              <w:bottom w:type="dxa" w:w="80"/>
+              <w:right w:type="dxa" w:w="120"/>
+            </w:tcMar>
+            <w:vAlign w:val="top"/>
+          </w:tcPr>
+          <w:p>
+            <w:r>
+              <w:rPr>
+                <w:rFonts w:ascii="Arial" w:cs="Arial" w:eastAsia="Arial" w:hAnsi="Arial"/>
+                <w:color w:val="000000"/>
+                <w:sz w:val="18"/>
+                <w:szCs w:val="18"/>
+              </w:rPr>
+              <w:t xml:space="preserve">ready</w:t>
+            </w:r>
+          </w:p>
+        </w:tc>
+      </w:tr>
+    </w:tbl>
+    <w:p>
+      <w:pPr>
+        <w:spacing w:after="160"/>
+      </w:pPr>
+      <w:r>
+        <w:rPr>
+          <w:rFonts w:ascii="Arial" w:cs="Arial" w:eastAsia="Arial" w:hAnsi="Arial"/>
+          <w:color w:val="000000"/>
+          <w:sz w:val="22"/>
+          <w:szCs w:val="22"/>
+        </w:rPr>
+        <w:t xml:space="preserve">This work item has zero dependencies and is immediately available for work.</w:t>
+      </w:r>
+    </w:p>
+    <w:p>
+      <w:pPr>
+        <w:pStyle w:val="Heading3"/>
+        <w:spacing w:after="120" w:before="240"/>
+      </w:pPr>
+      <w:r>
+        <w:rPr>
+          <w:rFonts w:ascii="Arial" w:cs="Arial" w:eastAsia="Arial" w:hAnsi="Arial"/>
+          <w:b/>
+          <w:bCs/>
+          <w:color w:val="1F3864"/>
+          <w:sz w:val="22"/>
+          <w:szCs w:val="22"/>
+        </w:rPr>
+        <w:t xml:space="preserve">9.4.2 After Master PRD Import</w:t>
+      </w:r>
+    </w:p>
+    <w:p>
+      <w:pPr>
+        <w:spacing w:after="160"/>
+      </w:pPr>
+      <w:r>
+        <w:rPr>
+          <w:rFonts w:ascii="Arial" w:cs="Arial" w:eastAsia="Arial" w:hAnsi="Arial"/>
+          <w:color w:val="000000"/>
+          <w:sz w:val="22"/>
+          <w:szCs w:val="22"/>
+        </w:rPr>
+        <w:t xml:space="preserve">When the Master PRD session results are imported  —  creating Domain and Process records in the database  —  the engine creates one work item:</w:t>
+      </w:r>
+    </w:p>
+    <w:tbl>
+      <w:tblPr>
+        <w:tblW w:type="dxa" w:w="9360"/>
+        <w:tblBorders>
+          <w:top w:val="single" w:color="auto" w:sz="4"/>
+          <w:left w:val="single" w:color="auto" w:sz="4"/>
+          <w:bottom w:val="single" w:color="auto" w:sz="4"/>
+          <w:right w:val="single" w:color="auto" w:sz="4"/>
+          <w:insideH w:val="single" w:color="auto" w:sz="4"/>
+          <w:insideV w:val="single" w:color="auto" w:sz="4"/>
+        </w:tblBorders>
+      </w:tblPr>
+      <w:tblGrid>
+        <w:gridCol w:w="2200"/>
+        <w:gridCol w:w="7160"/>
+      </w:tblGrid>
+      <w:tr>
+        <w:tc>
+          <w:tcPr>
+            <w:tcW w:type="dxa" w:w="2200"/>
+            <w:tcBorders>
+              <w:top w:val="single" w:color="AAAAAA" w:sz="1"/>
+              <w:left w:val="single" w:color="AAAAAA" w:sz="1"/>
+              <w:bottom w:val="single" w:color="AAAAAA" w:sz="1"/>
+              <w:right w:val="single" w:color="AAAAAA" w:sz="1"/>
+            </w:tcBorders>
+            <w:shd w:fill="1F3864" w:val="clear"/>
+            <w:tcMar>
+              <w:top w:type="dxa" w:w="80"/>
+              <w:left w:type="dxa" w:w="120"/>
+              <w:bottom w:type="dxa" w:w="80"/>
+              <w:right w:type="dxa" w:w="120"/>
+            </w:tcMar>
+            <w:vAlign w:val="center"/>
+          </w:tcPr>
+          <w:p>
+            <w:r>
+              <w:rPr>
+                <w:rFonts w:ascii="Arial" w:cs="Arial" w:eastAsia="Arial" w:hAnsi="Arial"/>
+                <w:b/>
+                <w:bCs/>
+                <w:color w:val="FFFFFF"/>
+                <w:sz w:val="18"/>
+                <w:szCs w:val="18"/>
+              </w:rPr>
+              <w:t xml:space="preserve">Field</w:t>
+            </w:r>
+          </w:p>
+        </w:tc>
+        <w:tc>
+          <w:tcPr>
+            <w:tcW w:type="dxa" w:w="7160"/>
+            <w:tcBorders>
+              <w:top w:val="single" w:color="AAAAAA" w:sz="1"/>
+              <w:left w:val="single" w:color="AAAAAA" w:sz="1"/>
+              <w:bottom w:val="single" w:color="AAAAAA" w:sz="1"/>
+              <w:right w:val="single" w:color="AAAAAA" w:sz="1"/>
+            </w:tcBorders>
+            <w:shd w:fill="1F3864" w:val="clear"/>
+            <w:tcMar>
+              <w:top w:type="dxa" w:w="80"/>
+              <w:left w:type="dxa" w:w="120"/>
+              <w:bottom w:type="dxa" w:w="80"/>
+              <w:right w:type="dxa" w:w="120"/>
+            </w:tcMar>
+            <w:vAlign w:val="center"/>
+          </w:tcPr>
+          <w:p>
+            <w:r>
+              <w:rPr>
+                <w:rFonts w:ascii="Arial" w:cs="Arial" w:eastAsia="Arial" w:hAnsi="Arial"/>
+                <w:b/>
+                <w:bCs/>
+                <w:color w:val="FFFFFF"/>
+                <w:sz w:val="18"/>
+                <w:szCs w:val="18"/>
+              </w:rPr>
+              <w:t xml:space="preserve">Value</w:t>
+            </w:r>
+          </w:p>
+        </w:tc>
+      </w:tr>
+      <w:tr>
+        <w:tc>
+          <w:tcPr>
+            <w:tcW w:type="dxa" w:w="2200"/>
+            <w:tcBorders>
+              <w:top w:val="single" w:color="AAAAAA" w:sz="1"/>
+              <w:left w:val="single" w:color="AAAAAA" w:sz="1"/>
+              <w:bottom w:val="single" w:color="AAAAAA" w:sz="1"/>
+              <w:right w:val="single" w:color="AAAAAA" w:sz="1"/>
+            </w:tcBorders>
+            <w:tcMar>
+              <w:top w:type="dxa" w:w="80"/>
+              <w:left w:type="dxa" w:w="120"/>
+              <w:bottom w:type="dxa" w:w="80"/>
+              <w:right w:type="dxa" w:w="120"/>
+            </w:tcMar>
+            <w:vAlign w:val="top"/>
+          </w:tcPr>
+          <w:p>
+            <w:r>
+              <w:rPr>
+                <w:rFonts w:ascii="Arial" w:cs="Arial" w:eastAsia="Arial" w:hAnsi="Arial"/>
+                <w:b/>
+                <w:bCs/>
+                <w:color w:val="000000"/>
+                <w:sz w:val="18"/>
+                <w:szCs w:val="18"/>
+              </w:rPr>
+              <w:t xml:space="preserve">item_type</w:t>
+            </w:r>
+          </w:p>
+        </w:tc>
+        <w:tc>
+          <w:tcPr>
+            <w:tcW w:type="dxa" w:w="7160"/>
+            <w:tcBorders>
+              <w:top w:val="single" w:color="AAAAAA" w:sz="1"/>
+              <w:left w:val="single" w:color="AAAAAA" w:sz="1"/>
+              <w:bottom w:val="single" w:color="AAAAAA" w:sz="1"/>
+              <w:right w:val="single" w:color="AAAAAA" w:sz="1"/>
+            </w:tcBorders>
+            <w:tcMar>
+              <w:top w:type="dxa" w:w="80"/>
+              <w:left w:type="dxa" w:w="120"/>
+              <w:bottom w:type="dxa" w:w="80"/>
+              <w:right w:type="dxa" w:w="120"/>
+            </w:tcMar>
+            <w:vAlign w:val="top"/>
+          </w:tcPr>
+          <w:p>
+            <w:r>
+              <w:rPr>
+                <w:rFonts w:ascii="Arial" w:cs="Arial" w:eastAsia="Arial" w:hAnsi="Arial"/>
+                <w:color w:val="000000"/>
+                <w:sz w:val="18"/>
+                <w:szCs w:val="18"/>
+              </w:rPr>
+              <w:t xml:space="preserve">business_object_discovery</w:t>
+            </w:r>
+          </w:p>
+        </w:tc>
+      </w:tr>
+      <w:tr>
+        <w:tc>
+          <w:tcPr>
+            <w:tcW w:type="dxa" w:w="2200"/>
+            <w:tcBorders>
+              <w:top w:val="single" w:color="AAAAAA" w:sz="1"/>
+              <w:left w:val="single" w:color="AAAAAA" w:sz="1"/>
+              <w:bottom w:val="single" w:color="AAAAAA" w:sz="1"/>
+              <w:right w:val="single" w:color="AAAAAA" w:sz="1"/>
+            </w:tcBorders>
+            <w:shd w:fill="F2F7FB" w:val="clear"/>
+            <w:tcMar>
+              <w:top w:type="dxa" w:w="80"/>
+              <w:left w:type="dxa" w:w="120"/>
+              <w:bottom w:type="dxa" w:w="80"/>
+              <w:right w:type="dxa" w:w="120"/>
+            </w:tcMar>
+            <w:vAlign w:val="top"/>
+          </w:tcPr>
+          <w:p>
+            <w:r>
+              <w:rPr>
+                <w:rFonts w:ascii="Arial" w:cs="Arial" w:eastAsia="Arial" w:hAnsi="Arial"/>
+                <w:b/>
+                <w:bCs/>
+                <w:color w:val="000000"/>
+                <w:sz w:val="18"/>
+                <w:szCs w:val="18"/>
+              </w:rPr>
+              <w:t xml:space="preserve">phase</w:t>
+            </w:r>
+          </w:p>
+        </w:tc>
+        <w:tc>
+          <w:tcPr>
+            <w:tcW w:type="dxa" w:w="7160"/>
+            <w:tcBorders>
+              <w:top w:val="single" w:color="AAAAAA" w:sz="1"/>
+              <w:left w:val="single" w:color="AAAAAA" w:sz="1"/>
+              <w:bottom w:val="single" w:color="AAAAAA" w:sz="1"/>
+              <w:right w:val="single" w:color="AAAAAA" w:sz="1"/>
+            </w:tcBorders>
+            <w:shd w:fill="F2F7FB" w:val="clear"/>
+            <w:tcMar>
+              <w:top w:type="dxa" w:w="80"/>
+              <w:left w:type="dxa" w:w="120"/>
+              <w:bottom w:type="dxa" w:w="80"/>
+              <w:right w:type="dxa" w:w="120"/>
+            </w:tcMar>
+            <w:vAlign w:val="top"/>
+          </w:tcPr>
+          <w:p>
+            <w:r>
+              <w:rPr>
+                <w:rFonts w:ascii="Arial" w:cs="Arial" w:eastAsia="Arial" w:hAnsi="Arial"/>
+                <w:color w:val="000000"/>
+                <w:sz w:val="18"/>
+                <w:szCs w:val="18"/>
+              </w:rPr>
+              <w:t xml:space="preserve">Phase 2</w:t>
+            </w:r>
+          </w:p>
+        </w:tc>
+      </w:tr>
+      <w:tr>
+        <w:tc>
+          <w:tcPr>
+            <w:tcW w:type="dxa" w:w="2200"/>
+            <w:tcBorders>
+              <w:top w:val="single" w:color="AAAAAA" w:sz="1"/>
+              <w:left w:val="single" w:color="AAAAAA" w:sz="1"/>
+              <w:bottom w:val="single" w:color="AAAAAA" w:sz="1"/>
+              <w:right w:val="single" w:color="AAAAAA" w:sz="1"/>
+            </w:tcBorders>
+            <w:tcMar>
+              <w:top w:type="dxa" w:w="80"/>
+              <w:left w:type="dxa" w:w="120"/>
+              <w:bottom w:type="dxa" w:w="80"/>
+              <w:right w:type="dxa" w:w="120"/>
+            </w:tcMar>
+            <w:vAlign w:val="top"/>
+          </w:tcPr>
+          <w:p>
+            <w:r>
+              <w:rPr>
+                <w:rFonts w:ascii="Arial" w:cs="Arial" w:eastAsia="Arial" w:hAnsi="Arial"/>
+                <w:b/>
+                <w:bCs/>
+                <w:color w:val="000000"/>
+                <w:sz w:val="18"/>
+                <w:szCs w:val="18"/>
+              </w:rPr>
+              <w:t xml:space="preserve">status</w:t>
+            </w:r>
+          </w:p>
+        </w:tc>
+        <w:tc>
+          <w:tcPr>
+            <w:tcW w:type="dxa" w:w="7160"/>
+            <w:tcBorders>
+              <w:top w:val="single" w:color="AAAAAA" w:sz="1"/>
+              <w:left w:val="single" w:color="AAAAAA" w:sz="1"/>
+              <w:bottom w:val="single" w:color="AAAAAA" w:sz="1"/>
+              <w:right w:val="single" w:color="AAAAAA" w:sz="1"/>
+            </w:tcBorders>
+            <w:tcMar>
+              <w:top w:type="dxa" w:w="80"/>
+              <w:left w:type="dxa" w:w="120"/>
+              <w:bottom w:type="dxa" w:w="80"/>
+              <w:right w:type="dxa" w:w="120"/>
+            </w:tcMar>
+            <w:vAlign w:val="top"/>
+          </w:tcPr>
+          <w:p>
+            <w:r>
+              <w:rPr>
+                <w:rFonts w:ascii="Arial" w:cs="Arial" w:eastAsia="Arial" w:hAnsi="Arial"/>
+                <w:color w:val="000000"/>
+                <w:sz w:val="18"/>
+                <w:szCs w:val="18"/>
+              </w:rPr>
+              <w:t xml:space="preserve">not_started</w:t>
+            </w:r>
+          </w:p>
+        </w:tc>
+      </w:tr>
+    </w:tbl>
+    <w:p>
+      <w:pPr>
+        <w:spacing w:after="160"/>
+      </w:pPr>
+      <w:r>
+        <w:rPr>
+          <w:rFonts w:ascii="Arial" w:cs="Arial" w:eastAsia="Arial" w:hAnsi="Arial"/>
+          <w:color w:val="000000"/>
+          <w:sz w:val="22"/>
+          <w:szCs w:val="22"/>
+        </w:rPr>
+        <w:t xml:space="preserve">One Dependency row is created: business_object_discovery depends on master_prd. The engine recalculates and transitions this item to ready (since master_prd is now complete).</w:t>
+      </w:r>
+    </w:p>
+    <w:p>
+      <w:pPr>
+        <w:pStyle w:val="Heading3"/>
+        <w:spacing w:after="120" w:before="240"/>
+      </w:pPr>
+      <w:r>
+        <w:rPr>
+          <w:rFonts w:ascii="Arial" w:cs="Arial" w:eastAsia="Arial" w:hAnsi="Arial"/>
+          <w:b/>
+          <w:bCs/>
+          <w:color w:val="1F3864"/>
+          <w:sz w:val="22"/>
+          <w:szCs w:val="22"/>
+        </w:rPr>
+        <w:t xml:space="preserve">9.4.3 After Business Object Discovery Import</w:t>
+      </w:r>
+    </w:p>
+    <w:p>
+      <w:pPr>
+        <w:spacing w:after="160"/>
+      </w:pPr>
+      <w:r>
+        <w:rPr>
+          <w:rFonts w:ascii="Arial" w:cs="Arial" w:eastAsia="Arial" w:hAnsi="Arial"/>
+          <w:color w:val="000000"/>
+          <w:sz w:val="22"/>
+          <w:szCs w:val="22"/>
+        </w:rPr>
+        <w:t xml:space="preserve">This is the primary graph construction event. The import creates Entity records with BusinessObject resolution links and populates the Entity Inventory’s process participation data, including which entities participate in which domains. The engine creates work items for all remaining phases:</w:t>
+      </w:r>
+    </w:p>
+    <w:p>
+      <w:pPr>
+        <w:spacing w:after="120"/>
+      </w:pPr>
+      <w:r>
+        <w:rPr>
+          <w:rFonts w:ascii="Arial" w:cs="Arial" w:eastAsia="Arial" w:hAnsi="Arial"/>
+          <w:b/>
+          <w:bCs/>
+          <w:color w:val="000000"/>
+          <w:sz w:val="22"/>
+          <w:szCs w:val="22"/>
+        </w:rPr>
+        <w:t xml:space="preserve">Entity PRDs (Phase 2):</w:t>
+      </w:r>
+    </w:p>
+    <w:p>
+      <w:pPr>
+        <w:spacing w:after="160"/>
+      </w:pPr>
+      <w:r>
+        <w:rPr>
+          <w:rFonts w:ascii="Arial" w:cs="Arial" w:eastAsia="Arial" w:hAnsi="Arial"/>
+          <w:color w:val="000000"/>
+          <w:sz w:val="22"/>
+          <w:szCs w:val="22"/>
+        </w:rPr>
+        <w:t xml:space="preserve">One entity_prd work item per Entity record. Each depends on the business_object_discovery work item.</w:t>
+      </w:r>
+    </w:p>
+    <w:p>
+      <w:pPr>
+        <w:spacing w:after="120"/>
+      </w:pPr>
+      <w:r>
+        <w:rPr>
+          <w:rFonts w:ascii="Arial" w:cs="Arial" w:eastAsia="Arial" w:hAnsi="Arial"/>
+          <w:b/>
+          <w:bCs/>
+          <w:color w:val="000000"/>
+          <w:sz w:val="22"/>
+          <w:szCs w:val="22"/>
+        </w:rPr>
+        <w:t xml:space="preserve">Domain Overview (Phase 3):</w:t>
+      </w:r>
+    </w:p>
+    <w:p>
+      <w:pPr>
+        <w:spacing w:after="160"/>
+      </w:pPr>
+      <w:r>
+        <w:rPr>
+          <w:rFonts w:ascii="Arial" w:cs="Arial" w:eastAsia="Arial" w:hAnsi="Arial"/>
+          <w:color w:val="000000"/>
+          <w:sz w:val="22"/>
+          <w:szCs w:val="22"/>
+        </w:rPr>
+        <w:t xml:space="preserve">One domain_overview work item per Domain record. Each depends on: (1) the business_object_discovery work item, and (2) the entity_prd work items for every entity whose Entity Inventory data lists it as participating in that domain.</w:t>
+      </w:r>
+    </w:p>
+    <w:p>
+      <w:pPr>
+        <w:spacing w:after="160"/>
+      </w:pPr>
+      <w:r>
+        <w:rPr>
+          <w:rFonts w:ascii="Arial" w:cs="Arial" w:eastAsia="Arial" w:hAnsi="Arial"/>
+          <w:color w:val="000000"/>
+          <w:sz w:val="22"/>
+          <w:szCs w:val="22"/>
+        </w:rPr>
+        <w:t xml:space="preserve">The administrator can optionally add cross-domain dependencies after creation. For example, if the Mentor Recruitment domain should not begin until the Mentoring domain is fully defined, the administrator adds a Dependency row from MR’s domain_overview to MN’s domain_reconciliation. Cross-domain dependencies are a judgment call, not an automatic calculation.</w:t>
+      </w:r>
+    </w:p>
+    <w:p>
+      <w:pPr>
+        <w:spacing w:after="120"/>
+      </w:pPr>
+      <w:r>
+        <w:rPr>
+          <w:rFonts w:ascii="Arial" w:cs="Arial" w:eastAsia="Arial" w:hAnsi="Arial"/>
+          <w:b/>
+          <w:bCs/>
+          <w:color w:val="000000"/>
+          <w:sz w:val="22"/>
+          <w:szCs w:val="22"/>
+        </w:rPr>
+        <w:t xml:space="preserve">Process Definitions (Phase 4):</w:t>
+      </w:r>
+    </w:p>
+    <w:p>
+      <w:pPr>
+        <w:spacing w:after="160"/>
+      </w:pPr>
+      <w:r>
+        <w:rPr>
+          <w:rFonts w:ascii="Arial" w:cs="Arial" w:eastAsia="Arial" w:hAnsi="Arial"/>
+          <w:color w:val="000000"/>
+          <w:sz w:val="22"/>
+          <w:szCs w:val="22"/>
+        </w:rPr>
+        <w:t xml:space="preserve">One process_definition work item per Process record. Each depends on: (1) the domain_overview work item for its domain, and (2) the prior process_definition work item within the same domain by sort_order, if any. The first process in a domain has no intra-domain dependency.</w:t>
+      </w:r>
+    </w:p>
+    <w:p>
+      <w:pPr>
+        <w:spacing w:after="160"/>
+      </w:pPr>
+      <w:r>
+        <w:rPr>
+          <w:rFonts w:ascii="Arial" w:cs="Arial" w:eastAsia="Arial" w:hAnsi="Arial"/>
+          <w:color w:val="000000"/>
+          <w:sz w:val="22"/>
+          <w:szCs w:val="22"/>
+        </w:rPr>
+        <w:t xml:space="preserve">Process definitions do not have direct dependencies on individual entity PRDs. The domain_overview serves as the gateway  —  it cannot become ready until all entity PRDs relevant to that domain are complete, so any process definition in the domain is guaranteed to have its entity context available.</w:t>
+      </w:r>
+    </w:p>
+    <w:p>
+      <w:pPr>
+        <w:spacing w:after="120"/>
+      </w:pPr>
+      <w:r>
+        <w:rPr>
+          <w:rFonts w:ascii="Arial" w:cs="Arial" w:eastAsia="Arial" w:hAnsi="Arial"/>
+          <w:b/>
+          <w:bCs/>
+          <w:color w:val="000000"/>
+          <w:sz w:val="22"/>
+          <w:szCs w:val="22"/>
+        </w:rPr>
+        <w:t xml:space="preserve">Domain Reconciliation (Phase 5):</w:t>
+      </w:r>
+    </w:p>
+    <w:p>
+      <w:pPr>
+        <w:spacing w:after="160"/>
+      </w:pPr>
+      <w:r>
+        <w:rPr>
+          <w:rFonts w:ascii="Arial" w:cs="Arial" w:eastAsia="Arial" w:hAnsi="Arial"/>
+          <w:color w:val="000000"/>
+          <w:sz w:val="22"/>
+          <w:szCs w:val="22"/>
+        </w:rPr>
+        <w:t xml:space="preserve">One domain_reconciliation work item per Domain record. Each depends on all process_definition work items in that domain.</w:t>
+      </w:r>
+    </w:p>
+    <w:p>
+      <w:pPr>
+        <w:spacing w:after="120"/>
+      </w:pPr>
+      <w:r>
+        <w:rPr>
+          <w:rFonts w:ascii="Arial" w:cs="Arial" w:eastAsia="Arial" w:hAnsi="Arial"/>
+          <w:b/>
+          <w:bCs/>
+          <w:color w:val="000000"/>
+          <w:sz w:val="22"/>
+          <w:szCs w:val="22"/>
+        </w:rPr>
+        <w:t xml:space="preserve">Stakeholder Review (Phase 6):</w:t>
+      </w:r>
+    </w:p>
+    <w:p>
+      <w:pPr>
+        <w:spacing w:after="160"/>
+      </w:pPr>
+      <w:r>
+        <w:rPr>
+          <w:rFonts w:ascii="Arial" w:cs="Arial" w:eastAsia="Arial" w:hAnsi="Arial"/>
+          <w:color w:val="000000"/>
+          <w:sz w:val="22"/>
+          <w:szCs w:val="22"/>
+        </w:rPr>
+        <w:t xml:space="preserve">One stakeholder_review work item per Domain record. Each depends on the domain_reconciliation work item for that domain.</w:t>
+      </w:r>
+    </w:p>
+    <w:p>
+      <w:pPr>
+        <w:spacing w:after="120"/>
+      </w:pPr>
+      <w:r>
+        <w:rPr>
+          <w:rFonts w:ascii="Arial" w:cs="Arial" w:eastAsia="Arial" w:hAnsi="Arial"/>
+          <w:b/>
+          <w:bCs/>
+          <w:color w:val="000000"/>
+          <w:sz w:val="22"/>
+          <w:szCs w:val="22"/>
+        </w:rPr>
+        <w:t xml:space="preserve">YAML Generation (Phase 7):</w:t>
+      </w:r>
+    </w:p>
+    <w:p>
+      <w:pPr>
+        <w:spacing w:after="160"/>
+      </w:pPr>
+      <w:r>
+        <w:rPr>
+          <w:rFonts w:ascii="Arial" w:cs="Arial" w:eastAsia="Arial" w:hAnsi="Arial"/>
+          <w:color w:val="000000"/>
+          <w:sz w:val="22"/>
+          <w:szCs w:val="22"/>
+        </w:rPr>
+        <w:t xml:space="preserve">One yaml_generation work item per Domain record. Each depends on the stakeholder_review work item for that domain. YAML generation runs in parallel across domains  —  there are no cross-domain dependencies for YAML generation. The administrator chooses which domain to process first.</w:t>
+      </w:r>
+    </w:p>
+    <w:p>
+      <w:pPr>
+        <w:spacing w:after="120"/>
+      </w:pPr>
+      <w:r>
+        <w:rPr>
+          <w:rFonts w:ascii="Arial" w:cs="Arial" w:eastAsia="Arial" w:hAnsi="Arial"/>
+          <w:b/>
+          <w:bCs/>
+          <w:color w:val="000000"/>
+          <w:sz w:val="22"/>
+          <w:szCs w:val="22"/>
+        </w:rPr>
+        <w:t xml:space="preserve">CRM Selection (Phase 8):</w:t>
+      </w:r>
+    </w:p>
+    <w:p>
+      <w:pPr>
+        <w:spacing w:after="160"/>
+      </w:pPr>
+      <w:r>
+        <w:rPr>
+          <w:rFonts w:ascii="Arial" w:cs="Arial" w:eastAsia="Arial" w:hAnsi="Arial"/>
+          <w:color w:val="000000"/>
+          <w:sz w:val="22"/>
+          <w:szCs w:val="22"/>
+        </w:rPr>
+        <w:t xml:space="preserve">One crm_selection work item. Depends on all yaml_generation work items.</w:t>
+      </w:r>
+    </w:p>
+    <w:p>
+      <w:pPr>
+        <w:spacing w:after="120"/>
+      </w:pPr>
+      <w:r>
+        <w:rPr>
+          <w:rFonts w:ascii="Arial" w:cs="Arial" w:eastAsia="Arial" w:hAnsi="Arial"/>
+          <w:b/>
+          <w:bCs/>
+          <w:color w:val="000000"/>
+          <w:sz w:val="22"/>
+          <w:szCs w:val="22"/>
+        </w:rPr>
+        <w:t xml:space="preserve">CRM Deployment (Phase 9):</w:t>
+      </w:r>
+    </w:p>
+    <w:p>
+      <w:pPr>
+        <w:spacing w:after="160"/>
+      </w:pPr>
+      <w:r>
+        <w:rPr>
+          <w:rFonts w:ascii="Arial" w:cs="Arial" w:eastAsia="Arial" w:hAnsi="Arial"/>
+          <w:color w:val="000000"/>
+          <w:sz w:val="22"/>
+          <w:szCs w:val="22"/>
+        </w:rPr>
+        <w:t xml:space="preserve">One crm_deployment work item. Depends on crm_selection.</w:t>
+      </w:r>
+    </w:p>
+    <w:p>
+      <w:pPr>
+        <w:spacing w:after="120"/>
+      </w:pPr>
+      <w:r>
+        <w:rPr>
+          <w:rFonts w:ascii="Arial" w:cs="Arial" w:eastAsia="Arial" w:hAnsi="Arial"/>
+          <w:b/>
+          <w:bCs/>
+          <w:color w:val="000000"/>
+          <w:sz w:val="22"/>
+          <w:szCs w:val="22"/>
+        </w:rPr>
+        <w:t xml:space="preserve">CRM Configuration (Phase 10):</w:t>
+      </w:r>
+    </w:p>
+    <w:p>
+      <w:pPr>
+        <w:spacing w:after="160"/>
+      </w:pPr>
+      <w:r>
+        <w:rPr>
+          <w:rFonts w:ascii="Arial" w:cs="Arial" w:eastAsia="Arial" w:hAnsi="Arial"/>
+          <w:color w:val="000000"/>
+          <w:sz w:val="22"/>
+          <w:szCs w:val="22"/>
+        </w:rPr>
+        <w:t xml:space="preserve">One crm_configuration work item. Depends on crm_deployment.</w:t>
+      </w:r>
+    </w:p>
+    <w:p>
+      <w:pPr>
+        <w:spacing w:after="120"/>
+      </w:pPr>
+      <w:r>
+        <w:rPr>
+          <w:rFonts w:ascii="Arial" w:cs="Arial" w:eastAsia="Arial" w:hAnsi="Arial"/>
+          <w:b/>
+          <w:bCs/>
+          <w:color w:val="000000"/>
+          <w:sz w:val="22"/>
+          <w:szCs w:val="22"/>
+        </w:rPr>
+        <w:t xml:space="preserve">Verification (Phase 11):</w:t>
+      </w:r>
+    </w:p>
+    <w:p>
+      <w:pPr>
+        <w:spacing w:after="160"/>
+      </w:pPr>
+      <w:r>
+        <w:rPr>
+          <w:rFonts w:ascii="Arial" w:cs="Arial" w:eastAsia="Arial" w:hAnsi="Arial"/>
+          <w:color w:val="000000"/>
+          <w:sz w:val="22"/>
+          <w:szCs w:val="22"/>
+        </w:rPr>
+        <w:t xml:space="preserve">One verification work item. Depends on crm_configuration.</w:t>
+      </w:r>
+    </w:p>
+    <w:p>
+      <w:pPr>
+        <w:spacing w:after="160"/>
+      </w:pPr>
+      <w:r>
+        <w:rPr>
+          <w:rFonts w:ascii="Arial" w:cs="Arial" w:eastAsia="Arial" w:hAnsi="Arial"/>
+          <w:color w:val="000000"/>
+          <w:sz w:val="22"/>
+          <w:szCs w:val="22"/>
+        </w:rPr>
+        <w:t xml:space="preserve">After creating all work items and dependencies, the engine runs a full recalculation pass. Entity PRD work items whose only dependency (business_object_discovery) is now complete transition to ready.</w:t>
+      </w:r>
+    </w:p>
+    <w:p>
+      <w:pPr>
+        <w:pStyle w:val="Heading3"/>
+        <w:spacing w:after="120" w:before="240"/>
+      </w:pPr>
+      <w:r>
+        <w:rPr>
+          <w:rFonts w:ascii="Arial" w:cs="Arial" w:eastAsia="Arial" w:hAnsi="Arial"/>
+          <w:b/>
+          <w:bCs/>
+          <w:color w:val="1F3864"/>
+          <w:sz w:val="22"/>
+          <w:szCs w:val="22"/>
+        </w:rPr>
+        <w:t xml:space="preserve">9.4.4 Mid-Project Additions</w:t>
+      </w:r>
+    </w:p>
+    <w:p>
+      <w:pPr>
+        <w:spacing w:after="120"/>
+      </w:pPr>
+      <w:r>
+        <w:rPr>
+          <w:rFonts w:ascii="Arial" w:cs="Arial" w:eastAsia="Arial" w:hAnsi="Arial"/>
+          <w:b/>
+          <w:bCs/>
+          <w:color w:val="000000"/>
+          <w:sz w:val="22"/>
+          <w:szCs w:val="22"/>
+        </w:rPr>
+        <w:t xml:space="preserve">New entity discovered:</w:t>
+      </w:r>
+    </w:p>
+    <w:p>
+      <w:pPr>
+        <w:spacing w:after="160"/>
+      </w:pPr>
+      <w:r>
+        <w:rPr>
+          <w:rFonts w:ascii="Arial" w:cs="Arial" w:eastAsia="Arial" w:hAnsi="Arial"/>
+          <w:color w:val="000000"/>
+          <w:sz w:val="22"/>
+          <w:szCs w:val="22"/>
+        </w:rPr>
+        <w:t xml:space="preserve">The administrator adds the Entity record to the database. The engine creates a new entity_prd work item depending on business_object_discovery and sets its status to ready (since business_object_discovery is already complete at this point). The administrator is responsible for adding this entity_prd as a dependency to any domain_overview work items for domains that use this entity. The impact analysis engine (Section 12) surfaces the change for the administrator’s review.</w:t>
+      </w:r>
+    </w:p>
+    <w:p>
+      <w:pPr>
+        <w:spacing w:after="120"/>
+      </w:pPr>
+      <w:r>
+        <w:rPr>
+          <w:rFonts w:ascii="Arial" w:cs="Arial" w:eastAsia="Arial" w:hAnsi="Arial"/>
+          <w:b/>
+          <w:bCs/>
+          <w:color w:val="000000"/>
+          <w:sz w:val="22"/>
+          <w:szCs w:val="22"/>
+        </w:rPr>
+        <w:t xml:space="preserve">New process discovered:</w:t>
+      </w:r>
+    </w:p>
+    <w:p>
+      <w:pPr>
+        <w:spacing w:after="160"/>
+      </w:pPr>
+      <w:r>
+        <w:rPr>
+          <w:rFonts w:ascii="Arial" w:cs="Arial" w:eastAsia="Arial" w:hAnsi="Arial"/>
+          <w:color w:val="000000"/>
+          <w:sz w:val="22"/>
+          <w:szCs w:val="22"/>
+        </w:rPr>
+        <w:t xml:space="preserve">The administrator adds the Process record. The engine creates a new process_definition work item depending on that domain’s domain_overview, and inserts it into the domain’s sort_order sequence. The domain_reconciliation work item for that domain automatically inherits the new dependency because it depends on all process_definition work items in the domain.</w:t>
+      </w:r>
+    </w:p>
+    <w:p>
+      <w:pPr>
+        <w:spacing w:after="120"/>
+      </w:pPr>
+      <w:r>
+        <w:rPr>
+          <w:rFonts w:ascii="Arial" w:cs="Arial" w:eastAsia="Arial" w:hAnsi="Arial"/>
+          <w:b/>
+          <w:bCs/>
+          <w:color w:val="000000"/>
+          <w:sz w:val="22"/>
+          <w:szCs w:val="22"/>
+        </w:rPr>
+        <w:t xml:space="preserve">Cross-domain dependency added:</w:t>
+      </w:r>
+    </w:p>
+    <w:p>
+      <w:pPr>
+        <w:spacing w:after="160"/>
+      </w:pPr>
+      <w:r>
+        <w:rPr>
+          <w:rFonts w:ascii="Arial" w:cs="Arial" w:eastAsia="Arial" w:hAnsi="Arial"/>
+          <w:color w:val="000000"/>
+          <w:sz w:val="22"/>
+          <w:szCs w:val="22"/>
+        </w:rPr>
+        <w:t xml:space="preserve">The administrator determines that one domain should complete before another begins. The administrator adds a Dependency row from the later domain’s domain_overview to the earlier domain’s domain_reconciliation. The engine recalculates the later domain’s domain_overview status accordingly.</w:t>
+      </w:r>
+    </w:p>
+    <w:p>
+      <w:pPr>
+        <w:pStyle w:val="Heading2"/>
+        <w:spacing w:after="160" w:before="280"/>
+      </w:pPr>
+      <w:r>
+        <w:rPr>
+          <w:rFonts w:ascii="Arial" w:cs="Arial" w:eastAsia="Arial" w:hAnsi="Arial"/>
+          <w:b/>
+          <w:bCs/>
+          <w:color w:val="1F3864"/>
+          <w:sz w:val="24"/>
+          <w:szCs w:val="24"/>
+        </w:rPr>
+        <w:t xml:space="preserve">9.5 Phase Ordering Rules</w:t>
+      </w:r>
+    </w:p>
+    <w:p>
+      <w:pPr>
+        <w:spacing w:after="160"/>
+      </w:pPr>
+      <w:r>
+        <w:rPr>
+          <w:rFonts w:ascii="Arial" w:cs="Arial" w:eastAsia="Arial" w:hAnsi="Arial"/>
+          <w:color w:val="000000"/>
+          <w:sz w:val="22"/>
+          <w:szCs w:val="22"/>
+        </w:rPr>
+        <w:t xml:space="preserve">The engine enforces the following dependency rules. Each rule is expressed as “X depends on Y,” meaning X cannot transition to ready until Y has status complete.</w:t>
+      </w:r>
+    </w:p>
+    <w:tbl>
+      <w:tblPr>
+        <w:tblW w:type="dxa" w:w="9360"/>
+        <w:tblBorders>
+          <w:top w:val="single" w:color="auto" w:sz="4"/>
+          <w:left w:val="single" w:color="auto" w:sz="4"/>
+          <w:bottom w:val="single" w:color="auto" w:sz="4"/>
+          <w:right w:val="single" w:color="auto" w:sz="4"/>
+          <w:insideH w:val="single" w:color="auto" w:sz="4"/>
+          <w:insideV w:val="single" w:color="auto" w:sz="4"/>
+        </w:tblBorders>
+      </w:tblPr>
+      <w:tblGrid>
+        <w:gridCol w:w="800"/>
+        <w:gridCol w:w="2800"/>
+        <w:gridCol w:w="5760"/>
+      </w:tblGrid>
+      <w:tr>
+        <w:tc>
+          <w:tcPr>
+            <w:tcW w:type="dxa" w:w="800"/>
+            <w:tcBorders>
+              <w:top w:val="single" w:color="AAAAAA" w:sz="1"/>
+              <w:left w:val="single" w:color="AAAAAA" w:sz="1"/>
+              <w:bottom w:val="single" w:color="AAAAAA" w:sz="1"/>
+              <w:right w:val="single" w:color="AAAAAA" w:sz="1"/>
+            </w:tcBorders>
+            <w:shd w:fill="1F3864" w:val="clear"/>
+            <w:tcMar>
+              <w:top w:type="dxa" w:w="80"/>
+              <w:left w:type="dxa" w:w="120"/>
+              <w:bottom w:type="dxa" w:w="80"/>
+              <w:right w:type="dxa" w:w="120"/>
+            </w:tcMar>
+            <w:vAlign w:val="center"/>
+          </w:tcPr>
+          <w:p>
+            <w:r>
+              <w:rPr>
+                <w:rFonts w:ascii="Arial" w:cs="Arial" w:eastAsia="Arial" w:hAnsi="Arial"/>
+                <w:b/>
+                <w:bCs/>
+                <w:color w:val="FFFFFF"/>
+                <w:sz w:val="18"/>
+                <w:szCs w:val="18"/>
+              </w:rPr>
+              <w:t xml:space="preserve">Rule</w:t>
+            </w:r>
+          </w:p>
+        </w:tc>
+        <w:tc>
+          <w:tcPr>
+            <w:tcW w:type="dxa" w:w="2800"/>
+            <w:tcBorders>
+              <w:top w:val="single" w:color="AAAAAA" w:sz="1"/>
+              <w:left w:val="single" w:color="AAAAAA" w:sz="1"/>
+              <w:bottom w:val="single" w:color="AAAAAA" w:sz="1"/>
+              <w:right w:val="single" w:color="AAAAAA" w:sz="1"/>
+            </w:tcBorders>
+            <w:shd w:fill="1F3864" w:val="clear"/>
+            <w:tcMar>
+              <w:top w:type="dxa" w:w="80"/>
+              <w:left w:type="dxa" w:w="120"/>
+              <w:bottom w:type="dxa" w:w="80"/>
+              <w:right w:type="dxa" w:w="120"/>
+            </w:tcMar>
+            <w:vAlign w:val="center"/>
+          </w:tcPr>
+          <w:p>
+            <w:r>
+              <w:rPr>
+                <w:rFonts w:ascii="Arial" w:cs="Arial" w:eastAsia="Arial" w:hAnsi="Arial"/>
+                <w:b/>
+                <w:bCs/>
+                <w:color w:val="FFFFFF"/>
+                <w:sz w:val="18"/>
+                <w:szCs w:val="18"/>
+              </w:rPr>
+              <w:t xml:space="preserve">Work Item</w:t>
+            </w:r>
+          </w:p>
+        </w:tc>
+        <w:tc>
+          <w:tcPr>
+            <w:tcW w:type="dxa" w:w="5760"/>
+            <w:tcBorders>
+              <w:top w:val="single" w:color="AAAAAA" w:sz="1"/>
+              <w:left w:val="single" w:color="AAAAAA" w:sz="1"/>
+              <w:bottom w:val="single" w:color="AAAAAA" w:sz="1"/>
+              <w:right w:val="single" w:color="AAAAAA" w:sz="1"/>
+            </w:tcBorders>
+            <w:shd w:fill="1F3864" w:val="clear"/>
+            <w:tcMar>
+              <w:top w:type="dxa" w:w="80"/>
+              <w:left w:type="dxa" w:w="120"/>
+              <w:bottom w:type="dxa" w:w="80"/>
+              <w:right w:type="dxa" w:w="120"/>
+            </w:tcMar>
+            <w:vAlign w:val="center"/>
+          </w:tcPr>
+          <w:p>
+            <w:r>
+              <w:rPr>
+                <w:rFonts w:ascii="Arial" w:cs="Arial" w:eastAsia="Arial" w:hAnsi="Arial"/>
+                <w:b/>
+                <w:bCs/>
+                <w:color w:val="FFFFFF"/>
+                <w:sz w:val="18"/>
+                <w:szCs w:val="18"/>
+              </w:rPr>
+              <w:t xml:space="preserve">Depends On</w:t>
+            </w:r>
+          </w:p>
+        </w:tc>
+      </w:tr>
+      <w:tr>
+        <w:tc>
+          <w:tcPr>
+            <w:tcW w:type="dxa" w:w="800"/>
+            <w:tcBorders>
+              <w:top w:val="single" w:color="AAAAAA" w:sz="1"/>
+              <w:left w:val="single" w:color="AAAAAA" w:sz="1"/>
+              <w:bottom w:val="single" w:color="AAAAAA" w:sz="1"/>
+              <w:right w:val="single" w:color="AAAAAA" w:sz="1"/>
+            </w:tcBorders>
+            <w:tcMar>
+              <w:top w:type="dxa" w:w="80"/>
+              <w:left w:type="dxa" w:w="120"/>
+              <w:bottom w:type="dxa" w:w="80"/>
+              <w:right w:type="dxa" w:w="120"/>
+            </w:tcMar>
+            <w:vAlign w:val="top"/>
+          </w:tcPr>
+          <w:p>
+            <w:r>
+              <w:rPr>
+                <w:rFonts w:ascii="Arial" w:cs="Arial" w:eastAsia="Arial" w:hAnsi="Arial"/>
+                <w:b/>
+                <w:bCs/>
+                <w:color w:val="000000"/>
+                <w:sz w:val="18"/>
+                <w:szCs w:val="18"/>
+              </w:rPr>
+              <w:t xml:space="preserve">1</w:t>
+            </w:r>
+          </w:p>
+        </w:tc>
+        <w:tc>
+          <w:tcPr>
+            <w:tcW w:type="dxa" w:w="2800"/>
+            <w:tcBorders>
+              <w:top w:val="single" w:color="AAAAAA" w:sz="1"/>
+              <w:left w:val="single" w:color="AAAAAA" w:sz="1"/>
+              <w:bottom w:val="single" w:color="AAAAAA" w:sz="1"/>
+              <w:right w:val="single" w:color="AAAAAA" w:sz="1"/>
+            </w:tcBorders>
+            <w:tcMar>
+              <w:top w:type="dxa" w:w="80"/>
+              <w:left w:type="dxa" w:w="120"/>
+              <w:bottom w:type="dxa" w:w="80"/>
+              <w:right w:type="dxa" w:w="120"/>
+            </w:tcMar>
+            <w:vAlign w:val="top"/>
+          </w:tcPr>
+          <w:p>
+            <w:r>
+              <w:rPr>
+                <w:rFonts w:ascii="Arial" w:cs="Arial" w:eastAsia="Arial" w:hAnsi="Arial"/>
+                <w:color w:val="000000"/>
+                <w:sz w:val="18"/>
+                <w:szCs w:val="18"/>
+              </w:rPr>
+              <w:t xml:space="preserve">Master PRD</w:t>
+            </w:r>
+          </w:p>
+        </w:tc>
+        <w:tc>
+          <w:tcPr>
+            <w:tcW w:type="dxa" w:w="5760"/>
+            <w:tcBorders>
+              <w:top w:val="single" w:color="AAAAAA" w:sz="1"/>
+              <w:left w:val="single" w:color="AAAAAA" w:sz="1"/>
+              <w:bottom w:val="single" w:color="AAAAAA" w:sz="1"/>
+              <w:right w:val="single" w:color="AAAAAA" w:sz="1"/>
+            </w:tcBorders>
+            <w:tcMar>
+              <w:top w:type="dxa" w:w="80"/>
+              <w:left w:type="dxa" w:w="120"/>
+              <w:bottom w:type="dxa" w:w="80"/>
+              <w:right w:type="dxa" w:w="120"/>
+            </w:tcMar>
+            <w:vAlign w:val="top"/>
+          </w:tcPr>
+          <w:p>
+            <w:r>
+              <w:rPr>
+                <w:rFonts w:ascii="Arial" w:cs="Arial" w:eastAsia="Arial" w:hAnsi="Arial"/>
+                <w:color w:val="000000"/>
+                <w:sz w:val="18"/>
+                <w:szCs w:val="18"/>
+              </w:rPr>
+              <w:t xml:space="preserve">(none — immediately ready)</w:t>
+            </w:r>
+          </w:p>
+        </w:tc>
+      </w:tr>
+      <w:tr>
+        <w:tc>
+          <w:tcPr>
+            <w:tcW w:type="dxa" w:w="800"/>
+            <w:tcBorders>
+              <w:top w:val="single" w:color="AAAAAA" w:sz="1"/>
+              <w:left w:val="single" w:color="AAAAAA" w:sz="1"/>
+              <w:bottom w:val="single" w:color="AAAAAA" w:sz="1"/>
+              <w:right w:val="single" w:color="AAAAAA" w:sz="1"/>
+            </w:tcBorders>
+            <w:shd w:fill="F2F7FB" w:val="clear"/>
+            <w:tcMar>
+              <w:top w:type="dxa" w:w="80"/>
+              <w:left w:type="dxa" w:w="120"/>
+              <w:bottom w:type="dxa" w:w="80"/>
+              <w:right w:type="dxa" w:w="120"/>
+            </w:tcMar>
+            <w:vAlign w:val="top"/>
+          </w:tcPr>
+          <w:p>
+            <w:r>
+              <w:rPr>
+                <w:rFonts w:ascii="Arial" w:cs="Arial" w:eastAsia="Arial" w:hAnsi="Arial"/>
+                <w:b/>
+                <w:bCs/>
+                <w:color w:val="000000"/>
+                <w:sz w:val="18"/>
+                <w:szCs w:val="18"/>
+              </w:rPr>
+              <w:t xml:space="preserve">2</w:t>
+            </w:r>
+          </w:p>
+        </w:tc>
+        <w:tc>
+          <w:tcPr>
+            <w:tcW w:type="dxa" w:w="2800"/>
+            <w:tcBorders>
+              <w:top w:val="single" w:color="AAAAAA" w:sz="1"/>
+              <w:left w:val="single" w:color="AAAAAA" w:sz="1"/>
+              <w:bottom w:val="single" w:color="AAAAAA" w:sz="1"/>
+              <w:right w:val="single" w:color="AAAAAA" w:sz="1"/>
+            </w:tcBorders>
+            <w:shd w:fill="F2F7FB" w:val="clear"/>
+            <w:tcMar>
+              <w:top w:type="dxa" w:w="80"/>
+              <w:left w:type="dxa" w:w="120"/>
+              <w:bottom w:type="dxa" w:w="80"/>
+              <w:right w:type="dxa" w:w="120"/>
+            </w:tcMar>
+            <w:vAlign w:val="top"/>
+          </w:tcPr>
+          <w:p>
+            <w:r>
+              <w:rPr>
+                <w:rFonts w:ascii="Arial" w:cs="Arial" w:eastAsia="Arial" w:hAnsi="Arial"/>
+                <w:color w:val="000000"/>
+                <w:sz w:val="18"/>
+                <w:szCs w:val="18"/>
+              </w:rPr>
+              <w:t xml:space="preserve">Business Object Discovery</w:t>
+            </w:r>
+          </w:p>
+        </w:tc>
+        <w:tc>
+          <w:tcPr>
+            <w:tcW w:type="dxa" w:w="5760"/>
+            <w:tcBorders>
+              <w:top w:val="single" w:color="AAAAAA" w:sz="1"/>
+              <w:left w:val="single" w:color="AAAAAA" w:sz="1"/>
+              <w:bottom w:val="single" w:color="AAAAAA" w:sz="1"/>
+              <w:right w:val="single" w:color="AAAAAA" w:sz="1"/>
+            </w:tcBorders>
+            <w:shd w:fill="F2F7FB" w:val="clear"/>
+            <w:tcMar>
+              <w:top w:type="dxa" w:w="80"/>
+              <w:left w:type="dxa" w:w="120"/>
+              <w:bottom w:type="dxa" w:w="80"/>
+              <w:right w:type="dxa" w:w="120"/>
+            </w:tcMar>
+            <w:vAlign w:val="top"/>
+          </w:tcPr>
+          <w:p>
+            <w:r>
+              <w:rPr>
+                <w:rFonts w:ascii="Arial" w:cs="Arial" w:eastAsia="Arial" w:hAnsi="Arial"/>
+                <w:color w:val="000000"/>
+                <w:sz w:val="18"/>
+                <w:szCs w:val="18"/>
+              </w:rPr>
+              <w:t xml:space="preserve">Master PRD</w:t>
+            </w:r>
+          </w:p>
+        </w:tc>
+      </w:tr>
+      <w:tr>
+        <w:tc>
+          <w:tcPr>
+            <w:tcW w:type="dxa" w:w="800"/>
+            <w:tcBorders>
+              <w:top w:val="single" w:color="AAAAAA" w:sz="1"/>
+              <w:left w:val="single" w:color="AAAAAA" w:sz="1"/>
+              <w:bottom w:val="single" w:color="AAAAAA" w:sz="1"/>
+              <w:right w:val="single" w:color="AAAAAA" w:sz="1"/>
+            </w:tcBorders>
+            <w:tcMar>
+              <w:top w:type="dxa" w:w="80"/>
+              <w:left w:type="dxa" w:w="120"/>
+              <w:bottom w:type="dxa" w:w="80"/>
+              <w:right w:type="dxa" w:w="120"/>
+            </w:tcMar>
+            <w:vAlign w:val="top"/>
+          </w:tcPr>
+          <w:p>
+            <w:r>
+              <w:rPr>
+                <w:rFonts w:ascii="Arial" w:cs="Arial" w:eastAsia="Arial" w:hAnsi="Arial"/>
+                <w:b/>
+                <w:bCs/>
+                <w:color w:val="000000"/>
+                <w:sz w:val="18"/>
+                <w:szCs w:val="18"/>
+              </w:rPr>
+              <w:t xml:space="preserve">3</w:t>
+            </w:r>
+          </w:p>
+        </w:tc>
+        <w:tc>
+          <w:tcPr>
+            <w:tcW w:type="dxa" w:w="2800"/>
+            <w:tcBorders>
+              <w:top w:val="single" w:color="AAAAAA" w:sz="1"/>
+              <w:left w:val="single" w:color="AAAAAA" w:sz="1"/>
+              <w:bottom w:val="single" w:color="AAAAAA" w:sz="1"/>
+              <w:right w:val="single" w:color="AAAAAA" w:sz="1"/>
+            </w:tcBorders>
+            <w:tcMar>
+              <w:top w:type="dxa" w:w="80"/>
+              <w:left w:type="dxa" w:w="120"/>
+              <w:bottom w:type="dxa" w:w="80"/>
+              <w:right w:type="dxa" w:w="120"/>
+            </w:tcMar>
+            <w:vAlign w:val="top"/>
+          </w:tcPr>
+          <w:p>
+            <w:r>
+              <w:rPr>
+                <w:rFonts w:ascii="Arial" w:cs="Arial" w:eastAsia="Arial" w:hAnsi="Arial"/>
+                <w:color w:val="000000"/>
+                <w:sz w:val="18"/>
+                <w:szCs w:val="18"/>
+              </w:rPr>
+              <w:t xml:space="preserve">Each Entity PRD</w:t>
+            </w:r>
+          </w:p>
+        </w:tc>
+        <w:tc>
+          <w:tcPr>
+            <w:tcW w:type="dxa" w:w="5760"/>
+            <w:tcBorders>
+              <w:top w:val="single" w:color="AAAAAA" w:sz="1"/>
+              <w:left w:val="single" w:color="AAAAAA" w:sz="1"/>
+              <w:bottom w:val="single" w:color="AAAAAA" w:sz="1"/>
+              <w:right w:val="single" w:color="AAAAAA" w:sz="1"/>
+            </w:tcBorders>
+            <w:tcMar>
+              <w:top w:type="dxa" w:w="80"/>
+              <w:left w:type="dxa" w:w="120"/>
+              <w:bottom w:type="dxa" w:w="80"/>
+              <w:right w:type="dxa" w:w="120"/>
+            </w:tcMar>
+            <w:vAlign w:val="top"/>
+          </w:tcPr>
+          <w:p>
+            <w:r>
+              <w:rPr>
+                <w:rFonts w:ascii="Arial" w:cs="Arial" w:eastAsia="Arial" w:hAnsi="Arial"/>
+                <w:color w:val="000000"/>
+                <w:sz w:val="18"/>
+                <w:szCs w:val="18"/>
+              </w:rPr>
+              <w:t xml:space="preserve">Business Object Discovery</w:t>
+            </w:r>
+          </w:p>
+        </w:tc>
+      </w:tr>
+      <w:tr>
+        <w:tc>
+          <w:tcPr>
+            <w:tcW w:type="dxa" w:w="800"/>
+            <w:tcBorders>
+              <w:top w:val="single" w:color="AAAAAA" w:sz="1"/>
+              <w:left w:val="single" w:color="AAAAAA" w:sz="1"/>
+              <w:bottom w:val="single" w:color="AAAAAA" w:sz="1"/>
+              <w:right w:val="single" w:color="AAAAAA" w:sz="1"/>
+            </w:tcBorders>
+            <w:shd w:fill="F2F7FB" w:val="clear"/>
+            <w:tcMar>
+              <w:top w:type="dxa" w:w="80"/>
+              <w:left w:type="dxa" w:w="120"/>
+              <w:bottom w:type="dxa" w:w="80"/>
+              <w:right w:type="dxa" w:w="120"/>
+            </w:tcMar>
+            <w:vAlign w:val="top"/>
+          </w:tcPr>
+          <w:p>
+            <w:r>
+              <w:rPr>
+                <w:rFonts w:ascii="Arial" w:cs="Arial" w:eastAsia="Arial" w:hAnsi="Arial"/>
+                <w:b/>
+                <w:bCs/>
+                <w:color w:val="000000"/>
+                <w:sz w:val="18"/>
+                <w:szCs w:val="18"/>
+              </w:rPr>
+              <w:t xml:space="preserve">4a</w:t>
+            </w:r>
+          </w:p>
+        </w:tc>
+        <w:tc>
+          <w:tcPr>
+            <w:tcW w:type="dxa" w:w="2800"/>
+            <w:tcBorders>
+              <w:top w:val="single" w:color="AAAAAA" w:sz="1"/>
+              <w:left w:val="single" w:color="AAAAAA" w:sz="1"/>
+              <w:bottom w:val="single" w:color="AAAAAA" w:sz="1"/>
+              <w:right w:val="single" w:color="AAAAAA" w:sz="1"/>
+            </w:tcBorders>
+            <w:shd w:fill="F2F7FB" w:val="clear"/>
+            <w:tcMar>
+              <w:top w:type="dxa" w:w="80"/>
+              <w:left w:type="dxa" w:w="120"/>
+              <w:bottom w:type="dxa" w:w="80"/>
+              <w:right w:type="dxa" w:w="120"/>
+            </w:tcMar>
+            <w:vAlign w:val="top"/>
+          </w:tcPr>
+          <w:p>
+            <w:r>
+              <w:rPr>
+                <w:rFonts w:ascii="Arial" w:cs="Arial" w:eastAsia="Arial" w:hAnsi="Arial"/>
+                <w:color w:val="000000"/>
+                <w:sz w:val="18"/>
+                <w:szCs w:val="18"/>
+              </w:rPr>
+              <w:t xml:space="preserve">Each Domain Overview</w:t>
+            </w:r>
+          </w:p>
+        </w:tc>
+        <w:tc>
+          <w:tcPr>
+            <w:tcW w:type="dxa" w:w="5760"/>
+            <w:tcBorders>
+              <w:top w:val="single" w:color="AAAAAA" w:sz="1"/>
+              <w:left w:val="single" w:color="AAAAAA" w:sz="1"/>
+              <w:bottom w:val="single" w:color="AAAAAA" w:sz="1"/>
+              <w:right w:val="single" w:color="AAAAAA" w:sz="1"/>
+            </w:tcBorders>
+            <w:shd w:fill="F2F7FB" w:val="clear"/>
+            <w:tcMar>
+              <w:top w:type="dxa" w:w="80"/>
+              <w:left w:type="dxa" w:w="120"/>
+              <w:bottom w:type="dxa" w:w="80"/>
+              <w:right w:type="dxa" w:w="120"/>
+            </w:tcMar>
+            <w:vAlign w:val="top"/>
+          </w:tcPr>
+          <w:p>
+            <w:r>
+              <w:rPr>
+                <w:rFonts w:ascii="Arial" w:cs="Arial" w:eastAsia="Arial" w:hAnsi="Arial"/>
+                <w:color w:val="000000"/>
+                <w:sz w:val="18"/>
+                <w:szCs w:val="18"/>
+              </w:rPr>
+              <w:t xml:space="preserve">Business Object Discovery</w:t>
+            </w:r>
+          </w:p>
+        </w:tc>
+      </w:tr>
+      <w:tr>
+        <w:tc>
+          <w:tcPr>
+            <w:tcW w:type="dxa" w:w="800"/>
+            <w:tcBorders>
+              <w:top w:val="single" w:color="AAAAAA" w:sz="1"/>
+              <w:left w:val="single" w:color="AAAAAA" w:sz="1"/>
+              <w:bottom w:val="single" w:color="AAAAAA" w:sz="1"/>
+              <w:right w:val="single" w:color="AAAAAA" w:sz="1"/>
+            </w:tcBorders>
+            <w:tcMar>
+              <w:top w:type="dxa" w:w="80"/>
+              <w:left w:type="dxa" w:w="120"/>
+              <w:bottom w:type="dxa" w:w="80"/>
+              <w:right w:type="dxa" w:w="120"/>
+            </w:tcMar>
+            <w:vAlign w:val="top"/>
+          </w:tcPr>
+          <w:p>
+            <w:r>
+              <w:rPr>
+                <w:rFonts w:ascii="Arial" w:cs="Arial" w:eastAsia="Arial" w:hAnsi="Arial"/>
+                <w:b/>
+                <w:bCs/>
+                <w:color w:val="000000"/>
+                <w:sz w:val="18"/>
+                <w:szCs w:val="18"/>
+              </w:rPr>
+              <w:t xml:space="preserve">4b</w:t>
+            </w:r>
+          </w:p>
+        </w:tc>
+        <w:tc>
+          <w:tcPr>
+            <w:tcW w:type="dxa" w:w="2800"/>
+            <w:tcBorders>
+              <w:top w:val="single" w:color="AAAAAA" w:sz="1"/>
+              <w:left w:val="single" w:color="AAAAAA" w:sz="1"/>
+              <w:bottom w:val="single" w:color="AAAAAA" w:sz="1"/>
+              <w:right w:val="single" w:color="AAAAAA" w:sz="1"/>
+            </w:tcBorders>
+            <w:tcMar>
+              <w:top w:type="dxa" w:w="80"/>
+              <w:left w:type="dxa" w:w="120"/>
+              <w:bottom w:type="dxa" w:w="80"/>
+              <w:right w:type="dxa" w:w="120"/>
+            </w:tcMar>
+            <w:vAlign w:val="top"/>
+          </w:tcPr>
+          <w:p>
+            <w:r>
+              <w:rPr>
+                <w:rFonts w:ascii="Arial" w:cs="Arial" w:eastAsia="Arial" w:hAnsi="Arial"/>
+                <w:color w:val="000000"/>
+                <w:sz w:val="18"/>
+                <w:szCs w:val="18"/>
+              </w:rPr>
+              <w:t xml:space="preserve">Each Domain Overview</w:t>
+            </w:r>
+          </w:p>
+        </w:tc>
+        <w:tc>
+          <w:tcPr>
+            <w:tcW w:type="dxa" w:w="5760"/>
+            <w:tcBorders>
+              <w:top w:val="single" w:color="AAAAAA" w:sz="1"/>
+              <w:left w:val="single" w:color="AAAAAA" w:sz="1"/>
+              <w:bottom w:val="single" w:color="AAAAAA" w:sz="1"/>
+              <w:right w:val="single" w:color="AAAAAA" w:sz="1"/>
+            </w:tcBorders>
+            <w:tcMar>
+              <w:top w:type="dxa" w:w="80"/>
+              <w:left w:type="dxa" w:w="120"/>
+              <w:bottom w:type="dxa" w:w="80"/>
+              <w:right w:type="dxa" w:w="120"/>
+            </w:tcMar>
+            <w:vAlign w:val="top"/>
+          </w:tcPr>
+          <w:p>
+            <w:r>
+              <w:rPr>
+                <w:rFonts w:ascii="Arial" w:cs="Arial" w:eastAsia="Arial" w:hAnsi="Arial"/>
+                <w:color w:val="000000"/>
+                <w:sz w:val="18"/>
+                <w:szCs w:val="18"/>
+              </w:rPr>
+              <w:t xml:space="preserve">The entity_prd work items for entities that participate in that domain (from Entity Inventory data)</w:t>
+            </w:r>
+          </w:p>
+        </w:tc>
+      </w:tr>
+      <w:tr>
+        <w:tc>
+          <w:tcPr>
+            <w:tcW w:type="dxa" w:w="800"/>
+            <w:tcBorders>
+              <w:top w:val="single" w:color="AAAAAA" w:sz="1"/>
+              <w:left w:val="single" w:color="AAAAAA" w:sz="1"/>
+              <w:bottom w:val="single" w:color="AAAAAA" w:sz="1"/>
+              <w:right w:val="single" w:color="AAAAAA" w:sz="1"/>
+            </w:tcBorders>
+            <w:shd w:fill="F2F7FB" w:val="clear"/>
+            <w:tcMar>
+              <w:top w:type="dxa" w:w="80"/>
+              <w:left w:type="dxa" w:w="120"/>
+              <w:bottom w:type="dxa" w:w="80"/>
+              <w:right w:type="dxa" w:w="120"/>
+            </w:tcMar>
+            <w:vAlign w:val="top"/>
+          </w:tcPr>
+          <w:p>
+            <w:r>
+              <w:rPr>
+                <w:rFonts w:ascii="Arial" w:cs="Arial" w:eastAsia="Arial" w:hAnsi="Arial"/>
+                <w:b/>
+                <w:bCs/>
+                <w:color w:val="000000"/>
+                <w:sz w:val="18"/>
+                <w:szCs w:val="18"/>
+              </w:rPr>
+              <w:t xml:space="preserve">4c</w:t>
+            </w:r>
+          </w:p>
+        </w:tc>
+        <w:tc>
+          <w:tcPr>
+            <w:tcW w:type="dxa" w:w="2800"/>
+            <w:tcBorders>
+              <w:top w:val="single" w:color="AAAAAA" w:sz="1"/>
+              <w:left w:val="single" w:color="AAAAAA" w:sz="1"/>
+              <w:bottom w:val="single" w:color="AAAAAA" w:sz="1"/>
+              <w:right w:val="single" w:color="AAAAAA" w:sz="1"/>
+            </w:tcBorders>
+            <w:shd w:fill="F2F7FB" w:val="clear"/>
+            <w:tcMar>
+              <w:top w:type="dxa" w:w="80"/>
+              <w:left w:type="dxa" w:w="120"/>
+              <w:bottom w:type="dxa" w:w="80"/>
+              <w:right w:type="dxa" w:w="120"/>
+            </w:tcMar>
+            <w:vAlign w:val="top"/>
+          </w:tcPr>
+          <w:p>
+            <w:r>
+              <w:rPr>
+                <w:rFonts w:ascii="Arial" w:cs="Arial" w:eastAsia="Arial" w:hAnsi="Arial"/>
+                <w:color w:val="000000"/>
+                <w:sz w:val="18"/>
+                <w:szCs w:val="18"/>
+              </w:rPr>
+              <w:t xml:space="preserve">Each Domain Overview</w:t>
+            </w:r>
+          </w:p>
+        </w:tc>
+        <w:tc>
+          <w:tcPr>
+            <w:tcW w:type="dxa" w:w="5760"/>
+            <w:tcBorders>
+              <w:top w:val="single" w:color="AAAAAA" w:sz="1"/>
+              <w:left w:val="single" w:color="AAAAAA" w:sz="1"/>
+              <w:bottom w:val="single" w:color="AAAAAA" w:sz="1"/>
+              <w:right w:val="single" w:color="AAAAAA" w:sz="1"/>
+            </w:tcBorders>
+            <w:shd w:fill="F2F7FB" w:val="clear"/>
+            <w:tcMar>
+              <w:top w:type="dxa" w:w="80"/>
+              <w:left w:type="dxa" w:w="120"/>
+              <w:bottom w:type="dxa" w:w="80"/>
+              <w:right w:type="dxa" w:w="120"/>
+            </w:tcMar>
+            <w:vAlign w:val="top"/>
+          </w:tcPr>
+          <w:p>
+            <w:r>
+              <w:rPr>
+                <w:rFonts w:ascii="Arial" w:cs="Arial" w:eastAsia="Arial" w:hAnsi="Arial"/>
+                <w:color w:val="000000"/>
+                <w:sz w:val="18"/>
+                <w:szCs w:val="18"/>
+              </w:rPr>
+              <w:t xml:space="preserve">(Optional) Another domain’s domain_reconciliation, if cross-domain ordering is required</w:t>
+            </w:r>
+          </w:p>
+        </w:tc>
+      </w:tr>
+      <w:tr>
+        <w:tc>
+          <w:tcPr>
+            <w:tcW w:type="dxa" w:w="800"/>
+            <w:tcBorders>
+              <w:top w:val="single" w:color="AAAAAA" w:sz="1"/>
+              <w:left w:val="single" w:color="AAAAAA" w:sz="1"/>
+              <w:bottom w:val="single" w:color="AAAAAA" w:sz="1"/>
+              <w:right w:val="single" w:color="AAAAAA" w:sz="1"/>
+            </w:tcBorders>
+            <w:tcMar>
+              <w:top w:type="dxa" w:w="80"/>
+              <w:left w:type="dxa" w:w="120"/>
+              <w:bottom w:type="dxa" w:w="80"/>
+              <w:right w:type="dxa" w:w="120"/>
+            </w:tcMar>
+            <w:vAlign w:val="top"/>
+          </w:tcPr>
+          <w:p>
+            <w:r>
+              <w:rPr>
+                <w:rFonts w:ascii="Arial" w:cs="Arial" w:eastAsia="Arial" w:hAnsi="Arial"/>
+                <w:b/>
+                <w:bCs/>
+                <w:color w:val="000000"/>
+                <w:sz w:val="18"/>
+                <w:szCs w:val="18"/>
+              </w:rPr>
+              <w:t xml:space="preserve">5a</w:t>
+            </w:r>
+          </w:p>
+        </w:tc>
+        <w:tc>
+          <w:tcPr>
+            <w:tcW w:type="dxa" w:w="2800"/>
+            <w:tcBorders>
+              <w:top w:val="single" w:color="AAAAAA" w:sz="1"/>
+              <w:left w:val="single" w:color="AAAAAA" w:sz="1"/>
+              <w:bottom w:val="single" w:color="AAAAAA" w:sz="1"/>
+              <w:right w:val="single" w:color="AAAAAA" w:sz="1"/>
+            </w:tcBorders>
+            <w:tcMar>
+              <w:top w:type="dxa" w:w="80"/>
+              <w:left w:type="dxa" w:w="120"/>
+              <w:bottom w:type="dxa" w:w="80"/>
+              <w:right w:type="dxa" w:w="120"/>
+            </w:tcMar>
+            <w:vAlign w:val="top"/>
+          </w:tcPr>
+          <w:p>
+            <w:r>
+              <w:rPr>
+                <w:rFonts w:ascii="Arial" w:cs="Arial" w:eastAsia="Arial" w:hAnsi="Arial"/>
+                <w:color w:val="000000"/>
+                <w:sz w:val="18"/>
+                <w:szCs w:val="18"/>
+              </w:rPr>
+              <w:t xml:space="preserve">Each Process Definition</w:t>
+            </w:r>
+          </w:p>
+        </w:tc>
+        <w:tc>
+          <w:tcPr>
+            <w:tcW w:type="dxa" w:w="5760"/>
+            <w:tcBorders>
+              <w:top w:val="single" w:color="AAAAAA" w:sz="1"/>
+              <w:left w:val="single" w:color="AAAAAA" w:sz="1"/>
+              <w:bottom w:val="single" w:color="AAAAAA" w:sz="1"/>
+              <w:right w:val="single" w:color="AAAAAA" w:sz="1"/>
+            </w:tcBorders>
+            <w:tcMar>
+              <w:top w:type="dxa" w:w="80"/>
+              <w:left w:type="dxa" w:w="120"/>
+              <w:bottom w:type="dxa" w:w="80"/>
+              <w:right w:type="dxa" w:w="120"/>
+            </w:tcMar>
+            <w:vAlign w:val="top"/>
+          </w:tcPr>
+          <w:p>
+            <w:r>
+              <w:rPr>
+                <w:rFonts w:ascii="Arial" w:cs="Arial" w:eastAsia="Arial" w:hAnsi="Arial"/>
+                <w:color w:val="000000"/>
+                <w:sz w:val="18"/>
+                <w:szCs w:val="18"/>
+              </w:rPr>
+              <w:t xml:space="preserve">The domain_overview for its domain</w:t>
+            </w:r>
+          </w:p>
+        </w:tc>
+      </w:tr>
+      <w:tr>
+        <w:tc>
+          <w:tcPr>
+            <w:tcW w:type="dxa" w:w="800"/>
+            <w:tcBorders>
+              <w:top w:val="single" w:color="AAAAAA" w:sz="1"/>
+              <w:left w:val="single" w:color="AAAAAA" w:sz="1"/>
+              <w:bottom w:val="single" w:color="AAAAAA" w:sz="1"/>
+              <w:right w:val="single" w:color="AAAAAA" w:sz="1"/>
+            </w:tcBorders>
+            <w:shd w:fill="F2F7FB" w:val="clear"/>
+            <w:tcMar>
+              <w:top w:type="dxa" w:w="80"/>
+              <w:left w:type="dxa" w:w="120"/>
+              <w:bottom w:type="dxa" w:w="80"/>
+              <w:right w:type="dxa" w:w="120"/>
+            </w:tcMar>
+            <w:vAlign w:val="top"/>
+          </w:tcPr>
+          <w:p>
+            <w:r>
+              <w:rPr>
+                <w:rFonts w:ascii="Arial" w:cs="Arial" w:eastAsia="Arial" w:hAnsi="Arial"/>
+                <w:b/>
+                <w:bCs/>
+                <w:color w:val="000000"/>
+                <w:sz w:val="18"/>
+                <w:szCs w:val="18"/>
+              </w:rPr>
+              <w:t xml:space="preserve">5b</w:t>
+            </w:r>
+          </w:p>
+        </w:tc>
+        <w:tc>
+          <w:tcPr>
+            <w:tcW w:type="dxa" w:w="2800"/>
+            <w:tcBorders>
+              <w:top w:val="single" w:color="AAAAAA" w:sz="1"/>
+              <w:left w:val="single" w:color="AAAAAA" w:sz="1"/>
+              <w:bottom w:val="single" w:color="AAAAAA" w:sz="1"/>
+              <w:right w:val="single" w:color="AAAAAA" w:sz="1"/>
+            </w:tcBorders>
+            <w:shd w:fill="F2F7FB" w:val="clear"/>
+            <w:tcMar>
+              <w:top w:type="dxa" w:w="80"/>
+              <w:left w:type="dxa" w:w="120"/>
+              <w:bottom w:type="dxa" w:w="80"/>
+              <w:right w:type="dxa" w:w="120"/>
+            </w:tcMar>
+            <w:vAlign w:val="top"/>
+          </w:tcPr>
+          <w:p>
+            <w:r>
+              <w:rPr>
+                <w:rFonts w:ascii="Arial" w:cs="Arial" w:eastAsia="Arial" w:hAnsi="Arial"/>
+                <w:color w:val="000000"/>
+                <w:sz w:val="18"/>
+                <w:szCs w:val="18"/>
+              </w:rPr>
+              <w:t xml:space="preserve">Each Process Definition</w:t>
+            </w:r>
+          </w:p>
+        </w:tc>
+        <w:tc>
+          <w:tcPr>
+            <w:tcW w:type="dxa" w:w="5760"/>
+            <w:tcBorders>
+              <w:top w:val="single" w:color="AAAAAA" w:sz="1"/>
+              <w:left w:val="single" w:color="AAAAAA" w:sz="1"/>
+              <w:bottom w:val="single" w:color="AAAAAA" w:sz="1"/>
+              <w:right w:val="single" w:color="AAAAAA" w:sz="1"/>
+            </w:tcBorders>
+            <w:shd w:fill="F2F7FB" w:val="clear"/>
+            <w:tcMar>
+              <w:top w:type="dxa" w:w="80"/>
+              <w:left w:type="dxa" w:w="120"/>
+              <w:bottom w:type="dxa" w:w="80"/>
+              <w:right w:type="dxa" w:w="120"/>
+            </w:tcMar>
+            <w:vAlign w:val="top"/>
+          </w:tcPr>
+          <w:p>
+            <w:r>
+              <w:rPr>
+                <w:rFonts w:ascii="Arial" w:cs="Arial" w:eastAsia="Arial" w:hAnsi="Arial"/>
+                <w:color w:val="000000"/>
+                <w:sz w:val="18"/>
+                <w:szCs w:val="18"/>
+              </w:rPr>
+              <w:t xml:space="preserve">The prior process_definition in the same domain by sort_order, if any</w:t>
+            </w:r>
+          </w:p>
+        </w:tc>
+      </w:tr>
+      <w:tr>
+        <w:tc>
+          <w:tcPr>
+            <w:tcW w:type="dxa" w:w="800"/>
+            <w:tcBorders>
+              <w:top w:val="single" w:color="AAAAAA" w:sz="1"/>
+              <w:left w:val="single" w:color="AAAAAA" w:sz="1"/>
+              <w:bottom w:val="single" w:color="AAAAAA" w:sz="1"/>
+              <w:right w:val="single" w:color="AAAAAA" w:sz="1"/>
+            </w:tcBorders>
+            <w:tcMar>
+              <w:top w:type="dxa" w:w="80"/>
+              <w:left w:type="dxa" w:w="120"/>
+              <w:bottom w:type="dxa" w:w="80"/>
+              <w:right w:type="dxa" w:w="120"/>
+            </w:tcMar>
+            <w:vAlign w:val="top"/>
+          </w:tcPr>
+          <w:p>
+            <w:r>
+              <w:rPr>
+                <w:rFonts w:ascii="Arial" w:cs="Arial" w:eastAsia="Arial" w:hAnsi="Arial"/>
+                <w:b/>
+                <w:bCs/>
+                <w:color w:val="000000"/>
+                <w:sz w:val="18"/>
+                <w:szCs w:val="18"/>
+              </w:rPr>
+              <w:t xml:space="preserve">6</w:t>
+            </w:r>
+          </w:p>
+        </w:tc>
+        <w:tc>
+          <w:tcPr>
+            <w:tcW w:type="dxa" w:w="2800"/>
+            <w:tcBorders>
+              <w:top w:val="single" w:color="AAAAAA" w:sz="1"/>
+              <w:left w:val="single" w:color="AAAAAA" w:sz="1"/>
+              <w:bottom w:val="single" w:color="AAAAAA" w:sz="1"/>
+              <w:right w:val="single" w:color="AAAAAA" w:sz="1"/>
+            </w:tcBorders>
+            <w:tcMar>
+              <w:top w:type="dxa" w:w="80"/>
+              <w:left w:type="dxa" w:w="120"/>
+              <w:bottom w:type="dxa" w:w="80"/>
+              <w:right w:type="dxa" w:w="120"/>
+            </w:tcMar>
+            <w:vAlign w:val="top"/>
+          </w:tcPr>
+          <w:p>
+            <w:r>
+              <w:rPr>
+                <w:rFonts w:ascii="Arial" w:cs="Arial" w:eastAsia="Arial" w:hAnsi="Arial"/>
+                <w:color w:val="000000"/>
+                <w:sz w:val="18"/>
+                <w:szCs w:val="18"/>
+              </w:rPr>
+              <w:t xml:space="preserve">Each Domain Reconciliation</w:t>
+            </w:r>
+          </w:p>
+        </w:tc>
+        <w:tc>
+          <w:tcPr>
+            <w:tcW w:type="dxa" w:w="5760"/>
+            <w:tcBorders>
+              <w:top w:val="single" w:color="AAAAAA" w:sz="1"/>
+              <w:left w:val="single" w:color="AAAAAA" w:sz="1"/>
+              <w:bottom w:val="single" w:color="AAAAAA" w:sz="1"/>
+              <w:right w:val="single" w:color="AAAAAA" w:sz="1"/>
+            </w:tcBorders>
+            <w:tcMar>
+              <w:top w:type="dxa" w:w="80"/>
+              <w:left w:type="dxa" w:w="120"/>
+              <w:bottom w:type="dxa" w:w="80"/>
+              <w:right w:type="dxa" w:w="120"/>
+            </w:tcMar>
+            <w:vAlign w:val="top"/>
+          </w:tcPr>
+          <w:p>
+            <w:r>
+              <w:rPr>
+                <w:rFonts w:ascii="Arial" w:cs="Arial" w:eastAsia="Arial" w:hAnsi="Arial"/>
+                <w:color w:val="000000"/>
+                <w:sz w:val="18"/>
+                <w:szCs w:val="18"/>
+              </w:rPr>
+              <w:t xml:space="preserve">All process_definitions in that domain</w:t>
+            </w:r>
+          </w:p>
+        </w:tc>
+      </w:tr>
+      <w:tr>
+        <w:tc>
+          <w:tcPr>
+            <w:tcW w:type="dxa" w:w="800"/>
+            <w:tcBorders>
+              <w:top w:val="single" w:color="AAAAAA" w:sz="1"/>
+              <w:left w:val="single" w:color="AAAAAA" w:sz="1"/>
+              <w:bottom w:val="single" w:color="AAAAAA" w:sz="1"/>
+              <w:right w:val="single" w:color="AAAAAA" w:sz="1"/>
+            </w:tcBorders>
+            <w:shd w:fill="F2F7FB" w:val="clear"/>
+            <w:tcMar>
+              <w:top w:type="dxa" w:w="80"/>
+              <w:left w:type="dxa" w:w="120"/>
+              <w:bottom w:type="dxa" w:w="80"/>
+              <w:right w:type="dxa" w:w="120"/>
+            </w:tcMar>
+            <w:vAlign w:val="top"/>
+          </w:tcPr>
+          <w:p>
+            <w:r>
+              <w:rPr>
+                <w:rFonts w:ascii="Arial" w:cs="Arial" w:eastAsia="Arial" w:hAnsi="Arial"/>
+                <w:b/>
+                <w:bCs/>
+                <w:color w:val="000000"/>
+                <w:sz w:val="18"/>
+                <w:szCs w:val="18"/>
+              </w:rPr>
+              <w:t xml:space="preserve">7</w:t>
+            </w:r>
+          </w:p>
+        </w:tc>
+        <w:tc>
+          <w:tcPr>
+            <w:tcW w:type="dxa" w:w="2800"/>
+            <w:tcBorders>
+              <w:top w:val="single" w:color="AAAAAA" w:sz="1"/>
+              <w:left w:val="single" w:color="AAAAAA" w:sz="1"/>
+              <w:bottom w:val="single" w:color="AAAAAA" w:sz="1"/>
+              <w:right w:val="single" w:color="AAAAAA" w:sz="1"/>
+            </w:tcBorders>
+            <w:shd w:fill="F2F7FB" w:val="clear"/>
+            <w:tcMar>
+              <w:top w:type="dxa" w:w="80"/>
+              <w:left w:type="dxa" w:w="120"/>
+              <w:bottom w:type="dxa" w:w="80"/>
+              <w:right w:type="dxa" w:w="120"/>
+            </w:tcMar>
+            <w:vAlign w:val="top"/>
+          </w:tcPr>
+          <w:p>
+            <w:r>
+              <w:rPr>
+                <w:rFonts w:ascii="Arial" w:cs="Arial" w:eastAsia="Arial" w:hAnsi="Arial"/>
+                <w:color w:val="000000"/>
+                <w:sz w:val="18"/>
+                <w:szCs w:val="18"/>
+              </w:rPr>
+              <w:t xml:space="preserve">Each Stakeholder Review</w:t>
+            </w:r>
+          </w:p>
+        </w:tc>
+        <w:tc>
+          <w:tcPr>
+            <w:tcW w:type="dxa" w:w="5760"/>
+            <w:tcBorders>
+              <w:top w:val="single" w:color="AAAAAA" w:sz="1"/>
+              <w:left w:val="single" w:color="AAAAAA" w:sz="1"/>
+              <w:bottom w:val="single" w:color="AAAAAA" w:sz="1"/>
+              <w:right w:val="single" w:color="AAAAAA" w:sz="1"/>
+            </w:tcBorders>
+            <w:shd w:fill="F2F7FB" w:val="clear"/>
+            <w:tcMar>
+              <w:top w:type="dxa" w:w="80"/>
+              <w:left w:type="dxa" w:w="120"/>
+              <w:bottom w:type="dxa" w:w="80"/>
+              <w:right w:type="dxa" w:w="120"/>
+            </w:tcMar>
+            <w:vAlign w:val="top"/>
+          </w:tcPr>
+          <w:p>
+            <w:r>
+              <w:rPr>
+                <w:rFonts w:ascii="Arial" w:cs="Arial" w:eastAsia="Arial" w:hAnsi="Arial"/>
+                <w:color w:val="000000"/>
+                <w:sz w:val="18"/>
+                <w:szCs w:val="18"/>
+              </w:rPr>
+              <w:t xml:space="preserve">The domain_reconciliation for that domain</w:t>
+            </w:r>
+          </w:p>
+        </w:tc>
+      </w:tr>
+      <w:tr>
+        <w:tc>
+          <w:tcPr>
+            <w:tcW w:type="dxa" w:w="800"/>
+            <w:tcBorders>
+              <w:top w:val="single" w:color="AAAAAA" w:sz="1"/>
+              <w:left w:val="single" w:color="AAAAAA" w:sz="1"/>
+              <w:bottom w:val="single" w:color="AAAAAA" w:sz="1"/>
+              <w:right w:val="single" w:color="AAAAAA" w:sz="1"/>
+            </w:tcBorders>
+            <w:tcMar>
+              <w:top w:type="dxa" w:w="80"/>
+              <w:left w:type="dxa" w:w="120"/>
+              <w:bottom w:type="dxa" w:w="80"/>
+              <w:right w:type="dxa" w:w="120"/>
+            </w:tcMar>
+            <w:vAlign w:val="top"/>
+          </w:tcPr>
+          <w:p>
+            <w:r>
+              <w:rPr>
+                <w:rFonts w:ascii="Arial" w:cs="Arial" w:eastAsia="Arial" w:hAnsi="Arial"/>
+                <w:b/>
+                <w:bCs/>
+                <w:color w:val="000000"/>
+                <w:sz w:val="18"/>
+                <w:szCs w:val="18"/>
+              </w:rPr>
+              <w:t xml:space="preserve">8</w:t>
+            </w:r>
+          </w:p>
+        </w:tc>
+        <w:tc>
+          <w:tcPr>
+            <w:tcW w:type="dxa" w:w="2800"/>
+            <w:tcBorders>
+              <w:top w:val="single" w:color="AAAAAA" w:sz="1"/>
+              <w:left w:val="single" w:color="AAAAAA" w:sz="1"/>
+              <w:bottom w:val="single" w:color="AAAAAA" w:sz="1"/>
+              <w:right w:val="single" w:color="AAAAAA" w:sz="1"/>
+            </w:tcBorders>
+            <w:tcMar>
+              <w:top w:type="dxa" w:w="80"/>
+              <w:left w:type="dxa" w:w="120"/>
+              <w:bottom w:type="dxa" w:w="80"/>
+              <w:right w:type="dxa" w:w="120"/>
+            </w:tcMar>
+            <w:vAlign w:val="top"/>
+          </w:tcPr>
+          <w:p>
+            <w:r>
+              <w:rPr>
+                <w:rFonts w:ascii="Arial" w:cs="Arial" w:eastAsia="Arial" w:hAnsi="Arial"/>
+                <w:color w:val="000000"/>
+                <w:sz w:val="18"/>
+                <w:szCs w:val="18"/>
+              </w:rPr>
+              <w:t xml:space="preserve">Each YAML Generation</w:t>
+            </w:r>
+          </w:p>
+        </w:tc>
+        <w:tc>
+          <w:tcPr>
+            <w:tcW w:type="dxa" w:w="5760"/>
+            <w:tcBorders>
+              <w:top w:val="single" w:color="AAAAAA" w:sz="1"/>
+              <w:left w:val="single" w:color="AAAAAA" w:sz="1"/>
+              <w:bottom w:val="single" w:color="AAAAAA" w:sz="1"/>
+              <w:right w:val="single" w:color="AAAAAA" w:sz="1"/>
+            </w:tcBorders>
+            <w:tcMar>
+              <w:top w:type="dxa" w:w="80"/>
+              <w:left w:type="dxa" w:w="120"/>
+              <w:bottom w:type="dxa" w:w="80"/>
+              <w:right w:type="dxa" w:w="120"/>
+            </w:tcMar>
+            <w:vAlign w:val="top"/>
+          </w:tcPr>
+          <w:p>
+            <w:r>
+              <w:rPr>
+                <w:rFonts w:ascii="Arial" w:cs="Arial" w:eastAsia="Arial" w:hAnsi="Arial"/>
+                <w:color w:val="000000"/>
+                <w:sz w:val="18"/>
+                <w:szCs w:val="18"/>
+              </w:rPr>
+              <w:t xml:space="preserve">The stakeholder_review for that domain</w:t>
+            </w:r>
+          </w:p>
+        </w:tc>
+      </w:tr>
+      <w:tr>
+        <w:tc>
+          <w:tcPr>
+            <w:tcW w:type="dxa" w:w="800"/>
+            <w:tcBorders>
+              <w:top w:val="single" w:color="AAAAAA" w:sz="1"/>
+              <w:left w:val="single" w:color="AAAAAA" w:sz="1"/>
+              <w:bottom w:val="single" w:color="AAAAAA" w:sz="1"/>
+              <w:right w:val="single" w:color="AAAAAA" w:sz="1"/>
+            </w:tcBorders>
+            <w:shd w:fill="F2F7FB" w:val="clear"/>
+            <w:tcMar>
+              <w:top w:type="dxa" w:w="80"/>
+              <w:left w:type="dxa" w:w="120"/>
+              <w:bottom w:type="dxa" w:w="80"/>
+              <w:right w:type="dxa" w:w="120"/>
+            </w:tcMar>
+            <w:vAlign w:val="top"/>
+          </w:tcPr>
+          <w:p>
+            <w:r>
+              <w:rPr>
+                <w:rFonts w:ascii="Arial" w:cs="Arial" w:eastAsia="Arial" w:hAnsi="Arial"/>
+                <w:b/>
+                <w:bCs/>
+                <w:color w:val="000000"/>
+                <w:sz w:val="18"/>
+                <w:szCs w:val="18"/>
+              </w:rPr>
+              <w:t xml:space="preserve">9</w:t>
+            </w:r>
+          </w:p>
+        </w:tc>
+        <w:tc>
+          <w:tcPr>
+            <w:tcW w:type="dxa" w:w="2800"/>
+            <w:tcBorders>
+              <w:top w:val="single" w:color="AAAAAA" w:sz="1"/>
+              <w:left w:val="single" w:color="AAAAAA" w:sz="1"/>
+              <w:bottom w:val="single" w:color="AAAAAA" w:sz="1"/>
+              <w:right w:val="single" w:color="AAAAAA" w:sz="1"/>
+            </w:tcBorders>
+            <w:shd w:fill="F2F7FB" w:val="clear"/>
+            <w:tcMar>
+              <w:top w:type="dxa" w:w="80"/>
+              <w:left w:type="dxa" w:w="120"/>
+              <w:bottom w:type="dxa" w:w="80"/>
+              <w:right w:type="dxa" w:w="120"/>
+            </w:tcMar>
+            <w:vAlign w:val="top"/>
+          </w:tcPr>
+          <w:p>
+            <w:r>
+              <w:rPr>
+                <w:rFonts w:ascii="Arial" w:cs="Arial" w:eastAsia="Arial" w:hAnsi="Arial"/>
+                <w:color w:val="000000"/>
+                <w:sz w:val="18"/>
+                <w:szCs w:val="18"/>
+              </w:rPr>
+              <w:t xml:space="preserve">CRM Selection</w:t>
+            </w:r>
+          </w:p>
+        </w:tc>
+        <w:tc>
+          <w:tcPr>
+            <w:tcW w:type="dxa" w:w="5760"/>
+            <w:tcBorders>
+              <w:top w:val="single" w:color="AAAAAA" w:sz="1"/>
+              <w:left w:val="single" w:color="AAAAAA" w:sz="1"/>
+              <w:bottom w:val="single" w:color="AAAAAA" w:sz="1"/>
+              <w:right w:val="single" w:color="AAAAAA" w:sz="1"/>
+            </w:tcBorders>
+            <w:shd w:fill="F2F7FB" w:val="clear"/>
+            <w:tcMar>
+              <w:top w:type="dxa" w:w="80"/>
+              <w:left w:type="dxa" w:w="120"/>
+              <w:bottom w:type="dxa" w:w="80"/>
+              <w:right w:type="dxa" w:w="120"/>
+            </w:tcMar>
+            <w:vAlign w:val="top"/>
+          </w:tcPr>
+          <w:p>
+            <w:r>
+              <w:rPr>
+                <w:rFonts w:ascii="Arial" w:cs="Arial" w:eastAsia="Arial" w:hAnsi="Arial"/>
+                <w:color w:val="000000"/>
+                <w:sz w:val="18"/>
+                <w:szCs w:val="18"/>
+              </w:rPr>
+              <w:t xml:space="preserve">All yaml_generation work items</w:t>
+            </w:r>
+          </w:p>
+        </w:tc>
+      </w:tr>
+      <w:tr>
+        <w:tc>
+          <w:tcPr>
+            <w:tcW w:type="dxa" w:w="800"/>
+            <w:tcBorders>
+              <w:top w:val="single" w:color="AAAAAA" w:sz="1"/>
+              <w:left w:val="single" w:color="AAAAAA" w:sz="1"/>
+              <w:bottom w:val="single" w:color="AAAAAA" w:sz="1"/>
+              <w:right w:val="single" w:color="AAAAAA" w:sz="1"/>
+            </w:tcBorders>
+            <w:tcMar>
+              <w:top w:type="dxa" w:w="80"/>
+              <w:left w:type="dxa" w:w="120"/>
+              <w:bottom w:type="dxa" w:w="80"/>
+              <w:right w:type="dxa" w:w="120"/>
+            </w:tcMar>
+            <w:vAlign w:val="top"/>
+          </w:tcPr>
+          <w:p>
+            <w:r>
+              <w:rPr>
+                <w:rFonts w:ascii="Arial" w:cs="Arial" w:eastAsia="Arial" w:hAnsi="Arial"/>
+                <w:b/>
+                <w:bCs/>
+                <w:color w:val="000000"/>
+                <w:sz w:val="18"/>
+                <w:szCs w:val="18"/>
+              </w:rPr>
+              <w:t xml:space="preserve">10</w:t>
+            </w:r>
+          </w:p>
+        </w:tc>
+        <w:tc>
+          <w:tcPr>
+            <w:tcW w:type="dxa" w:w="2800"/>
+            <w:tcBorders>
+              <w:top w:val="single" w:color="AAAAAA" w:sz="1"/>
+              <w:left w:val="single" w:color="AAAAAA" w:sz="1"/>
+              <w:bottom w:val="single" w:color="AAAAAA" w:sz="1"/>
+              <w:right w:val="single" w:color="AAAAAA" w:sz="1"/>
+            </w:tcBorders>
+            <w:tcMar>
+              <w:top w:type="dxa" w:w="80"/>
+              <w:left w:type="dxa" w:w="120"/>
+              <w:bottom w:type="dxa" w:w="80"/>
+              <w:right w:type="dxa" w:w="120"/>
+            </w:tcMar>
+            <w:vAlign w:val="top"/>
+          </w:tcPr>
+          <w:p>
+            <w:r>
+              <w:rPr>
+                <w:rFonts w:ascii="Arial" w:cs="Arial" w:eastAsia="Arial" w:hAnsi="Arial"/>
+                <w:color w:val="000000"/>
+                <w:sz w:val="18"/>
+                <w:szCs w:val="18"/>
+              </w:rPr>
+              <w:t xml:space="preserve">CRM Deployment</w:t>
+            </w:r>
+          </w:p>
+        </w:tc>
+        <w:tc>
+          <w:tcPr>
+            <w:tcW w:type="dxa" w:w="5760"/>
+            <w:tcBorders>
+              <w:top w:val="single" w:color="AAAAAA" w:sz="1"/>
+              <w:left w:val="single" w:color="AAAAAA" w:sz="1"/>
+              <w:bottom w:val="single" w:color="AAAAAA" w:sz="1"/>
+              <w:right w:val="single" w:color="AAAAAA" w:sz="1"/>
+            </w:tcBorders>
+            <w:tcMar>
+              <w:top w:type="dxa" w:w="80"/>
+              <w:left w:type="dxa" w:w="120"/>
+              <w:bottom w:type="dxa" w:w="80"/>
+              <w:right w:type="dxa" w:w="120"/>
+            </w:tcMar>
+            <w:vAlign w:val="top"/>
+          </w:tcPr>
+          <w:p>
+            <w:r>
+              <w:rPr>
+                <w:rFonts w:ascii="Arial" w:cs="Arial" w:eastAsia="Arial" w:hAnsi="Arial"/>
+                <w:color w:val="000000"/>
+                <w:sz w:val="18"/>
+                <w:szCs w:val="18"/>
+              </w:rPr>
+              <w:t xml:space="preserve">CRM Selection</w:t>
+            </w:r>
+          </w:p>
+        </w:tc>
+      </w:tr>
+      <w:tr>
+        <w:tc>
+          <w:tcPr>
+            <w:tcW w:type="dxa" w:w="800"/>
+            <w:tcBorders>
+              <w:top w:val="single" w:color="AAAAAA" w:sz="1"/>
+              <w:left w:val="single" w:color="AAAAAA" w:sz="1"/>
+              <w:bottom w:val="single" w:color="AAAAAA" w:sz="1"/>
+              <w:right w:val="single" w:color="AAAAAA" w:sz="1"/>
+            </w:tcBorders>
+            <w:shd w:fill="F2F7FB" w:val="clear"/>
+            <w:tcMar>
+              <w:top w:type="dxa" w:w="80"/>
+              <w:left w:type="dxa" w:w="120"/>
+              <w:bottom w:type="dxa" w:w="80"/>
+              <w:right w:type="dxa" w:w="120"/>
+            </w:tcMar>
+            <w:vAlign w:val="top"/>
+          </w:tcPr>
+          <w:p>
+            <w:r>
+              <w:rPr>
+                <w:rFonts w:ascii="Arial" w:cs="Arial" w:eastAsia="Arial" w:hAnsi="Arial"/>
+                <w:b/>
+                <w:bCs/>
+                <w:color w:val="000000"/>
+                <w:sz w:val="18"/>
+                <w:szCs w:val="18"/>
+              </w:rPr>
+              <w:t xml:space="preserve">11</w:t>
+            </w:r>
+          </w:p>
+        </w:tc>
+        <w:tc>
+          <w:tcPr>
+            <w:tcW w:type="dxa" w:w="2800"/>
+            <w:tcBorders>
+              <w:top w:val="single" w:color="AAAAAA" w:sz="1"/>
+              <w:left w:val="single" w:color="AAAAAA" w:sz="1"/>
+              <w:bottom w:val="single" w:color="AAAAAA" w:sz="1"/>
+              <w:right w:val="single" w:color="AAAAAA" w:sz="1"/>
+            </w:tcBorders>
+            <w:shd w:fill="F2F7FB" w:val="clear"/>
+            <w:tcMar>
+              <w:top w:type="dxa" w:w="80"/>
+              <w:left w:type="dxa" w:w="120"/>
+              <w:bottom w:type="dxa" w:w="80"/>
+              <w:right w:type="dxa" w:w="120"/>
+            </w:tcMar>
+            <w:vAlign w:val="top"/>
+          </w:tcPr>
+          <w:p>
+            <w:r>
+              <w:rPr>
+                <w:rFonts w:ascii="Arial" w:cs="Arial" w:eastAsia="Arial" w:hAnsi="Arial"/>
+                <w:color w:val="000000"/>
+                <w:sz w:val="18"/>
+                <w:szCs w:val="18"/>
+              </w:rPr>
+              <w:t xml:space="preserve">CRM Configuration</w:t>
+            </w:r>
+          </w:p>
+        </w:tc>
+        <w:tc>
+          <w:tcPr>
+            <w:tcW w:type="dxa" w:w="5760"/>
+            <w:tcBorders>
+              <w:top w:val="single" w:color="AAAAAA" w:sz="1"/>
+              <w:left w:val="single" w:color="AAAAAA" w:sz="1"/>
+              <w:bottom w:val="single" w:color="AAAAAA" w:sz="1"/>
+              <w:right w:val="single" w:color="AAAAAA" w:sz="1"/>
+            </w:tcBorders>
+            <w:shd w:fill="F2F7FB" w:val="clear"/>
+            <w:tcMar>
+              <w:top w:type="dxa" w:w="80"/>
+              <w:left w:type="dxa" w:w="120"/>
+              <w:bottom w:type="dxa" w:w="80"/>
+              <w:right w:type="dxa" w:w="120"/>
+            </w:tcMar>
+            <w:vAlign w:val="top"/>
+          </w:tcPr>
+          <w:p>
+            <w:r>
+              <w:rPr>
+                <w:rFonts w:ascii="Arial" w:cs="Arial" w:eastAsia="Arial" w:hAnsi="Arial"/>
+                <w:color w:val="000000"/>
+                <w:sz w:val="18"/>
+                <w:szCs w:val="18"/>
+              </w:rPr>
+              <w:t xml:space="preserve">CRM Deployment</w:t>
+            </w:r>
+          </w:p>
+        </w:tc>
+      </w:tr>
+      <w:tr>
+        <w:tc>
+          <w:tcPr>
+            <w:tcW w:type="dxa" w:w="800"/>
+            <w:tcBorders>
+              <w:top w:val="single" w:color="AAAAAA" w:sz="1"/>
+              <w:left w:val="single" w:color="AAAAAA" w:sz="1"/>
+              <w:bottom w:val="single" w:color="AAAAAA" w:sz="1"/>
+              <w:right w:val="single" w:color="AAAAAA" w:sz="1"/>
+            </w:tcBorders>
+            <w:tcMar>
+              <w:top w:type="dxa" w:w="80"/>
+              <w:left w:type="dxa" w:w="120"/>
+              <w:bottom w:type="dxa" w:w="80"/>
+              <w:right w:type="dxa" w:w="120"/>
+            </w:tcMar>
+            <w:vAlign w:val="top"/>
+          </w:tcPr>
+          <w:p>
+            <w:r>
+              <w:rPr>
+                <w:rFonts w:ascii="Arial" w:cs="Arial" w:eastAsia="Arial" w:hAnsi="Arial"/>
+                <w:b/>
+                <w:bCs/>
+                <w:color w:val="000000"/>
+                <w:sz w:val="18"/>
+                <w:szCs w:val="18"/>
+              </w:rPr>
+              <w:t xml:space="preserve">12</w:t>
+            </w:r>
+          </w:p>
+        </w:tc>
+        <w:tc>
+          <w:tcPr>
+            <w:tcW w:type="dxa" w:w="2800"/>
+            <w:tcBorders>
+              <w:top w:val="single" w:color="AAAAAA" w:sz="1"/>
+              <w:left w:val="single" w:color="AAAAAA" w:sz="1"/>
+              <w:bottom w:val="single" w:color="AAAAAA" w:sz="1"/>
+              <w:right w:val="single" w:color="AAAAAA" w:sz="1"/>
+            </w:tcBorders>
+            <w:tcMar>
+              <w:top w:type="dxa" w:w="80"/>
+              <w:left w:type="dxa" w:w="120"/>
+              <w:bottom w:type="dxa" w:w="80"/>
+              <w:right w:type="dxa" w:w="120"/>
+            </w:tcMar>
+            <w:vAlign w:val="top"/>
+          </w:tcPr>
+          <w:p>
+            <w:r>
+              <w:rPr>
+                <w:rFonts w:ascii="Arial" w:cs="Arial" w:eastAsia="Arial" w:hAnsi="Arial"/>
+                <w:color w:val="000000"/>
+                <w:sz w:val="18"/>
+                <w:szCs w:val="18"/>
+              </w:rPr>
+              <w:t xml:space="preserve">Verification</w:t>
+            </w:r>
+          </w:p>
+        </w:tc>
+        <w:tc>
+          <w:tcPr>
+            <w:tcW w:type="dxa" w:w="5760"/>
+            <w:tcBorders>
+              <w:top w:val="single" w:color="AAAAAA" w:sz="1"/>
+              <w:left w:val="single" w:color="AAAAAA" w:sz="1"/>
+              <w:bottom w:val="single" w:color="AAAAAA" w:sz="1"/>
+              <w:right w:val="single" w:color="AAAAAA" w:sz="1"/>
+            </w:tcBorders>
+            <w:tcMar>
+              <w:top w:type="dxa" w:w="80"/>
+              <w:left w:type="dxa" w:w="120"/>
+              <w:bottom w:type="dxa" w:w="80"/>
+              <w:right w:type="dxa" w:w="120"/>
+            </w:tcMar>
+            <w:vAlign w:val="top"/>
+          </w:tcPr>
+          <w:p>
+            <w:r>
+              <w:rPr>
+                <w:rFonts w:ascii="Arial" w:cs="Arial" w:eastAsia="Arial" w:hAnsi="Arial"/>
+                <w:color w:val="000000"/>
+                <w:sz w:val="18"/>
+                <w:szCs w:val="18"/>
+              </w:rPr>
+              <w:t xml:space="preserve">CRM Configuration</w:t>
+            </w:r>
+          </w:p>
+        </w:tc>
+      </w:tr>
+    </w:tbl>
+    <w:p>
+      <w:pPr>
+        <w:spacing w:after="160"/>
+      </w:pPr>
+      <w:r>
+        <w:rPr>
+          <w:rFonts w:ascii="Arial" w:cs="Arial" w:eastAsia="Arial" w:hAnsi="Arial"/>
+          <w:color w:val="000000"/>
+          <w:sz w:val="22"/>
+          <w:szCs w:val="22"/>
+        </w:rPr>
+        <w:t xml:space="preserve">Rules with the same number but different letter suffixes all apply to the same work item type. A work item becomes ready only when all applicable rules are satisfied.</w:t>
+      </w:r>
+    </w:p>
+    <w:p>
+      <w:pPr>
+        <w:spacing w:after="160"/>
+      </w:pPr>
+      <w:r>
+        <w:rPr>
+          <w:rFonts w:ascii="Arial" w:cs="Arial" w:eastAsia="Arial" w:hAnsi="Arial"/>
+          <w:color w:val="000000"/>
+          <w:sz w:val="22"/>
+          <w:szCs w:val="22"/>
+        </w:rPr>
+        <w:t xml:space="preserve">Rule 4c is optional and administrator-managed. The engine does not automatically create cross-domain dependencies. Rule 8 has no cross-domain dependencies  —  YAML generation for each domain depends only on that domain’s stakeholder review, consistent with DEC-007 (domain sort_order is display preference only).</w:t>
+      </w:r>
+    </w:p>
+    <w:p>
+      <w:pPr>
+        <w:pStyle w:val="Heading2"/>
+        <w:spacing w:after="160" w:before="280"/>
+      </w:pPr>
+      <w:r>
+        <w:rPr>
+          <w:rFonts w:ascii="Arial" w:cs="Arial" w:eastAsia="Arial" w:hAnsi="Arial"/>
+          <w:b/>
+          <w:bCs/>
+          <w:color w:val="1F3864"/>
+          <w:sz w:val="24"/>
+          <w:szCs w:val="24"/>
+        </w:rPr>
+        <w:t xml:space="preserve">9.6 Available Work Calculation</w:t>
+      </w:r>
+    </w:p>
+    <w:p>
+      <w:pPr>
+        <w:spacing w:after="160"/>
+      </w:pPr>
+      <w:r>
+        <w:rPr>
+          <w:rFonts w:ascii="Arial" w:cs="Arial" w:eastAsia="Arial" w:hAnsi="Arial"/>
+          <w:color w:val="000000"/>
+          <w:sz w:val="22"/>
+          <w:szCs w:val="22"/>
+        </w:rPr>
+        <w:t xml:space="preserve">The Project Dashboard presents available work in two groups, displayed in this order:</w:t>
+      </w:r>
+    </w:p>
+    <w:p>
+      <w:pPr>
+        <w:spacing w:after="160"/>
+      </w:pPr>
+      <w:r>
+        <w:rPr>
+          <w:rFonts w:ascii="Arial" w:cs="Arial" w:eastAsia="Arial" w:hAnsi="Arial"/>
+          <w:color w:val="000000"/>
+          <w:sz w:val="22"/>
+          <w:szCs w:val="22"/>
+        </w:rPr>
+        <w:t xml:space="preserve">Continue Work  —  work items with status in_progress. These represent work the administrator has already started and should finish before picking up new items.</w:t>
+      </w:r>
+    </w:p>
+    <w:p>
+      <w:pPr>
+        <w:spacing w:after="160"/>
+      </w:pPr>
+      <w:r>
+        <w:rPr>
+          <w:rFonts w:ascii="Arial" w:cs="Arial" w:eastAsia="Arial" w:hAnsi="Arial"/>
+          <w:color w:val="000000"/>
+          <w:sz w:val="22"/>
+          <w:szCs w:val="22"/>
+        </w:rPr>
+        <w:t xml:space="preserve">Ready to Start  —  work items with status ready. These represent new work whose dependencies are all satisfied.</w:t>
+      </w:r>
+    </w:p>
+    <w:p>
+      <w:pPr>
+        <w:spacing w:after="160"/>
+      </w:pPr>
+      <w:r>
+        <w:rPr>
+          <w:rFonts w:ascii="Arial" w:cs="Arial" w:eastAsia="Arial" w:hAnsi="Arial"/>
+          <w:color w:val="000000"/>
+          <w:sz w:val="22"/>
+          <w:szCs w:val="22"/>
+        </w:rPr>
+        <w:t xml:space="preserve">The ordering within each group (by phase, then by domain) presents earlier-phase items first, giving the administrator a natural priority sequence without enforcing it. The administrator is free to choose any ready item regardless of its position in the list.</w:t>
+      </w:r>
+    </w:p>
+    <w:p>
+      <w:pPr>
+        <w:pStyle w:val="Heading2"/>
+        <w:spacing w:after="160" w:before="280"/>
+      </w:pPr>
+      <w:r>
+        <w:rPr>
+          <w:rFonts w:ascii="Arial" w:cs="Arial" w:eastAsia="Arial" w:hAnsi="Arial"/>
+          <w:b/>
+          <w:bCs/>
+          <w:color w:val="1F3864"/>
+          <w:sz w:val="24"/>
+          <w:szCs w:val="24"/>
+        </w:rPr>
+        <w:t xml:space="preserve">9.7 Status Transitions and Side Effects</w:t>
+      </w:r>
+    </w:p>
+    <w:p>
+      <w:pPr>
+        <w:pStyle w:val="Heading3"/>
+        <w:spacing w:after="120" w:before="240"/>
+      </w:pPr>
+      <w:r>
+        <w:rPr>
+          <w:rFonts w:ascii="Arial" w:cs="Arial" w:eastAsia="Arial" w:hAnsi="Arial"/>
+          <w:b/>
+          <w:bCs/>
+          <w:color w:val="1F3864"/>
+          <w:sz w:val="22"/>
+          <w:szCs w:val="22"/>
+        </w:rPr>
+        <w:t xml:space="preserve">9.7.1 Forward Transitions</w:t>
+      </w:r>
+    </w:p>
+    <w:tbl>
+      <w:tblPr>
+        <w:tblW w:type="dxa" w:w="9360"/>
+        <w:tblBorders>
+          <w:top w:val="single" w:color="auto" w:sz="4"/>
+          <w:left w:val="single" w:color="auto" w:sz="4"/>
+          <w:bottom w:val="single" w:color="auto" w:sz="4"/>
+          <w:right w:val="single" w:color="auto" w:sz="4"/>
+          <w:insideH w:val="single" w:color="auto" w:sz="4"/>
+          <w:insideV w:val="single" w:color="auto" w:sz="4"/>
+        </w:tblBorders>
+      </w:tblPr>
+      <w:tblGrid>
+        <w:gridCol w:w="2400"/>
+        <w:gridCol w:w="2400"/>
+        <w:gridCol w:w="4560"/>
+      </w:tblGrid>
+      <w:tr>
+        <w:tc>
+          <w:tcPr>
+            <w:tcW w:type="dxa" w:w="2400"/>
+            <w:tcBorders>
+              <w:top w:val="single" w:color="AAAAAA" w:sz="1"/>
+              <w:left w:val="single" w:color="AAAAAA" w:sz="1"/>
+              <w:bottom w:val="single" w:color="AAAAAA" w:sz="1"/>
+              <w:right w:val="single" w:color="AAAAAA" w:sz="1"/>
+            </w:tcBorders>
+            <w:shd w:fill="1F3864" w:val="clear"/>
+            <w:tcMar>
+              <w:top w:type="dxa" w:w="80"/>
+              <w:left w:type="dxa" w:w="120"/>
+              <w:bottom w:type="dxa" w:w="80"/>
+              <w:right w:type="dxa" w:w="120"/>
+            </w:tcMar>
+            <w:vAlign w:val="center"/>
+          </w:tcPr>
+          <w:p>
+            <w:r>
+              <w:rPr>
+                <w:rFonts w:ascii="Arial" w:cs="Arial" w:eastAsia="Arial" w:hAnsi="Arial"/>
+                <w:b/>
+                <w:bCs/>
+                <w:color w:val="FFFFFF"/>
+                <w:sz w:val="18"/>
+                <w:szCs w:val="18"/>
+              </w:rPr>
+              <w:t xml:space="preserve">Transition</w:t>
+            </w:r>
+          </w:p>
+        </w:tc>
+        <w:tc>
+          <w:tcPr>
+            <w:tcW w:type="dxa" w:w="2400"/>
+            <w:tcBorders>
+              <w:top w:val="single" w:color="AAAAAA" w:sz="1"/>
+              <w:left w:val="single" w:color="AAAAAA" w:sz="1"/>
+              <w:bottom w:val="single" w:color="AAAAAA" w:sz="1"/>
+              <w:right w:val="single" w:color="AAAAAA" w:sz="1"/>
+            </w:tcBorders>
+            <w:shd w:fill="1F3864" w:val="clear"/>
+            <w:tcMar>
+              <w:top w:type="dxa" w:w="80"/>
+              <w:left w:type="dxa" w:w="120"/>
+              <w:bottom w:type="dxa" w:w="80"/>
+              <w:right w:type="dxa" w:w="120"/>
+            </w:tcMar>
+            <w:vAlign w:val="center"/>
+          </w:tcPr>
+          <w:p>
+            <w:r>
+              <w:rPr>
+                <w:rFonts w:ascii="Arial" w:cs="Arial" w:eastAsia="Arial" w:hAnsi="Arial"/>
+                <w:b/>
+                <w:bCs/>
+                <w:color w:val="FFFFFF"/>
+                <w:sz w:val="18"/>
+                <w:szCs w:val="18"/>
+              </w:rPr>
+              <w:t xml:space="preserve">Trigger</w:t>
+            </w:r>
+          </w:p>
+        </w:tc>
+        <w:tc>
+          <w:tcPr>
+            <w:tcW w:type="dxa" w:w="4560"/>
+            <w:tcBorders>
+              <w:top w:val="single" w:color="AAAAAA" w:sz="1"/>
+              <w:left w:val="single" w:color="AAAAAA" w:sz="1"/>
+              <w:bottom w:val="single" w:color="AAAAAA" w:sz="1"/>
+              <w:right w:val="single" w:color="AAAAAA" w:sz="1"/>
+            </w:tcBorders>
+            <w:shd w:fill="1F3864" w:val="clear"/>
+            <w:tcMar>
+              <w:top w:type="dxa" w:w="80"/>
+              <w:left w:type="dxa" w:w="120"/>
+              <w:bottom w:type="dxa" w:w="80"/>
+              <w:right w:type="dxa" w:w="120"/>
+            </w:tcMar>
+            <w:vAlign w:val="center"/>
+          </w:tcPr>
+          <w:p>
+            <w:r>
+              <w:rPr>
+                <w:rFonts w:ascii="Arial" w:cs="Arial" w:eastAsia="Arial" w:hAnsi="Arial"/>
+                <w:b/>
+                <w:bCs/>
+                <w:color w:val="FFFFFF"/>
+                <w:sz w:val="18"/>
+                <w:szCs w:val="18"/>
+              </w:rPr>
+              <w:t xml:space="preserve">Side Effects</w:t>
+            </w:r>
+          </w:p>
+        </w:tc>
+      </w:tr>
+      <w:tr>
+        <w:tc>
+          <w:tcPr>
+            <w:tcW w:type="dxa" w:w="2400"/>
+            <w:tcBorders>
+              <w:top w:val="single" w:color="AAAAAA" w:sz="1"/>
+              <w:left w:val="single" w:color="AAAAAA" w:sz="1"/>
+              <w:bottom w:val="single" w:color="AAAAAA" w:sz="1"/>
+              <w:right w:val="single" w:color="AAAAAA" w:sz="1"/>
+            </w:tcBorders>
+            <w:tcMar>
+              <w:top w:type="dxa" w:w="80"/>
+              <w:left w:type="dxa" w:w="120"/>
+              <w:bottom w:type="dxa" w:w="80"/>
+              <w:right w:type="dxa" w:w="120"/>
+            </w:tcMar>
+            <w:vAlign w:val="top"/>
+          </w:tcPr>
+          <w:p>
+            <w:r>
+              <w:rPr>
+                <w:rFonts w:ascii="Arial" w:cs="Arial" w:eastAsia="Arial" w:hAnsi="Arial"/>
+                <w:b/>
+                <w:bCs/>
+                <w:color w:val="000000"/>
+                <w:sz w:val="18"/>
+                <w:szCs w:val="18"/>
+              </w:rPr>
+              <w:t xml:space="preserve">not_started → ready</w:t>
+            </w:r>
+          </w:p>
+        </w:tc>
+        <w:tc>
+          <w:tcPr>
+            <w:tcW w:type="dxa" w:w="2400"/>
+            <w:tcBorders>
+              <w:top w:val="single" w:color="AAAAAA" w:sz="1"/>
+              <w:left w:val="single" w:color="AAAAAA" w:sz="1"/>
+              <w:bottom w:val="single" w:color="AAAAAA" w:sz="1"/>
+              <w:right w:val="single" w:color="AAAAAA" w:sz="1"/>
+            </w:tcBorders>
+            <w:tcMar>
+              <w:top w:type="dxa" w:w="80"/>
+              <w:left w:type="dxa" w:w="120"/>
+              <w:bottom w:type="dxa" w:w="80"/>
+              <w:right w:type="dxa" w:w="120"/>
+            </w:tcMar>
+            <w:vAlign w:val="top"/>
+          </w:tcPr>
+          <w:p>
+            <w:r>
+              <w:rPr>
+                <w:rFonts w:ascii="Arial" w:cs="Arial" w:eastAsia="Arial" w:hAnsi="Arial"/>
+                <w:color w:val="000000"/>
+                <w:sz w:val="18"/>
+                <w:szCs w:val="18"/>
+              </w:rPr>
+              <w:t xml:space="preserve">Engine recalculation</w:t>
+            </w:r>
+          </w:p>
+        </w:tc>
+        <w:tc>
+          <w:tcPr>
+            <w:tcW w:type="dxa" w:w="4560"/>
+            <w:tcBorders>
+              <w:top w:val="single" w:color="AAAAAA" w:sz="1"/>
+              <w:left w:val="single" w:color="AAAAAA" w:sz="1"/>
+              <w:bottom w:val="single" w:color="AAAAAA" w:sz="1"/>
+              <w:right w:val="single" w:color="AAAAAA" w:sz="1"/>
+            </w:tcBorders>
+            <w:tcMar>
+              <w:top w:type="dxa" w:w="80"/>
+              <w:left w:type="dxa" w:w="120"/>
+              <w:bottom w:type="dxa" w:w="80"/>
+              <w:right w:type="dxa" w:w="120"/>
+            </w:tcMar>
+            <w:vAlign w:val="top"/>
+          </w:tcPr>
+          <w:p>
+            <w:r>
+              <w:rPr>
+                <w:rFonts w:ascii="Arial" w:cs="Arial" w:eastAsia="Arial" w:hAnsi="Arial"/>
+                <w:color w:val="000000"/>
+                <w:sz w:val="18"/>
+                <w:szCs w:val="18"/>
+              </w:rPr>
+              <w:t xml:space="preserve">Update status, set updated_at</w:t>
+            </w:r>
+          </w:p>
+        </w:tc>
+      </w:tr>
+      <w:tr>
+        <w:tc>
+          <w:tcPr>
+            <w:tcW w:type="dxa" w:w="2400"/>
+            <w:tcBorders>
+              <w:top w:val="single" w:color="AAAAAA" w:sz="1"/>
+              <w:left w:val="single" w:color="AAAAAA" w:sz="1"/>
+              <w:bottom w:val="single" w:color="AAAAAA" w:sz="1"/>
+              <w:right w:val="single" w:color="AAAAAA" w:sz="1"/>
+            </w:tcBorders>
+            <w:shd w:fill="F2F7FB" w:val="clear"/>
+            <w:tcMar>
+              <w:top w:type="dxa" w:w="80"/>
+              <w:left w:type="dxa" w:w="120"/>
+              <w:bottom w:type="dxa" w:w="80"/>
+              <w:right w:type="dxa" w:w="120"/>
+            </w:tcMar>
+            <w:vAlign w:val="top"/>
+          </w:tcPr>
+          <w:p>
+            <w:r>
+              <w:rPr>
+                <w:rFonts w:ascii="Arial" w:cs="Arial" w:eastAsia="Arial" w:hAnsi="Arial"/>
+                <w:b/>
+                <w:bCs/>
+                <w:color w:val="000000"/>
+                <w:sz w:val="18"/>
+                <w:szCs w:val="18"/>
+              </w:rPr>
+              <w:t xml:space="preserve">ready → in_progress</w:t>
+            </w:r>
+          </w:p>
+        </w:tc>
+        <w:tc>
+          <w:tcPr>
+            <w:tcW w:type="dxa" w:w="2400"/>
+            <w:tcBorders>
+              <w:top w:val="single" w:color="AAAAAA" w:sz="1"/>
+              <w:left w:val="single" w:color="AAAAAA" w:sz="1"/>
+              <w:bottom w:val="single" w:color="AAAAAA" w:sz="1"/>
+              <w:right w:val="single" w:color="AAAAAA" w:sz="1"/>
+            </w:tcBorders>
+            <w:shd w:fill="F2F7FB" w:val="clear"/>
+            <w:tcMar>
+              <w:top w:type="dxa" w:w="80"/>
+              <w:left w:type="dxa" w:w="120"/>
+              <w:bottom w:type="dxa" w:w="80"/>
+              <w:right w:type="dxa" w:w="120"/>
+            </w:tcMar>
+            <w:vAlign w:val="top"/>
+          </w:tcPr>
+          <w:p>
+            <w:r>
+              <w:rPr>
+                <w:rFonts w:ascii="Arial" w:cs="Arial" w:eastAsia="Arial" w:hAnsi="Arial"/>
+                <w:color w:val="000000"/>
+                <w:sz w:val="18"/>
+                <w:szCs w:val="18"/>
+              </w:rPr>
+              <w:t xml:space="preserve">Administrator starts work</w:t>
+            </w:r>
+          </w:p>
+        </w:tc>
+        <w:tc>
+          <w:tcPr>
+            <w:tcW w:type="dxa" w:w="4560"/>
+            <w:tcBorders>
+              <w:top w:val="single" w:color="AAAAAA" w:sz="1"/>
+              <w:left w:val="single" w:color="AAAAAA" w:sz="1"/>
+              <w:bottom w:val="single" w:color="AAAAAA" w:sz="1"/>
+              <w:right w:val="single" w:color="AAAAAA" w:sz="1"/>
+            </w:tcBorders>
+            <w:shd w:fill="F2F7FB" w:val="clear"/>
+            <w:tcMar>
+              <w:top w:type="dxa" w:w="80"/>
+              <w:left w:type="dxa" w:w="120"/>
+              <w:bottom w:type="dxa" w:w="80"/>
+              <w:right w:type="dxa" w:w="120"/>
+            </w:tcMar>
+            <w:vAlign w:val="top"/>
+          </w:tcPr>
+          <w:p>
+            <w:r>
+              <w:rPr>
+                <w:rFonts w:ascii="Arial" w:cs="Arial" w:eastAsia="Arial" w:hAnsi="Arial"/>
+                <w:color w:val="000000"/>
+                <w:sz w:val="18"/>
+                <w:szCs w:val="18"/>
+              </w:rPr>
+              <w:t xml:space="preserve">Set started_at; for AI-session items, create AISession record with session_type "initial"</w:t>
+            </w:r>
+          </w:p>
+        </w:tc>
+      </w:tr>
+      <w:tr>
+        <w:tc>
+          <w:tcPr>
+            <w:tcW w:type="dxa" w:w="2400"/>
+            <w:tcBorders>
+              <w:top w:val="single" w:color="AAAAAA" w:sz="1"/>
+              <w:left w:val="single" w:color="AAAAAA" w:sz="1"/>
+              <w:bottom w:val="single" w:color="AAAAAA" w:sz="1"/>
+              <w:right w:val="single" w:color="AAAAAA" w:sz="1"/>
+            </w:tcBorders>
+            <w:tcMar>
+              <w:top w:type="dxa" w:w="80"/>
+              <w:left w:type="dxa" w:w="120"/>
+              <w:bottom w:type="dxa" w:w="80"/>
+              <w:right w:type="dxa" w:w="120"/>
+            </w:tcMar>
+            <w:vAlign w:val="top"/>
+          </w:tcPr>
+          <w:p>
+            <w:r>
+              <w:rPr>
+                <w:rFonts w:ascii="Arial" w:cs="Arial" w:eastAsia="Arial" w:hAnsi="Arial"/>
+                <w:b/>
+                <w:bCs/>
+                <w:color w:val="000000"/>
+                <w:sz w:val="18"/>
+                <w:szCs w:val="18"/>
+              </w:rPr>
+              <w:t xml:space="preserve">in_progress → complete</w:t>
+            </w:r>
+          </w:p>
+        </w:tc>
+        <w:tc>
+          <w:tcPr>
+            <w:tcW w:type="dxa" w:w="2400"/>
+            <w:tcBorders>
+              <w:top w:val="single" w:color="AAAAAA" w:sz="1"/>
+              <w:left w:val="single" w:color="AAAAAA" w:sz="1"/>
+              <w:bottom w:val="single" w:color="AAAAAA" w:sz="1"/>
+              <w:right w:val="single" w:color="AAAAAA" w:sz="1"/>
+            </w:tcBorders>
+            <w:tcMar>
+              <w:top w:type="dxa" w:w="80"/>
+              <w:left w:type="dxa" w:w="120"/>
+              <w:bottom w:type="dxa" w:w="80"/>
+              <w:right w:type="dxa" w:w="120"/>
+            </w:tcMar>
+            <w:vAlign w:val="top"/>
+          </w:tcPr>
+          <w:p>
+            <w:r>
+              <w:rPr>
+                <w:rFonts w:ascii="Arial" w:cs="Arial" w:eastAsia="Arial" w:hAnsi="Arial"/>
+                <w:color w:val="000000"/>
+                <w:sz w:val="18"/>
+                <w:szCs w:val="18"/>
+              </w:rPr>
+              <w:t xml:space="preserve">Administrator marks complete</w:t>
+            </w:r>
+          </w:p>
+        </w:tc>
+        <w:tc>
+          <w:tcPr>
+            <w:tcW w:type="dxa" w:w="4560"/>
+            <w:tcBorders>
+              <w:top w:val="single" w:color="AAAAAA" w:sz="1"/>
+              <w:left w:val="single" w:color="AAAAAA" w:sz="1"/>
+              <w:bottom w:val="single" w:color="AAAAAA" w:sz="1"/>
+              <w:right w:val="single" w:color="AAAAAA" w:sz="1"/>
+            </w:tcBorders>
+            <w:tcMar>
+              <w:top w:type="dxa" w:w="80"/>
+              <w:left w:type="dxa" w:w="120"/>
+              <w:bottom w:type="dxa" w:w="80"/>
+              <w:right w:type="dxa" w:w="120"/>
+            </w:tcMar>
+            <w:vAlign w:val="top"/>
+          </w:tcPr>
+          <w:p>
+            <w:r>
+              <w:rPr>
+                <w:rFonts w:ascii="Arial" w:cs="Arial" w:eastAsia="Arial" w:hAnsi="Arial"/>
+                <w:color w:val="000000"/>
+                <w:sz w:val="18"/>
+                <w:szCs w:val="18"/>
+              </w:rPr>
+              <w:t xml:space="preserve">Set completed_at; trigger downstream recalculation</w:t>
+            </w:r>
+          </w:p>
+        </w:tc>
+      </w:tr>
+    </w:tbl>
+    <w:p>
+      <w:pPr>
+        <w:spacing w:after="160"/>
+      </w:pPr>
+      <w:r>
+        <w:rPr>
+          <w:rFonts w:ascii="Arial" w:cs="Arial" w:eastAsia="Arial" w:hAnsi="Arial"/>
+          <w:color w:val="000000"/>
+          <w:sz w:val="22"/>
+          <w:szCs w:val="22"/>
+        </w:rPr>
+        <w:t xml:space="preserve">Downstream recalculation on completion: The engine queries the Dependency table for all work items that depend on the completed item. For each dependent work item, it checks whether all of that item’s dependencies are now complete. If so and the item is currently not_started, it transitions to ready. If the item is currently blocked with a blocked_reason referencing this upstream item, it follows the unblocking logic described in Section 9.8.</w:t>
+      </w:r>
+    </w:p>
+    <w:p>
+      <w:pPr>
+        <w:pStyle w:val="Heading3"/>
+        <w:spacing w:after="120" w:before="240"/>
+      </w:pPr>
+      <w:r>
+        <w:rPr>
+          <w:rFonts w:ascii="Arial" w:cs="Arial" w:eastAsia="Arial" w:hAnsi="Arial"/>
+          <w:b/>
+          <w:bCs/>
+          <w:color w:val="1F3864"/>
+          <w:sz w:val="22"/>
+          <w:szCs w:val="22"/>
+        </w:rPr>
+        <w:t xml:space="preserve">9.7.2 Revision Transition</w:t>
+      </w:r>
+    </w:p>
+    <w:p>
+      <w:pPr>
+        <w:spacing w:after="160"/>
+      </w:pPr>
+      <w:r>
+        <w:rPr>
+          <w:rFonts w:ascii="Arial" w:cs="Arial" w:eastAsia="Arial" w:hAnsi="Arial"/>
+          <w:color w:val="000000"/>
+          <w:sz w:val="22"/>
+          <w:szCs w:val="22"/>
+        </w:rPr>
+        <w:t xml:space="preserve">When a completed work item needs revision  —  for example, stakeholder feedback requires changes to a Domain PRD, or a scope change requires updating an Entity PRD  —  the administrator reopens it. The engine clears completed_at, creates a new AISession record with session_type "revision," and triggers cascade regression on downstream items.</w:t>
+      </w:r>
+    </w:p>
+    <w:p>
+      <w:pPr>
+        <w:spacing w:after="120"/>
+      </w:pPr>
+      <w:r>
+        <w:rPr>
+          <w:rFonts w:ascii="Arial" w:cs="Arial" w:eastAsia="Arial" w:hAnsi="Arial"/>
+          <w:b/>
+          <w:bCs/>
+          <w:color w:val="000000"/>
+          <w:sz w:val="22"/>
+          <w:szCs w:val="22"/>
+        </w:rPr>
+        <w:t xml:space="preserve">Cascade regression:</w:t>
+      </w:r>
+    </w:p>
+    <w:p>
+      <w:pPr>
+        <w:spacing w:after="160"/>
+      </w:pPr>
+      <w:r>
+        <w:rPr>
+          <w:rFonts w:ascii="Arial" w:cs="Arial" w:eastAsia="Arial" w:hAnsi="Arial"/>
+          <w:color w:val="000000"/>
+          <w:sz w:val="22"/>
+          <w:szCs w:val="22"/>
+        </w:rPr>
+        <w:t xml:space="preserve">When a completed work item reverts to in_progress, the engine evaluates every downstream work item (direct and transitive) and applies the following rules:</w:t>
+      </w:r>
+    </w:p>
+    <w:p>
+      <w:pPr>
+        <w:spacing w:after="160"/>
+      </w:pPr>
+      <w:r>
+        <w:rPr>
+          <w:rFonts w:ascii="Arial" w:cs="Arial" w:eastAsia="Arial" w:hAnsi="Arial"/>
+          <w:color w:val="000000"/>
+          <w:sz w:val="22"/>
+          <w:szCs w:val="22"/>
+        </w:rPr>
+        <w:t xml:space="preserve">Downstream items with status ready transition to not_started. Their readiness was based on the now-reopened item’s completion, so they are no longer eligible for work.</w:t>
+      </w:r>
+    </w:p>
+    <w:p>
+      <w:pPr>
+        <w:spacing w:after="160"/>
+      </w:pPr>
+      <w:r>
+        <w:rPr>
+          <w:rFonts w:ascii="Arial" w:cs="Arial" w:eastAsia="Arial" w:hAnsi="Arial"/>
+          <w:color w:val="000000"/>
+          <w:sz w:val="22"/>
+          <w:szCs w:val="22"/>
+        </w:rPr>
+        <w:t xml:space="preserve">Downstream items with status in_progress or complete transition to blocked. Their blocked_reason is set to reference the reopened upstream item. Their status_before_blocked is set to their current status for later restoration.</w:t>
+      </w:r>
+    </w:p>
+    <w:p>
+      <w:pPr>
+        <w:spacing w:after="160"/>
+      </w:pPr>
+      <w:r>
+        <w:rPr>
+          <w:rFonts w:ascii="Arial" w:cs="Arial" w:eastAsia="Arial" w:hAnsi="Arial"/>
+          <w:color w:val="000000"/>
+          <w:sz w:val="22"/>
+          <w:szCs w:val="22"/>
+        </w:rPr>
+        <w:t xml:space="preserve">Downstream items with status not_started are unaffected  —  they were already waiting on other dependencies.</w:t>
+      </w:r>
+    </w:p>
+    <w:p>
+      <w:pPr>
+        <w:spacing w:after="160"/>
+      </w:pPr>
+      <w:r>
+        <w:rPr>
+          <w:rFonts w:ascii="Arial" w:cs="Arial" w:eastAsia="Arial" w:hAnsi="Arial"/>
+          <w:color w:val="000000"/>
+          <w:sz w:val="22"/>
+          <w:szCs w:val="22"/>
+        </w:rPr>
+        <w:t xml:space="preserve">Downstream items already blocked for a different reason are unaffected.</w:t>
+      </w:r>
+    </w:p>
+    <w:p>
+      <w:pPr>
+        <w:spacing w:after="160"/>
+      </w:pPr>
+      <w:r>
+        <w:rPr>
+          <w:rFonts w:ascii="Arial" w:cs="Arial" w:eastAsia="Arial" w:hAnsi="Arial"/>
+          <w:color w:val="000000"/>
+          <w:sz w:val="22"/>
+          <w:szCs w:val="22"/>
+        </w:rPr>
+        <w:t xml:space="preserve">When the reopened item completes again, the engine runs downstream recalculation. Items that were regressed to not_started are re-evaluated and transition to ready if all dependencies are complete. Items that were blocked due to this revision are unblocked per the logic in Section 9.8.</w:t>
+      </w:r>
+    </w:p>
+    <w:p>
+      <w:pPr>
+        <w:pStyle w:val="Heading2"/>
+        <w:spacing w:after="160" w:before="280"/>
+      </w:pPr>
+      <w:r>
+        <w:rPr>
+          <w:rFonts w:ascii="Arial" w:cs="Arial" w:eastAsia="Arial" w:hAnsi="Arial"/>
+          <w:b/>
+          <w:bCs/>
+          <w:color w:val="1F3864"/>
+          <w:sz w:val="24"/>
+          <w:szCs w:val="24"/>
+        </w:rPr>
+        <w:t xml:space="preserve">9.8 Blocked State Handling</w:t>
+      </w:r>
+    </w:p>
+    <w:p>
+      <w:pPr>
+        <w:pStyle w:val="Heading3"/>
+        <w:spacing w:after="120" w:before="240"/>
+      </w:pPr>
+      <w:r>
+        <w:rPr>
+          <w:rFonts w:ascii="Arial" w:cs="Arial" w:eastAsia="Arial" w:hAnsi="Arial"/>
+          <w:b/>
+          <w:bCs/>
+          <w:color w:val="1F3864"/>
+          <w:sz w:val="22"/>
+          <w:szCs w:val="22"/>
+        </w:rPr>
+        <w:t xml:space="preserve">9.8.1 Causes</w:t>
+      </w:r>
+    </w:p>
+    <w:p>
+      <w:pPr>
+        <w:spacing w:after="160"/>
+      </w:pPr>
+      <w:r>
+        <w:rPr>
+          <w:rFonts w:ascii="Arial" w:cs="Arial" w:eastAsia="Arial" w:hAnsi="Arial"/>
+          <w:color w:val="000000"/>
+          <w:sz w:val="22"/>
+          <w:szCs w:val="22"/>
+        </w:rPr>
+        <w:t xml:space="preserve">A work item becomes blocked under three circumstances:</w:t>
+      </w:r>
+    </w:p>
+    <w:p>
+      <w:pPr>
+        <w:spacing w:after="160"/>
+      </w:pPr>
+      <w:r>
+        <w:rPr>
+          <w:rFonts w:ascii="Arial" w:cs="Arial" w:eastAsia="Arial" w:hAnsi="Arial"/>
+          <w:color w:val="000000"/>
+          <w:sz w:val="22"/>
+          <w:szCs w:val="22"/>
+        </w:rPr>
+        <w:t xml:space="preserve">Upstream revision. A dependency that was previously complete has been reopened. The engine sets blocked_reason to identify the upstream item and stores the prior status in status_before_blocked. This is automatic, triggered by the cascade regression logic in Section 9.7.2.</w:t>
+      </w:r>
+    </w:p>
+    <w:p>
+      <w:pPr>
+        <w:spacing w:after="160"/>
+      </w:pPr>
+      <w:r>
+        <w:rPr>
+          <w:rFonts w:ascii="Arial" w:cs="Arial" w:eastAsia="Arial" w:hAnsi="Arial"/>
+          <w:color w:val="000000"/>
+          <w:sz w:val="22"/>
+          <w:szCs w:val="22"/>
+        </w:rPr>
+        <w:t xml:space="preserve">Administrator-initiated block. The administrator manually blocks a work item for a reason outside the dependency graph  —  for example, waiting for stakeholder availability, pending an external vendor decision, or paused for organizational reasons. The administrator provides the blocked_reason. The engine stores the prior status in status_before_blocked. This can be applied to any work item regardless of its current status (except not_started, which has no meaningful work to block).</w:t>
+      </w:r>
+    </w:p>
+    <w:p>
+      <w:pPr>
+        <w:spacing w:after="160"/>
+      </w:pPr>
+      <w:r>
+        <w:rPr>
+          <w:rFonts w:ascii="Arial" w:cs="Arial" w:eastAsia="Arial" w:hAnsi="Arial"/>
+          <w:color w:val="000000"/>
+          <w:sz w:val="22"/>
+          <w:szCs w:val="22"/>
+        </w:rPr>
+        <w:t xml:space="preserve">Scope change in progress. A scope change (new entity discovered, Master PRD revision needed) may require blocking downstream items until the upstream change is resolved. This is a specific case of administrator-initiated blocking where the blocked_reason references the scope change.</w:t>
+      </w:r>
+    </w:p>
+    <w:p>
+      <w:pPr>
+        <w:pStyle w:val="Heading3"/>
+        <w:spacing w:after="120" w:before="240"/>
+      </w:pPr>
+      <w:r>
+        <w:rPr>
+          <w:rFonts w:ascii="Arial" w:cs="Arial" w:eastAsia="Arial" w:hAnsi="Arial"/>
+          <w:b/>
+          <w:bCs/>
+          <w:color w:val="1F3864"/>
+          <w:sz w:val="22"/>
+          <w:szCs w:val="22"/>
+        </w:rPr>
+        <w:t xml:space="preserve">9.8.2 Unblocking</w:t>
+      </w:r>
+    </w:p>
+    <w:p>
+      <w:pPr>
+        <w:spacing w:after="120"/>
+      </w:pPr>
+      <w:r>
+        <w:rPr>
+          <w:rFonts w:ascii="Arial" w:cs="Arial" w:eastAsia="Arial" w:hAnsi="Arial"/>
+          <w:b/>
+          <w:bCs/>
+          <w:color w:val="000000"/>
+          <w:sz w:val="22"/>
+          <w:szCs w:val="22"/>
+        </w:rPr>
+        <w:t xml:space="preserve">Automatic unblocking (upstream revision resolved):</w:t>
+      </w:r>
+    </w:p>
+    <w:p>
+      <w:pPr>
+        <w:spacing w:after="160"/>
+      </w:pPr>
+      <w:r>
+        <w:rPr>
+          <w:rFonts w:ascii="Arial" w:cs="Arial" w:eastAsia="Arial" w:hAnsi="Arial"/>
+          <w:color w:val="000000"/>
+          <w:sz w:val="22"/>
+          <w:szCs w:val="22"/>
+        </w:rPr>
+        <w:t xml:space="preserve">When a reopened upstream item completes again, the engine identifies all work items whose blocked_reason references that upstream item. For each: (1) The engine checks whether all of that item’s dependencies are now complete. (2) If all dependencies are complete, the item transitions from blocked to the status stored in status_before_blocked. The blocked_reason and status_before_blocked fields are cleared. (3) If other dependencies are still incomplete, the item transitions from blocked to not_started. The blocked_reason and status_before_blocked fields are cleared.</w:t>
+      </w:r>
+    </w:p>
+    <w:p>
+      <w:pPr>
+        <w:spacing w:after="120"/>
+      </w:pPr>
+      <w:r>
+        <w:rPr>
+          <w:rFonts w:ascii="Arial" w:cs="Arial" w:eastAsia="Arial" w:hAnsi="Arial"/>
+          <w:b/>
+          <w:bCs/>
+          <w:color w:val="000000"/>
+          <w:sz w:val="22"/>
+          <w:szCs w:val="22"/>
+        </w:rPr>
+        <w:t xml:space="preserve">Manual unblocking (administrator-initiated):</w:t>
+      </w:r>
+    </w:p>
+    <w:p>
+      <w:pPr>
+        <w:spacing w:after="160"/>
+      </w:pPr>
+      <w:r>
+        <w:rPr>
+          <w:rFonts w:ascii="Arial" w:cs="Arial" w:eastAsia="Arial" w:hAnsi="Arial"/>
+          <w:color w:val="000000"/>
+          <w:sz w:val="22"/>
+          <w:szCs w:val="22"/>
+        </w:rPr>
+        <w:t xml:space="preserve">The administrator clears the block. The item transitions from blocked to the status stored in status_before_blocked. The blocked_reason and status_before_blocked fields are cleared.</w:t>
+      </w:r>
+    </w:p>
+    <w:p>
+      <w:pPr>
+        <w:pStyle w:val="Heading3"/>
+        <w:spacing w:after="120" w:before="240"/>
+      </w:pPr>
+      <w:r>
+        <w:rPr>
+          <w:rFonts w:ascii="Arial" w:cs="Arial" w:eastAsia="Arial" w:hAnsi="Arial"/>
+          <w:b/>
+          <w:bCs/>
+          <w:color w:val="1F3864"/>
+          <w:sz w:val="22"/>
+          <w:szCs w:val="22"/>
+        </w:rPr>
+        <w:t xml:space="preserve">9.8.3 Blocked Reason Format</w:t>
+      </w:r>
+    </w:p>
+    <w:p>
+      <w:pPr>
+        <w:spacing w:after="160"/>
+      </w:pPr>
+      <w:r>
+        <w:rPr>
+          <w:rFonts w:ascii="Arial" w:cs="Arial" w:eastAsia="Arial" w:hAnsi="Arial"/>
+          <w:color w:val="000000"/>
+          <w:sz w:val="22"/>
+          <w:szCs w:val="22"/>
+        </w:rPr>
+        <w:t xml:space="preserve">The blocked_reason field is free text, but the engine uses a structured prefix for automatically generated reasons to distinguish them from administrator-written reasons. Automatic reasons follow the format: UPSTREAM_REVISION: {work_item_type}  —  {descriptive_name} (Work Item #{id}). Administrator reasons are free text. The structured prefix allows the engine to identify which blocked items should be automatically re-evaluated when an upstream revision completes.</w:t>
+      </w:r>
+    </w:p>
+    <w:p>
+      <w:pPr>
+        <w:pStyle w:val="Heading2"/>
+        <w:spacing w:after="160" w:before="280"/>
+      </w:pPr>
+      <w:r>
+        <w:rPr>
+          <w:rFonts w:ascii="Arial" w:cs="Arial" w:eastAsia="Arial" w:hAnsi="Arial"/>
+          <w:b/>
+          <w:bCs/>
+          <w:color w:val="1F3864"/>
+          <w:sz w:val="24"/>
+          <w:szCs w:val="24"/>
+        </w:rPr>
+        <w:t xml:space="preserve">9.9 Schema Changes</w:t>
+      </w:r>
+    </w:p>
+    <w:p>
+      <w:pPr>
+        <w:spacing w:after="160"/>
+      </w:pPr>
+      <w:r>
+        <w:rPr>
+          <w:rFonts w:ascii="Arial" w:cs="Arial" w:eastAsia="Arial" w:hAnsi="Arial"/>
+          <w:color w:val="000000"/>
+          <w:sz w:val="22"/>
+          <w:szCs w:val="22"/>
+        </w:rPr>
+        <w:t xml:space="preserve">This section requires the following changes to the WorkItem table defined in Section 6.3:</w:t>
+      </w:r>
+    </w:p>
+    <w:p>
+      <w:pPr>
+        <w:spacing w:after="160"/>
+      </w:pPr>
+      <w:r>
+        <w:rPr>
+          <w:rFonts w:ascii="Arial" w:cs="Arial" w:eastAsia="Arial" w:hAnsi="Arial"/>
+          <w:color w:val="000000"/>
+          <w:sz w:val="22"/>
+          <w:szCs w:val="22"/>
+        </w:rPr>
+        <w:t xml:space="preserve">New column: status_before_blocked (TEXT, nullable). Stores the status a work item held before it was blocked, enabling restoration when the block is cleared. Null when the item is not blocked.</w:t>
+      </w:r>
+    </w:p>
+    <w:p>
+      <w:pPr>
+        <w:spacing w:after="160"/>
+      </w:pPr>
+      <w:r>
+        <w:rPr>
+          <w:rFonts w:ascii="Arial" w:cs="Arial" w:eastAsia="Arial" w:hAnsi="Arial"/>
+          <w:color w:val="000000"/>
+          <w:sz w:val="22"/>
+          <w:szCs w:val="22"/>
+        </w:rPr>
+        <w:t xml:space="preserve">Extended item_type values: The item_type column accepts the following values: master_prd, business_object_discovery, entity_prd, domain_overview, process_definition, domain_reconciliation, stakeholder_review, yaml_generation, crm_selection, crm_deployment, crm_configuration, verification.</w:t>
+      </w:r>
+    </w:p>
+    <w:p>
+      <w:pPr>
+        <w:pStyle w:val="Heading2"/>
+        <w:spacing w:after="160" w:before="280"/>
+      </w:pPr>
+      <w:r>
+        <w:rPr>
+          <w:rFonts w:ascii="Arial" w:cs="Arial" w:eastAsia="Arial" w:hAnsi="Arial"/>
+          <w:b/>
+          <w:bCs/>
+          <w:color w:val="1F3864"/>
+          <w:sz w:val="24"/>
+          <w:szCs w:val="24"/>
+        </w:rPr>
+        <w:t xml:space="preserve">9.10 Domain Overview Output</w:t>
+      </w:r>
+    </w:p>
+    <w:p>
+      <w:pPr>
+        <w:spacing w:after="160"/>
+      </w:pPr>
+      <w:r>
+        <w:rPr>
+          <w:rFonts w:ascii="Arial" w:cs="Arial" w:eastAsia="Arial" w:hAnsi="Arial"/>
+          <w:color w:val="000000"/>
+          <w:sz w:val="22"/>
+          <w:szCs w:val="22"/>
+        </w:rPr>
+        <w:t xml:space="preserve">The domain_overview work item produces a Domain Overview document  —  a focused domain-scoped reference that assembles content from upstream work items. The document contains:</w:t>
+      </w:r>
+    </w:p>
+    <w:p>
+      <w:pPr>
+        <w:spacing w:after="160"/>
+      </w:pPr>
+      <w:r>
+        <w:rPr>
+          <w:rFonts w:ascii="Arial" w:cs="Arial" w:eastAsia="Arial" w:hAnsi="Arial"/>
+          <w:color w:val="000000"/>
+          <w:sz w:val="22"/>
+          <w:szCs w:val="22"/>
+        </w:rPr>
+        <w:t xml:space="preserve">Domain Purpose  —  expanded business context, drawn from and elaborating on the Master PRD’s domain description.</w:t>
+      </w:r>
+    </w:p>
+    <w:p>
+      <w:pPr>
+        <w:spacing w:after="160"/>
+      </w:pPr>
+      <w:r>
+        <w:rPr>
+          <w:rFonts w:ascii="Arial" w:cs="Arial" w:eastAsia="Arial" w:hAnsi="Arial"/>
+          <w:color w:val="000000"/>
+          <w:sz w:val="22"/>
+          <w:szCs w:val="22"/>
+        </w:rPr>
+        <w:t xml:space="preserve">Personas  —  personas participating in this domain, scoped from the Master PRD’s persona definitions to their domain-specific roles.</w:t>
+      </w:r>
+    </w:p>
+    <w:p>
+      <w:pPr>
+        <w:spacing w:after="160"/>
+      </w:pPr>
+      <w:r>
+        <w:rPr>
+          <w:rFonts w:ascii="Arial" w:cs="Arial" w:eastAsia="Arial" w:hAnsi="Arial"/>
+          <w:color w:val="000000"/>
+          <w:sz w:val="22"/>
+          <w:szCs w:val="22"/>
+        </w:rPr>
+        <w:t xml:space="preserve">Business Processes  —  the complete process inventory for the domain with lifecycle narrative, process relationships, and dependency ordering. Describes how the processes connect end to end.</w:t>
+      </w:r>
+    </w:p>
+    <w:p>
+      <w:pPr>
+        <w:spacing w:after="160"/>
+      </w:pPr>
+      <w:r>
+        <w:rPr>
+          <w:rFonts w:ascii="Arial" w:cs="Arial" w:eastAsia="Arial" w:hAnsi="Arial"/>
+          <w:color w:val="000000"/>
+          <w:sz w:val="22"/>
+          <w:szCs w:val="22"/>
+        </w:rPr>
+        <w:t xml:space="preserve">Data Reference  —  the entities and fields relevant to this domain, assembled by reference to the completed Entity PRDs. Shows which entities the domain uses without redefining them.</w:t>
+      </w:r>
+    </w:p>
+    <w:p>
+      <w:pPr>
+        <w:spacing w:after="160"/>
+      </w:pPr>
+      <w:r>
+        <w:rPr>
+          <w:rFonts w:ascii="Arial" w:cs="Arial" w:eastAsia="Arial" w:hAnsi="Arial"/>
+          <w:color w:val="000000"/>
+          <w:sz w:val="22"/>
+          <w:szCs w:val="22"/>
+        </w:rPr>
+        <w:t xml:space="preserve">This document serves as the primary context input for all process definition conversations in the domain, replacing the need to upload the Master PRD, Entity Inventory, and individual Entity PRDs separately into each process session.</w:t>
       </w:r>
     </w:p>
     <w:p>
@@ -28299,6 +32347,254 @@
     </w:p>
     <w:p>
       <w:pPr>
+        <w:pStyle w:val="Heading2"/>
+        <w:spacing w:after="160" w:before="280"/>
+      </w:pPr>
+      <w:r>
+        <w:rPr>
+          <w:rFonts w:ascii="Arial" w:cs="Arial" w:eastAsia="Arial" w:hAnsi="Arial"/>
+          <w:b/>
+          <w:bCs/>
+          <w:color w:val="1F3864"/>
+          <w:sz w:val="24"/>
+          <w:szCs w:val="24"/>
+        </w:rPr>
+        <w:t xml:space="preserve">15.9 Stored status with event-driven recalculation (DEC-009)</w:t>
+      </w:r>
+    </w:p>
+    <w:p>
+      <w:pPr>
+        <w:spacing w:after="160"/>
+      </w:pPr>
+      <w:r>
+        <w:rPr>
+          <w:rFonts w:ascii="Arial" w:cs="Arial" w:eastAsia="Arial" w:hAnsi="Arial"/>
+          <w:color w:val="000000"/>
+          <w:sz w:val="22"/>
+          <w:szCs w:val="22"/>
+        </w:rPr>
+        <w:t xml:space="preserve">Work item status is stored on the WorkItem record and updated by the engine whenever an upstream item transitions. This avoids recalculating the full dependency graph on every dashboard query while keeping stored values current through event-driven triggers.</w:t>
+      </w:r>
+    </w:p>
+    <w:p>
+      <w:pPr>
+        <w:pStyle w:val="Heading2"/>
+        <w:spacing w:after="160" w:before="280"/>
+      </w:pPr>
+      <w:r>
+        <w:rPr>
+          <w:rFonts w:ascii="Arial" w:cs="Arial" w:eastAsia="Arial" w:hAnsi="Arial"/>
+          <w:b/>
+          <w:bCs/>
+          <w:color w:val="1F3864"/>
+          <w:sz w:val="24"/>
+          <w:szCs w:val="24"/>
+        </w:rPr>
+        <w:t xml:space="preserve">15.10 Dependency graph built progressively (DEC-010)</w:t>
+      </w:r>
+    </w:p>
+    <w:p>
+      <w:pPr>
+        <w:spacing w:after="160"/>
+      </w:pPr>
+      <w:r>
+        <w:rPr>
+          <w:rFonts w:ascii="Arial" w:cs="Arial" w:eastAsia="Arial" w:hAnsi="Arial"/>
+          <w:color w:val="000000"/>
+          <w:sz w:val="22"/>
+          <w:szCs w:val="22"/>
+        </w:rPr>
+        <w:t xml:space="preserve">The engine creates work items at three points: project creation (Master PRD only), Master PRD import (Business Object Discovery only), and Business Object Discovery import (all remaining phases). This progressive approach reflects the fact that later work items cannot be defined until earlier phases identify the domains, entities, and processes.</w:t>
+      </w:r>
+    </w:p>
+    <w:p>
+      <w:pPr>
+        <w:pStyle w:val="Heading2"/>
+        <w:spacing w:after="160" w:before="280"/>
+      </w:pPr>
+      <w:r>
+        <w:rPr>
+          <w:rFonts w:ascii="Arial" w:cs="Arial" w:eastAsia="Arial" w:hAnsi="Arial"/>
+          <w:b/>
+          <w:bCs/>
+          <w:color w:val="1F3864"/>
+          <w:sz w:val="24"/>
+          <w:szCs w:val="24"/>
+        </w:rPr>
+        <w:t xml:space="preserve">15.11 Process dependencies wired through domain_overview (DEC-011)</w:t>
+      </w:r>
+    </w:p>
+    <w:p>
+      <w:pPr>
+        <w:spacing w:after="160"/>
+      </w:pPr>
+      <w:r>
+        <w:rPr>
+          <w:rFonts w:ascii="Arial" w:cs="Arial" w:eastAsia="Arial" w:hAnsi="Arial"/>
+          <w:color w:val="000000"/>
+          <w:sz w:val="22"/>
+          <w:szCs w:val="22"/>
+        </w:rPr>
+        <w:t xml:space="preserve">Process definition work items depend on their domain’s domain_overview, not directly on individual entity PRDs. The domain_overview serves as a gateway  —  it cannot become ready until all entity PRDs relevant to that domain are complete, guaranteeing that process definitions have full entity context available. This also provides a single node for cross-domain dependency wiring.</w:t>
+      </w:r>
+    </w:p>
+    <w:p>
+      <w:pPr>
+        <w:pStyle w:val="Heading2"/>
+        <w:spacing w:after="160" w:before="280"/>
+      </w:pPr>
+      <w:r>
+        <w:rPr>
+          <w:rFonts w:ascii="Arial" w:cs="Arial" w:eastAsia="Arial" w:hAnsi="Arial"/>
+          <w:b/>
+          <w:bCs/>
+          <w:color w:val="1F3864"/>
+          <w:sz w:val="24"/>
+          <w:szCs w:val="24"/>
+        </w:rPr>
+        <w:t xml:space="preserve">15.12 Parallel YAML generation across domains (DEC-012)</w:t>
+      </w:r>
+    </w:p>
+    <w:p>
+      <w:pPr>
+        <w:spacing w:after="160"/>
+      </w:pPr>
+      <w:r>
+        <w:rPr>
+          <w:rFonts w:ascii="Arial" w:cs="Arial" w:eastAsia="Arial" w:hAnsi="Arial"/>
+          <w:color w:val="000000"/>
+          <w:sz w:val="22"/>
+          <w:szCs w:val="22"/>
+        </w:rPr>
+        <w:t xml:space="preserve">YAML generation work items have no cross-domain dependencies. Each depends only on its own domain’s stakeholder review. The administrator chooses which domain to process first. This is consistent with DEC-007 (domain sort_order is display preference only).</w:t>
+      </w:r>
+    </w:p>
+    <w:p>
+      <w:pPr>
+        <w:pStyle w:val="Heading2"/>
+        <w:spacing w:after="160" w:before="280"/>
+      </w:pPr>
+      <w:r>
+        <w:rPr>
+          <w:rFonts w:ascii="Arial" w:cs="Arial" w:eastAsia="Arial" w:hAnsi="Arial"/>
+          <w:b/>
+          <w:bCs/>
+          <w:color w:val="1F3864"/>
+          <w:sz w:val="24"/>
+          <w:szCs w:val="24"/>
+        </w:rPr>
+        <w:t xml:space="preserve">15.13 Cascade regression on revision (DEC-013)</w:t>
+      </w:r>
+    </w:p>
+    <w:p>
+      <w:pPr>
+        <w:spacing w:after="160"/>
+      </w:pPr>
+      <w:r>
+        <w:rPr>
+          <w:rFonts w:ascii="Arial" w:cs="Arial" w:eastAsia="Arial" w:hAnsi="Arial"/>
+          <w:color w:val="000000"/>
+          <w:sz w:val="22"/>
+          <w:szCs w:val="22"/>
+        </w:rPr>
+        <w:t xml:space="preserve">When a completed work item is reopened, downstream items that are ready revert to not_started, and downstream items that are in_progress or complete are blocked with the prior status preserved. This prevents work from proceeding on potentially stale upstream data.</w:t>
+      </w:r>
+    </w:p>
+    <w:p>
+      <w:pPr>
+        <w:pStyle w:val="Heading2"/>
+        <w:spacing w:after="160" w:before="280"/>
+      </w:pPr>
+      <w:r>
+        <w:rPr>
+          <w:rFonts w:ascii="Arial" w:cs="Arial" w:eastAsia="Arial" w:hAnsi="Arial"/>
+          <w:b/>
+          <w:bCs/>
+          <w:color w:val="1F3864"/>
+          <w:sz w:val="24"/>
+          <w:szCs w:val="24"/>
+        </w:rPr>
+        <w:t xml:space="preserve">15.14 Scope change dependency updates are administrator-driven (DEC-014)</w:t>
+      </w:r>
+    </w:p>
+    <w:p>
+      <w:pPr>
+        <w:spacing w:after="160"/>
+      </w:pPr>
+      <w:r>
+        <w:rPr>
+          <w:rFonts w:ascii="Arial" w:cs="Arial" w:eastAsia="Arial" w:hAnsi="Arial"/>
+          <w:color w:val="000000"/>
+          <w:sz w:val="22"/>
+          <w:szCs w:val="22"/>
+        </w:rPr>
+        <w:t xml:space="preserve">When Entity Inventory participation data changes mid-project or cross-domain ordering is needed, the impact analysis engine surfaces the change, but the administrator decides whether to add, modify, or remove dependencies. Automatic dependency modification on every data update would create disproportionate churn for minor scope discoveries.</w:t>
+      </w:r>
+    </w:p>
+    <w:p>
+      <w:pPr>
+        <w:pStyle w:val="Heading2"/>
+        <w:spacing w:after="160" w:before="280"/>
+      </w:pPr>
+      <w:r>
+        <w:rPr>
+          <w:rFonts w:ascii="Arial" w:cs="Arial" w:eastAsia="Arial" w:hAnsi="Arial"/>
+          <w:b/>
+          <w:bCs/>
+          <w:color w:val="1F3864"/>
+          <w:sz w:val="24"/>
+          <w:szCs w:val="24"/>
+        </w:rPr>
+        <w:t xml:space="preserve">15.15 Domain overview as gateway to process work (DEC-015)</w:t>
+      </w:r>
+    </w:p>
+    <w:p>
+      <w:pPr>
+        <w:spacing w:after="160"/>
+      </w:pPr>
+      <w:r>
+        <w:rPr>
+          <w:rFonts w:ascii="Arial" w:cs="Arial" w:eastAsia="Arial" w:hAnsi="Arial"/>
+          <w:color w:val="000000"/>
+          <w:sz w:val="22"/>
+          <w:szCs w:val="22"/>
+        </w:rPr>
+        <w:t xml:space="preserve">Each domain has a domain_overview work item that produces a domain-scoped reference document assembling personas, business process inventory, and data reference from upstream work items. This replaces the need to upload multiple documents into each process definition conversation and provides a natural node for cross-domain dependency ordering.</w:t>
+      </w:r>
+    </w:p>
+    <w:p>
+      <w:pPr>
+        <w:pStyle w:val="Heading2"/>
+        <w:spacing w:after="160" w:before="280"/>
+      </w:pPr>
+      <w:r>
+        <w:rPr>
+          <w:rFonts w:ascii="Arial" w:cs="Arial" w:eastAsia="Arial" w:hAnsi="Arial"/>
+          <w:b/>
+          <w:bCs/>
+          <w:color w:val="1F3864"/>
+          <w:sz w:val="24"/>
+          <w:szCs w:val="24"/>
+        </w:rPr>
+        <w:t xml:space="preserve">15.16 CRM Selection and CRM Deployment are separate work items (DEC-016)</w:t>
+      </w:r>
+    </w:p>
+    <w:p>
+      <w:pPr>
+        <w:spacing w:after="160"/>
+      </w:pPr>
+      <w:r>
+        <w:rPr>
+          <w:rFonts w:ascii="Arial" w:cs="Arial" w:eastAsia="Arial" w:hAnsi="Arial"/>
+          <w:color w:val="000000"/>
+          <w:sz w:val="22"/>
+          <w:szCs w:val="22"/>
+        </w:rPr>
+        <w:t xml:space="preserve">The Document Production Process combines these into a single phase, but they are distinct activities with different outputs. CRM Selection is an AI-session conversation producing a CRM Evaluation Report. CRM Deployment is the provisioning of the actual CRM instance. Separating them provides clearer status tracking and accommodates the reality that time may pass between platform selection and instance provisioning.</w:t>
+      </w:r>
+    </w:p>
+    <w:p>
+      <w:pPr>
         <w:pStyle w:val="Heading1"/>
         <w:spacing w:after="200" w:before="360"/>
       </w:pPr>
@@ -28436,6 +32732,68 @@
           <w:szCs w:val="22"/>
         </w:rPr>
         <w:t xml:space="preserve">The current layout tables capture the detail and list view structures defined in the YAML schema. Additional layout types (e.g., side panels, mass update views) may be needed as the YAML schema evolves.</w:t>
+      </w:r>
+    </w:p>
+    <w:p>
+      <w:pPr>
+        <w:pStyle w:val="Heading2"/>
+        <w:spacing w:after="160" w:before="280"/>
+      </w:pPr>
+      <w:r>
+        <w:rPr>
+          <w:rFonts w:ascii="Arial" w:cs="Arial" w:eastAsia="Arial" w:hAnsi="Arial"/>
+          <w:b/>
+          <w:bCs/>
+          <w:color w:val="1F3864"/>
+          <w:sz w:val="24"/>
+          <w:szCs w:val="24"/>
+        </w:rPr>
+        <w:t xml:space="preserve">16.5 Blocked reason parsing for automatic unblocking (ISS-005)</w:t>
+      </w:r>
+    </w:p>
+    <w:p>
+      <w:pPr>
+        <w:spacing w:after="160"/>
+      </w:pPr>
+      <w:r>
+        <w:rPr>
+          <w:rFonts w:ascii="Arial" w:cs="Arial" w:eastAsia="Arial" w:hAnsi="Arial"/>
+          <w:color w:val="000000"/>
+          <w:sz w:val="22"/>
+          <w:szCs w:val="22"/>
+        </w:rPr>
+        <w:t xml:space="preserve">The current design uses a structured prefix in the blocked_reason text field to identify automatically generated blocks. An alternative would be a separate blocked_by_work_item_id foreign key column, which would be more reliable for the engine to query but adds schema complexity. The approach should be evaluated during implementation.</w:t>
+      </w:r>
+    </w:p>
+    <w:p>
+      <w:pPr>
+        <w:pStyle w:val="Heading2"/>
+        <w:spacing w:after="160" w:before="280"/>
+      </w:pPr>
+      <w:r>
+        <w:rPr>
+          <w:rFonts w:ascii="Arial" w:cs="Arial" w:eastAsia="Arial" w:hAnsi="Arial"/>
+          <w:b/>
+          <w:bCs/>
+          <w:color w:val="1F3864"/>
+          <w:sz w:val="24"/>
+          <w:szCs w:val="24"/>
+        </w:rPr>
+        <w:t xml:space="preserve">16.6 Document Production Process update required (ISS-006)</w:t>
+      </w:r>
+    </w:p>
+    <w:p>
+      <w:pPr>
+        <w:spacing w:after="160"/>
+      </w:pPr>
+      <w:r>
+        <w:rPr>
+          <w:rFonts w:ascii="Arial" w:cs="Arial" w:eastAsia="Arial" w:hAnsi="Arial"/>
+          <w:color w:val="000000"/>
+          <w:sz w:val="22"/>
+          <w:szCs w:val="22"/>
+        </w:rPr>
+        <w:t xml:space="preserve">The introduction of domain_overview as a new work item type and the separation of CRM Selection from CRM Deployment add phases to the Document Production Process. The process document will need to be updated to incorporate the domain overview phase, define its document structure, split the CRM Selection and Deployment phase, and update phase numbering throughout. The interview guide suite may also need a new guide for domain overview conversations.</w:t>
       </w:r>
     </w:p>
     <w:p>

</xml_diff>

<commit_message>
Close ISS-006: Document Production Process updated to v1.5
Mark ISS-006 as resolved. Document Production Process v1.5 incorporates
Domain Overview phase and CRM Selection/Deployment split.
</commit_message>
<xml_diff>
--- a/PRDs/product/crmbuilder-automation-PRD/crmbuilder-automation-l2-PRD.docx
+++ b/PRDs/product/crmbuilder-automation-PRD/crmbuilder-automation-l2-PRD.docx
@@ -363,7 +363,7 @@
                 <w:sz w:val="18"/>
                 <w:szCs w:val="18"/>
               </w:rPr>
-              <w:t xml:space="preserve">04-02-26 23:30</w:t>
+              <w:t xml:space="preserve">04-02-26 23:45</w:t>
             </w:r>
           </w:p>
         </w:tc>
@@ -32779,7 +32779,7 @@
           <w:sz w:val="24"/>
           <w:szCs w:val="24"/>
         </w:rPr>
-        <w:t xml:space="preserve">16.6 Document Production Process update required (ISS-006)</w:t>
+        <w:t xml:space="preserve">16.6 Document Production Process update required (ISS-006) — Resolved</w:t>
       </w:r>
     </w:p>
     <w:p>
@@ -32794,6 +32794,31 @@
           <w:szCs w:val="22"/>
         </w:rPr>
         <w:t xml:space="preserve">The introduction of domain_overview as a new work item type and the separation of CRM Selection from CRM Deployment add phases to the Document Production Process. The process document will need to be updated to incorporate the domain overview phase, define its document structure, split the CRM Selection and Deployment phase, and update phase numbering throughout. The interview guide suite may also need a new guide for domain overview conversations.</w:t>
+      </w:r>
+    </w:p>
+    <w:p>
+      <w:pPr>
+        <w:spacing w:after="160"/>
+      </w:pPr>
+      <w:r>
+        <w:rPr>
+          <w:rFonts w:ascii="Arial" w:cs="Arial" w:eastAsia="Arial" w:hAnsi="Arial"/>
+          <w:b/>
+          <w:bCs/>
+          <w:color w:val="000000"/>
+          <w:sz w:val="22"/>
+          <w:szCs w:val="22"/>
+        </w:rPr>
+        <w:t xml:space="preserve">Resolution: </w:t>
+      </w:r>
+      <w:r>
+        <w:rPr>
+          <w:rFonts w:ascii="Arial" w:cs="Arial" w:eastAsia="Arial" w:hAnsi="Arial"/>
+          <w:color w:val="000000"/>
+          <w:sz w:val="22"/>
+          <w:szCs w:val="22"/>
+        </w:rPr>
+        <w:t xml:space="preserve">Document Production Process v1.5 incorporates both changes. Phase 3 (Domain Overview) added with document structure, context requirements, and cross-domain dependency option. CRM Selection and CRM Deployment split into Phase 8 and Phase 9. All phase numbering updated throughout (9 → 11 phases).</w:t>
       </w:r>
     </w:p>
     <w:p>

</xml_diff>

<commit_message>
L2 PRD: Section 10 (Prompt Generator) complete
- Added Section 10 with subsections 10.1-10.10 covering:
  - Prompt structure (6-section standard)
  - Context assembly rules for 9 work item types
  - Decision and issue inclusion via relevance cascade
  - Structured output format (JSON with common envelope)
  - Session type variations (initial, revision, clarification)
  - Interview guide selection (prompt-optimized, file-based)
  - Prompt templates (file-based, per work item type)
  - Context size management (4-tier priority system)
  - Schema changes for Domain, Entity, Field, Client tables
- Added DEC-017 through DEC-033 to Section 15
- Resolved ISS-002 (structured output format is JSON)
- Updated Next Steps to mark Section 10 complete
- Schema additions: Domain.parent_domain_id, Domain.is_service,
  Domain.domain_overview_text, Domain.domain_reconciliation_text,
  Entity.primary_domain_id, Field.is_native,
  Client.organization_overview, Client.crm_platform
</commit_message>
<xml_diff>
--- a/PRDs/product/crmbuilder-automation-PRD/crmbuilder-automation-l2-PRD.docx
+++ b/PRDs/product/crmbuilder-automation-PRD/crmbuilder-automation-l2-PRD.docx
@@ -31934,6 +31934,1645 @@
     </w:p>
     <w:p>
       <w:pPr>
+        <w:pStyle w:val="Heading2"/>
+        <w:spacing w:after="160" w:before="280"/>
+      </w:pPr>
+      <w:r>
+        <w:rPr>
+          <w:rFonts w:ascii="Arial" w:cs="Arial" w:eastAsia="Arial" w:hAnsi="Arial"/>
+          <w:b/>
+          <w:bCs/>
+          <w:color w:val="1F3864"/>
+          <w:sz w:val="24"/>
+          <w:szCs w:val="24"/>
+        </w:rPr>
+        <w:t xml:space="preserve">10.1 Overview</w:t>
+      </w:r>
+    </w:p>
+    <w:p>
+      <w:pPr>
+        <w:spacing w:after="160"/>
+      </w:pPr>
+      <w:r>
+        <w:rPr>
+          <w:rFonts w:ascii="Arial" w:cs="Arial" w:eastAsia="Arial" w:hAnsi="Arial"/>
+          <w:color w:val="000000"/>
+          <w:sz w:val="22"/>
+          <w:szCs w:val="22"/>
+        </w:rPr>
+        <w:t xml:space="preserve">The Prompt Generator assembles complete AI session prompts from the database. When the administrator selects a ready work item and initiates prompt generation, the Prompt Generator reads the database to collect all relevant context, selects the appropriate interview guide, includes applicable decisions and open issues, and specifies the structured output format the AI must produce. The output is a text block the administrator copies into Claude.ai.</w:t>
+      </w:r>
+    </w:p>
+    <w:p>
+      <w:pPr>
+        <w:spacing w:after="160"/>
+      </w:pPr>
+      <w:r>
+        <w:rPr>
+          <w:rFonts w:ascii="Arial" w:cs="Arial" w:eastAsia="Arial" w:hAnsi="Arial"/>
+          <w:color w:val="000000"/>
+          <w:sz w:val="22"/>
+          <w:szCs w:val="22"/>
+        </w:rPr>
+        <w:t xml:space="preserve">The Prompt Generator eliminates manual context assembly — the administrator no longer needs to identify which documents to upload, which decisions are locked, or which issues remain open. The database contains all of this information, and the Prompt Generator packages it into a prompt that gives the AI everything it needs to conduct the session.</w:t>
+      </w:r>
+    </w:p>
+    <w:p>
+      <w:pPr>
+        <w:spacing w:after="160"/>
+      </w:pPr>
+      <w:r>
+        <w:rPr>
+          <w:rFonts w:ascii="Arial" w:cs="Arial" w:eastAsia="Arial" w:hAnsi="Arial"/>
+          <w:color w:val="000000"/>
+          <w:sz w:val="22"/>
+          <w:szCs w:val="22"/>
+        </w:rPr>
+        <w:t xml:space="preserve">The Prompt Generator operates on three session types: initial sessions for new work, revision sessions for reopened work items, and clarification sessions for follow-up questions about completed work.</w:t>
+      </w:r>
+    </w:p>
+    <w:p>
+      <w:pPr>
+        <w:pStyle w:val="Heading2"/>
+        <w:spacing w:after="160" w:before="280"/>
+      </w:pPr>
+      <w:r>
+        <w:rPr>
+          <w:rFonts w:ascii="Arial" w:cs="Arial" w:eastAsia="Arial" w:hAnsi="Arial"/>
+          <w:b/>
+          <w:bCs/>
+          <w:color w:val="1F3864"/>
+          <w:sz w:val="24"/>
+          <w:szCs w:val="24"/>
+        </w:rPr>
+        <w:t xml:space="preserve">10.2 Prompt Structure</w:t>
+      </w:r>
+    </w:p>
+    <w:p>
+      <w:pPr>
+        <w:spacing w:after="160"/>
+      </w:pPr>
+      <w:r>
+        <w:rPr>
+          <w:rFonts w:ascii="Arial" w:cs="Arial" w:eastAsia="Arial" w:hAnsi="Arial"/>
+          <w:color w:val="000000"/>
+          <w:sz w:val="22"/>
+          <w:szCs w:val="22"/>
+        </w:rPr>
+        <w:t xml:space="preserve">Every generated prompt contains six sections in a fixed order. The order is designed so the AI reads behavioral instructions before encountering data, matching how the interview guides are designed to work.</w:t>
+      </w:r>
+    </w:p>
+    <w:p>
+      <w:pPr>
+        <w:spacing w:after="160"/>
+      </w:pPr>
+      <w:r>
+        <w:rPr>
+          <w:rFonts w:ascii="Arial" w:cs="Arial" w:eastAsia="Arial" w:hAnsi="Arial"/>
+          <w:b/>
+          <w:bCs/>
+          <w:color w:val="000000"/>
+          <w:sz w:val="22"/>
+          <w:szCs w:val="22"/>
+        </w:rPr>
+        <w:t xml:space="preserve">Section 1: Session Header. </w:t>
+      </w:r>
+      <w:r>
+        <w:rPr>
+          <w:rFonts w:ascii="Arial" w:cs="Arial" w:eastAsia="Arial" w:hAnsi="Arial"/>
+          <w:color w:val="000000"/>
+          <w:sz w:val="22"/>
+          <w:szCs w:val="22"/>
+        </w:rPr>
+        <w:t xml:space="preserve">Identifies the work item type, the specific item (e.g., “Contact Entity PRD” or “Client Intake (MN-INTAKE) Process Definition”), the session type (initial, revision, or clarification), and the phase number. For revision sessions, the header includes the revision reason. For clarification sessions, the header includes the administrator’s question or topic.</w:t>
+      </w:r>
+    </w:p>
+    <w:p>
+      <w:pPr>
+        <w:spacing w:after="160"/>
+      </w:pPr>
+      <w:r>
+        <w:rPr>
+          <w:rFonts w:ascii="Arial" w:cs="Arial" w:eastAsia="Arial" w:hAnsi="Arial"/>
+          <w:b/>
+          <w:bCs/>
+          <w:color w:val="000000"/>
+          <w:sz w:val="22"/>
+          <w:szCs w:val="22"/>
+        </w:rPr>
+        <w:t xml:space="preserve">Section 2: Session Instructions. </w:t>
+      </w:r>
+      <w:r>
+        <w:rPr>
+          <w:rFonts w:ascii="Arial" w:cs="Arial" w:eastAsia="Arial" w:hAnsi="Arial"/>
+          <w:color w:val="000000"/>
+          <w:sz w:val="22"/>
+          <w:szCs w:val="22"/>
+        </w:rPr>
+        <w:t xml:space="preserve">The prompt-optimized interview guide for this work item type. This tells the AI its role, behavioral rules, required document sections, completeness standards, and how to conduct the session. Prompt-optimized guides retain all behavioral instructions and completeness standards from the source guides but remove administrator logistics (file upload steps, repository paths, commit instructions) and metadata (changelogs, version headers). Each prompt-optimized guide carries a source_version reference; the system flags it as stale when the source guide advances past the referenced version.</w:t>
+      </w:r>
+    </w:p>
+    <w:p>
+      <w:pPr>
+        <w:spacing w:after="160"/>
+      </w:pPr>
+      <w:r>
+        <w:rPr>
+          <w:rFonts w:ascii="Arial" w:cs="Arial" w:eastAsia="Arial" w:hAnsi="Arial"/>
+          <w:b/>
+          <w:bCs/>
+          <w:color w:val="000000"/>
+          <w:sz w:val="22"/>
+          <w:szCs w:val="22"/>
+        </w:rPr>
+        <w:t xml:space="preserve">Section 3: Context. </w:t>
+      </w:r>
+      <w:r>
+        <w:rPr>
+          <w:rFonts w:ascii="Arial" w:cs="Arial" w:eastAsia="Arial" w:hAnsi="Arial"/>
+          <w:color w:val="000000"/>
+          <w:sz w:val="22"/>
+          <w:szCs w:val="22"/>
+        </w:rPr>
+        <w:t xml:space="preserve">Database-sourced data that replaces uploaded documents. Organized into labeled subsections so the AI can reference specific pieces. The content varies by work item type — Section 10.3 defines the assembly rules for each type.</w:t>
+      </w:r>
+    </w:p>
+    <w:p>
+      <w:pPr>
+        <w:spacing w:after="160"/>
+      </w:pPr>
+      <w:r>
+        <w:rPr>
+          <w:rFonts w:ascii="Arial" w:cs="Arial" w:eastAsia="Arial" w:hAnsi="Arial"/>
+          <w:b/>
+          <w:bCs/>
+          <w:color w:val="000000"/>
+          <w:sz w:val="22"/>
+          <w:szCs w:val="22"/>
+        </w:rPr>
+        <w:t xml:space="preserve">Section 4: Locked Decisions. </w:t>
+      </w:r>
+      <w:r>
+        <w:rPr>
+          <w:rFonts w:ascii="Arial" w:cs="Arial" w:eastAsia="Arial" w:hAnsi="Arial"/>
+          <w:color w:val="000000"/>
+          <w:sz w:val="22"/>
+          <w:szCs w:val="22"/>
+        </w:rPr>
+        <w:t xml:space="preserve">Decisions relevant to this work item’s scope, presented under a “Locked Decisions — do not reopen” header. The inclusion rules are defined in Section 10.4.</w:t>
+      </w:r>
+    </w:p>
+    <w:p>
+      <w:pPr>
+        <w:spacing w:after="160"/>
+      </w:pPr>
+      <w:r>
+        <w:rPr>
+          <w:rFonts w:ascii="Arial" w:cs="Arial" w:eastAsia="Arial" w:hAnsi="Arial"/>
+          <w:b/>
+          <w:bCs/>
+          <w:color w:val="000000"/>
+          <w:sz w:val="22"/>
+          <w:szCs w:val="22"/>
+        </w:rPr>
+        <w:t xml:space="preserve">Section 5: Open Issues. </w:t>
+      </w:r>
+      <w:r>
+        <w:rPr>
+          <w:rFonts w:ascii="Arial" w:cs="Arial" w:eastAsia="Arial" w:hAnsi="Arial"/>
+          <w:color w:val="000000"/>
+          <w:sz w:val="22"/>
+          <w:szCs w:val="22"/>
+        </w:rPr>
+        <w:t xml:space="preserve">Unresolved questions relevant to this scope, presented under an “Open Issues — attempt to resolve or note impact” header. The inclusion rules are defined in Section 10.4.</w:t>
+      </w:r>
+    </w:p>
+    <w:p>
+      <w:pPr>
+        <w:spacing w:after="160"/>
+      </w:pPr>
+      <w:r>
+        <w:rPr>
+          <w:rFonts w:ascii="Arial" w:cs="Arial" w:eastAsia="Arial" w:hAnsi="Arial"/>
+          <w:b/>
+          <w:bCs/>
+          <w:color w:val="000000"/>
+          <w:sz w:val="22"/>
+          <w:szCs w:val="22"/>
+        </w:rPr>
+        <w:t xml:space="preserve">Section 6: Structured Output Specification. </w:t>
+      </w:r>
+      <w:r>
+        <w:rPr>
+          <w:rFonts w:ascii="Arial" w:cs="Arial" w:eastAsia="Arial" w:hAnsi="Arial"/>
+          <w:color w:val="000000"/>
+          <w:sz w:val="22"/>
+          <w:szCs w:val="22"/>
+        </w:rPr>
+        <w:t xml:space="preserve">The JSON format and schema the AI must produce at the end of the session for import back into the database. This section specifies the common envelope structure and the type-specific payload fields. The format is defined in Section 10.5.</w:t>
+      </w:r>
+    </w:p>
+    <w:p>
+      <w:pPr>
+        <w:pStyle w:val="Heading2"/>
+        <w:spacing w:after="160" w:before="280"/>
+      </w:pPr>
+      <w:r>
+        <w:rPr>
+          <w:rFonts w:ascii="Arial" w:cs="Arial" w:eastAsia="Arial" w:hAnsi="Arial"/>
+          <w:b/>
+          <w:bCs/>
+          <w:color w:val="1F3864"/>
+          <w:sz w:val="24"/>
+          <w:szCs w:val="24"/>
+        </w:rPr>
+        <w:t xml:space="preserve">10.3 Context Assembly Rules</w:t>
+      </w:r>
+    </w:p>
+    <w:p>
+      <w:pPr>
+        <w:spacing w:after="160"/>
+      </w:pPr>
+      <w:r>
+        <w:rPr>
+          <w:rFonts w:ascii="Arial" w:cs="Arial" w:eastAsia="Arial" w:hAnsi="Arial"/>
+          <w:color w:val="000000"/>
+          <w:sz w:val="22"/>
+          <w:szCs w:val="22"/>
+        </w:rPr>
+        <w:t xml:space="preserve">Nine work item types require generated prompts. Three work item types do not require prompts: stakeholder_review (conducted outside Claude), crm_configuration (tool-driven), and verification (tool-generated).</w:t>
+      </w:r>
+    </w:p>
+    <w:p>
+      <w:pPr>
+        <w:pStyle w:val="Heading3"/>
+        <w:spacing w:after="120" w:before="240"/>
+      </w:pPr>
+      <w:r>
+        <w:rPr>
+          <w:rFonts w:ascii="Arial" w:cs="Arial" w:eastAsia="Arial" w:hAnsi="Arial"/>
+          <w:b/>
+          <w:bCs/>
+          <w:color w:val="1F3864"/>
+          <w:sz w:val="22"/>
+          <w:szCs w:val="22"/>
+        </w:rPr>
+        <w:t xml:space="preserve">10.3.1 master_prd</w:t>
+      </w:r>
+    </w:p>
+    <w:p>
+      <w:pPr>
+        <w:spacing w:after="160"/>
+      </w:pPr>
+      <w:r>
+        <w:rPr>
+          <w:rFonts w:ascii="Arial" w:cs="Arial" w:eastAsia="Arial" w:hAnsi="Arial"/>
+          <w:color w:val="000000"/>
+          <w:sz w:val="22"/>
+          <w:szCs w:val="22"/>
+        </w:rPr>
+        <w:t xml:space="preserve">The Master PRD session has no upstream data in the database. The Context section contains the client name and description from the master database Client record, and any administrator-provided notes about the organization captured at project creation time. The Session Instructions carry the primary weight for this work item type.</w:t>
+      </w:r>
+    </w:p>
+    <w:p>
+      <w:pPr>
+        <w:pStyle w:val="Heading3"/>
+        <w:spacing w:after="120" w:before="240"/>
+      </w:pPr>
+      <w:r>
+        <w:rPr>
+          <w:rFonts w:ascii="Arial" w:cs="Arial" w:eastAsia="Arial" w:hAnsi="Arial"/>
+          <w:b/>
+          <w:bCs/>
+          <w:color w:val="1F3864"/>
+          <w:sz w:val="22"/>
+          <w:szCs w:val="22"/>
+        </w:rPr>
+        <w:t xml:space="preserve">10.3.2 business_object_discovery</w:t>
+      </w:r>
+    </w:p>
+    <w:p>
+      <w:pPr>
+        <w:spacing w:after="160"/>
+      </w:pPr>
+      <w:r>
+        <w:rPr>
+          <w:rFonts w:ascii="Arial" w:cs="Arial" w:eastAsia="Arial" w:hAnsi="Arial"/>
+          <w:color w:val="000000"/>
+          <w:sz w:val="22"/>
+          <w:szCs w:val="22"/>
+        </w:rPr>
+        <w:t xml:space="preserve">The Prompt Generator reconstructs the Master PRD’s content from structured database records. The Context section contains: Client.organization_overview (the narrative prose describing the organization’s mission, operating context, and CRM rationale); all Domain records with name, code, description, and sort_order, presented hierarchically with sub-domains nested under parents and services in a separate subsection; all Process records grouped by domain and sub-domain with name, code, description, and dependency order; and all Persona records with name, description, and primary domains.</w:t>
+      </w:r>
+    </w:p>
+    <w:p>
+      <w:pPr>
+        <w:pStyle w:val="Heading3"/>
+        <w:spacing w:after="120" w:before="240"/>
+      </w:pPr>
+      <w:r>
+        <w:rPr>
+          <w:rFonts w:ascii="Arial" w:cs="Arial" w:eastAsia="Arial" w:hAnsi="Arial"/>
+          <w:b/>
+          <w:bCs/>
+          <w:color w:val="1F3864"/>
+          <w:sz w:val="22"/>
+          <w:szCs w:val="22"/>
+        </w:rPr>
+        <w:t xml:space="preserve">10.3.3 entity_prd</w:t>
+      </w:r>
+    </w:p>
+    <w:p>
+      <w:pPr>
+        <w:spacing w:after="160"/>
+      </w:pPr>
+      <w:r>
+        <w:rPr>
+          <w:rFonts w:ascii="Arial" w:cs="Arial" w:eastAsia="Arial" w:hAnsi="Arial"/>
+          <w:color w:val="000000"/>
+          <w:sz w:val="22"/>
+          <w:szCs w:val="22"/>
+        </w:rPr>
+        <w:t xml:space="preserve">The Context section contains: all Domain records with descriptions; all Process records with descriptions; the target entity’s BusinessObject record with name, classification, and description; all Entity records with name, purpose, entity_type, native/custom status, and primary_domain_id (the Entity Inventory equivalent); for each previously completed entity, its Field records (with is_native flag), FieldOption records, and Relationship records (the equivalent of uploading prior Entity PRDs); and the target entity’s participation data including primary domain and additional domains.</w:t>
+      </w:r>
+    </w:p>
+    <w:p>
+      <w:pPr>
+        <w:pStyle w:val="Heading3"/>
+        <w:spacing w:after="120" w:before="240"/>
+      </w:pPr>
+      <w:r>
+        <w:rPr>
+          <w:rFonts w:ascii="Arial" w:cs="Arial" w:eastAsia="Arial" w:hAnsi="Arial"/>
+          <w:b/>
+          <w:bCs/>
+          <w:color w:val="1F3864"/>
+          <w:sz w:val="22"/>
+          <w:szCs w:val="22"/>
+        </w:rPr>
+        <w:t xml:space="preserve">10.3.4 domain_overview</w:t>
+      </w:r>
+    </w:p>
+    <w:p>
+      <w:pPr>
+        <w:spacing w:after="160"/>
+      </w:pPr>
+      <w:r>
+        <w:rPr>
+          <w:rFonts w:ascii="Arial" w:cs="Arial" w:eastAsia="Arial" w:hAnsi="Arial"/>
+          <w:color w:val="000000"/>
+          <w:sz w:val="22"/>
+          <w:szCs w:val="22"/>
+        </w:rPr>
+        <w:t xml:space="preserve">The Context section contains: Client.organization_overview; the target Domain record with name, code, and description; if the target is a sub-domain, the parent Domain record; all Process records for this domain with name, code, description, and sort_order; Persona records participating in this domain; Entity records whose primary_domain_id matches this domain plus entities linked through ProcessEntity cross-references, with their Field, FieldOption, and Relationship data; and Cross-Domain Service Domain records with descriptions.</w:t>
+      </w:r>
+    </w:p>
+    <w:p>
+      <w:pPr>
+        <w:spacing w:after="160"/>
+      </w:pPr>
+      <w:r>
+        <w:rPr>
+          <w:rFonts w:ascii="Arial" w:cs="Arial" w:eastAsia="Arial" w:hAnsi="Arial"/>
+          <w:color w:val="000000"/>
+          <w:sz w:val="22"/>
+          <w:szCs w:val="22"/>
+        </w:rPr>
+        <w:t xml:space="preserve">For a parent domain overview of a domain with sub-domains, the context also includes the sub-domain Domain records with their names, codes, descriptions, and process inventories. For a sub-domain overview, the context adds the parent Domain’s domain_overview_text as supplementary context.</w:t>
+      </w:r>
+    </w:p>
+    <w:p>
+      <w:pPr>
+        <w:pStyle w:val="Heading3"/>
+        <w:spacing w:after="120" w:before="240"/>
+      </w:pPr>
+      <w:r>
+        <w:rPr>
+          <w:rFonts w:ascii="Arial" w:cs="Arial" w:eastAsia="Arial" w:hAnsi="Arial"/>
+          <w:b/>
+          <w:bCs/>
+          <w:color w:val="1F3864"/>
+          <w:sz w:val="22"/>
+          <w:szCs w:val="22"/>
+        </w:rPr>
+        <w:t xml:space="preserve">10.3.5 process_definition</w:t>
+      </w:r>
+    </w:p>
+    <w:p>
+      <w:pPr>
+        <w:spacing w:after="160"/>
+      </w:pPr>
+      <w:r>
+        <w:rPr>
+          <w:rFonts w:ascii="Arial" w:cs="Arial" w:eastAsia="Arial" w:hAnsi="Arial"/>
+          <w:color w:val="000000"/>
+          <w:sz w:val="22"/>
+          <w:szCs w:val="22"/>
+        </w:rPr>
+        <w:t xml:space="preserve">The Context section contains: the domain’s domain_overview_text as the primary reference (for processes within a sub-domain, the sub-domain’s domain_overview_text is primary and the parent domain’s domain_overview_text is included as supplementary context labeled “Parent Domain Context”); all Persona records participating in this domain with their domain-specific roles; all Entity records relevant to this domain with their Field, FieldOption, and Relationship data; all previously completed Process records in this domain or sub-domain with their ProcessStep records, Requirement records, and ProcessEntity, ProcessField, and ProcessPersona cross-references; and Decision and OpenIssue records scoped to this domain and its previously completed processes.</w:t>
+      </w:r>
+    </w:p>
+    <w:p>
+      <w:pPr>
+        <w:pStyle w:val="Heading3"/>
+        <w:spacing w:after="120" w:before="240"/>
+      </w:pPr>
+      <w:r>
+        <w:rPr>
+          <w:rFonts w:ascii="Arial" w:cs="Arial" w:eastAsia="Arial" w:hAnsi="Arial"/>
+          <w:b/>
+          <w:bCs/>
+          <w:color w:val="1F3864"/>
+          <w:sz w:val="22"/>
+          <w:szCs w:val="22"/>
+        </w:rPr>
+        <w:t xml:space="preserve">10.3.6 domain_reconciliation</w:t>
+      </w:r>
+    </w:p>
+    <w:p>
+      <w:pPr>
+        <w:spacing w:after="160"/>
+      </w:pPr>
+      <w:r>
+        <w:rPr>
+          <w:rFonts w:ascii="Arial" w:cs="Arial" w:eastAsia="Arial" w:hAnsi="Arial"/>
+          <w:color w:val="000000"/>
+          <w:sz w:val="22"/>
+          <w:szCs w:val="22"/>
+        </w:rPr>
+        <w:t xml:space="preserve">The Context section contains: the domain’s domain_overview_text; all Process records in this domain with their full data including ProcessStep records, Requirement records, and all cross-references; all Entity records relevant to this domain with Field, FieldOption, and Relationship data; and all Decision and OpenIssue records scoped to this domain and its processes. For sub-domain reconciliation, the same structure applies scoped to the sub-domain. For parent domain reconciliation, the context includes the parent domain’s domain_overview_text plus each sub-domain’s domain_reconciliation_text and structured data.</w:t>
+      </w:r>
+    </w:p>
+    <w:p>
+      <w:pPr>
+        <w:pStyle w:val="Heading3"/>
+        <w:spacing w:after="120" w:before="240"/>
+      </w:pPr>
+      <w:r>
+        <w:rPr>
+          <w:rFonts w:ascii="Arial" w:cs="Arial" w:eastAsia="Arial" w:hAnsi="Arial"/>
+          <w:b/>
+          <w:bCs/>
+          <w:color w:val="1F3864"/>
+          <w:sz w:val="22"/>
+          <w:szCs w:val="22"/>
+        </w:rPr>
+        <w:t xml:space="preserve">10.3.7 yaml_generation</w:t>
+      </w:r>
+    </w:p>
+    <w:p>
+      <w:pPr>
+        <w:spacing w:after="160"/>
+      </w:pPr>
+      <w:r>
+        <w:rPr>
+          <w:rFonts w:ascii="Arial" w:cs="Arial" w:eastAsia="Arial" w:hAnsi="Arial"/>
+          <w:color w:val="000000"/>
+          <w:sz w:val="22"/>
+          <w:szCs w:val="22"/>
+        </w:rPr>
+        <w:t xml:space="preserve">The Context section contains: the domain’s domain_reconciliation_text; all Entity records relevant to this domain with full Field, FieldOption, and Relationship data; Layout data from LayoutPanel, LayoutRow, LayoutTab, and ListColumn tables; all Requirement records for this domain’s processes; all Decision records scoped to this domain; and entity, field, relationship, and layout data from previously completed domains assembled from the database into a YAML-like structure. The Prompt Generator derives this from the current database state rather than storing YAML output from prior sessions, ensuring the context always reflects current definitions.</w:t>
+      </w:r>
+    </w:p>
+    <w:p>
+      <w:pPr>
+        <w:pStyle w:val="Heading3"/>
+        <w:spacing w:after="120" w:before="240"/>
+      </w:pPr>
+      <w:r>
+        <w:rPr>
+          <w:rFonts w:ascii="Arial" w:cs="Arial" w:eastAsia="Arial" w:hAnsi="Arial"/>
+          <w:b/>
+          <w:bCs/>
+          <w:color w:val="1F3864"/>
+          <w:sz w:val="22"/>
+          <w:szCs w:val="22"/>
+        </w:rPr>
+        <w:t xml:space="preserve">10.3.8 crm_selection</w:t>
+      </w:r>
+    </w:p>
+    <w:p>
+      <w:pPr>
+        <w:spacing w:after="160"/>
+      </w:pPr>
+      <w:r>
+        <w:rPr>
+          <w:rFonts w:ascii="Arial" w:cs="Arial" w:eastAsia="Arial" w:hAnsi="Arial"/>
+          <w:color w:val="000000"/>
+          <w:sz w:val="22"/>
+          <w:szCs w:val="22"/>
+        </w:rPr>
+        <w:t xml:space="preserve">The Context section contains the broadest scope of any work item type: Client.organization_overview; all Domain records with domain_reconciliation_text; all Entity records with full Field, FieldOption, and Relationship data; all Requirement records across all domains; Layout data from all Layout tables; all Decision records across the entire project; and all implementation-relevant OpenIssue records.</w:t>
+      </w:r>
+    </w:p>
+    <w:p>
+      <w:pPr>
+        <w:pStyle w:val="Heading3"/>
+        <w:spacing w:after="120" w:before="240"/>
+      </w:pPr>
+      <w:r>
+        <w:rPr>
+          <w:rFonts w:ascii="Arial" w:cs="Arial" w:eastAsia="Arial" w:hAnsi="Arial"/>
+          <w:b/>
+          <w:bCs/>
+          <w:color w:val="1F3864"/>
+          <w:sz w:val="22"/>
+          <w:szCs w:val="22"/>
+        </w:rPr>
+        <w:t xml:space="preserve">10.3.9 crm_deployment</w:t>
+      </w:r>
+    </w:p>
+    <w:p>
+      <w:pPr>
+        <w:spacing w:after="160"/>
+      </w:pPr>
+      <w:r>
+        <w:rPr>
+          <w:rFonts w:ascii="Arial" w:cs="Arial" w:eastAsia="Arial" w:hAnsi="Arial"/>
+          <w:color w:val="000000"/>
+          <w:sz w:val="22"/>
+          <w:szCs w:val="22"/>
+        </w:rPr>
+        <w:t xml:space="preserve">The Context section contains: Client.organization_overview; Client.crm_platform (the selected CRM platform); entity and field scale summary including entity count, custom entity count, total field count, and relationship count; platform-specific deployment requirements from the crm_selection session results; and infrastructure-related Decision and OpenIssue records.</w:t>
+      </w:r>
+    </w:p>
+    <w:p>
+      <w:pPr>
+        <w:pStyle w:val="Heading2"/>
+        <w:spacing w:after="160" w:before="280"/>
+      </w:pPr>
+      <w:r>
+        <w:rPr>
+          <w:rFonts w:ascii="Arial" w:cs="Arial" w:eastAsia="Arial" w:hAnsi="Arial"/>
+          <w:b/>
+          <w:bCs/>
+          <w:color w:val="1F3864"/>
+          <w:sz w:val="24"/>
+          <w:szCs w:val="24"/>
+        </w:rPr>
+        <w:t xml:space="preserve">10.4 Decision and Issue Inclusion</w:t>
+      </w:r>
+    </w:p>
+    <w:p>
+      <w:pPr>
+        <w:spacing w:after="160"/>
+      </w:pPr>
+      <w:r>
+        <w:rPr>
+          <w:rFonts w:ascii="Arial" w:cs="Arial" w:eastAsia="Arial" w:hAnsi="Arial"/>
+          <w:color w:val="000000"/>
+          <w:sz w:val="22"/>
+          <w:szCs w:val="22"/>
+        </w:rPr>
+        <w:t xml:space="preserve">Decision and OpenIssue records are included based on a relevance cascade that matches scope to the work item type. Records are included if any of their scoping foreign keys (domain_id, entity_id, process_id, field_id, requirement_id, business_object_id) match the work item’s context.</w:t>
+      </w:r>
+    </w:p>
+    <w:p>
+      <w:pPr>
+        <w:spacing w:after="160"/>
+      </w:pPr>
+      <w:r>
+        <w:rPr>
+          <w:rFonts w:ascii="Arial" w:cs="Arial" w:eastAsia="Arial" w:hAnsi="Arial"/>
+          <w:color w:val="000000"/>
+          <w:sz w:val="22"/>
+          <w:szCs w:val="22"/>
+        </w:rPr>
+        <w:t xml:space="preserve">Global records — records with no scoping foreign keys set — are project-wide and included in all prompts except master_prd where no decisions or issues exist yet.</w:t>
+      </w:r>
+    </w:p>
+    <w:p>
+      <w:pPr>
+        <w:spacing w:after="160"/>
+      </w:pPr>
+      <w:r>
+        <w:rPr>
+          <w:rFonts w:ascii="Arial" w:cs="Arial" w:eastAsia="Arial" w:hAnsi="Arial"/>
+          <w:color w:val="000000"/>
+          <w:sz w:val="22"/>
+          <w:szCs w:val="22"/>
+        </w:rPr>
+        <w:t xml:space="preserve">Inclusion rules by work item type: master_prd includes none (no decisions exist at project start). business_object_discovery includes global only. entity_prd includes global, plus records scoped to the target entity, plus records scoped to the entity’s primary domain. domain_overview includes global plus domain-scoped records. process_definition includes global, domain-scoped, process-scoped, and records scoped to any entity involved in this process. domain_reconciliation includes global plus all domain-scoped, process-scoped, and entity-scoped records within the domain. yaml_generation uses the same rules as domain_reconciliation. crm_selection includes all Decision and OpenIssue records across the entire project. crm_deployment includes global plus deployment or infrastructure-scoped records.</w:t>
+      </w:r>
+    </w:p>
+    <w:p>
+      <w:pPr>
+        <w:spacing w:after="160"/>
+      </w:pPr>
+      <w:r>
+        <w:rPr>
+          <w:rFonts w:ascii="Arial" w:cs="Arial" w:eastAsia="Arial" w:hAnsi="Arial"/>
+          <w:color w:val="000000"/>
+          <w:sz w:val="22"/>
+          <w:szCs w:val="22"/>
+        </w:rPr>
+        <w:t xml:space="preserve">Decisions are presented under a “Locked Decisions — do not reopen” header. Open issues are presented under an “Open Issues — attempt to resolve or note impact” header. This distinction makes the AI’s expected behavior explicit: respect locked decisions, attempt to resolve or work around open issues.</w:t>
+      </w:r>
+    </w:p>
+    <w:p>
+      <w:pPr>
+        <w:pStyle w:val="Heading2"/>
+        <w:spacing w:after="160" w:before="280"/>
+      </w:pPr>
+      <w:r>
+        <w:rPr>
+          <w:rFonts w:ascii="Arial" w:cs="Arial" w:eastAsia="Arial" w:hAnsi="Arial"/>
+          <w:b/>
+          <w:bCs/>
+          <w:color w:val="1F3864"/>
+          <w:sz w:val="24"/>
+          <w:szCs w:val="24"/>
+        </w:rPr>
+        <w:t xml:space="preserve">10.5 Structured Output Format</w:t>
+      </w:r>
+    </w:p>
+    <w:p>
+      <w:pPr>
+        <w:spacing w:after="160"/>
+      </w:pPr>
+      <w:r>
+        <w:rPr>
+          <w:rFonts w:ascii="Arial" w:cs="Arial" w:eastAsia="Arial" w:hAnsi="Arial"/>
+          <w:color w:val="000000"/>
+          <w:sz w:val="22"/>
+          <w:szCs w:val="22"/>
+        </w:rPr>
+        <w:t xml:space="preserve">AI sessions produce a JSON block at the end of each conversation for the Import Processor to parse. JSON is chosen for parsing reliability over human readability. The administrator verifies imported data through the Import Processor’s review screen, not by reading the raw JSON.</w:t>
+      </w:r>
+    </w:p>
+    <w:p>
+      <w:pPr>
+        <w:pStyle w:val="Heading3"/>
+        <w:spacing w:after="120" w:before="240"/>
+      </w:pPr>
+      <w:r>
+        <w:rPr>
+          <w:rFonts w:ascii="Arial" w:cs="Arial" w:eastAsia="Arial" w:hAnsi="Arial"/>
+          <w:b/>
+          <w:bCs/>
+          <w:color w:val="1F3864"/>
+          <w:sz w:val="22"/>
+          <w:szCs w:val="22"/>
+        </w:rPr>
+        <w:t xml:space="preserve">10.5.1 Common Envelope</w:t>
+      </w:r>
+    </w:p>
+    <w:p>
+      <w:pPr>
+        <w:spacing w:after="160"/>
+      </w:pPr>
+      <w:r>
+        <w:rPr>
+          <w:rFonts w:ascii="Arial" w:cs="Arial" w:eastAsia="Arial" w:hAnsi="Arial"/>
+          <w:color w:val="000000"/>
+          <w:sz w:val="22"/>
+          <w:szCs w:val="22"/>
+        </w:rPr>
+        <w:t xml:space="preserve">Every structured output uses a common envelope containing: output_version (string, enables schema evolution), work_item_type (string, tells the processor which payload schema to expect), work_item_id (integer, links output to the specific work item for audit), session_type (initial, revision, or clarification), payload (type-specific data object), decisions (array of new decisions made during the session), and open_issues (array of new or updated open issues). Decisions and open issues are extracted into top-level arrays because they follow a consistent structure across all work item types, allowing the Import Processor to handle them through a single code path.</w:t>
+      </w:r>
+    </w:p>
+    <w:p>
+      <w:pPr>
+        <w:pStyle w:val="Heading3"/>
+        <w:spacing w:after="120" w:before="240"/>
+      </w:pPr>
+      <w:r>
+        <w:rPr>
+          <w:rFonts w:ascii="Arial" w:cs="Arial" w:eastAsia="Arial" w:hAnsi="Arial"/>
+          <w:b/>
+          <w:bCs/>
+          <w:color w:val="1F3864"/>
+          <w:sz w:val="22"/>
+          <w:szCs w:val="22"/>
+        </w:rPr>
+        <w:t xml:space="preserve">10.5.2 Type-Specific Payloads</w:t>
+      </w:r>
+    </w:p>
+    <w:p>
+      <w:pPr>
+        <w:spacing w:after="160"/>
+      </w:pPr>
+      <w:r>
+        <w:rPr>
+          <w:rFonts w:ascii="Arial" w:cs="Arial" w:eastAsia="Arial" w:hAnsi="Arial"/>
+          <w:color w:val="000000"/>
+          <w:sz w:val="22"/>
+          <w:szCs w:val="22"/>
+        </w:rPr>
+        <w:t xml:space="preserve">Each work item type defines the data categories its payload contains. Exact field-level JSON schemas are defined during implementation.</w:t>
+      </w:r>
+    </w:p>
+    <w:p>
+      <w:pPr>
+        <w:spacing w:after="160"/>
+      </w:pPr>
+      <w:r>
+        <w:rPr>
+          <w:rFonts w:ascii="Arial" w:cs="Arial" w:eastAsia="Arial" w:hAnsi="Arial"/>
+          <w:b/>
+          <w:bCs/>
+          <w:color w:val="000000"/>
+          <w:sz w:val="22"/>
+          <w:szCs w:val="22"/>
+        </w:rPr>
+        <w:t xml:space="preserve">master_prd: </w:t>
+      </w:r>
+      <w:r>
+        <w:rPr>
+          <w:rFonts w:ascii="Arial" w:cs="Arial" w:eastAsia="Arial" w:hAnsi="Arial"/>
+          <w:color w:val="000000"/>
+          <w:sz w:val="22"/>
+          <w:szCs w:val="22"/>
+        </w:rPr>
+        <w:t xml:space="preserve">Organization overview narrative. Personas with name, description, responsibilities, CRM capabilities, and identifiers. Domains with name, code, description, sort_order, and nested sub-domains where applicable. Processes per domain with name, code, description, sort_order, tier, business value, and key capabilities. Cross-Domain Services with name, description, capabilities, consuming domains, and owned entities. System scope with in-scope items, out-of-scope items, and integrations.</w:t>
+      </w:r>
+    </w:p>
+    <w:p>
+      <w:pPr>
+        <w:spacing w:after="160"/>
+      </w:pPr>
+      <w:r>
+        <w:rPr>
+          <w:rFonts w:ascii="Arial" w:cs="Arial" w:eastAsia="Arial" w:hAnsi="Arial"/>
+          <w:b/>
+          <w:bCs/>
+          <w:color w:val="000000"/>
+          <w:sz w:val="22"/>
+          <w:szCs w:val="22"/>
+        </w:rPr>
+        <w:t xml:space="preserve">business_object_discovery: </w:t>
+      </w:r>
+      <w:r>
+        <w:rPr>
+          <w:rFonts w:ascii="Arial" w:cs="Arial" w:eastAsia="Arial" w:hAnsi="Arial"/>
+          <w:color w:val="000000"/>
+          <w:sz w:val="22"/>
+          <w:szCs w:val="22"/>
+        </w:rPr>
+        <w:t xml:space="preserve">Business objects with name, description, source domains, source processes, and classification. For entity-classified objects: entity name, entity type, native/custom status, discriminator field and values. Entity participation data with primary domain, additional domains, and participating processes. Dependency order for entity definition interviews.</w:t>
+      </w:r>
+    </w:p>
+    <w:p>
+      <w:pPr>
+        <w:spacing w:after="160"/>
+      </w:pPr>
+      <w:r>
+        <w:rPr>
+          <w:rFonts w:ascii="Arial" w:cs="Arial" w:eastAsia="Arial" w:hAnsi="Arial"/>
+          <w:b/>
+          <w:bCs/>
+          <w:color w:val="000000"/>
+          <w:sz w:val="22"/>
+          <w:szCs w:val="22"/>
+        </w:rPr>
+        <w:t xml:space="preserve">entity_prd: </w:t>
+      </w:r>
+      <w:r>
+        <w:rPr>
+          <w:rFonts w:ascii="Arial" w:cs="Arial" w:eastAsia="Arial" w:hAnsi="Arial"/>
+          <w:color w:val="000000"/>
+          <w:sz w:val="22"/>
+          <w:szCs w:val="22"/>
+        </w:rPr>
+        <w:t xml:space="preserve">Entity metadata with entity type, native/custom status, contributing domains, discriminator details. Native fields with field name, PRD name, type, and referencing processes. Custom fields with full field-level detail including domain attribution, visibility rules, and implementation notes. Relationships with link types, labels, and domain attribution. Dynamic logic rules grouped by discriminator value. Layout guidance. Implementation notes.</w:t>
+      </w:r>
+    </w:p>
+    <w:p>
+      <w:pPr>
+        <w:spacing w:after="160"/>
+      </w:pPr>
+      <w:r>
+        <w:rPr>
+          <w:rFonts w:ascii="Arial" w:cs="Arial" w:eastAsia="Arial" w:hAnsi="Arial"/>
+          <w:b/>
+          <w:bCs/>
+          <w:color w:val="000000"/>
+          <w:sz w:val="22"/>
+          <w:szCs w:val="22"/>
+        </w:rPr>
+        <w:t xml:space="preserve">domain_overview: </w:t>
+      </w:r>
+      <w:r>
+        <w:rPr>
+          <w:rFonts w:ascii="Arial" w:cs="Arial" w:eastAsia="Arial" w:hAnsi="Arial"/>
+          <w:color w:val="000000"/>
+          <w:sz w:val="22"/>
+          <w:szCs w:val="22"/>
+        </w:rPr>
+        <w:t xml:space="preserve">Domain purpose narrative. Personas with identifier and domain-specific role. Business process inventory with dependency ordering and lifecycle narrative. Data reference with entity identifiers, referenced fields, and usage notes. For parent domain overviews: sub-domain structure rationale, cross-sub-domain relationships, and oversight requirements.</w:t>
+      </w:r>
+    </w:p>
+    <w:p>
+      <w:pPr>
+        <w:spacing w:after="160"/>
+      </w:pPr>
+      <w:r>
+        <w:rPr>
+          <w:rFonts w:ascii="Arial" w:cs="Arial" w:eastAsia="Arial" w:hAnsi="Arial"/>
+          <w:b/>
+          <w:bCs/>
+          <w:color w:val="000000"/>
+          <w:sz w:val="22"/>
+          <w:szCs w:val="22"/>
+        </w:rPr>
+        <w:t xml:space="preserve">process_definition: </w:t>
+      </w:r>
+      <w:r>
+        <w:rPr>
+          <w:rFonts w:ascii="Arial" w:cs="Arial" w:eastAsia="Arial" w:hAnsi="Arial"/>
+          <w:color w:val="000000"/>
+          <w:sz w:val="22"/>
+          <w:szCs w:val="22"/>
+        </w:rPr>
+        <w:t xml:space="preserve">Process purpose. Process triggers with preconditions, required data, initiation mechanism, and initiating persona. Personas with identifier and role. Process workflow as ordered steps with decision points and status transitions. Process completion with end states and handoffs. System requirements with identifiers. Process data grouped by entity with field references. Data collected grouped by entity with new field definitions. Updates to prior documents. Interview transcript.</w:t>
+      </w:r>
+    </w:p>
+    <w:p>
+      <w:pPr>
+        <w:spacing w:after="160"/>
+      </w:pPr>
+      <w:r>
+        <w:rPr>
+          <w:rFonts w:ascii="Arial" w:cs="Arial" w:eastAsia="Arial" w:hAnsi="Arial"/>
+          <w:b/>
+          <w:bCs/>
+          <w:color w:val="000000"/>
+          <w:sz w:val="22"/>
+          <w:szCs w:val="22"/>
+        </w:rPr>
+        <w:t xml:space="preserve">domain_reconciliation: </w:t>
+      </w:r>
+      <w:r>
+        <w:rPr>
+          <w:rFonts w:ascii="Arial" w:cs="Arial" w:eastAsia="Arial" w:hAnsi="Arial"/>
+          <w:color w:val="000000"/>
+          <w:sz w:val="22"/>
+          <w:szCs w:val="22"/>
+        </w:rPr>
+        <w:t xml:space="preserve">Domain overview narrative. Personas with consolidated role. Conflict resolutions with affected items. Consolidated data reference grouped by entity with deduplicated fields. Cross-process gaps. For parent reconciliation: cross-sub-domain consistency resolutions and shared entity usage reconciliation.</w:t>
+      </w:r>
+    </w:p>
+    <w:p>
+      <w:pPr>
+        <w:spacing w:after="160"/>
+      </w:pPr>
+      <w:r>
+        <w:rPr>
+          <w:rFonts w:ascii="Arial" w:cs="Arial" w:eastAsia="Arial" w:hAnsi="Arial"/>
+          <w:b/>
+          <w:bCs/>
+          <w:color w:val="000000"/>
+          <w:sz w:val="22"/>
+          <w:szCs w:val="22"/>
+        </w:rPr>
+        <w:t xml:space="preserve">yaml_generation: </w:t>
+      </w:r>
+      <w:r>
+        <w:rPr>
+          <w:rFonts w:ascii="Arial" w:cs="Arial" w:eastAsia="Arial" w:hAnsi="Arial"/>
+          <w:color w:val="000000"/>
+          <w:sz w:val="22"/>
+          <w:szCs w:val="22"/>
+        </w:rPr>
+        <w:t xml:space="preserve">Entity configurations with implementation-specific detail. Relationship configurations. Layout definitions per entity. Resolved and unresolved exceptions.</w:t>
+      </w:r>
+    </w:p>
+    <w:p>
+      <w:pPr>
+        <w:spacing w:after="160"/>
+      </w:pPr>
+      <w:r>
+        <w:rPr>
+          <w:rFonts w:ascii="Arial" w:cs="Arial" w:eastAsia="Arial" w:hAnsi="Arial"/>
+          <w:b/>
+          <w:bCs/>
+          <w:color w:val="000000"/>
+          <w:sz w:val="22"/>
+          <w:szCs w:val="22"/>
+        </w:rPr>
+        <w:t xml:space="preserve">crm_selection: </w:t>
+      </w:r>
+      <w:r>
+        <w:rPr>
+          <w:rFonts w:ascii="Arial" w:cs="Arial" w:eastAsia="Arial" w:hAnsi="Arial"/>
+          <w:color w:val="000000"/>
+          <w:sz w:val="22"/>
+          <w:szCs w:val="22"/>
+        </w:rPr>
+        <w:t xml:space="preserve">Recommended platforms with summary, strengths, tradeoffs, and cost considerations. Requirements coverage assessment per platform. Platform-specific risks with severity and mitigation.</w:t>
+      </w:r>
+    </w:p>
+    <w:p>
+      <w:pPr>
+        <w:spacing w:after="160"/>
+      </w:pPr>
+      <w:r>
+        <w:rPr>
+          <w:rFonts w:ascii="Arial" w:cs="Arial" w:eastAsia="Arial" w:hAnsi="Arial"/>
+          <w:b/>
+          <w:bCs/>
+          <w:color w:val="000000"/>
+          <w:sz w:val="22"/>
+          <w:szCs w:val="22"/>
+        </w:rPr>
+        <w:t xml:space="preserve">crm_deployment: </w:t>
+      </w:r>
+      <w:r>
+        <w:rPr>
+          <w:rFonts w:ascii="Arial" w:cs="Arial" w:eastAsia="Arial" w:hAnsi="Arial"/>
+          <w:color w:val="000000"/>
+          <w:sz w:val="22"/>
+          <w:szCs w:val="22"/>
+        </w:rPr>
+        <w:t xml:space="preserve">Deployment plan with provisioning steps and server requirements. Infrastructure decisions. Platform-specific notes. Open items.</w:t>
+      </w:r>
+    </w:p>
+    <w:p>
+      <w:pPr>
+        <w:pStyle w:val="Heading2"/>
+        <w:spacing w:after="160" w:before="280"/>
+      </w:pPr>
+      <w:r>
+        <w:rPr>
+          <w:rFonts w:ascii="Arial" w:cs="Arial" w:eastAsia="Arial" w:hAnsi="Arial"/>
+          <w:b/>
+          <w:bCs/>
+          <w:color w:val="1F3864"/>
+          <w:sz w:val="24"/>
+          <w:szCs w:val="24"/>
+        </w:rPr>
+        <w:t xml:space="preserve">10.6 Session Type Variations</w:t>
+      </w:r>
+    </w:p>
+    <w:p>
+      <w:pPr>
+        <w:pStyle w:val="Heading3"/>
+        <w:spacing w:after="120" w:before="240"/>
+      </w:pPr>
+      <w:r>
+        <w:rPr>
+          <w:rFonts w:ascii="Arial" w:cs="Arial" w:eastAsia="Arial" w:hAnsi="Arial"/>
+          <w:b/>
+          <w:bCs/>
+          <w:color w:val="1F3864"/>
+          <w:sz w:val="22"/>
+          <w:szCs w:val="22"/>
+        </w:rPr>
+        <w:t xml:space="preserve">10.6.1 Initial Sessions</w:t>
+      </w:r>
+    </w:p>
+    <w:p>
+      <w:pPr>
+        <w:spacing w:after="160"/>
+      </w:pPr>
+      <w:r>
+        <w:rPr>
+          <w:rFonts w:ascii="Arial" w:cs="Arial" w:eastAsia="Arial" w:hAnsi="Arial"/>
+          <w:color w:val="000000"/>
+          <w:sz w:val="22"/>
+          <w:szCs w:val="22"/>
+        </w:rPr>
+        <w:t xml:space="preserve">Initial sessions use the standard six-section prompt structure with context assembled from the current database state. The Session Instructions contain the full prompt-optimized interview guide. The Structured Output Specification requires a complete payload for the work item type.</w:t>
+      </w:r>
+    </w:p>
+    <w:p>
+      <w:pPr>
+        <w:pStyle w:val="Heading3"/>
+        <w:spacing w:after="120" w:before="240"/>
+      </w:pPr>
+      <w:r>
+        <w:rPr>
+          <w:rFonts w:ascii="Arial" w:cs="Arial" w:eastAsia="Arial" w:hAnsi="Arial"/>
+          <w:b/>
+          <w:bCs/>
+          <w:color w:val="1F3864"/>
+          <w:sz w:val="22"/>
+          <w:szCs w:val="22"/>
+        </w:rPr>
+        <w:t xml:space="preserve">10.6.2 Revision Sessions</w:t>
+      </w:r>
+    </w:p>
+    <w:p>
+      <w:pPr>
+        <w:spacing w:after="160"/>
+      </w:pPr>
+      <w:r>
+        <w:rPr>
+          <w:rFonts w:ascii="Arial" w:cs="Arial" w:eastAsia="Arial" w:hAnsi="Arial"/>
+          <w:color w:val="000000"/>
+          <w:sz w:val="22"/>
+          <w:szCs w:val="22"/>
+        </w:rPr>
+        <w:t xml:space="preserve">When a completed work item is reopened for revision, the Prompt Generator assembles a revision prompt using the same six-section structure with three modifications.</w:t>
+      </w:r>
+    </w:p>
+    <w:p>
+      <w:pPr>
+        <w:spacing w:after="160"/>
+      </w:pPr>
+      <w:r>
+        <w:rPr>
+          <w:rFonts w:ascii="Arial" w:cs="Arial" w:eastAsia="Arial" w:hAnsi="Arial"/>
+          <w:color w:val="000000"/>
+          <w:sz w:val="22"/>
+          <w:szCs w:val="22"/>
+        </w:rPr>
+        <w:t xml:space="preserve">The Session Header includes session_type “revision” and the revision reason — why the work item is being reopened. The revision reason may originate from stakeholder feedback, an upstream scope change, an impact analysis finding, or an administrator-initiated correction.</w:t>
+      </w:r>
+    </w:p>
+    <w:p>
+      <w:pPr>
+        <w:spacing w:after="160"/>
+      </w:pPr>
+      <w:r>
+        <w:rPr>
+          <w:rFonts w:ascii="Arial" w:cs="Arial" w:eastAsia="Arial" w:hAnsi="Arial"/>
+          <w:color w:val="000000"/>
+          <w:sz w:val="22"/>
+          <w:szCs w:val="22"/>
+        </w:rPr>
+        <w:t xml:space="preserve">The Session Instructions include the prompt-optimized guide with a revision preamble instructing the AI to treat the existing database data as the baseline and focus on the specified changes rather than conducting a full session from scratch.</w:t>
+      </w:r>
+    </w:p>
+    <w:p>
+      <w:pPr>
+        <w:spacing w:after="160"/>
+      </w:pPr>
+      <w:r>
+        <w:rPr>
+          <w:rFonts w:ascii="Arial" w:cs="Arial" w:eastAsia="Arial" w:hAnsi="Arial"/>
+          <w:color w:val="000000"/>
+          <w:sz w:val="22"/>
+          <w:szCs w:val="22"/>
+        </w:rPr>
+        <w:t xml:space="preserve">The Context section assembles data using the same rules as the initial session, but the database now contains the results of the initial session. The AI sees the current state as baseline. The prompt also includes specific change instructions provided by the administrator when reopening the work item. The Structured Output Specification uses the same JSON envelope and payload format. The Import Processor handles revision output as updates to existing records rather than new record creation.</w:t>
+      </w:r>
+    </w:p>
+    <w:p>
+      <w:pPr>
+        <w:pStyle w:val="Heading3"/>
+        <w:spacing w:after="120" w:before="240"/>
+      </w:pPr>
+      <w:r>
+        <w:rPr>
+          <w:rFonts w:ascii="Arial" w:cs="Arial" w:eastAsia="Arial" w:hAnsi="Arial"/>
+          <w:b/>
+          <w:bCs/>
+          <w:color w:val="1F3864"/>
+          <w:sz w:val="22"/>
+          <w:szCs w:val="22"/>
+        </w:rPr>
+        <w:t xml:space="preserve">10.6.3 Clarification Sessions</w:t>
+      </w:r>
+    </w:p>
+    <w:p>
+      <w:pPr>
+        <w:spacing w:after="160"/>
+      </w:pPr>
+      <w:r>
+        <w:rPr>
+          <w:rFonts w:ascii="Arial" w:cs="Arial" w:eastAsia="Arial" w:hAnsi="Arial"/>
+          <w:color w:val="000000"/>
+          <w:sz w:val="22"/>
+          <w:szCs w:val="22"/>
+        </w:rPr>
+        <w:t xml:space="preserve">Clarification sessions do not reopen the work item. The administrator asks follow-up questions about a completed session without changing its status.</w:t>
+      </w:r>
+    </w:p>
+    <w:p>
+      <w:pPr>
+        <w:spacing w:after="160"/>
+      </w:pPr>
+      <w:r>
+        <w:rPr>
+          <w:rFonts w:ascii="Arial" w:cs="Arial" w:eastAsia="Arial" w:hAnsi="Arial"/>
+          <w:color w:val="000000"/>
+          <w:sz w:val="22"/>
+          <w:szCs w:val="22"/>
+        </w:rPr>
+        <w:t xml:space="preserve">The Session Header includes session_type “clarification” and the administrator’s question or topic. The Session Instructions are minimal — no interview guide is included. The instructions direct the AI to answer based on the provided context and to produce structured output only if the clarification reveals an error or needed change.</w:t>
+      </w:r>
+    </w:p>
+    <w:p>
+      <w:pPr>
+        <w:spacing w:after="160"/>
+      </w:pPr>
+      <w:r>
+        <w:rPr>
+          <w:rFonts w:ascii="Arial" w:cs="Arial" w:eastAsia="Arial" w:hAnsi="Arial"/>
+          <w:color w:val="000000"/>
+          <w:sz w:val="22"/>
+          <w:szCs w:val="22"/>
+        </w:rPr>
+        <w:t xml:space="preserve">The Context section includes the same data as the initial session plus the structured output from the initial session, stored in AISession.structured_output. This allows the AI to reference exactly what was produced. The Structured Output Specification is conditional — by default no structured output is required, but if the clarification reveals a correction, the AI should produce a structured output block following the standard format.</w:t>
+      </w:r>
+    </w:p>
+    <w:p>
+      <w:pPr>
+        <w:pStyle w:val="Heading2"/>
+        <w:spacing w:after="160" w:before="280"/>
+      </w:pPr>
+      <w:r>
+        <w:rPr>
+          <w:rFonts w:ascii="Arial" w:cs="Arial" w:eastAsia="Arial" w:hAnsi="Arial"/>
+          <w:b/>
+          <w:bCs/>
+          <w:color w:val="1F3864"/>
+          <w:sz w:val="24"/>
+          <w:szCs w:val="24"/>
+        </w:rPr>
+        <w:t xml:space="preserve">10.7 Interview Guide Selection</w:t>
+      </w:r>
+    </w:p>
+    <w:p>
+      <w:pPr>
+        <w:spacing w:after="160"/>
+      </w:pPr>
+      <w:r>
+        <w:rPr>
+          <w:rFonts w:ascii="Arial" w:cs="Arial" w:eastAsia="Arial" w:hAnsi="Arial"/>
+          <w:color w:val="000000"/>
+          <w:sz w:val="22"/>
+          <w:szCs w:val="22"/>
+        </w:rPr>
+        <w:t xml:space="preserve">Each prompt-capable work item type maps to exactly one prompt-optimized interview guide: master_prd maps to prompt-master-prd.md, business_object_discovery to prompt-business-object-discovery.md, entity_prd to prompt-entity-prd.md, domain_overview to prompt-domain-overview.md, process_definition to prompt-process-definition.md, domain_reconciliation to prompt-domain-reconciliation.md, yaml_generation to prompt-yaml-generation.md, crm_selection to prompt-crm-selection.md, and crm_deployment to prompt-crm-deployment.md.</w:t>
+      </w:r>
+    </w:p>
+    <w:p>
+      <w:pPr>
+        <w:spacing w:after="160"/>
+      </w:pPr>
+      <w:r>
+        <w:rPr>
+          <w:rFonts w:ascii="Arial" w:cs="Arial" w:eastAsia="Arial" w:hAnsi="Arial"/>
+          <w:color w:val="000000"/>
+          <w:sz w:val="22"/>
+          <w:szCs w:val="22"/>
+        </w:rPr>
+        <w:t xml:space="preserve">Prompt-optimized guides are stored in the crmbuilder repository at PRDs/process/interviews/prompt-optimized/. Each file carries a source_version reference in its header identifying the version of the source guide it was derived from. The application reads the appropriate guide from this directory at prompt generation time.</w:t>
+      </w:r>
+    </w:p>
+    <w:p>
+      <w:pPr>
+        <w:spacing w:after="160"/>
+      </w:pPr>
+      <w:r>
+        <w:rPr>
+          <w:rFonts w:ascii="Arial" w:cs="Arial" w:eastAsia="Arial" w:hAnsi="Arial"/>
+          <w:color w:val="000000"/>
+          <w:sz w:val="22"/>
+          <w:szCs w:val="22"/>
+        </w:rPr>
+        <w:t xml:space="preserve">When a source guide’s version advances past the source_version referenced in the prompt-optimized guide, the system flags the prompt-optimized guide as stale. The administrator updates the prompt-optimized guide before generating new prompts for that work item type.</w:t>
+      </w:r>
+    </w:p>
+    <w:p>
+      <w:pPr>
+        <w:spacing w:after="160"/>
+      </w:pPr>
+      <w:r>
+        <w:rPr>
+          <w:rFonts w:ascii="Arial" w:cs="Arial" w:eastAsia="Arial" w:hAnsi="Arial"/>
+          <w:color w:val="000000"/>
+          <w:sz w:val="22"/>
+          <w:szCs w:val="22"/>
+        </w:rPr>
+        <w:t xml:space="preserve">Four work item types do not yet have source guides: domain_overview, yaml_generation, crm_selection, and crm_deployment. These guides will be authored as part of the CRM Builder methodology.</w:t>
+      </w:r>
+    </w:p>
+    <w:p>
+      <w:pPr>
+        <w:pStyle w:val="Heading2"/>
+        <w:spacing w:after="160" w:before="280"/>
+      </w:pPr>
+      <w:r>
+        <w:rPr>
+          <w:rFonts w:ascii="Arial" w:cs="Arial" w:eastAsia="Arial" w:hAnsi="Arial"/>
+          <w:b/>
+          <w:bCs/>
+          <w:color w:val="1F3864"/>
+          <w:sz w:val="24"/>
+          <w:szCs w:val="24"/>
+        </w:rPr>
+        <w:t xml:space="preserve">10.8 Prompt Templates</w:t>
+      </w:r>
+    </w:p>
+    <w:p>
+      <w:pPr>
+        <w:spacing w:after="160"/>
+      </w:pPr>
+      <w:r>
+        <w:rPr>
+          <w:rFonts w:ascii="Arial" w:cs="Arial" w:eastAsia="Arial" w:hAnsi="Arial"/>
+          <w:color w:val="000000"/>
+          <w:sz w:val="22"/>
+          <w:szCs w:val="22"/>
+        </w:rPr>
+        <w:t xml:space="preserve">The Prompt Generator uses one template per work item type to assemble the final prompt. Each template defines the six-section structure with placeholder tokens for database-derived content and session-type-conditional sections.</w:t>
+      </w:r>
+    </w:p>
+    <w:p>
+      <w:pPr>
+        <w:spacing w:after="160"/>
+      </w:pPr>
+      <w:r>
+        <w:rPr>
+          <w:rFonts w:ascii="Arial" w:cs="Arial" w:eastAsia="Arial" w:hAnsi="Arial"/>
+          <w:color w:val="000000"/>
+          <w:sz w:val="22"/>
+          <w:szCs w:val="22"/>
+        </w:rPr>
+        <w:t xml:space="preserve">Templates are stored in the crmbuilder repository at PRDs/process/interviews/prompt-templates/template-{work_item_type}.md. Each template contains static text for section headers, behavioral instructions, and output format specifications; placeholder tokens that the Prompt Generator replaces with data read from the database; and session-type markers identifying content included only for initial, revision, or clarification sessions.</w:t>
+      </w:r>
+    </w:p>
+    <w:p>
+      <w:pPr>
+        <w:spacing w:after="160"/>
+      </w:pPr>
+      <w:r>
+        <w:rPr>
+          <w:rFonts w:ascii="Arial" w:cs="Arial" w:eastAsia="Arial" w:hAnsi="Arial"/>
+          <w:color w:val="000000"/>
+          <w:sz w:val="22"/>
+          <w:szCs w:val="22"/>
+        </w:rPr>
+        <w:t xml:space="preserve">The Prompt Generator reads the template for the work item type, fills all placeholder tokens with database-derived content, includes or excludes session-type-conditional sections based on the session type, and produces the final prompt as a copyable text block. Templates are versioned through Git alongside the prompt-optimized guides.</w:t>
+      </w:r>
+    </w:p>
+    <w:p>
+      <w:pPr>
+        <w:pStyle w:val="Heading2"/>
+        <w:spacing w:after="160" w:before="280"/>
+      </w:pPr>
+      <w:r>
+        <w:rPr>
+          <w:rFonts w:ascii="Arial" w:cs="Arial" w:eastAsia="Arial" w:hAnsi="Arial"/>
+          <w:b/>
+          <w:bCs/>
+          <w:color w:val="1F3864"/>
+          <w:sz w:val="24"/>
+          <w:szCs w:val="24"/>
+        </w:rPr>
+        <w:t xml:space="preserve">10.9 Context Size Management</w:t>
+      </w:r>
+    </w:p>
+    <w:p>
+      <w:pPr>
+        <w:spacing w:after="160"/>
+      </w:pPr>
+      <w:r>
+        <w:rPr>
+          <w:rFonts w:ascii="Arial" w:cs="Arial" w:eastAsia="Arial" w:hAnsi="Arial"/>
+          <w:color w:val="000000"/>
+          <w:sz w:val="22"/>
+          <w:szCs w:val="22"/>
+        </w:rPr>
+        <w:t xml:space="preserve">Claude has a finite context window. The Prompt Generator tracks estimated token count as it assembles context and applies progressive reduction strategies when approaching the limit.</w:t>
+      </w:r>
+    </w:p>
+    <w:p>
+      <w:pPr>
+        <w:pStyle w:val="Heading3"/>
+        <w:spacing w:after="120" w:before="240"/>
+      </w:pPr>
+      <w:r>
+        <w:rPr>
+          <w:rFonts w:ascii="Arial" w:cs="Arial" w:eastAsia="Arial" w:hAnsi="Arial"/>
+          <w:b/>
+          <w:bCs/>
+          <w:color w:val="1F3864"/>
+          <w:sz w:val="22"/>
+          <w:szCs w:val="22"/>
+        </w:rPr>
+        <w:t xml:space="preserve">10.9.1 Priority Tiers</w:t>
+      </w:r>
+    </w:p>
+    <w:p>
+      <w:pPr>
+        <w:spacing w:after="160"/>
+      </w:pPr>
+      <w:r>
+        <w:rPr>
+          <w:rFonts w:ascii="Arial" w:cs="Arial" w:eastAsia="Arial" w:hAnsi="Arial"/>
+          <w:color w:val="000000"/>
+          <w:sz w:val="22"/>
+          <w:szCs w:val="22"/>
+        </w:rPr>
+        <w:t xml:space="preserve">Context is assembled in four priority tiers. Higher-priority content is never reduced to make room for lower-priority content.</w:t>
+      </w:r>
+    </w:p>
+    <w:p>
+      <w:pPr>
+        <w:spacing w:after="160"/>
+      </w:pPr>
+      <w:r>
+        <w:rPr>
+          <w:rFonts w:ascii="Arial" w:cs="Arial" w:eastAsia="Arial" w:hAnsi="Arial"/>
+          <w:b/>
+          <w:bCs/>
+          <w:color w:val="000000"/>
+          <w:sz w:val="22"/>
+          <w:szCs w:val="22"/>
+        </w:rPr>
+        <w:t xml:space="preserve">Priority 1 — Never reduced. </w:t>
+      </w:r>
+      <w:r>
+        <w:rPr>
+          <w:rFonts w:ascii="Arial" w:cs="Arial" w:eastAsia="Arial" w:hAnsi="Arial"/>
+          <w:color w:val="000000"/>
+          <w:sz w:val="22"/>
+          <w:szCs w:val="22"/>
+        </w:rPr>
+        <w:t xml:space="preserve">Session Instructions (prompt-optimized guide), Session Header, and Structured Output Specification. These define the session’s behavior and output contract.</w:t>
+      </w:r>
+    </w:p>
+    <w:p>
+      <w:pPr>
+        <w:spacing w:after="160"/>
+      </w:pPr>
+      <w:r>
+        <w:rPr>
+          <w:rFonts w:ascii="Arial" w:cs="Arial" w:eastAsia="Arial" w:hAnsi="Arial"/>
+          <w:b/>
+          <w:bCs/>
+          <w:color w:val="000000"/>
+          <w:sz w:val="22"/>
+          <w:szCs w:val="22"/>
+        </w:rPr>
+        <w:t xml:space="preserve">Priority 2 — Reduced last. </w:t>
+      </w:r>
+      <w:r>
+        <w:rPr>
+          <w:rFonts w:ascii="Arial" w:cs="Arial" w:eastAsia="Arial" w:hAnsi="Arial"/>
+          <w:color w:val="000000"/>
+          <w:sz w:val="22"/>
+          <w:szCs w:val="22"/>
+        </w:rPr>
+        <w:t xml:space="preserve">Directly relevant data — the target entity’s fields for entity_prd, prior process data within the same domain or sub-domain for process_definition, the domain’s processes and entities for domain_reconciliation. This is the data the AI needs to perform the primary work.</w:t>
+      </w:r>
+    </w:p>
+    <w:p>
+      <w:pPr>
+        <w:spacing w:after="160"/>
+      </w:pPr>
+      <w:r>
+        <w:rPr>
+          <w:rFonts w:ascii="Arial" w:cs="Arial" w:eastAsia="Arial" w:hAnsi="Arial"/>
+          <w:b/>
+          <w:bCs/>
+          <w:color w:val="000000"/>
+          <w:sz w:val="22"/>
+          <w:szCs w:val="22"/>
+        </w:rPr>
+        <w:t xml:space="preserve">Priority 3 — Summarized if needed. </w:t>
+      </w:r>
+      <w:r>
+        <w:rPr>
+          <w:rFonts w:ascii="Arial" w:cs="Arial" w:eastAsia="Arial" w:hAnsi="Arial"/>
+          <w:color w:val="000000"/>
+          <w:sz w:val="22"/>
+          <w:szCs w:val="22"/>
+        </w:rPr>
+        <w:t xml:space="preserve">Adjacent context — entities from other domains, parent domain overview text for sub-domain processes, prior YAML-equivalent data from other domains for yaml_generation. Useful supplementary context but not the primary input.</w:t>
+      </w:r>
+    </w:p>
+    <w:p>
+      <w:pPr>
+        <w:spacing w:after="160"/>
+      </w:pPr>
+      <w:r>
+        <w:rPr>
+          <w:rFonts w:ascii="Arial" w:cs="Arial" w:eastAsia="Arial" w:hAnsi="Arial"/>
+          <w:b/>
+          <w:bCs/>
+          <w:color w:val="000000"/>
+          <w:sz w:val="22"/>
+          <w:szCs w:val="22"/>
+        </w:rPr>
+        <w:t xml:space="preserve">Priority 4 — Summarized first. </w:t>
+      </w:r>
+      <w:r>
+        <w:rPr>
+          <w:rFonts w:ascii="Arial" w:cs="Arial" w:eastAsia="Arial" w:hAnsi="Arial"/>
+          <w:color w:val="000000"/>
+          <w:sz w:val="22"/>
+          <w:szCs w:val="22"/>
+        </w:rPr>
+        <w:t xml:space="preserve">Background context — organization overview, global decisions not directly relevant to the work item, completed process data from early-in-sequence processes whose field contributions are already captured in entity data.</w:t>
+      </w:r>
+    </w:p>
+    <w:p>
+      <w:pPr>
+        <w:pStyle w:val="Heading3"/>
+        <w:spacing w:after="120" w:before="240"/>
+      </w:pPr>
+      <w:r>
+        <w:rPr>
+          <w:rFonts w:ascii="Arial" w:cs="Arial" w:eastAsia="Arial" w:hAnsi="Arial"/>
+          <w:b/>
+          <w:bCs/>
+          <w:color w:val="1F3864"/>
+          <w:sz w:val="22"/>
+          <w:szCs w:val="22"/>
+        </w:rPr>
+        <w:t xml:space="preserve">10.9.2 Reduction Strategies</w:t>
+      </w:r>
+    </w:p>
+    <w:p>
+      <w:pPr>
+        <w:spacing w:after="160"/>
+      </w:pPr>
+      <w:r>
+        <w:rPr>
+          <w:rFonts w:ascii="Arial" w:cs="Arial" w:eastAsia="Arial" w:hAnsi="Arial"/>
+          <w:color w:val="000000"/>
+          <w:sz w:val="22"/>
+          <w:szCs w:val="22"/>
+        </w:rPr>
+        <w:t xml:space="preserve">When the estimated token count approaches the context window limit, the Prompt Generator applies reduction strategies in order: (1) omit Priority 4 content or reduce to one-line summaries; (2) summarize Priority 3 content by replacing full field listings with field counts and key fields only; (3) truncate prior process detail within Priority 2 by including full detail for the most recent two to three processes and summaries for earlier ones; (4) if still over the limit, flag to the administrator that the prompt exceeds context capacity and suggest splitting the work or using a higher-capacity model.</w:t>
+      </w:r>
+    </w:p>
+    <w:p>
+      <w:pPr>
+        <w:pStyle w:val="Heading3"/>
+        <w:spacing w:after="120" w:before="240"/>
+      </w:pPr>
+      <w:r>
+        <w:rPr>
+          <w:rFonts w:ascii="Arial" w:cs="Arial" w:eastAsia="Arial" w:hAnsi="Arial"/>
+          <w:b/>
+          <w:bCs/>
+          <w:color w:val="1F3864"/>
+          <w:sz w:val="22"/>
+          <w:szCs w:val="22"/>
+        </w:rPr>
+        <w:t xml:space="preserve">10.9.3 Logging</w:t>
+      </w:r>
+    </w:p>
+    <w:p>
+      <w:pPr>
+        <w:spacing w:after="160"/>
+      </w:pPr>
+      <w:r>
+        <w:rPr>
+          <w:rFonts w:ascii="Arial" w:cs="Arial" w:eastAsia="Arial" w:hAnsi="Arial"/>
+          <w:color w:val="000000"/>
+          <w:sz w:val="22"/>
+          <w:szCs w:val="22"/>
+        </w:rPr>
+        <w:t xml:space="preserve">The Prompt Generator logs the estimated token count for each generated prompt and records any reduction strategies applied. This allows the administrator to understand what context was included and what was trimmed.</w:t>
+      </w:r>
+    </w:p>
+    <w:p>
+      <w:pPr>
+        <w:pStyle w:val="Heading2"/>
+        <w:spacing w:after="160" w:before="280"/>
+      </w:pPr>
+      <w:r>
+        <w:rPr>
+          <w:rFonts w:ascii="Arial" w:cs="Arial" w:eastAsia="Arial" w:hAnsi="Arial"/>
+          <w:b/>
+          <w:bCs/>
+          <w:color w:val="1F3864"/>
+          <w:sz w:val="24"/>
+          <w:szCs w:val="24"/>
+        </w:rPr>
+        <w:t xml:space="preserve">10.10 Schema Changes</w:t>
+      </w:r>
+    </w:p>
+    <w:p>
+      <w:pPr>
+        <w:spacing w:after="160"/>
+      </w:pPr>
+      <w:r>
+        <w:rPr>
+          <w:rFonts w:ascii="Arial" w:cs="Arial" w:eastAsia="Arial" w:hAnsi="Arial"/>
+          <w:color w:val="000000"/>
+          <w:sz w:val="22"/>
+          <w:szCs w:val="22"/>
+        </w:rPr>
+        <w:t xml:space="preserve">This section requires the following changes to the database schema defined in earlier sections.</w:t>
+      </w:r>
+    </w:p>
+    <w:p>
+      <w:pPr>
+        <w:spacing w:after="160"/>
+      </w:pPr>
+      <w:r>
+        <w:rPr>
+          <w:rFonts w:ascii="Arial" w:cs="Arial" w:eastAsia="Arial" w:hAnsi="Arial"/>
+          <w:b/>
+          <w:bCs/>
+          <w:color w:val="000000"/>
+          <w:sz w:val="22"/>
+          <w:szCs w:val="22"/>
+        </w:rPr>
+        <w:t xml:space="preserve">Domain table (Section 4.1): </w:t>
+      </w:r>
+      <w:r>
+        <w:rPr>
+          <w:rFonts w:ascii="Arial" w:cs="Arial" w:eastAsia="Arial" w:hAnsi="Arial"/>
+          <w:color w:val="000000"/>
+          <w:sz w:val="22"/>
+          <w:szCs w:val="22"/>
+        </w:rPr>
+        <w:t xml:space="preserve">New column parent_domain_id (INTEGER, nullable, FK to Domain.id) — top-level domains have NULL, sub-domains reference their parent. New column is_service (BOOLEAN, NOT NULL, default FALSE) — Cross-Domain Services are Domain records with is_service = TRUE. New column domain_overview_text (TEXT, nullable) — populated when a domain_overview session is imported. New column domain_reconciliation_text (TEXT, nullable) — populated when a domain_reconciliation session is imported.</w:t>
+      </w:r>
+    </w:p>
+    <w:p>
+      <w:pPr>
+        <w:spacing w:after="160"/>
+      </w:pPr>
+      <w:r>
+        <w:rPr>
+          <w:rFonts w:ascii="Arial" w:cs="Arial" w:eastAsia="Arial" w:hAnsi="Arial"/>
+          <w:b/>
+          <w:bCs/>
+          <w:color w:val="000000"/>
+          <w:sz w:val="22"/>
+          <w:szCs w:val="22"/>
+        </w:rPr>
+        <w:t xml:space="preserve">Entity table (Section 4.2): </w:t>
+      </w:r>
+      <w:r>
+        <w:rPr>
+          <w:rFonts w:ascii="Arial" w:cs="Arial" w:eastAsia="Arial" w:hAnsi="Arial"/>
+          <w:color w:val="000000"/>
+          <w:sz w:val="22"/>
+          <w:szCs w:val="22"/>
+        </w:rPr>
+        <w:t xml:space="preserve">New column primary_domain_id (INTEGER, nullable, FK to Domain.id) — captures the domain that owns the entity’s lifecycle, populated during business_object_discovery import.</w:t>
+      </w:r>
+    </w:p>
+    <w:p>
+      <w:pPr>
+        <w:spacing w:after="160"/>
+      </w:pPr>
+      <w:r>
+        <w:rPr>
+          <w:rFonts w:ascii="Arial" w:cs="Arial" w:eastAsia="Arial" w:hAnsi="Arial"/>
+          <w:b/>
+          <w:bCs/>
+          <w:color w:val="000000"/>
+          <w:sz w:val="22"/>
+          <w:szCs w:val="22"/>
+        </w:rPr>
+        <w:t xml:space="preserve">Field table (Section 4.3): </w:t>
+      </w:r>
+      <w:r>
+        <w:rPr>
+          <w:rFonts w:ascii="Arial" w:cs="Arial" w:eastAsia="Arial" w:hAnsi="Arial"/>
+          <w:color w:val="000000"/>
+          <w:sz w:val="22"/>
+          <w:szCs w:val="22"/>
+        </w:rPr>
+        <w:t xml:space="preserve">New column is_native (BOOLEAN, NOT NULL, default FALSE) — native fields are documented in Entity PRDs to prevent duplicate creation during YAML generation but are not created via YAML.</w:t>
+      </w:r>
+    </w:p>
+    <w:p>
+      <w:pPr>
+        <w:spacing w:after="160"/>
+      </w:pPr>
+      <w:r>
+        <w:rPr>
+          <w:rFonts w:ascii="Arial" w:cs="Arial" w:eastAsia="Arial" w:hAnsi="Arial"/>
+          <w:b/>
+          <w:bCs/>
+          <w:color w:val="000000"/>
+          <w:sz w:val="22"/>
+          <w:szCs w:val="22"/>
+        </w:rPr>
+        <w:t xml:space="preserve">Client table (Section 3.1, master database): </w:t>
+      </w:r>
+      <w:r>
+        <w:rPr>
+          <w:rFonts w:ascii="Arial" w:cs="Arial" w:eastAsia="Arial" w:hAnsi="Arial"/>
+          <w:color w:val="000000"/>
+          <w:sz w:val="22"/>
+          <w:szCs w:val="22"/>
+        </w:rPr>
+        <w:t xml:space="preserve">New column organization_overview (TEXT, nullable) — stores the narrative from the Master PRD’s Organization Overview section. New column crm_platform (TEXT, nullable) — stores the selected CRM platform after the administrator reviews the CRM Evaluation Report.</w:t>
+      </w:r>
+    </w:p>
+    <w:p>
+      <w:pPr>
+        <w:pStyle w:val="Heading1"/>
+        <w:spacing w:after="200" w:before="360"/>
+      </w:pPr>
+      <w:r>
+        <w:rPr>
+          <w:rFonts w:ascii="Arial" w:cs="Arial" w:eastAsia="Arial" w:hAnsi="Arial"/>
+          <w:b/>
+          <w:bCs/>
+          <w:color w:val="1F3864"/>
+          <w:sz w:val="28"/>
+          <w:szCs w:val="28"/>
+        </w:rPr>
+        <w:t xml:space="preserve">11. Import Processor</w:t>
+      </w:r>
+    </w:p>
+    <w:p>
+      <w:pPr>
         <w:spacing w:after="160"/>
       </w:pPr>
       <w:r>
@@ -31945,7 +33584,7 @@
           <w:sz w:val="22"/>
           <w:szCs w:val="22"/>
         </w:rPr>
-        <w:t xml:space="preserve">This section will be defined in a subsequent revision. It will cover how the application reads the database to assemble a complete AI session prompt, including context selection, decision and issue inclusion, interview guide references, and the structured output format the AI must produce.</w:t>
+        <w:t xml:space="preserve">This section will be defined in a subsequent revision. It will cover parsing structured AI output, mapping to database records, the review and confirmation workflow, handling partial imports, and conflict detection during import.</w:t>
       </w:r>
     </w:p>
     <w:p>
@@ -31962,7 +33601,7 @@
           <w:sz w:val="28"/>
           <w:szCs w:val="28"/>
         </w:rPr>
-        <w:t xml:space="preserve">11. Import Processor</w:t>
+        <w:t xml:space="preserve">12. Impact Analysis Engine</w:t>
       </w:r>
     </w:p>
     <w:p>
@@ -31978,7 +33617,7 @@
           <w:sz w:val="22"/>
           <w:szCs w:val="22"/>
         </w:rPr>
-        <w:t xml:space="preserve">This section will be defined in a subsequent revision. It will cover parsing structured AI output, mapping to database records, the review and confirmation workflow, handling partial imports, and conflict detection during import.</w:t>
+        <w:t xml:space="preserve">This section will be defined in a subsequent revision. It will cover dependency tracing, cross-reference queries, change propagation logic, the impact presentation format, and the review tracking workflow.</w:t>
       </w:r>
     </w:p>
     <w:p>
@@ -31995,7 +33634,7 @@
           <w:sz w:val="28"/>
           <w:szCs w:val="28"/>
         </w:rPr>
-        <w:t xml:space="preserve">12. Impact Analysis Engine</w:t>
+        <w:t xml:space="preserve">13. Document Generator</w:t>
       </w:r>
     </w:p>
     <w:p>
@@ -32011,7 +33650,7 @@
           <w:sz w:val="22"/>
           <w:szCs w:val="22"/>
         </w:rPr>
-        <w:t xml:space="preserve">This section will be defined in a subsequent revision. It will cover dependency tracing, cross-reference queries, change propagation logic, the impact presentation format, and the review tracking workflow.</w:t>
+        <w:t xml:space="preserve">This section will be defined in a subsequent revision. It will cover generating Entity PRDs, Process Documents, Domain PRDs, the Master PRD, and YAML program files from the current database state. It will also define staleness detection and regeneration triggers.</w:t>
       </w:r>
     </w:p>
     <w:p>
@@ -32028,7 +33667,7 @@
           <w:sz w:val="28"/>
           <w:szCs w:val="28"/>
         </w:rPr>
-        <w:t xml:space="preserve">13. Document Generator</w:t>
+        <w:t xml:space="preserve">14. User Interface</w:t>
       </w:r>
     </w:p>
     <w:p>
@@ -32044,7 +33683,7 @@
           <w:sz w:val="22"/>
           <w:szCs w:val="22"/>
         </w:rPr>
-        <w:t xml:space="preserve">This section will be defined in a subsequent revision. It will cover generating Entity PRDs, Process Documents, Domain PRDs, the Master PRD, and YAML program files from the current database state. It will also define staleness detection and regeneration triggers.</w:t>
+        <w:t xml:space="preserve">This section will be defined in a subsequent revision. It will cover the project dashboard, work item navigation, session orchestration screens, import review interface, impact analysis display, document generation controls, and integration with the existing CRM Builder deployment and configuration panels.</w:t>
       </w:r>
     </w:p>
     <w:p>
@@ -32061,7 +33700,24 @@
           <w:sz w:val="28"/>
           <w:szCs w:val="28"/>
         </w:rPr>
-        <w:t xml:space="preserve">14. User Interface</w:t>
+        <w:t xml:space="preserve">15. Decisions Made</w:t>
+      </w:r>
+    </w:p>
+    <w:p>
+      <w:pPr>
+        <w:pStyle w:val="Heading2"/>
+        <w:spacing w:after="160" w:before="280"/>
+      </w:pPr>
+      <w:r>
+        <w:rPr>
+          <w:rFonts w:ascii="Arial" w:cs="Arial" w:eastAsia="Arial" w:hAnsi="Arial"/>
+          <w:b/>
+          <w:bCs/>
+          <w:color w:val="1F3864"/>
+          <w:sz w:val="24"/>
+          <w:szCs w:val="24"/>
+        </w:rPr>
+        <w:t xml:space="preserve">15.1 Separate database per client (DEC-001)</w:t>
       </w:r>
     </w:p>
     <w:p>
@@ -32071,13 +33727,1003 @@
       <w:r>
         <w:rPr>
           <w:rFonts w:ascii="Arial" w:cs="Arial" w:eastAsia="Arial" w:hAnsi="Arial"/>
-          <w:i/>
-          <w:iCs/>
-          <w:color w:val="888888"/>
+          <w:color w:val="000000"/>
           <w:sz w:val="22"/>
           <w:szCs w:val="22"/>
         </w:rPr>
-        <w:t xml:space="preserve">This section will be defined in a subsequent revision. It will cover the project dashboard, work item navigation, session orchestration screens, import review interface, impact analysis display, document generation controls, and integration with the existing CRM Builder deployment and configuration panels.</w:t>
+        <w:t xml:space="preserve">Each client implementation gets its own SQLite database file. A master database stores the client list and paths. This provides clean isolation for backup, archival, and deletion.</w:t>
+      </w:r>
+    </w:p>
+    <w:p>
+      <w:pPr>
+        <w:pStyle w:val="Heading2"/>
+        <w:spacing w:after="160" w:before="280"/>
+      </w:pPr>
+      <w:r>
+        <w:rPr>
+          <w:rFonts w:ascii="Arial" w:cs="Arial" w:eastAsia="Arial" w:hAnsi="Arial"/>
+          <w:b/>
+          <w:bCs/>
+          <w:color w:val="1F3864"/>
+          <w:sz w:val="24"/>
+          <w:szCs w:val="24"/>
+        </w:rPr>
+        <w:t xml:space="preserve">15.2 AI sessions are external (DEC-002)</w:t>
+      </w:r>
+    </w:p>
+    <w:p>
+      <w:pPr>
+        <w:spacing w:after="160"/>
+      </w:pPr>
+      <w:r>
+        <w:rPr>
+          <w:rFonts w:ascii="Arial" w:cs="Arial" w:eastAsia="Arial" w:hAnsi="Arial"/>
+          <w:color w:val="000000"/>
+          <w:sz w:val="22"/>
+          <w:szCs w:val="22"/>
+        </w:rPr>
+        <w:t xml:space="preserve">AI conversations run in Claude.ai, not embedded in the application (Option B from the L1 PRD). The application generates prompts and imports structured results. This avoids building an inferior chat interface and leverages Claude.ai’s existing capabilities.</w:t>
+      </w:r>
+    </w:p>
+    <w:p>
+      <w:pPr>
+        <w:pStyle w:val="Heading2"/>
+        <w:spacing w:after="160" w:before="280"/>
+      </w:pPr>
+      <w:r>
+        <w:rPr>
+          <w:rFonts w:ascii="Arial" w:cs="Arial" w:eastAsia="Arial" w:hAnsi="Arial"/>
+          <w:b/>
+          <w:bCs/>
+          <w:color w:val="1F3864"/>
+          <w:sz w:val="24"/>
+          <w:szCs w:val="24"/>
+        </w:rPr>
+        <w:t xml:space="preserve">15.3 Entity belongs to client, not domain (DEC-003)</w:t>
+      </w:r>
+    </w:p>
+    <w:p>
+      <w:pPr>
+        <w:spacing w:after="160"/>
+      </w:pPr>
+      <w:r>
+        <w:rPr>
+          <w:rFonts w:ascii="Arial" w:cs="Arial" w:eastAsia="Arial" w:hAnsi="Arial"/>
+          <w:color w:val="000000"/>
+          <w:sz w:val="22"/>
+          <w:szCs w:val="22"/>
+        </w:rPr>
+        <w:t xml:space="preserve">Entities are scoped to the client, not to any specific domain. Cross-domain usage is captured through the ProcessEntity cross-reference table. This supports entities like Contact that are used across multiple domains.</w:t>
+      </w:r>
+    </w:p>
+    <w:p>
+      <w:pPr>
+        <w:pStyle w:val="Heading2"/>
+        <w:spacing w:after="160" w:before="280"/>
+      </w:pPr>
+      <w:r>
+        <w:rPr>
+          <w:rFonts w:ascii="Arial" w:cs="Arial" w:eastAsia="Arial" w:hAnsi="Arial"/>
+          <w:b/>
+          <w:bCs/>
+          <w:color w:val="1F3864"/>
+          <w:sz w:val="24"/>
+          <w:szCs w:val="24"/>
+        </w:rPr>
+        <w:t xml:space="preserve">15.4 BusinessObject as a staging table (DEC-004)</w:t>
+      </w:r>
+    </w:p>
+    <w:p>
+      <w:pPr>
+        <w:spacing w:after="160"/>
+      </w:pPr>
+      <w:r>
+        <w:rPr>
+          <w:rFonts w:ascii="Arial" w:cs="Arial" w:eastAsia="Arial" w:hAnsi="Arial"/>
+          <w:color w:val="000000"/>
+          <w:sz w:val="22"/>
+          <w:szCs w:val="22"/>
+        </w:rPr>
+        <w:t xml:space="preserve">BusinessObject captures everything discovered during Business Object Discovery as unclassified candidates. Each is classified as an entity, process, persona, field value, lifecycle state, relationship, or excluded. The resolution links to the resulting record in the appropriate table.</w:t>
+      </w:r>
+    </w:p>
+    <w:p>
+      <w:pPr>
+        <w:pStyle w:val="Heading2"/>
+        <w:spacing w:after="160" w:before="280"/>
+      </w:pPr>
+      <w:r>
+        <w:rPr>
+          <w:rFonts w:ascii="Arial" w:cs="Arial" w:eastAsia="Arial" w:hAnsi="Arial"/>
+          <w:b/>
+          <w:bCs/>
+          <w:color w:val="1F3864"/>
+          <w:sz w:val="24"/>
+          <w:szCs w:val="24"/>
+        </w:rPr>
+        <w:t xml:space="preserve">15.5 All changes go through managed process (DEC-005)</w:t>
+      </w:r>
+    </w:p>
+    <w:p>
+      <w:pPr>
+        <w:spacing w:after="160"/>
+      </w:pPr>
+      <w:r>
+        <w:rPr>
+          <w:rFonts w:ascii="Arial" w:cs="Arial" w:eastAsia="Arial" w:hAnsi="Arial"/>
+          <w:color w:val="000000"/>
+          <w:sz w:val="22"/>
+          <w:szCs w:val="22"/>
+        </w:rPr>
+        <w:t xml:space="preserve">No direct edits to the database. Every modification goes through impact analysis, requires confirmation, and is recorded in the audit trail. This ensures no change propagates without the administrator understanding and approving its downstream effects.</w:t>
+      </w:r>
+    </w:p>
+    <w:p>
+      <w:pPr>
+        <w:pStyle w:val="Heading2"/>
+        <w:spacing w:after="160" w:before="280"/>
+      </w:pPr>
+      <w:r>
+        <w:rPr>
+          <w:rFonts w:ascii="Arial" w:cs="Arial" w:eastAsia="Arial" w:hAnsi="Arial"/>
+          <w:b/>
+          <w:bCs/>
+          <w:color w:val="1F3864"/>
+          <w:sz w:val="24"/>
+          <w:szCs w:val="24"/>
+        </w:rPr>
+        <w:t xml:space="preserve">15.6 Cross-references support optional step-level granularity (DEC-006)</w:t>
+      </w:r>
+    </w:p>
+    <w:p>
+      <w:pPr>
+        <w:spacing w:after="160"/>
+      </w:pPr>
+      <w:r>
+        <w:rPr>
+          <w:rFonts w:ascii="Arial" w:cs="Arial" w:eastAsia="Arial" w:hAnsi="Arial"/>
+          <w:color w:val="000000"/>
+          <w:sz w:val="22"/>
+          <w:szCs w:val="22"/>
+        </w:rPr>
+        <w:t xml:space="preserve">ProcessField and ProcessEntity include a nullable process_step_id. When populated, impact analysis can identify the specific step affected. When null, the impact is reported at the process level.</w:t>
+      </w:r>
+    </w:p>
+    <w:p>
+      <w:pPr>
+        <w:pStyle w:val="Heading2"/>
+        <w:spacing w:after="160" w:before="280"/>
+      </w:pPr>
+      <w:r>
+        <w:rPr>
+          <w:rFonts w:ascii="Arial" w:cs="Arial" w:eastAsia="Arial" w:hAnsi="Arial"/>
+          <w:b/>
+          <w:bCs/>
+          <w:color w:val="1F3864"/>
+          <w:sz w:val="24"/>
+          <w:szCs w:val="24"/>
+        </w:rPr>
+        <w:t xml:space="preserve">15.7 Domain sort_order is display preference only (DEC-007)</w:t>
+      </w:r>
+    </w:p>
+    <w:p>
+      <w:pPr>
+        <w:spacing w:after="160"/>
+      </w:pPr>
+      <w:r>
+        <w:rPr>
+          <w:rFonts w:ascii="Arial" w:cs="Arial" w:eastAsia="Arial" w:hAnsi="Arial"/>
+          <w:color w:val="000000"/>
+          <w:sz w:val="22"/>
+          <w:szCs w:val="22"/>
+        </w:rPr>
+        <w:t xml:space="preserve">Domains have no cross-domain dependencies. Dependency enforcement operates at the process and entity level. Domain sort_order controls display ordering only.</w:t>
+      </w:r>
+    </w:p>
+    <w:p>
+      <w:pPr>
+        <w:pStyle w:val="Heading2"/>
+        <w:spacing w:after="160" w:before="280"/>
+      </w:pPr>
+      <w:r>
+        <w:rPr>
+          <w:rFonts w:ascii="Arial" w:cs="Arial" w:eastAsia="Arial" w:hAnsi="Arial"/>
+          <w:b/>
+          <w:bCs/>
+          <w:color w:val="1F3864"/>
+          <w:sz w:val="24"/>
+          <w:szCs w:val="24"/>
+        </w:rPr>
+        <w:t xml:space="preserve">15.8 Persona linked to CRM data model (DEC-008)</w:t>
+      </w:r>
+    </w:p>
+    <w:p>
+      <w:pPr>
+        <w:spacing w:after="160"/>
+      </w:pPr>
+      <w:r>
+        <w:rPr>
+          <w:rFonts w:ascii="Arial" w:cs="Arial" w:eastAsia="Arial" w:hAnsi="Arial"/>
+          <w:color w:val="000000"/>
+          <w:sz w:val="22"/>
+          <w:szCs w:val="22"/>
+        </w:rPr>
+        <w:t xml:space="preserve">Persona records can reference a specific entity, field, and field value in the CRM data model. This enables impact analysis to connect persona changes to CRM field changes.</w:t>
+      </w:r>
+    </w:p>
+    <w:p>
+      <w:pPr>
+        <w:pStyle w:val="Heading2"/>
+        <w:spacing w:after="160" w:before="280"/>
+      </w:pPr>
+      <w:r>
+        <w:rPr>
+          <w:rFonts w:ascii="Arial" w:cs="Arial" w:eastAsia="Arial" w:hAnsi="Arial"/>
+          <w:b/>
+          <w:bCs/>
+          <w:color w:val="1F3864"/>
+          <w:sz w:val="24"/>
+          <w:szCs w:val="24"/>
+        </w:rPr>
+        <w:t xml:space="preserve">15.9 Stored status with event-driven recalculation (DEC-009)</w:t>
+      </w:r>
+    </w:p>
+    <w:p>
+      <w:pPr>
+        <w:spacing w:after="160"/>
+      </w:pPr>
+      <w:r>
+        <w:rPr>
+          <w:rFonts w:ascii="Arial" w:cs="Arial" w:eastAsia="Arial" w:hAnsi="Arial"/>
+          <w:color w:val="000000"/>
+          <w:sz w:val="22"/>
+          <w:szCs w:val="22"/>
+        </w:rPr>
+        <w:t xml:space="preserve">Work item status is stored on the WorkItem record and updated by the engine whenever an upstream item transitions. This avoids recalculating the full dependency graph on every dashboard query while keeping stored values current through event-driven triggers.</w:t>
+      </w:r>
+    </w:p>
+    <w:p>
+      <w:pPr>
+        <w:pStyle w:val="Heading2"/>
+        <w:spacing w:after="160" w:before="280"/>
+      </w:pPr>
+      <w:r>
+        <w:rPr>
+          <w:rFonts w:ascii="Arial" w:cs="Arial" w:eastAsia="Arial" w:hAnsi="Arial"/>
+          <w:b/>
+          <w:bCs/>
+          <w:color w:val="1F3864"/>
+          <w:sz w:val="24"/>
+          <w:szCs w:val="24"/>
+        </w:rPr>
+        <w:t xml:space="preserve">15.10 Dependency graph built progressively (DEC-010)</w:t>
+      </w:r>
+    </w:p>
+    <w:p>
+      <w:pPr>
+        <w:spacing w:after="160"/>
+      </w:pPr>
+      <w:r>
+        <w:rPr>
+          <w:rFonts w:ascii="Arial" w:cs="Arial" w:eastAsia="Arial" w:hAnsi="Arial"/>
+          <w:color w:val="000000"/>
+          <w:sz w:val="22"/>
+          <w:szCs w:val="22"/>
+        </w:rPr>
+        <w:t xml:space="preserve">The engine creates work items at three points: project creation (Master PRD only), Master PRD import (Business Object Discovery only), and Business Object Discovery import (all remaining phases). This progressive approach reflects the fact that later work items cannot be defined until earlier phases identify the domains, entities, and processes.</w:t>
+      </w:r>
+    </w:p>
+    <w:p>
+      <w:pPr>
+        <w:pStyle w:val="Heading2"/>
+        <w:spacing w:after="160" w:before="280"/>
+      </w:pPr>
+      <w:r>
+        <w:rPr>
+          <w:rFonts w:ascii="Arial" w:cs="Arial" w:eastAsia="Arial" w:hAnsi="Arial"/>
+          <w:b/>
+          <w:bCs/>
+          <w:color w:val="1F3864"/>
+          <w:sz w:val="24"/>
+          <w:szCs w:val="24"/>
+        </w:rPr>
+        <w:t xml:space="preserve">15.11 Process dependencies wired through domain_overview (DEC-011)</w:t>
+      </w:r>
+    </w:p>
+    <w:p>
+      <w:pPr>
+        <w:spacing w:after="160"/>
+      </w:pPr>
+      <w:r>
+        <w:rPr>
+          <w:rFonts w:ascii="Arial" w:cs="Arial" w:eastAsia="Arial" w:hAnsi="Arial"/>
+          <w:color w:val="000000"/>
+          <w:sz w:val="22"/>
+          <w:szCs w:val="22"/>
+        </w:rPr>
+        <w:t xml:space="preserve">Process definition work items depend on their domain’s domain_overview, not directly on individual entity PRDs. The domain_overview serves as a gateway  —  it cannot become ready until all entity PRDs relevant to that domain are complete, guaranteeing that process definitions have full entity context available. This also provides a single node for cross-domain dependency wiring.</w:t>
+      </w:r>
+    </w:p>
+    <w:p>
+      <w:pPr>
+        <w:pStyle w:val="Heading2"/>
+        <w:spacing w:after="160" w:before="280"/>
+      </w:pPr>
+      <w:r>
+        <w:rPr>
+          <w:rFonts w:ascii="Arial" w:cs="Arial" w:eastAsia="Arial" w:hAnsi="Arial"/>
+          <w:b/>
+          <w:bCs/>
+          <w:color w:val="1F3864"/>
+          <w:sz w:val="24"/>
+          <w:szCs w:val="24"/>
+        </w:rPr>
+        <w:t xml:space="preserve">15.12 Parallel YAML generation across domains (DEC-012)</w:t>
+      </w:r>
+    </w:p>
+    <w:p>
+      <w:pPr>
+        <w:spacing w:after="160"/>
+      </w:pPr>
+      <w:r>
+        <w:rPr>
+          <w:rFonts w:ascii="Arial" w:cs="Arial" w:eastAsia="Arial" w:hAnsi="Arial"/>
+          <w:color w:val="000000"/>
+          <w:sz w:val="22"/>
+          <w:szCs w:val="22"/>
+        </w:rPr>
+        <w:t xml:space="preserve">YAML generation work items have no cross-domain dependencies. Each depends only on its own domain’s stakeholder review. The administrator chooses which domain to process first. This is consistent with DEC-007 (domain sort_order is display preference only).</w:t>
+      </w:r>
+    </w:p>
+    <w:p>
+      <w:pPr>
+        <w:pStyle w:val="Heading2"/>
+        <w:spacing w:after="160" w:before="280"/>
+      </w:pPr>
+      <w:r>
+        <w:rPr>
+          <w:rFonts w:ascii="Arial" w:cs="Arial" w:eastAsia="Arial" w:hAnsi="Arial"/>
+          <w:b/>
+          <w:bCs/>
+          <w:color w:val="1F3864"/>
+          <w:sz w:val="24"/>
+          <w:szCs w:val="24"/>
+        </w:rPr>
+        <w:t xml:space="preserve">15.13 Cascade regression on revision (DEC-013)</w:t>
+      </w:r>
+    </w:p>
+    <w:p>
+      <w:pPr>
+        <w:spacing w:after="160"/>
+      </w:pPr>
+      <w:r>
+        <w:rPr>
+          <w:rFonts w:ascii="Arial" w:cs="Arial" w:eastAsia="Arial" w:hAnsi="Arial"/>
+          <w:color w:val="000000"/>
+          <w:sz w:val="22"/>
+          <w:szCs w:val="22"/>
+        </w:rPr>
+        <w:t xml:space="preserve">When a completed work item is reopened, downstream items that are ready revert to not_started, and downstream items that are in_progress or complete are blocked with the prior status preserved. This prevents work from proceeding on potentially stale upstream data.</w:t>
+      </w:r>
+    </w:p>
+    <w:p>
+      <w:pPr>
+        <w:pStyle w:val="Heading2"/>
+        <w:spacing w:after="160" w:before="280"/>
+      </w:pPr>
+      <w:r>
+        <w:rPr>
+          <w:rFonts w:ascii="Arial" w:cs="Arial" w:eastAsia="Arial" w:hAnsi="Arial"/>
+          <w:b/>
+          <w:bCs/>
+          <w:color w:val="1F3864"/>
+          <w:sz w:val="24"/>
+          <w:szCs w:val="24"/>
+        </w:rPr>
+        <w:t xml:space="preserve">15.14 Scope change dependency updates are administrator-driven (DEC-014)</w:t>
+      </w:r>
+    </w:p>
+    <w:p>
+      <w:pPr>
+        <w:spacing w:after="160"/>
+      </w:pPr>
+      <w:r>
+        <w:rPr>
+          <w:rFonts w:ascii="Arial" w:cs="Arial" w:eastAsia="Arial" w:hAnsi="Arial"/>
+          <w:color w:val="000000"/>
+          <w:sz w:val="22"/>
+          <w:szCs w:val="22"/>
+        </w:rPr>
+        <w:t xml:space="preserve">When Entity Inventory participation data changes mid-project or cross-domain ordering is needed, the impact analysis engine surfaces the change, but the administrator decides whether to add, modify, or remove dependencies. Automatic dependency modification on every data update would create disproportionate churn for minor scope discoveries.</w:t>
+      </w:r>
+    </w:p>
+    <w:p>
+      <w:pPr>
+        <w:pStyle w:val="Heading2"/>
+        <w:spacing w:after="160" w:before="280"/>
+      </w:pPr>
+      <w:r>
+        <w:rPr>
+          <w:rFonts w:ascii="Arial" w:cs="Arial" w:eastAsia="Arial" w:hAnsi="Arial"/>
+          <w:b/>
+          <w:bCs/>
+          <w:color w:val="1F3864"/>
+          <w:sz w:val="24"/>
+          <w:szCs w:val="24"/>
+        </w:rPr>
+        <w:t xml:space="preserve">15.15 Domain overview as gateway to process work (DEC-015)</w:t>
+      </w:r>
+    </w:p>
+    <w:p>
+      <w:pPr>
+        <w:spacing w:after="160"/>
+      </w:pPr>
+      <w:r>
+        <w:rPr>
+          <w:rFonts w:ascii="Arial" w:cs="Arial" w:eastAsia="Arial" w:hAnsi="Arial"/>
+          <w:color w:val="000000"/>
+          <w:sz w:val="22"/>
+          <w:szCs w:val="22"/>
+        </w:rPr>
+        <w:t xml:space="preserve">Each domain has a domain_overview work item that produces a domain-scoped reference document assembling personas, business process inventory, and data reference from upstream work items. This replaces the need to upload multiple documents into each process definition conversation and provides a natural node for cross-domain dependency ordering.</w:t>
+      </w:r>
+    </w:p>
+    <w:p>
+      <w:pPr>
+        <w:pStyle w:val="Heading2"/>
+        <w:spacing w:after="160" w:before="280"/>
+      </w:pPr>
+      <w:r>
+        <w:rPr>
+          <w:rFonts w:ascii="Arial" w:cs="Arial" w:eastAsia="Arial" w:hAnsi="Arial"/>
+          <w:b/>
+          <w:bCs/>
+          <w:color w:val="1F3864"/>
+          <w:sz w:val="24"/>
+          <w:szCs w:val="24"/>
+        </w:rPr>
+        <w:t xml:space="preserve">15.16 CRM Selection and CRM Deployment are separate work items (DEC-016)</w:t>
+      </w:r>
+    </w:p>
+    <w:p>
+      <w:pPr>
+        <w:spacing w:after="160"/>
+      </w:pPr>
+      <w:r>
+        <w:rPr>
+          <w:rFonts w:ascii="Arial" w:cs="Arial" w:eastAsia="Arial" w:hAnsi="Arial"/>
+          <w:color w:val="000000"/>
+          <w:sz w:val="22"/>
+          <w:szCs w:val="22"/>
+        </w:rPr>
+        <w:t xml:space="preserve">The Document Production Process combines these into a single phase, but they are distinct activities with different outputs. CRM Selection is an AI-session conversation producing a CRM Evaluation Report. CRM Deployment is the provisioning of the actual CRM instance. Separating them provides clearer status tracking and accommodates the reality that time may pass between platform selection and instance provisioning.</w:t>
+      </w:r>
+    </w:p>
+    <w:p>
+      <w:pPr>
+        <w:pStyle w:val="Heading2"/>
+        <w:spacing w:after="160" w:before="280"/>
+      </w:pPr>
+      <w:r>
+        <w:rPr>
+          <w:rFonts w:ascii="Arial" w:cs="Arial" w:eastAsia="Arial" w:hAnsi="Arial"/>
+          <w:b/>
+          <w:bCs/>
+          <w:color w:val="1F3864"/>
+          <w:sz w:val="24"/>
+          <w:szCs w:val="24"/>
+        </w:rPr>
+        <w:t xml:space="preserve">15.17 Prompt-optimized interview guides (DEC-017)</w:t>
+      </w:r>
+    </w:p>
+    <w:p>
+      <w:pPr>
+        <w:spacing w:after="160"/>
+      </w:pPr>
+      <w:r>
+        <w:rPr>
+          <w:rFonts w:ascii="Arial" w:cs="Arial" w:eastAsia="Arial" w:hAnsi="Arial"/>
+          <w:color w:val="000000"/>
+          <w:sz w:val="22"/>
+          <w:szCs w:val="22"/>
+        </w:rPr>
+        <w:t xml:space="preserve">Session Instructions use prompt-optimized versions of the interview guides that retain all behavioral instructions and completeness standards but remove administrator logistics (file upload steps, repository paths, commit instructions) and metadata (changelogs, version headers). Each prompt-optimized guide carries a source_version reference; the system flags it as stale when the source guide advances past the referenced version. Prompt-optimized guides are stored alongside the source guides in the crmbuilder repository.</w:t>
+      </w:r>
+    </w:p>
+    <w:p>
+      <w:pPr>
+        <w:pStyle w:val="Heading2"/>
+        <w:spacing w:after="160" w:before="280"/>
+      </w:pPr>
+      <w:r>
+        <w:rPr>
+          <w:rFonts w:ascii="Arial" w:cs="Arial" w:eastAsia="Arial" w:hAnsi="Arial"/>
+          <w:b/>
+          <w:bCs/>
+          <w:color w:val="1F3864"/>
+          <w:sz w:val="24"/>
+          <w:szCs w:val="24"/>
+        </w:rPr>
+        <w:t xml:space="preserve">15.18 Sub-domains as self-referencing Domain records (DEC-018)</w:t>
+      </w:r>
+    </w:p>
+    <w:p>
+      <w:pPr>
+        <w:spacing w:after="160"/>
+      </w:pPr>
+      <w:r>
+        <w:rPr>
+          <w:rFonts w:ascii="Arial" w:cs="Arial" w:eastAsia="Arial" w:hAnsi="Arial"/>
+          <w:color w:val="000000"/>
+          <w:sz w:val="22"/>
+          <w:szCs w:val="22"/>
+        </w:rPr>
+        <w:t xml:space="preserve">The Domain table uses a nullable parent_domain_id column (FK to Domain.id) to represent sub-domains. Top-level domains have parent_domain_id = NULL. Sub-domains are Domain records whose parent_domain_id references their parent domain. This allows sub-domains to participate in the same workflow, work item, and dependency graph mechanisms as top-level domains without separate tables or branching logic.</w:t>
+      </w:r>
+    </w:p>
+    <w:p>
+      <w:pPr>
+        <w:pStyle w:val="Heading2"/>
+        <w:spacing w:after="160" w:before="280"/>
+      </w:pPr>
+      <w:r>
+        <w:rPr>
+          <w:rFonts w:ascii="Arial" w:cs="Arial" w:eastAsia="Arial" w:hAnsi="Arial"/>
+          <w:b/>
+          <w:bCs/>
+          <w:color w:val="1F3864"/>
+          <w:sz w:val="24"/>
+          <w:szCs w:val="24"/>
+        </w:rPr>
+        <w:t xml:space="preserve">15.19 Sub-domain work items use existing types with parent-aware dependencies (DEC-019)</w:t>
+      </w:r>
+    </w:p>
+    <w:p>
+      <w:pPr>
+        <w:spacing w:after="160"/>
+      </w:pPr>
+      <w:r>
+        <w:rPr>
+          <w:rFonts w:ascii="Arial" w:cs="Arial" w:eastAsia="Arial" w:hAnsi="Arial"/>
+          <w:color w:val="000000"/>
+          <w:sz w:val="22"/>
+          <w:szCs w:val="22"/>
+        </w:rPr>
+        <w:t xml:space="preserve">Sub-domain overviews and reconciliations use the existing domain_overview and domain_reconciliation work item types. The Workflow Engine determines sub-domain status by checking parent_domain_id on the Domain record. Dependency graph construction creates: parent domain_overview first, then sub-domain domain_overviews depending on the parent’s overview, process_definitions depending on their sub-domain’s overview, sub-domain domain_reconciliations depending on their process_definitions, and the parent domain_reconciliation depending on all sub-domain reconciliations.</w:t>
+      </w:r>
+    </w:p>
+    <w:p>
+      <w:pPr>
+        <w:pStyle w:val="Heading2"/>
+        <w:spacing w:after="160" w:before="280"/>
+      </w:pPr>
+      <w:r>
+        <w:rPr>
+          <w:rFonts w:ascii="Arial" w:cs="Arial" w:eastAsia="Arial" w:hAnsi="Arial"/>
+          <w:b/>
+          <w:bCs/>
+          <w:color w:val="1F3864"/>
+          <w:sz w:val="24"/>
+          <w:szCs w:val="24"/>
+        </w:rPr>
+        <w:t xml:space="preserve">15.20 Services distinguished by boolean flag on Domain (DEC-020)</w:t>
+      </w:r>
+    </w:p>
+    <w:p>
+      <w:pPr>
+        <w:spacing w:after="160"/>
+      </w:pPr>
+      <w:r>
+        <w:rPr>
+          <w:rFonts w:ascii="Arial" w:cs="Arial" w:eastAsia="Arial" w:hAnsi="Arial"/>
+          <w:color w:val="000000"/>
+          <w:sz w:val="22"/>
+          <w:szCs w:val="22"/>
+        </w:rPr>
+        <w:t xml:space="preserve">Cross-Domain Services are Domain records with is_service = TRUE (default FALSE). Services participate in the same workflow, work item, and dependency graph mechanisms as domains. Services never have sub-domains.</w:t>
+      </w:r>
+    </w:p>
+    <w:p>
+      <w:pPr>
+        <w:pStyle w:val="Heading2"/>
+        <w:spacing w:after="160" w:before="280"/>
+      </w:pPr>
+      <w:r>
+        <w:rPr>
+          <w:rFonts w:ascii="Arial" w:cs="Arial" w:eastAsia="Arial" w:hAnsi="Arial"/>
+          <w:b/>
+          <w:bCs/>
+          <w:color w:val="1F3864"/>
+          <w:sz w:val="24"/>
+          <w:szCs w:val="24"/>
+        </w:rPr>
+        <w:t xml:space="preserve">15.21 Primary domain reference on Entity (DEC-021)</w:t>
+      </w:r>
+    </w:p>
+    <w:p>
+      <w:pPr>
+        <w:spacing w:after="160"/>
+      </w:pPr>
+      <w:r>
+        <w:rPr>
+          <w:rFonts w:ascii="Arial" w:cs="Arial" w:eastAsia="Arial" w:hAnsi="Arial"/>
+          <w:color w:val="000000"/>
+          <w:sz w:val="22"/>
+          <w:szCs w:val="22"/>
+        </w:rPr>
+        <w:t xml:space="preserve">The Entity table includes a primary_domain_id column (FK to Domain.id) capturing the domain that owns the entity’s lifecycle, populated during business_object_discovery import. Additional domain participation is derived from ProcessEntity cross-references once process definition work populates them.</w:t>
+      </w:r>
+    </w:p>
+    <w:p>
+      <w:pPr>
+        <w:pStyle w:val="Heading2"/>
+        <w:spacing w:after="160" w:before="280"/>
+      </w:pPr>
+      <w:r>
+        <w:rPr>
+          <w:rFonts w:ascii="Arial" w:cs="Arial" w:eastAsia="Arial" w:hAnsi="Arial"/>
+          <w:b/>
+          <w:bCs/>
+          <w:color w:val="1F3864"/>
+          <w:sz w:val="24"/>
+          <w:szCs w:val="24"/>
+        </w:rPr>
+        <w:t xml:space="preserve">15.22 Domain overview narrative stored on Domain record (DEC-022)</w:t>
+      </w:r>
+    </w:p>
+    <w:p>
+      <w:pPr>
+        <w:spacing w:after="160"/>
+      </w:pPr>
+      <w:r>
+        <w:rPr>
+          <w:rFonts w:ascii="Arial" w:cs="Arial" w:eastAsia="Arial" w:hAnsi="Arial"/>
+          <w:color w:val="000000"/>
+          <w:sz w:val="22"/>
+          <w:szCs w:val="22"/>
+        </w:rPr>
+        <w:t xml:space="preserve">The Domain table includes a domain_overview_text column populated when a domain_overview session is imported. This stores the assembled narrative content produced during the overview session. Sub-domain overview prompts pull the parent domain’s domain_overview_text as context.</w:t>
+      </w:r>
+    </w:p>
+    <w:p>
+      <w:pPr>
+        <w:pStyle w:val="Heading2"/>
+        <w:spacing w:after="160" w:before="280"/>
+      </w:pPr>
+      <w:r>
+        <w:rPr>
+          <w:rFonts w:ascii="Arial" w:cs="Arial" w:eastAsia="Arial" w:hAnsi="Arial"/>
+          <w:b/>
+          <w:bCs/>
+          <w:color w:val="1F3864"/>
+          <w:sz w:val="24"/>
+          <w:szCs w:val="24"/>
+        </w:rPr>
+        <w:t xml:space="preserve">15.23 Sub-domain process prompts include parent domain context (DEC-023)</w:t>
+      </w:r>
+    </w:p>
+    <w:p>
+      <w:pPr>
+        <w:spacing w:after="160"/>
+      </w:pPr>
+      <w:r>
+        <w:rPr>
+          <w:rFonts w:ascii="Arial" w:cs="Arial" w:eastAsia="Arial" w:hAnsi="Arial"/>
+          <w:color w:val="000000"/>
+          <w:sz w:val="22"/>
+          <w:szCs w:val="22"/>
+        </w:rPr>
+        <w:t xml:space="preserve">For process_definition work items where the process belongs to a sub-domain, the Prompt Generator includes the parent domain’s domain_overview_text as supplementary context labeled “Parent Domain Context,” in addition to the sub-domain’s domain_overview_text as the primary reference. Context size management may summarize or trim the parent overview if space is constrained, but the default is to include it.</w:t>
+      </w:r>
+    </w:p>
+    <w:p>
+      <w:pPr>
+        <w:pStyle w:val="Heading2"/>
+        <w:spacing w:after="160" w:before="280"/>
+      </w:pPr>
+      <w:r>
+        <w:rPr>
+          <w:rFonts w:ascii="Arial" w:cs="Arial" w:eastAsia="Arial" w:hAnsi="Arial"/>
+          <w:b/>
+          <w:bCs/>
+          <w:color w:val="1F3864"/>
+          <w:sz w:val="24"/>
+          <w:szCs w:val="24"/>
+        </w:rPr>
+        <w:t xml:space="preserve">15.24 Domain reconciliation narrative stored on Domain record (DEC-024)</w:t>
+      </w:r>
+    </w:p>
+    <w:p>
+      <w:pPr>
+        <w:spacing w:after="160"/>
+      </w:pPr>
+      <w:r>
+        <w:rPr>
+          <w:rFonts w:ascii="Arial" w:cs="Arial" w:eastAsia="Arial" w:hAnsi="Arial"/>
+          <w:color w:val="000000"/>
+          <w:sz w:val="22"/>
+          <w:szCs w:val="22"/>
+        </w:rPr>
+        <w:t xml:space="preserve">The Domain table includes a domain_reconciliation_text column populated when a domain_reconciliation session is imported. For parent domain reconciliation prompts, the Prompt Generator pulls each sub-domain’s domain_reconciliation_text as context alongside the structured data.</w:t>
+      </w:r>
+    </w:p>
+    <w:p>
+      <w:pPr>
+        <w:pStyle w:val="Heading2"/>
+        <w:spacing w:after="160" w:before="280"/>
+      </w:pPr>
+      <w:r>
+        <w:rPr>
+          <w:rFonts w:ascii="Arial" w:cs="Arial" w:eastAsia="Arial" w:hAnsi="Arial"/>
+          <w:b/>
+          <w:bCs/>
+          <w:color w:val="1F3864"/>
+          <w:sz w:val="24"/>
+          <w:szCs w:val="24"/>
+        </w:rPr>
+        <w:t xml:space="preserve">15.25 YAML generation uses database-derived context (DEC-025)</w:t>
+      </w:r>
+    </w:p>
+    <w:p>
+      <w:pPr>
+        <w:spacing w:after="160"/>
+      </w:pPr>
+      <w:r>
+        <w:rPr>
+          <w:rFonts w:ascii="Arial" w:cs="Arial" w:eastAsia="Arial" w:hAnsi="Arial"/>
+          <w:color w:val="000000"/>
+          <w:sz w:val="22"/>
+          <w:szCs w:val="22"/>
+        </w:rPr>
+        <w:t xml:space="preserve">The Prompt Generator assembles entity, field, relationship, and layout data from the database into a YAML-like structure for yaml_generation context. This ensures the AI always sees the current database state rather than a stale snapshot from a prior session. No separate YAML storage is needed for prompt generation purposes.</w:t>
+      </w:r>
+    </w:p>
+    <w:p>
+      <w:pPr>
+        <w:pStyle w:val="Heading2"/>
+        <w:spacing w:after="160" w:before="280"/>
+      </w:pPr>
+      <w:r>
+        <w:rPr>
+          <w:rFonts w:ascii="Arial" w:cs="Arial" w:eastAsia="Arial" w:hAnsi="Arial"/>
+          <w:b/>
+          <w:bCs/>
+          <w:color w:val="1F3864"/>
+          <w:sz w:val="24"/>
+          <w:szCs w:val="24"/>
+        </w:rPr>
+        <w:t xml:space="preserve">15.26 CRM platform stored on Client record (DEC-026)</w:t>
+      </w:r>
+    </w:p>
+    <w:p>
+      <w:pPr>
+        <w:spacing w:after="160"/>
+      </w:pPr>
+      <w:r>
+        <w:rPr>
+          <w:rFonts w:ascii="Arial" w:cs="Arial" w:eastAsia="Arial" w:hAnsi="Arial"/>
+          <w:color w:val="000000"/>
+          <w:sz w:val="22"/>
+          <w:szCs w:val="22"/>
+        </w:rPr>
+        <w:t xml:space="preserve">The Client table (master database) includes a crm_platform column populated when the administrator selects a platform after reviewing the CRM Evaluation Report.</w:t>
+      </w:r>
+    </w:p>
+    <w:p>
+      <w:pPr>
+        <w:pStyle w:val="Heading2"/>
+        <w:spacing w:after="160" w:before="280"/>
+      </w:pPr>
+      <w:r>
+        <w:rPr>
+          <w:rFonts w:ascii="Arial" w:cs="Arial" w:eastAsia="Arial" w:hAnsi="Arial"/>
+          <w:b/>
+          <w:bCs/>
+          <w:color w:val="1F3864"/>
+          <w:sz w:val="24"/>
+          <w:szCs w:val="24"/>
+        </w:rPr>
+        <w:t xml:space="preserve">15.27 Decision and issue inclusion uses relevance cascade (DEC-027)</w:t>
+      </w:r>
+    </w:p>
+    <w:p>
+      <w:pPr>
+        <w:spacing w:after="160"/>
+      </w:pPr>
+      <w:r>
+        <w:rPr>
+          <w:rFonts w:ascii="Arial" w:cs="Arial" w:eastAsia="Arial" w:hAnsi="Arial"/>
+          <w:color w:val="000000"/>
+          <w:sz w:val="22"/>
+          <w:szCs w:val="22"/>
+        </w:rPr>
+        <w:t xml:space="preserve">The Prompt Generator includes Decision and OpenIssue records based on a scope-matching cascade per work item type, ranging from global-only (master_prd, business_object_discovery) through domain-scoped and item-scoped (entity_prd, process_definition) up to full-project inclusion (crm_selection). Decisions are presented under a “Locked Decisions — do not reopen” header. Open issues are presented under an “Open Issues — attempt to resolve or note impact” header.</w:t>
+      </w:r>
+    </w:p>
+    <w:p>
+      <w:pPr>
+        <w:pStyle w:val="Heading2"/>
+        <w:spacing w:after="160" w:before="280"/>
+      </w:pPr>
+      <w:r>
+        <w:rPr>
+          <w:rFonts w:ascii="Arial" w:cs="Arial" w:eastAsia="Arial" w:hAnsi="Arial"/>
+          <w:b/>
+          <w:bCs/>
+          <w:color w:val="1F3864"/>
+          <w:sz w:val="24"/>
+          <w:szCs w:val="24"/>
+        </w:rPr>
+        <w:t xml:space="preserve">15.28 Prompt-optimized guides stored as files (DEC-028)</w:t>
+      </w:r>
+    </w:p>
+    <w:p>
+      <w:pPr>
+        <w:spacing w:after="160"/>
+      </w:pPr>
+      <w:r>
+        <w:rPr>
+          <w:rFonts w:ascii="Arial" w:cs="Arial" w:eastAsia="Arial" w:hAnsi="Arial"/>
+          <w:color w:val="000000"/>
+          <w:sz w:val="22"/>
+          <w:szCs w:val="22"/>
+        </w:rPr>
+        <w:t xml:space="preserve">Prompt-optimized guides are stored in PRDs/process/interviews/prompt-optimized/ in the crmbuilder repository with a naming convention of prompt-{work_item_type}.md. The application reads them from this directory at prompt generation time. Git provides version control.</w:t>
+      </w:r>
+    </w:p>
+    <w:p>
+      <w:pPr>
+        <w:pStyle w:val="Heading2"/>
+        <w:spacing w:after="160" w:before="280"/>
+      </w:pPr>
+      <w:r>
+        <w:rPr>
+          <w:rFonts w:ascii="Arial" w:cs="Arial" w:eastAsia="Arial" w:hAnsi="Arial"/>
+          <w:b/>
+          <w:bCs/>
+          <w:color w:val="1F3864"/>
+          <w:sz w:val="24"/>
+          <w:szCs w:val="24"/>
+        </w:rPr>
+        <w:t xml:space="preserve">15.29 Structured output format is JSON (DEC-029)</w:t>
+      </w:r>
+    </w:p>
+    <w:p>
+      <w:pPr>
+        <w:spacing w:after="160"/>
+      </w:pPr>
+      <w:r>
+        <w:rPr>
+          <w:rFonts w:ascii="Arial" w:cs="Arial" w:eastAsia="Arial" w:hAnsi="Arial"/>
+          <w:color w:val="000000"/>
+          <w:sz w:val="22"/>
+          <w:szCs w:val="22"/>
+        </w:rPr>
+        <w:t xml:space="preserve">AI sessions produce a JSON block with a common envelope (output_version, work_item_type, work_item_id, session_type, payload, decisions, open_issues). The payload structure varies by work item type. Decisions and open issues use a consistent format across all types. JSON is chosen for parsing reliability over human readability. The administrator verifies imported data through the Import Processor’s review screen.</w:t>
+      </w:r>
+    </w:p>
+    <w:p>
+      <w:pPr>
+        <w:pStyle w:val="Heading2"/>
+        <w:spacing w:after="160" w:before="280"/>
+      </w:pPr>
+      <w:r>
+        <w:rPr>
+          <w:rFonts w:ascii="Arial" w:cs="Arial" w:eastAsia="Arial" w:hAnsi="Arial"/>
+          <w:b/>
+          <w:bCs/>
+          <w:color w:val="1F3864"/>
+          <w:sz w:val="24"/>
+          <w:szCs w:val="24"/>
+        </w:rPr>
+        <w:t xml:space="preserve">15.30 Native field flag on Field table (DEC-030)</w:t>
+      </w:r>
+    </w:p>
+    <w:p>
+      <w:pPr>
+        <w:spacing w:after="160"/>
+      </w:pPr>
+      <w:r>
+        <w:rPr>
+          <w:rFonts w:ascii="Arial" w:cs="Arial" w:eastAsia="Arial" w:hAnsi="Arial"/>
+          <w:color w:val="000000"/>
+          <w:sz w:val="22"/>
+          <w:szCs w:val="22"/>
+        </w:rPr>
+        <w:t xml:space="preserve">The Field table includes an is_native column (default FALSE). Native fields are documented in Entity PRDs to prevent duplicate creation during YAML generation but are not created via YAML. The Import Processor sets this flag based on the entity_prd payload’s native vs. custom field classification.</w:t>
+      </w:r>
+    </w:p>
+    <w:p>
+      <w:pPr>
+        <w:pStyle w:val="Heading2"/>
+        <w:spacing w:after="160" w:before="280"/>
+      </w:pPr>
+      <w:r>
+        <w:rPr>
+          <w:rFonts w:ascii="Arial" w:cs="Arial" w:eastAsia="Arial" w:hAnsi="Arial"/>
+          <w:b/>
+          <w:bCs/>
+          <w:color w:val="1F3864"/>
+          <w:sz w:val="24"/>
+          <w:szCs w:val="24"/>
+        </w:rPr>
+        <w:t xml:space="preserve">15.31 Three session types with distinct prompt variations (DEC-031)</w:t>
+      </w:r>
+    </w:p>
+    <w:p>
+      <w:pPr>
+        <w:spacing w:after="160"/>
+      </w:pPr>
+      <w:r>
+        <w:rPr>
+          <w:rFonts w:ascii="Arial" w:cs="Arial" w:eastAsia="Arial" w:hAnsi="Arial"/>
+          <w:color w:val="000000"/>
+          <w:sz w:val="22"/>
+          <w:szCs w:val="22"/>
+        </w:rPr>
+        <w:t xml:space="preserve">Initial prompts assemble context from the database for a blank-slate session. Revision prompts use the same structure plus revision reason, current database state reflecting initial session results, and specific change instructions. Clarification prompts include the prior session’s structured output as context, use minimal session instructions, and only require structured output if the clarification reveals a needed change.</w:t>
+      </w:r>
+    </w:p>
+    <w:p>
+      <w:pPr>
+        <w:pStyle w:val="Heading2"/>
+        <w:spacing w:after="160" w:before="280"/>
+      </w:pPr>
+      <w:r>
+        <w:rPr>
+          <w:rFonts w:ascii="Arial" w:cs="Arial" w:eastAsia="Arial" w:hAnsi="Arial"/>
+          <w:b/>
+          <w:bCs/>
+          <w:color w:val="1F3864"/>
+          <w:sz w:val="24"/>
+          <w:szCs w:val="24"/>
+        </w:rPr>
+        <w:t xml:space="preserve">15.32 Prompt templates stored as files per work item type (DEC-032)</w:t>
+      </w:r>
+    </w:p>
+    <w:p>
+      <w:pPr>
+        <w:spacing w:after="160"/>
+      </w:pPr>
+      <w:r>
+        <w:rPr>
+          <w:rFonts w:ascii="Arial" w:cs="Arial" w:eastAsia="Arial" w:hAnsi="Arial"/>
+          <w:color w:val="000000"/>
+          <w:sz w:val="22"/>
+          <w:szCs w:val="22"/>
+        </w:rPr>
+        <w:t xml:space="preserve">Prompt templates are stored in PRDs/process/interviews/prompt-templates/template-{work_item_type}.md in the crmbuilder repository. Each template defines the six-section structure with placeholder tokens for database-derived content and session-type-conditional sections. The Prompt Generator reads the template, fills placeholders from the database, and includes or excludes sections based on session type.</w:t>
+      </w:r>
+    </w:p>
+    <w:p>
+      <w:pPr>
+        <w:pStyle w:val="Heading2"/>
+        <w:spacing w:after="160" w:before="280"/>
+      </w:pPr>
+      <w:r>
+        <w:rPr>
+          <w:rFonts w:ascii="Arial" w:cs="Arial" w:eastAsia="Arial" w:hAnsi="Arial"/>
+          <w:b/>
+          <w:bCs/>
+          <w:color w:val="1F3864"/>
+          <w:sz w:val="24"/>
+          <w:szCs w:val="24"/>
+        </w:rPr>
+        <w:t xml:space="preserve">15.33 Tiered priority context size management (DEC-033)</w:t>
+      </w:r>
+    </w:p>
+    <w:p>
+      <w:pPr>
+        <w:spacing w:after="160"/>
+      </w:pPr>
+      <w:r>
+        <w:rPr>
+          <w:rFonts w:ascii="Arial" w:cs="Arial" w:eastAsia="Arial" w:hAnsi="Arial"/>
+          <w:color w:val="000000"/>
+          <w:sz w:val="22"/>
+          <w:szCs w:val="22"/>
+        </w:rPr>
+        <w:t xml:space="preserve">The Prompt Generator assembles context in four priority tiers and tracks estimated token count. When approaching the context window limit, it applies reduction strategies in order: omit or summarize Priority 4 (background context), summarize Priority 3 (adjacent context), truncate prior process detail to summaries within Priority 2, and flag to the administrator if still over capacity. The generator logs token estimates and any reductions applied.</w:t>
       </w:r>
     </w:p>
     <w:p>
@@ -32094,7 +34740,7 @@
           <w:sz w:val="28"/>
           <w:szCs w:val="28"/>
         </w:rPr>
-        <w:t xml:space="preserve">15. Decisions Made</w:t>
+        <w:t xml:space="preserve">16. Open Issues</w:t>
       </w:r>
     </w:p>
     <w:p>
@@ -32111,7 +34757,7 @@
           <w:sz w:val="24"/>
           <w:szCs w:val="24"/>
         </w:rPr>
-        <w:t xml:space="preserve">15.1 Separate database per client (DEC-001)</w:t>
+        <w:t xml:space="preserve">16.1 CBM transition approach (ISS-001)</w:t>
       </w:r>
     </w:p>
     <w:p>
@@ -32125,7 +34771,7 @@
           <w:sz w:val="22"/>
           <w:szCs w:val="22"/>
         </w:rPr>
-        <w:t xml:space="preserve">Each client implementation gets its own SQLite database file. A master database stores the client list and paths. This provides clean isolation for backup, archival, and deletion.</w:t>
+        <w:t xml:space="preserve">The existing CBM implementation is partially complete under the old document-centric process. The approach for transitioning CBM to the database-driven process — whether to migrate existing data, restart from scratch, or use a hybrid approach — has not been decided.</w:t>
       </w:r>
     </w:p>
     <w:p>
@@ -32142,7 +34788,7 @@
           <w:sz w:val="24"/>
           <w:szCs w:val="24"/>
         </w:rPr>
-        <w:t xml:space="preserve">15.2 AI sessions are external (DEC-002)</w:t>
+        <w:t xml:space="preserve">16.2 Structured output format (ISS-002) — Resolved</w:t>
       </w:r>
     </w:p>
     <w:p>
@@ -32156,61 +34802,24 @@
           <w:sz w:val="22"/>
           <w:szCs w:val="22"/>
         </w:rPr>
-        <w:t xml:space="preserve">AI conversations run in Claude.ai, not embedded in the application (Option B from the L1 PRD). The application generates prompts and imports structured results. This avoids building an inferior chat interface and leverages Claude.ai’s existing capabilities.</w:t>
-      </w:r>
-    </w:p>
-    <w:p>
-      <w:pPr>
-        <w:pStyle w:val="Heading2"/>
-        <w:spacing w:after="160" w:before="280"/>
+        <w:t xml:space="preserve">The specific format (JSON schema, YAML schema, or other) for the structured output block that AI sessions must produce has not been defined. This format must be parseable by the import processor and flexible enough to handle all work item types.</w:t>
+      </w:r>
+    </w:p>
+    <w:p>
+      <w:pPr>
+        <w:spacing w:after="160"/>
       </w:pPr>
       <w:r>
         <w:rPr>
           <w:rFonts w:ascii="Arial" w:cs="Arial" w:eastAsia="Arial" w:hAnsi="Arial"/>
           <w:b/>
           <w:bCs/>
-          <w:color w:val="1F3864"/>
-          <w:sz w:val="24"/>
-          <w:szCs w:val="24"/>
-        </w:rPr>
-        <w:t xml:space="preserve">15.3 Entity belongs to client, not domain (DEC-003)</w:t>
-      </w:r>
-    </w:p>
-    <w:p>
-      <w:pPr>
-        <w:spacing w:after="160"/>
-      </w:pPr>
-      <w:r>
-        <w:rPr>
-          <w:rFonts w:ascii="Arial" w:cs="Arial" w:eastAsia="Arial" w:hAnsi="Arial"/>
           <w:color w:val="000000"/>
           <w:sz w:val="22"/>
           <w:szCs w:val="22"/>
         </w:rPr>
-        <w:t xml:space="preserve">Entities are scoped to the client, not to any specific domain. Cross-domain usage is captured through the ProcessEntity cross-reference table. This supports entities like Contact that are used across multiple domains.</w:t>
-      </w:r>
-    </w:p>
-    <w:p>
-      <w:pPr>
-        <w:pStyle w:val="Heading2"/>
-        <w:spacing w:after="160" w:before="280"/>
-      </w:pPr>
-      <w:r>
-        <w:rPr>
-          <w:rFonts w:ascii="Arial" w:cs="Arial" w:eastAsia="Arial" w:hAnsi="Arial"/>
-          <w:b/>
-          <w:bCs/>
-          <w:color w:val="1F3864"/>
-          <w:sz w:val="24"/>
-          <w:szCs w:val="24"/>
-        </w:rPr>
-        <w:t xml:space="preserve">15.4 BusinessObject as a staging table (DEC-004)</w:t>
-      </w:r>
-    </w:p>
-    <w:p>
-      <w:pPr>
-        <w:spacing w:after="160"/>
-      </w:pPr>
+        <w:t xml:space="preserve">Resolution: </w:t>
+      </w:r>
       <w:r>
         <w:rPr>
           <w:rFonts w:ascii="Arial" w:cs="Arial" w:eastAsia="Arial" w:hAnsi="Arial"/>
@@ -32218,458 +34827,7 @@
           <w:sz w:val="22"/>
           <w:szCs w:val="22"/>
         </w:rPr>
-        <w:t xml:space="preserve">BusinessObject captures everything discovered during Business Object Discovery as unclassified candidates. Each is classified as an entity, process, persona, field value, lifecycle state, relationship, or excluded. The resolution links to the resulting record in the appropriate table.</w:t>
-      </w:r>
-    </w:p>
-    <w:p>
-      <w:pPr>
-        <w:pStyle w:val="Heading2"/>
-        <w:spacing w:after="160" w:before="280"/>
-      </w:pPr>
-      <w:r>
-        <w:rPr>
-          <w:rFonts w:ascii="Arial" w:cs="Arial" w:eastAsia="Arial" w:hAnsi="Arial"/>
-          <w:b/>
-          <w:bCs/>
-          <w:color w:val="1F3864"/>
-          <w:sz w:val="24"/>
-          <w:szCs w:val="24"/>
-        </w:rPr>
-        <w:t xml:space="preserve">15.5 All changes go through managed process (DEC-005)</w:t>
-      </w:r>
-    </w:p>
-    <w:p>
-      <w:pPr>
-        <w:spacing w:after="160"/>
-      </w:pPr>
-      <w:r>
-        <w:rPr>
-          <w:rFonts w:ascii="Arial" w:cs="Arial" w:eastAsia="Arial" w:hAnsi="Arial"/>
-          <w:color w:val="000000"/>
-          <w:sz w:val="22"/>
-          <w:szCs w:val="22"/>
-        </w:rPr>
-        <w:t xml:space="preserve">No direct edits to the database. Every modification goes through impact analysis, requires confirmation, and is recorded in the audit trail. This ensures no change propagates without the administrator understanding and approving its downstream effects.</w:t>
-      </w:r>
-    </w:p>
-    <w:p>
-      <w:pPr>
-        <w:pStyle w:val="Heading2"/>
-        <w:spacing w:after="160" w:before="280"/>
-      </w:pPr>
-      <w:r>
-        <w:rPr>
-          <w:rFonts w:ascii="Arial" w:cs="Arial" w:eastAsia="Arial" w:hAnsi="Arial"/>
-          <w:b/>
-          <w:bCs/>
-          <w:color w:val="1F3864"/>
-          <w:sz w:val="24"/>
-          <w:szCs w:val="24"/>
-        </w:rPr>
-        <w:t xml:space="preserve">15.6 Cross-references support optional step-level granularity (DEC-006)</w:t>
-      </w:r>
-    </w:p>
-    <w:p>
-      <w:pPr>
-        <w:spacing w:after="160"/>
-      </w:pPr>
-      <w:r>
-        <w:rPr>
-          <w:rFonts w:ascii="Arial" w:cs="Arial" w:eastAsia="Arial" w:hAnsi="Arial"/>
-          <w:color w:val="000000"/>
-          <w:sz w:val="22"/>
-          <w:szCs w:val="22"/>
-        </w:rPr>
-        <w:t xml:space="preserve">ProcessField and ProcessEntity include a nullable process_step_id. When populated, impact analysis can identify the specific step affected. When null, the impact is reported at the process level.</w:t>
-      </w:r>
-    </w:p>
-    <w:p>
-      <w:pPr>
-        <w:pStyle w:val="Heading2"/>
-        <w:spacing w:after="160" w:before="280"/>
-      </w:pPr>
-      <w:r>
-        <w:rPr>
-          <w:rFonts w:ascii="Arial" w:cs="Arial" w:eastAsia="Arial" w:hAnsi="Arial"/>
-          <w:b/>
-          <w:bCs/>
-          <w:color w:val="1F3864"/>
-          <w:sz w:val="24"/>
-          <w:szCs w:val="24"/>
-        </w:rPr>
-        <w:t xml:space="preserve">15.7 Domain sort_order is display preference only (DEC-007)</w:t>
-      </w:r>
-    </w:p>
-    <w:p>
-      <w:pPr>
-        <w:spacing w:after="160"/>
-      </w:pPr>
-      <w:r>
-        <w:rPr>
-          <w:rFonts w:ascii="Arial" w:cs="Arial" w:eastAsia="Arial" w:hAnsi="Arial"/>
-          <w:color w:val="000000"/>
-          <w:sz w:val="22"/>
-          <w:szCs w:val="22"/>
-        </w:rPr>
-        <w:t xml:space="preserve">Domains have no cross-domain dependencies. Dependency enforcement operates at the process and entity level. Domain sort_order controls display ordering only.</w:t>
-      </w:r>
-    </w:p>
-    <w:p>
-      <w:pPr>
-        <w:pStyle w:val="Heading2"/>
-        <w:spacing w:after="160" w:before="280"/>
-      </w:pPr>
-      <w:r>
-        <w:rPr>
-          <w:rFonts w:ascii="Arial" w:cs="Arial" w:eastAsia="Arial" w:hAnsi="Arial"/>
-          <w:b/>
-          <w:bCs/>
-          <w:color w:val="1F3864"/>
-          <w:sz w:val="24"/>
-          <w:szCs w:val="24"/>
-        </w:rPr>
-        <w:t xml:space="preserve">15.8 Persona linked to CRM data model (DEC-008)</w:t>
-      </w:r>
-    </w:p>
-    <w:p>
-      <w:pPr>
-        <w:spacing w:after="160"/>
-      </w:pPr>
-      <w:r>
-        <w:rPr>
-          <w:rFonts w:ascii="Arial" w:cs="Arial" w:eastAsia="Arial" w:hAnsi="Arial"/>
-          <w:color w:val="000000"/>
-          <w:sz w:val="22"/>
-          <w:szCs w:val="22"/>
-        </w:rPr>
-        <w:t xml:space="preserve">Persona records can reference a specific entity, field, and field value in the CRM data model. This enables impact analysis to connect persona changes to CRM field changes.</w:t>
-      </w:r>
-    </w:p>
-    <w:p>
-      <w:pPr>
-        <w:pStyle w:val="Heading2"/>
-        <w:spacing w:after="160" w:before="280"/>
-      </w:pPr>
-      <w:r>
-        <w:rPr>
-          <w:rFonts w:ascii="Arial" w:cs="Arial" w:eastAsia="Arial" w:hAnsi="Arial"/>
-          <w:b/>
-          <w:bCs/>
-          <w:color w:val="1F3864"/>
-          <w:sz w:val="24"/>
-          <w:szCs w:val="24"/>
-        </w:rPr>
-        <w:t xml:space="preserve">15.9 Stored status with event-driven recalculation (DEC-009)</w:t>
-      </w:r>
-    </w:p>
-    <w:p>
-      <w:pPr>
-        <w:spacing w:after="160"/>
-      </w:pPr>
-      <w:r>
-        <w:rPr>
-          <w:rFonts w:ascii="Arial" w:cs="Arial" w:eastAsia="Arial" w:hAnsi="Arial"/>
-          <w:color w:val="000000"/>
-          <w:sz w:val="22"/>
-          <w:szCs w:val="22"/>
-        </w:rPr>
-        <w:t xml:space="preserve">Work item status is stored on the WorkItem record and updated by the engine whenever an upstream item transitions. This avoids recalculating the full dependency graph on every dashboard query while keeping stored values current through event-driven triggers.</w:t>
-      </w:r>
-    </w:p>
-    <w:p>
-      <w:pPr>
-        <w:pStyle w:val="Heading2"/>
-        <w:spacing w:after="160" w:before="280"/>
-      </w:pPr>
-      <w:r>
-        <w:rPr>
-          <w:rFonts w:ascii="Arial" w:cs="Arial" w:eastAsia="Arial" w:hAnsi="Arial"/>
-          <w:b/>
-          <w:bCs/>
-          <w:color w:val="1F3864"/>
-          <w:sz w:val="24"/>
-          <w:szCs w:val="24"/>
-        </w:rPr>
-        <w:t xml:space="preserve">15.10 Dependency graph built progressively (DEC-010)</w:t>
-      </w:r>
-    </w:p>
-    <w:p>
-      <w:pPr>
-        <w:spacing w:after="160"/>
-      </w:pPr>
-      <w:r>
-        <w:rPr>
-          <w:rFonts w:ascii="Arial" w:cs="Arial" w:eastAsia="Arial" w:hAnsi="Arial"/>
-          <w:color w:val="000000"/>
-          <w:sz w:val="22"/>
-          <w:szCs w:val="22"/>
-        </w:rPr>
-        <w:t xml:space="preserve">The engine creates work items at three points: project creation (Master PRD only), Master PRD import (Business Object Discovery only), and Business Object Discovery import (all remaining phases). This progressive approach reflects the fact that later work items cannot be defined until earlier phases identify the domains, entities, and processes.</w:t>
-      </w:r>
-    </w:p>
-    <w:p>
-      <w:pPr>
-        <w:pStyle w:val="Heading2"/>
-        <w:spacing w:after="160" w:before="280"/>
-      </w:pPr>
-      <w:r>
-        <w:rPr>
-          <w:rFonts w:ascii="Arial" w:cs="Arial" w:eastAsia="Arial" w:hAnsi="Arial"/>
-          <w:b/>
-          <w:bCs/>
-          <w:color w:val="1F3864"/>
-          <w:sz w:val="24"/>
-          <w:szCs w:val="24"/>
-        </w:rPr>
-        <w:t xml:space="preserve">15.11 Process dependencies wired through domain_overview (DEC-011)</w:t>
-      </w:r>
-    </w:p>
-    <w:p>
-      <w:pPr>
-        <w:spacing w:after="160"/>
-      </w:pPr>
-      <w:r>
-        <w:rPr>
-          <w:rFonts w:ascii="Arial" w:cs="Arial" w:eastAsia="Arial" w:hAnsi="Arial"/>
-          <w:color w:val="000000"/>
-          <w:sz w:val="22"/>
-          <w:szCs w:val="22"/>
-        </w:rPr>
-        <w:t xml:space="preserve">Process definition work items depend on their domain’s domain_overview, not directly on individual entity PRDs. The domain_overview serves as a gateway  —  it cannot become ready until all entity PRDs relevant to that domain are complete, guaranteeing that process definitions have full entity context available. This also provides a single node for cross-domain dependency wiring.</w:t>
-      </w:r>
-    </w:p>
-    <w:p>
-      <w:pPr>
-        <w:pStyle w:val="Heading2"/>
-        <w:spacing w:after="160" w:before="280"/>
-      </w:pPr>
-      <w:r>
-        <w:rPr>
-          <w:rFonts w:ascii="Arial" w:cs="Arial" w:eastAsia="Arial" w:hAnsi="Arial"/>
-          <w:b/>
-          <w:bCs/>
-          <w:color w:val="1F3864"/>
-          <w:sz w:val="24"/>
-          <w:szCs w:val="24"/>
-        </w:rPr>
-        <w:t xml:space="preserve">15.12 Parallel YAML generation across domains (DEC-012)</w:t>
-      </w:r>
-    </w:p>
-    <w:p>
-      <w:pPr>
-        <w:spacing w:after="160"/>
-      </w:pPr>
-      <w:r>
-        <w:rPr>
-          <w:rFonts w:ascii="Arial" w:cs="Arial" w:eastAsia="Arial" w:hAnsi="Arial"/>
-          <w:color w:val="000000"/>
-          <w:sz w:val="22"/>
-          <w:szCs w:val="22"/>
-        </w:rPr>
-        <w:t xml:space="preserve">YAML generation work items have no cross-domain dependencies. Each depends only on its own domain’s stakeholder review. The administrator chooses which domain to process first. This is consistent with DEC-007 (domain sort_order is display preference only).</w:t>
-      </w:r>
-    </w:p>
-    <w:p>
-      <w:pPr>
-        <w:pStyle w:val="Heading2"/>
-        <w:spacing w:after="160" w:before="280"/>
-      </w:pPr>
-      <w:r>
-        <w:rPr>
-          <w:rFonts w:ascii="Arial" w:cs="Arial" w:eastAsia="Arial" w:hAnsi="Arial"/>
-          <w:b/>
-          <w:bCs/>
-          <w:color w:val="1F3864"/>
-          <w:sz w:val="24"/>
-          <w:szCs w:val="24"/>
-        </w:rPr>
-        <w:t xml:space="preserve">15.13 Cascade regression on revision (DEC-013)</w:t>
-      </w:r>
-    </w:p>
-    <w:p>
-      <w:pPr>
-        <w:spacing w:after="160"/>
-      </w:pPr>
-      <w:r>
-        <w:rPr>
-          <w:rFonts w:ascii="Arial" w:cs="Arial" w:eastAsia="Arial" w:hAnsi="Arial"/>
-          <w:color w:val="000000"/>
-          <w:sz w:val="22"/>
-          <w:szCs w:val="22"/>
-        </w:rPr>
-        <w:t xml:space="preserve">When a completed work item is reopened, downstream items that are ready revert to not_started, and downstream items that are in_progress or complete are blocked with the prior status preserved. This prevents work from proceeding on potentially stale upstream data.</w:t>
-      </w:r>
-    </w:p>
-    <w:p>
-      <w:pPr>
-        <w:pStyle w:val="Heading2"/>
-        <w:spacing w:after="160" w:before="280"/>
-      </w:pPr>
-      <w:r>
-        <w:rPr>
-          <w:rFonts w:ascii="Arial" w:cs="Arial" w:eastAsia="Arial" w:hAnsi="Arial"/>
-          <w:b/>
-          <w:bCs/>
-          <w:color w:val="1F3864"/>
-          <w:sz w:val="24"/>
-          <w:szCs w:val="24"/>
-        </w:rPr>
-        <w:t xml:space="preserve">15.14 Scope change dependency updates are administrator-driven (DEC-014)</w:t>
-      </w:r>
-    </w:p>
-    <w:p>
-      <w:pPr>
-        <w:spacing w:after="160"/>
-      </w:pPr>
-      <w:r>
-        <w:rPr>
-          <w:rFonts w:ascii="Arial" w:cs="Arial" w:eastAsia="Arial" w:hAnsi="Arial"/>
-          <w:color w:val="000000"/>
-          <w:sz w:val="22"/>
-          <w:szCs w:val="22"/>
-        </w:rPr>
-        <w:t xml:space="preserve">When Entity Inventory participation data changes mid-project or cross-domain ordering is needed, the impact analysis engine surfaces the change, but the administrator decides whether to add, modify, or remove dependencies. Automatic dependency modification on every data update would create disproportionate churn for minor scope discoveries.</w:t>
-      </w:r>
-    </w:p>
-    <w:p>
-      <w:pPr>
-        <w:pStyle w:val="Heading2"/>
-        <w:spacing w:after="160" w:before="280"/>
-      </w:pPr>
-      <w:r>
-        <w:rPr>
-          <w:rFonts w:ascii="Arial" w:cs="Arial" w:eastAsia="Arial" w:hAnsi="Arial"/>
-          <w:b/>
-          <w:bCs/>
-          <w:color w:val="1F3864"/>
-          <w:sz w:val="24"/>
-          <w:szCs w:val="24"/>
-        </w:rPr>
-        <w:t xml:space="preserve">15.15 Domain overview as gateway to process work (DEC-015)</w:t>
-      </w:r>
-    </w:p>
-    <w:p>
-      <w:pPr>
-        <w:spacing w:after="160"/>
-      </w:pPr>
-      <w:r>
-        <w:rPr>
-          <w:rFonts w:ascii="Arial" w:cs="Arial" w:eastAsia="Arial" w:hAnsi="Arial"/>
-          <w:color w:val="000000"/>
-          <w:sz w:val="22"/>
-          <w:szCs w:val="22"/>
-        </w:rPr>
-        <w:t xml:space="preserve">Each domain has a domain_overview work item that produces a domain-scoped reference document assembling personas, business process inventory, and data reference from upstream work items. This replaces the need to upload multiple documents into each process definition conversation and provides a natural node for cross-domain dependency ordering.</w:t>
-      </w:r>
-    </w:p>
-    <w:p>
-      <w:pPr>
-        <w:pStyle w:val="Heading2"/>
-        <w:spacing w:after="160" w:before="280"/>
-      </w:pPr>
-      <w:r>
-        <w:rPr>
-          <w:rFonts w:ascii="Arial" w:cs="Arial" w:eastAsia="Arial" w:hAnsi="Arial"/>
-          <w:b/>
-          <w:bCs/>
-          <w:color w:val="1F3864"/>
-          <w:sz w:val="24"/>
-          <w:szCs w:val="24"/>
-        </w:rPr>
-        <w:t xml:space="preserve">15.16 CRM Selection and CRM Deployment are separate work items (DEC-016)</w:t>
-      </w:r>
-    </w:p>
-    <w:p>
-      <w:pPr>
-        <w:spacing w:after="160"/>
-      </w:pPr>
-      <w:r>
-        <w:rPr>
-          <w:rFonts w:ascii="Arial" w:cs="Arial" w:eastAsia="Arial" w:hAnsi="Arial"/>
-          <w:color w:val="000000"/>
-          <w:sz w:val="22"/>
-          <w:szCs w:val="22"/>
-        </w:rPr>
-        <w:t xml:space="preserve">The Document Production Process combines these into a single phase, but they are distinct activities with different outputs. CRM Selection is an AI-session conversation producing a CRM Evaluation Report. CRM Deployment is the provisioning of the actual CRM instance. Separating them provides clearer status tracking and accommodates the reality that time may pass between platform selection and instance provisioning.</w:t>
-      </w:r>
-    </w:p>
-    <w:p>
-      <w:pPr>
-        <w:pStyle w:val="Heading1"/>
-        <w:spacing w:after="200" w:before="360"/>
-      </w:pPr>
-      <w:r>
-        <w:rPr>
-          <w:rFonts w:ascii="Arial" w:cs="Arial" w:eastAsia="Arial" w:hAnsi="Arial"/>
-          <w:b/>
-          <w:bCs/>
-          <w:color w:val="1F3864"/>
-          <w:sz w:val="28"/>
-          <w:szCs w:val="28"/>
-        </w:rPr>
-        <w:t xml:space="preserve">16. Open Issues</w:t>
-      </w:r>
-    </w:p>
-    <w:p>
-      <w:pPr>
-        <w:pStyle w:val="Heading2"/>
-        <w:spacing w:after="160" w:before="280"/>
-      </w:pPr>
-      <w:r>
-        <w:rPr>
-          <w:rFonts w:ascii="Arial" w:cs="Arial" w:eastAsia="Arial" w:hAnsi="Arial"/>
-          <w:b/>
-          <w:bCs/>
-          <w:color w:val="1F3864"/>
-          <w:sz w:val="24"/>
-          <w:szCs w:val="24"/>
-        </w:rPr>
-        <w:t xml:space="preserve">16.1 CBM transition approach (ISS-001)</w:t>
-      </w:r>
-    </w:p>
-    <w:p>
-      <w:pPr>
-        <w:spacing w:after="160"/>
-      </w:pPr>
-      <w:r>
-        <w:rPr>
-          <w:rFonts w:ascii="Arial" w:cs="Arial" w:eastAsia="Arial" w:hAnsi="Arial"/>
-          <w:color w:val="000000"/>
-          <w:sz w:val="22"/>
-          <w:szCs w:val="22"/>
-        </w:rPr>
-        <w:t xml:space="preserve">The existing CBM implementation is partially complete under the old document-centric process. The approach for transitioning CBM to the database-driven process — whether to migrate existing data, restart from scratch, or use a hybrid approach — has not been decided.</w:t>
-      </w:r>
-    </w:p>
-    <w:p>
-      <w:pPr>
-        <w:pStyle w:val="Heading2"/>
-        <w:spacing w:after="160" w:before="280"/>
-      </w:pPr>
-      <w:r>
-        <w:rPr>
-          <w:rFonts w:ascii="Arial" w:cs="Arial" w:eastAsia="Arial" w:hAnsi="Arial"/>
-          <w:b/>
-          <w:bCs/>
-          <w:color w:val="1F3864"/>
-          <w:sz w:val="24"/>
-          <w:szCs w:val="24"/>
-        </w:rPr>
-        <w:t xml:space="preserve">16.2 Structured output format (ISS-002)</w:t>
-      </w:r>
-    </w:p>
-    <w:p>
-      <w:pPr>
-        <w:spacing w:after="160"/>
-      </w:pPr>
-      <w:r>
-        <w:rPr>
-          <w:rFonts w:ascii="Arial" w:cs="Arial" w:eastAsia="Arial" w:hAnsi="Arial"/>
-          <w:color w:val="000000"/>
-          <w:sz w:val="22"/>
-          <w:szCs w:val="22"/>
-        </w:rPr>
-        <w:t xml:space="preserve">The specific format (JSON schema, YAML schema, or other) for the structured output block that AI sessions must produce has not been defined. This format must be parseable by the import processor and flexible enough to handle all work item types.</w:t>
+        <w:t xml:space="preserve">The structured output format is JSON. AI sessions produce a JSON block with a common envelope containing output_version, work_item_type, work_item_id, session_type, a type-specific payload, and top-level arrays for decisions and open issues. Nine type-specific payload structures are defined covering all prompt-capable work item types. The L2 PRD defines the data categories each payload contains; exact field-level JSON schemas are defined during implementation. See Section 10.5.</w:t>
       </w:r>
     </w:p>
     <w:p>
@@ -32889,7 +35047,7 @@
           <w:sz w:val="22"/>
           <w:szCs w:val="22"/>
         </w:rPr>
-        <w:t xml:space="preserve">Design the Prompt Generator (Section 10).</w:t>
+        <w:t xml:space="preserve">Design the Prompt Generator (Section 10). — Complete</w:t>
       </w:r>
     </w:p>
     <w:p>

</xml_diff>

<commit_message>
L2 PRD v1.3: Section 12 (Impact Analysis Engine) complete
- 11 subsections (12.1-12.11) covering cross-reference query engine,
  pre-commit/post-commit analysis modes, impact presentation, review
  tracking, revision workflow interaction, batch processing, and
  document staleness detection
- DEC-039: Post-commit analysis for imports, pre-commit for direct edits
- Schema: action_required column on ChangeImpact table
- Next Steps: Section 12 marked complete
</commit_message>
<xml_diff>
--- a/PRDs/product/crmbuilder-automation-PRD/crmbuilder-automation-l2-PRD.docx
+++ b/PRDs/product/crmbuilder-automation-PRD/crmbuilder-automation-l2-PRD.docx
@@ -36591,18 +36591,3621 @@
     </w:p>
     <w:p>
       <w:pPr>
+        <w:pStyle w:val="Heading2"/>
+        <w:spacing w:after="160" w:before="280"/>
+      </w:pPr>
+      <w:r>
+        <w:rPr>
+          <w:rFonts w:ascii="Arial" w:cs="Arial" w:eastAsia="Arial" w:hAnsi="Arial"/>
+          <w:b/>
+          <w:bCs/>
+          <w:color w:val="1F3864"/>
+          <w:sz w:val="24"/>
+          <w:szCs w:val="24"/>
+        </w:rPr>
+        <w:t xml:space="preserve">12.1 Overview</w:t>
+      </w:r>
+    </w:p>
+    <w:p>
+      <w:pPr>
         <w:spacing w:after="160"/>
       </w:pPr>
       <w:r>
         <w:rPr>
           <w:rFonts w:ascii="Arial" w:cs="Arial" w:eastAsia="Arial" w:hAnsi="Arial"/>
-          <w:i/>
-          <w:iCs/>
-          <w:color w:val="888888"/>
-          <w:sz w:val="22"/>
-          <w:szCs w:val="22"/>
-        </w:rPr>
-        <w:t xml:space="preserve">This section will be defined in a subsequent revision. It will cover dependency tracing, cross-reference queries, change propagation logic, the impact presentation format, and the review tracking workflow.</w:t>
+          <w:color w:val="000000"/>
+          <w:sz w:val="22"/>
+          <w:szCs w:val="22"/>
+        </w:rPr>
+        <w:t xml:space="preserve">The Impact Analysis Engine traces the downstream effects of data changes across the requirements database. When a field definition changes, the engine identifies every process that references that field, every layout that displays it, every requirement that depends on it, and every document that would need regeneration. The engine produces a complete set of ChangeImpact records so the administrator can understand the full scope of a change and decide how to respond.</w:t>
+      </w:r>
+    </w:p>
+    <w:p>
+      <w:pPr>
+        <w:spacing w:after="160"/>
+      </w:pPr>
+      <w:r>
+        <w:rPr>
+          <w:rFonts w:ascii="Arial" w:cs="Arial" w:eastAsia="Arial" w:hAnsi="Arial"/>
+          <w:color w:val="000000"/>
+          <w:sz w:val="22"/>
+          <w:szCs w:val="22"/>
+        </w:rPr>
+        <w:t xml:space="preserve">The engine has two modes of operation depending on the change source:</w:t>
+      </w:r>
+    </w:p>
+    <w:p>
+      <w:pPr>
+        <w:spacing w:after="160"/>
+      </w:pPr>
+      <w:r>
+        <w:rPr>
+          <w:rFonts w:ascii="Arial" w:cs="Arial" w:eastAsia="Arial" w:hAnsi="Arial"/>
+          <w:b/>
+          <w:bCs/>
+          <w:color w:val="000000"/>
+          <w:sz w:val="22"/>
+          <w:szCs w:val="22"/>
+        </w:rPr>
+        <w:t xml:space="preserve">Post-commit analysis </w:t>
+      </w:r>
+      <w:r>
+        <w:rPr>
+          <w:rFonts w:ascii="Arial" w:cs="Arial" w:eastAsia="Arial" w:hAnsi="Arial"/>
+          <w:color w:val="000000"/>
+          <w:sz w:val="22"/>
+          <w:szCs w:val="22"/>
+        </w:rPr>
+        <w:t xml:space="preserve">runs after AI session imports commit data. The Import Processor triggers impact analysis as the final step in its downstream trigger sequence (Section 11.10.1, step 5). The engine receives the ChangeLog entries created during the commit transaction, traces their downstream effects through the cross-reference and dependency layers, and creates ChangeImpact records for administrator review. This mode applies to all three session types (initial, revision, clarification) whenever update operations are committed.</w:t>
+      </w:r>
+    </w:p>
+    <w:p>
+      <w:pPr>
+        <w:spacing w:after="160"/>
+      </w:pPr>
+      <w:r>
+        <w:rPr>
+          <w:rFonts w:ascii="Arial" w:cs="Arial" w:eastAsia="Arial" w:hAnsi="Arial"/>
+          <w:b/>
+          <w:bCs/>
+          <w:color w:val="000000"/>
+          <w:sz w:val="22"/>
+          <w:szCs w:val="22"/>
+        </w:rPr>
+        <w:t xml:space="preserve">Pre-commit analysis </w:t>
+      </w:r>
+      <w:r>
+        <w:rPr>
+          <w:rFonts w:ascii="Arial" w:cs="Arial" w:eastAsia="Arial" w:hAnsi="Arial"/>
+          <w:color w:val="000000"/>
+          <w:sz w:val="22"/>
+          <w:szCs w:val="22"/>
+        </w:rPr>
+        <w:t xml:space="preserve">runs before direct administrator edits are committed. When the administrator modifies a record outside of the import pipeline, the engine evaluates the proposed change against the current database state, presents the downstream impact, and requires confirmation before writing. If the administrator cancels, no data is modified and no ChangeLog entries are created.</w:t>
+      </w:r>
+    </w:p>
+    <w:p>
+      <w:pPr>
+        <w:spacing w:after="160"/>
+      </w:pPr>
+      <w:r>
+        <w:rPr>
+          <w:rFonts w:ascii="Arial" w:cs="Arial" w:eastAsia="Arial" w:hAnsi="Arial"/>
+          <w:color w:val="000000"/>
+          <w:sz w:val="22"/>
+          <w:szCs w:val="22"/>
+        </w:rPr>
+        <w:t xml:space="preserve">In both modes, the engine’s output is the same: a set of ChangeImpact records linked to the triggering ChangeLog entries, each identifying an affected record, describing how it is affected, and flagging whether it requires administrator review. The engine does not automatically modify any downstream records or reopen any work items — it surfaces information and the administrator decides how to act.</w:t>
+      </w:r>
+    </w:p>
+    <w:p>
+      <w:pPr>
+        <w:pStyle w:val="Heading2"/>
+        <w:spacing w:after="160" w:before="280"/>
+      </w:pPr>
+      <w:r>
+        <w:rPr>
+          <w:rFonts w:ascii="Arial" w:cs="Arial" w:eastAsia="Arial" w:hAnsi="Arial"/>
+          <w:b/>
+          <w:bCs/>
+          <w:color w:val="1F3864"/>
+          <w:sz w:val="24"/>
+          <w:szCs w:val="24"/>
+        </w:rPr>
+        <w:t xml:space="preserve">12.2 Change Sources</w:t>
+      </w:r>
+    </w:p>
+    <w:p>
+      <w:pPr>
+        <w:spacing w:after="160"/>
+      </w:pPr>
+      <w:r>
+        <w:rPr>
+          <w:rFonts w:ascii="Arial" w:cs="Arial" w:eastAsia="Arial" w:hAnsi="Arial"/>
+          <w:color w:val="000000"/>
+          <w:sz w:val="22"/>
+          <w:szCs w:val="22"/>
+        </w:rPr>
+        <w:t xml:space="preserve">Impact analysis is triggered by changes that modify or remove existing data. New records (inserts) are exempt because they have no existing downstream references — cross-references, layouts, and dependencies must be separately created, and those operations are evaluated independently.</w:t>
+      </w:r>
+    </w:p>
+    <w:p>
+      <w:pPr>
+        <w:spacing w:after="160"/>
+      </w:pPr>
+      <w:r>
+        <w:rPr>
+          <w:rFonts w:ascii="Arial" w:cs="Arial" w:eastAsia="Arial" w:hAnsi="Arial"/>
+          <w:b/>
+          <w:bCs/>
+          <w:color w:val="000000"/>
+          <w:sz w:val="22"/>
+          <w:szCs w:val="22"/>
+        </w:rPr>
+        <w:t xml:space="preserve">AI session imports. </w:t>
+      </w:r>
+      <w:r>
+        <w:rPr>
+          <w:rFonts w:ascii="Arial" w:cs="Arial" w:eastAsia="Arial" w:hAnsi="Arial"/>
+          <w:color w:val="000000"/>
+          <w:sz w:val="22"/>
+          <w:szCs w:val="22"/>
+        </w:rPr>
+        <w:t xml:space="preserve">The Import Processor triggers post-commit impact analysis whenever update operations are committed (Section 11.10.1, step 5). This applies to all three session types — initial, revision, and clarification. Insert-only imports skip impact analysis. The engine receives the ChangeLog entries from the commit transaction as its input.</w:t>
+      </w:r>
+    </w:p>
+    <w:p>
+      <w:pPr>
+        <w:spacing w:after="160"/>
+      </w:pPr>
+      <w:r>
+        <w:rPr>
+          <w:rFonts w:ascii="Arial" w:cs="Arial" w:eastAsia="Arial" w:hAnsi="Arial"/>
+          <w:b/>
+          <w:bCs/>
+          <w:color w:val="000000"/>
+          <w:sz w:val="22"/>
+          <w:szCs w:val="22"/>
+        </w:rPr>
+        <w:t xml:space="preserve">Direct administrator edits. </w:t>
+      </w:r>
+      <w:r>
+        <w:rPr>
+          <w:rFonts w:ascii="Arial" w:cs="Arial" w:eastAsia="Arial" w:hAnsi="Arial"/>
+          <w:color w:val="000000"/>
+          <w:sz w:val="22"/>
+          <w:szCs w:val="22"/>
+        </w:rPr>
+        <w:t xml:space="preserve">When the administrator modifies or deletes a record outside of the import pipeline, pre-commit impact analysis runs before the change is written. Updates and deletes both trigger analysis. The engine evaluates the proposed change against the current database state and presents the impact for confirmation.</w:t>
+      </w:r>
+    </w:p>
+    <w:p>
+      <w:pPr>
+        <w:spacing w:after="160"/>
+      </w:pPr>
+      <w:r>
+        <w:rPr>
+          <w:rFonts w:ascii="Arial" w:cs="Arial" w:eastAsia="Arial" w:hAnsi="Arial"/>
+          <w:b/>
+          <w:bCs/>
+          <w:color w:val="000000"/>
+          <w:sz w:val="22"/>
+          <w:szCs w:val="22"/>
+        </w:rPr>
+        <w:t xml:space="preserve">Exempt operations. </w:t>
+      </w:r>
+      <w:r>
+        <w:rPr>
+          <w:rFonts w:ascii="Arial" w:cs="Arial" w:eastAsia="Arial" w:hAnsi="Arial"/>
+          <w:color w:val="000000"/>
+          <w:sz w:val="22"/>
+          <w:szCs w:val="22"/>
+        </w:rPr>
+        <w:t xml:space="preserve">The following do not trigger impact analysis: insert operations (no existing downstream references); Workflow Engine status transitions including cascade regression and unblocking (these are managed consequences, not source changes); ChangeImpact record creation and review actions (administrative bookkeeping); and ChangeLog record creation (audit output, not source data).</w:t>
+      </w:r>
+    </w:p>
+    <w:p>
+      <w:pPr>
+        <w:pStyle w:val="Heading2"/>
+        <w:spacing w:after="160" w:before="280"/>
+      </w:pPr>
+      <w:r>
+        <w:rPr>
+          <w:rFonts w:ascii="Arial" w:cs="Arial" w:eastAsia="Arial" w:hAnsi="Arial"/>
+          <w:b/>
+          <w:bCs/>
+          <w:color w:val="1F3864"/>
+          <w:sz w:val="24"/>
+          <w:szCs w:val="24"/>
+        </w:rPr>
+        <w:t xml:space="preserve">12.3 Cross-Reference Query Engine</w:t>
+      </w:r>
+    </w:p>
+    <w:p>
+      <w:pPr>
+        <w:spacing w:after="160"/>
+      </w:pPr>
+      <w:r>
+        <w:rPr>
+          <w:rFonts w:ascii="Arial" w:cs="Arial" w:eastAsia="Arial" w:hAnsi="Arial"/>
+          <w:color w:val="000000"/>
+          <w:sz w:val="22"/>
+          <w:szCs w:val="22"/>
+        </w:rPr>
+        <w:t xml:space="preserve">The engine traces downstream effects by querying cross-reference, layout, management, and requirements tables. For each changed record, the engine identifies every record that references it directly. The query paths depend on the type of record that changed and whether the change is an update or a delete.</w:t>
+      </w:r>
+    </w:p>
+    <w:p>
+      <w:pPr>
+        <w:spacing w:after="160"/>
+      </w:pPr>
+      <w:r>
+        <w:rPr>
+          <w:rFonts w:ascii="Arial" w:cs="Arial" w:eastAsia="Arial" w:hAnsi="Arial"/>
+          <w:b/>
+          <w:bCs/>
+          <w:color w:val="000000"/>
+          <w:sz w:val="22"/>
+          <w:szCs w:val="22"/>
+        </w:rPr>
+        <w:t xml:space="preserve">Transitive tracing rule. </w:t>
+      </w:r>
+      <w:r>
+        <w:rPr>
+          <w:rFonts w:ascii="Arial" w:cs="Arial" w:eastAsia="Arial" w:hAnsi="Arial"/>
+          <w:color w:val="000000"/>
+          <w:sz w:val="22"/>
+          <w:szCs w:val="22"/>
+        </w:rPr>
+        <w:t xml:space="preserve">Delete operations trace transitively — if deleting an entity surfaces its fields as affected, the engine also traces each field’s downstream references (ProcessField, LayoutRow, ListColumn, etc.) to produce the complete impact set. Update operations trace one level only — changing an entity’s description surfaces processes that reference the entity, but does not cascade through the entity’s fields, because the fields themselves have not changed.</w:t>
+      </w:r>
+    </w:p>
+    <w:p>
+      <w:pPr>
+        <w:spacing w:after="160"/>
+      </w:pPr>
+      <w:r>
+        <w:rPr>
+          <w:rFonts w:ascii="Arial" w:cs="Arial" w:eastAsia="Arial" w:hAnsi="Arial"/>
+          <w:b/>
+          <w:bCs/>
+          <w:color w:val="000000"/>
+          <w:sz w:val="22"/>
+          <w:szCs w:val="22"/>
+        </w:rPr>
+        <w:t xml:space="preserve">Step-level granularity. </w:t>
+      </w:r>
+      <w:r>
+        <w:rPr>
+          <w:rFonts w:ascii="Arial" w:cs="Arial" w:eastAsia="Arial" w:hAnsi="Arial"/>
+          <w:color w:val="000000"/>
+          <w:sz w:val="22"/>
+          <w:szCs w:val="22"/>
+        </w:rPr>
+        <w:t xml:space="preserve">The cross-reference tables ProcessEntity, ProcessField, and ProcessPersona include an optional process_step_id (DEC-036). When step-level cross-references are populated, the engine reports the specific step affected, not just the process. Impact descriptions reference both the process and the step when available, enabling the administrator to assess impact at the most precise level recorded.</w:t>
+      </w:r>
+    </w:p>
+    <w:p>
+      <w:pPr>
+        <w:pStyle w:val="Heading3"/>
+        <w:spacing w:after="120" w:before="240"/>
+      </w:pPr>
+      <w:r>
+        <w:rPr>
+          <w:rFonts w:ascii="Arial" w:cs="Arial" w:eastAsia="Arial" w:hAnsi="Arial"/>
+          <w:b/>
+          <w:bCs/>
+          <w:color w:val="1F3864"/>
+          <w:sz w:val="22"/>
+          <w:szCs w:val="22"/>
+        </w:rPr>
+        <w:t xml:space="preserve">12.3.1 Field Change</w:t>
+      </w:r>
+    </w:p>
+    <w:p>
+      <w:pPr>
+        <w:spacing w:after="160"/>
+      </w:pPr>
+      <w:r>
+        <w:rPr>
+          <w:rFonts w:ascii="Arial" w:cs="Arial" w:eastAsia="Arial" w:hAnsi="Arial"/>
+          <w:color w:val="000000"/>
+          <w:sz w:val="22"/>
+          <w:szCs w:val="22"/>
+        </w:rPr>
+        <w:t xml:space="preserve">A change to a Field record (field type, label, required flag, default value, or deletion) triggers queries against:</w:t>
+      </w:r>
+    </w:p>
+    <w:p>
+      <w:pPr>
+        <w:spacing w:after="120"/>
+      </w:pPr>
+      <w:r>
+        <w:rPr>
+          <w:rFonts w:ascii="Arial" w:cs="Arial" w:eastAsia="Arial" w:hAnsi="Arial"/>
+          <w:b/>
+          <w:bCs/>
+          <w:color w:val="000000"/>
+          <w:sz w:val="22"/>
+          <w:szCs w:val="22"/>
+        </w:rPr>
+        <w:t xml:space="preserve">ProcessField — </w:t>
+      </w:r>
+      <w:r>
+        <w:rPr>
+          <w:rFonts w:ascii="Arial" w:cs="Arial" w:eastAsia="Arial" w:hAnsi="Arial"/>
+          <w:color w:val="000000"/>
+          <w:sz w:val="22"/>
+          <w:szCs w:val="22"/>
+        </w:rPr>
+        <w:t xml:space="preserve">every process and step that uses this field. The usage value (collected, displayed, updated, evaluated, filtered, calculated) is included in the impact description to distinguish between processes that merely display the field and processes that depend on its data type for calculations.</w:t>
+      </w:r>
+    </w:p>
+    <w:p>
+      <w:pPr>
+        <w:spacing w:after="120"/>
+      </w:pPr>
+      <w:r>
+        <w:rPr>
+          <w:rFonts w:ascii="Arial" w:cs="Arial" w:eastAsia="Arial" w:hAnsi="Arial"/>
+          <w:b/>
+          <w:bCs/>
+          <w:color w:val="000000"/>
+          <w:sz w:val="22"/>
+          <w:szCs w:val="22"/>
+        </w:rPr>
+        <w:t xml:space="preserve">LayoutRow — </w:t>
+      </w:r>
+      <w:r>
+        <w:rPr>
+          <w:rFonts w:ascii="Arial" w:cs="Arial" w:eastAsia="Arial" w:hAnsi="Arial"/>
+          <w:color w:val="000000"/>
+          <w:sz w:val="22"/>
+          <w:szCs w:val="22"/>
+        </w:rPr>
+        <w:t xml:space="preserve">rows where cell_1_field_id or cell_2_field_id references this field. A field type change may require layout adjustments (e.g., a varchar becoming a wysiwyg needs full-width rendering). A deletion orphans the layout cell.</w:t>
+      </w:r>
+    </w:p>
+    <w:p>
+      <w:pPr>
+        <w:spacing w:after="120"/>
+      </w:pPr>
+      <w:r>
+        <w:rPr>
+          <w:rFonts w:ascii="Arial" w:cs="Arial" w:eastAsia="Arial" w:hAnsi="Arial"/>
+          <w:b/>
+          <w:bCs/>
+          <w:color w:val="000000"/>
+          <w:sz w:val="22"/>
+          <w:szCs w:val="22"/>
+        </w:rPr>
+        <w:t xml:space="preserve">ListColumn — </w:t>
+      </w:r>
+      <w:r>
+        <w:rPr>
+          <w:rFonts w:ascii="Arial" w:cs="Arial" w:eastAsia="Arial" w:hAnsi="Arial"/>
+          <w:color w:val="000000"/>
+          <w:sz w:val="22"/>
+          <w:szCs w:val="22"/>
+        </w:rPr>
+        <w:t xml:space="preserve">list view columns displaying this field. A deletion removes the field from the list view.</w:t>
+      </w:r>
+    </w:p>
+    <w:p>
+      <w:pPr>
+        <w:spacing w:after="120"/>
+      </w:pPr>
+      <w:r>
+        <w:rPr>
+          <w:rFonts w:ascii="Arial" w:cs="Arial" w:eastAsia="Arial" w:hAnsi="Arial"/>
+          <w:b/>
+          <w:bCs/>
+          <w:color w:val="000000"/>
+          <w:sz w:val="22"/>
+          <w:szCs w:val="22"/>
+        </w:rPr>
+        <w:t xml:space="preserve">Persona — </w:t>
+      </w:r>
+      <w:r>
+        <w:rPr>
+          <w:rFonts w:ascii="Arial" w:cs="Arial" w:eastAsia="Arial" w:hAnsi="Arial"/>
+          <w:color w:val="000000"/>
+          <w:sz w:val="22"/>
+          <w:szCs w:val="22"/>
+        </w:rPr>
+        <w:t xml:space="preserve">personas whose persona_field_id references this field. If the field that discriminates personas is modified or deleted, every persona mapped through it is affected.</w:t>
+      </w:r>
+    </w:p>
+    <w:p>
+      <w:pPr>
+        <w:spacing w:after="120"/>
+      </w:pPr>
+      <w:r>
+        <w:rPr>
+          <w:rFonts w:ascii="Arial" w:cs="Arial" w:eastAsia="Arial" w:hAnsi="Arial"/>
+          <w:b/>
+          <w:bCs/>
+          <w:color w:val="000000"/>
+          <w:sz w:val="22"/>
+          <w:szCs w:val="22"/>
+        </w:rPr>
+        <w:t xml:space="preserve">Decision — </w:t>
+      </w:r>
+      <w:r>
+        <w:rPr>
+          <w:rFonts w:ascii="Arial" w:cs="Arial" w:eastAsia="Arial" w:hAnsi="Arial"/>
+          <w:color w:val="000000"/>
+          <w:sz w:val="22"/>
+          <w:szCs w:val="22"/>
+        </w:rPr>
+        <w:t xml:space="preserve">decisions scoped to this field (field_id FK).</w:t>
+      </w:r>
+    </w:p>
+    <w:p>
+      <w:pPr>
+        <w:spacing w:after="160"/>
+      </w:pPr>
+      <w:r>
+        <w:rPr>
+          <w:rFonts w:ascii="Arial" w:cs="Arial" w:eastAsia="Arial" w:hAnsi="Arial"/>
+          <w:b/>
+          <w:bCs/>
+          <w:color w:val="000000"/>
+          <w:sz w:val="22"/>
+          <w:szCs w:val="22"/>
+        </w:rPr>
+        <w:t xml:space="preserve">OpenIssue — </w:t>
+      </w:r>
+      <w:r>
+        <w:rPr>
+          <w:rFonts w:ascii="Arial" w:cs="Arial" w:eastAsia="Arial" w:hAnsi="Arial"/>
+          <w:color w:val="000000"/>
+          <w:sz w:val="22"/>
+          <w:szCs w:val="22"/>
+        </w:rPr>
+        <w:t xml:space="preserve">open issues scoped to this field (field_id FK).</w:t>
+      </w:r>
+    </w:p>
+    <w:p>
+      <w:pPr>
+        <w:pStyle w:val="Heading3"/>
+        <w:spacing w:after="120" w:before="240"/>
+      </w:pPr>
+      <w:r>
+        <w:rPr>
+          <w:rFonts w:ascii="Arial" w:cs="Arial" w:eastAsia="Arial" w:hAnsi="Arial"/>
+          <w:b/>
+          <w:bCs/>
+          <w:color w:val="1F3864"/>
+          <w:sz w:val="22"/>
+          <w:szCs w:val="22"/>
+        </w:rPr>
+        <w:t xml:space="preserve">12.3.2 Entity Change</w:t>
+      </w:r>
+    </w:p>
+    <w:p>
+      <w:pPr>
+        <w:spacing w:after="160"/>
+      </w:pPr>
+      <w:r>
+        <w:rPr>
+          <w:rFonts w:ascii="Arial" w:cs="Arial" w:eastAsia="Arial" w:hAnsi="Arial"/>
+          <w:color w:val="000000"/>
+          <w:sz w:val="22"/>
+          <w:szCs w:val="22"/>
+        </w:rPr>
+        <w:t xml:space="preserve">A change to an Entity record (name, code, entity_type, or deletion) triggers queries against:</w:t>
+      </w:r>
+    </w:p>
+    <w:p>
+      <w:pPr>
+        <w:spacing w:after="120"/>
+      </w:pPr>
+      <w:r>
+        <w:rPr>
+          <w:rFonts w:ascii="Arial" w:cs="Arial" w:eastAsia="Arial" w:hAnsi="Arial"/>
+          <w:b/>
+          <w:bCs/>
+          <w:color w:val="000000"/>
+          <w:sz w:val="22"/>
+          <w:szCs w:val="22"/>
+        </w:rPr>
+        <w:t xml:space="preserve">ProcessEntity — </w:t>
+      </w:r>
+      <w:r>
+        <w:rPr>
+          <w:rFonts w:ascii="Arial" w:cs="Arial" w:eastAsia="Arial" w:hAnsi="Arial"/>
+          <w:color w:val="000000"/>
+          <w:sz w:val="22"/>
+          <w:szCs w:val="22"/>
+        </w:rPr>
+        <w:t xml:space="preserve">every process and step that involves this entity.</w:t>
+      </w:r>
+    </w:p>
+    <w:p>
+      <w:pPr>
+        <w:spacing w:after="120"/>
+      </w:pPr>
+      <w:r>
+        <w:rPr>
+          <w:rFonts w:ascii="Arial" w:cs="Arial" w:eastAsia="Arial" w:hAnsi="Arial"/>
+          <w:b/>
+          <w:bCs/>
+          <w:color w:val="000000"/>
+          <w:sz w:val="22"/>
+          <w:szCs w:val="22"/>
+        </w:rPr>
+        <w:t xml:space="preserve">Field — </w:t>
+      </w:r>
+      <w:r>
+        <w:rPr>
+          <w:rFonts w:ascii="Arial" w:cs="Arial" w:eastAsia="Arial" w:hAnsi="Arial"/>
+          <w:color w:val="000000"/>
+          <w:sz w:val="22"/>
+          <w:szCs w:val="22"/>
+        </w:rPr>
+        <w:t xml:space="preserve">all fields belonging to this entity (entity_id FK). For deletes, each field is transitively traced per Section 12.3.1.</w:t>
+      </w:r>
+    </w:p>
+    <w:p>
+      <w:pPr>
+        <w:spacing w:after="120"/>
+      </w:pPr>
+      <w:r>
+        <w:rPr>
+          <w:rFonts w:ascii="Arial" w:cs="Arial" w:eastAsia="Arial" w:hAnsi="Arial"/>
+          <w:b/>
+          <w:bCs/>
+          <w:color w:val="000000"/>
+          <w:sz w:val="22"/>
+          <w:szCs w:val="22"/>
+        </w:rPr>
+        <w:t xml:space="preserve">Relationship — </w:t>
+      </w:r>
+      <w:r>
+        <w:rPr>
+          <w:rFonts w:ascii="Arial" w:cs="Arial" w:eastAsia="Arial" w:hAnsi="Arial"/>
+          <w:color w:val="000000"/>
+          <w:sz w:val="22"/>
+          <w:szCs w:val="22"/>
+        </w:rPr>
+        <w:t xml:space="preserve">relationships where this entity is on either side (entity_id or entity_foreign_id).</w:t>
+      </w:r>
+    </w:p>
+    <w:p>
+      <w:pPr>
+        <w:spacing w:after="120"/>
+      </w:pPr>
+      <w:r>
+        <w:rPr>
+          <w:rFonts w:ascii="Arial" w:cs="Arial" w:eastAsia="Arial" w:hAnsi="Arial"/>
+          <w:b/>
+          <w:bCs/>
+          <w:color w:val="000000"/>
+          <w:sz w:val="22"/>
+          <w:szCs w:val="22"/>
+        </w:rPr>
+        <w:t xml:space="preserve">LayoutPanel — </w:t>
+      </w:r>
+      <w:r>
+        <w:rPr>
+          <w:rFonts w:ascii="Arial" w:cs="Arial" w:eastAsia="Arial" w:hAnsi="Arial"/>
+          <w:color w:val="000000"/>
+          <w:sz w:val="22"/>
+          <w:szCs w:val="22"/>
+        </w:rPr>
+        <w:t xml:space="preserve">layout panels for this entity (entity_id FK). For deletes, each panel’s child rows, tabs, and columns are transitively included.</w:t>
+      </w:r>
+    </w:p>
+    <w:p>
+      <w:pPr>
+        <w:spacing w:after="120"/>
+      </w:pPr>
+      <w:r>
+        <w:rPr>
+          <w:rFonts w:ascii="Arial" w:cs="Arial" w:eastAsia="Arial" w:hAnsi="Arial"/>
+          <w:b/>
+          <w:bCs/>
+          <w:color w:val="000000"/>
+          <w:sz w:val="22"/>
+          <w:szCs w:val="22"/>
+        </w:rPr>
+        <w:t xml:space="preserve">ListColumn — </w:t>
+      </w:r>
+      <w:r>
+        <w:rPr>
+          <w:rFonts w:ascii="Arial" w:cs="Arial" w:eastAsia="Arial" w:hAnsi="Arial"/>
+          <w:color w:val="000000"/>
+          <w:sz w:val="22"/>
+          <w:szCs w:val="22"/>
+        </w:rPr>
+        <w:t xml:space="preserve">list view columns for this entity (entity_id FK).</w:t>
+      </w:r>
+    </w:p>
+    <w:p>
+      <w:pPr>
+        <w:spacing w:after="120"/>
+      </w:pPr>
+      <w:r>
+        <w:rPr>
+          <w:rFonts w:ascii="Arial" w:cs="Arial" w:eastAsia="Arial" w:hAnsi="Arial"/>
+          <w:b/>
+          <w:bCs/>
+          <w:color w:val="000000"/>
+          <w:sz w:val="22"/>
+          <w:szCs w:val="22"/>
+        </w:rPr>
+        <w:t xml:space="preserve">Persona — </w:t>
+      </w:r>
+      <w:r>
+        <w:rPr>
+          <w:rFonts w:ascii="Arial" w:cs="Arial" w:eastAsia="Arial" w:hAnsi="Arial"/>
+          <w:color w:val="000000"/>
+          <w:sz w:val="22"/>
+          <w:szCs w:val="22"/>
+        </w:rPr>
+        <w:t xml:space="preserve">personas mapped to this entity (persona_entity_id FK).</w:t>
+      </w:r>
+    </w:p>
+    <w:p>
+      <w:pPr>
+        <w:spacing w:after="120"/>
+      </w:pPr>
+      <w:r>
+        <w:rPr>
+          <w:rFonts w:ascii="Arial" w:cs="Arial" w:eastAsia="Arial" w:hAnsi="Arial"/>
+          <w:b/>
+          <w:bCs/>
+          <w:color w:val="000000"/>
+          <w:sz w:val="22"/>
+          <w:szCs w:val="22"/>
+        </w:rPr>
+        <w:t xml:space="preserve">Decision and OpenIssue — </w:t>
+      </w:r>
+      <w:r>
+        <w:rPr>
+          <w:rFonts w:ascii="Arial" w:cs="Arial" w:eastAsia="Arial" w:hAnsi="Arial"/>
+          <w:color w:val="000000"/>
+          <w:sz w:val="22"/>
+          <w:szCs w:val="22"/>
+        </w:rPr>
+        <w:t xml:space="preserve">items scoped to this entity (entity_id FK).</w:t>
+      </w:r>
+    </w:p>
+    <w:p>
+      <w:pPr>
+        <w:spacing w:after="120"/>
+      </w:pPr>
+      <w:r>
+        <w:rPr>
+          <w:rFonts w:ascii="Arial" w:cs="Arial" w:eastAsia="Arial" w:hAnsi="Arial"/>
+          <w:b/>
+          <w:bCs/>
+          <w:color w:val="000000"/>
+          <w:sz w:val="22"/>
+          <w:szCs w:val="22"/>
+        </w:rPr>
+        <w:t xml:space="preserve">WorkItem — </w:t>
+      </w:r>
+      <w:r>
+        <w:rPr>
+          <w:rFonts w:ascii="Arial" w:cs="Arial" w:eastAsia="Arial" w:hAnsi="Arial"/>
+          <w:color w:val="000000"/>
+          <w:sz w:val="22"/>
+          <w:szCs w:val="22"/>
+        </w:rPr>
+        <w:t xml:space="preserve">entity_prd work items scoped to this entity (entity_id FK).</w:t>
+      </w:r>
+    </w:p>
+    <w:p>
+      <w:pPr>
+        <w:spacing w:after="160"/>
+      </w:pPr>
+      <w:r>
+        <w:rPr>
+          <w:rFonts w:ascii="Arial" w:cs="Arial" w:eastAsia="Arial" w:hAnsi="Arial"/>
+          <w:b/>
+          <w:bCs/>
+          <w:color w:val="000000"/>
+          <w:sz w:val="22"/>
+          <w:szCs w:val="22"/>
+        </w:rPr>
+        <w:t xml:space="preserve">Domain — </w:t>
+      </w:r>
+      <w:r>
+        <w:rPr>
+          <w:rFonts w:ascii="Arial" w:cs="Arial" w:eastAsia="Arial" w:hAnsi="Arial"/>
+          <w:color w:val="000000"/>
+          <w:sz w:val="22"/>
+          <w:szCs w:val="22"/>
+        </w:rPr>
+        <w:t xml:space="preserve">if the entity’s primary_domain_id is changed, the previous owning domain is surfaced as affected.</w:t>
+      </w:r>
+    </w:p>
+    <w:p>
+      <w:pPr>
+        <w:pStyle w:val="Heading3"/>
+        <w:spacing w:after="120" w:before="240"/>
+      </w:pPr>
+      <w:r>
+        <w:rPr>
+          <w:rFonts w:ascii="Arial" w:cs="Arial" w:eastAsia="Arial" w:hAnsi="Arial"/>
+          <w:b/>
+          <w:bCs/>
+          <w:color w:val="1F3864"/>
+          <w:sz w:val="22"/>
+          <w:szCs w:val="22"/>
+        </w:rPr>
+        <w:t xml:space="preserve">12.3.3 FieldOption Change</w:t>
+      </w:r>
+    </w:p>
+    <w:p>
+      <w:pPr>
+        <w:spacing w:after="160"/>
+      </w:pPr>
+      <w:r>
+        <w:rPr>
+          <w:rFonts w:ascii="Arial" w:cs="Arial" w:eastAsia="Arial" w:hAnsi="Arial"/>
+          <w:color w:val="000000"/>
+          <w:sz w:val="22"/>
+          <w:szCs w:val="22"/>
+        </w:rPr>
+        <w:t xml:space="preserve">A change to a FieldOption record (value, label, or deletion) triggers queries against:</w:t>
+      </w:r>
+    </w:p>
+    <w:p>
+      <w:pPr>
+        <w:spacing w:after="120"/>
+      </w:pPr>
+      <w:r>
+        <w:rPr>
+          <w:rFonts w:ascii="Arial" w:cs="Arial" w:eastAsia="Arial" w:hAnsi="Arial"/>
+          <w:b/>
+          <w:bCs/>
+          <w:color w:val="000000"/>
+          <w:sz w:val="22"/>
+          <w:szCs w:val="22"/>
+        </w:rPr>
+        <w:t xml:space="preserve">Persona — </w:t>
+      </w:r>
+      <w:r>
+        <w:rPr>
+          <w:rFonts w:ascii="Arial" w:cs="Arial" w:eastAsia="Arial" w:hAnsi="Arial"/>
+          <w:color w:val="000000"/>
+          <w:sz w:val="22"/>
+          <w:szCs w:val="22"/>
+        </w:rPr>
+        <w:t xml:space="preserve">personas whose persona_field_value matches the option’s value and whose persona_field_id matches the option’s parent field. A renamed or deleted option may invalidate the persona mapping.</w:t>
+      </w:r>
+    </w:p>
+    <w:p>
+      <w:pPr>
+        <w:spacing w:after="120"/>
+      </w:pPr>
+      <w:r>
+        <w:rPr>
+          <w:rFonts w:ascii="Arial" w:cs="Arial" w:eastAsia="Arial" w:hAnsi="Arial"/>
+          <w:b/>
+          <w:bCs/>
+          <w:color w:val="000000"/>
+          <w:sz w:val="22"/>
+          <w:szCs w:val="22"/>
+        </w:rPr>
+        <w:t xml:space="preserve">LayoutPanel — </w:t>
+      </w:r>
+      <w:r>
+        <w:rPr>
+          <w:rFonts w:ascii="Arial" w:cs="Arial" w:eastAsia="Arial" w:hAnsi="Arial"/>
+          <w:color w:val="000000"/>
+          <w:sz w:val="22"/>
+          <w:szCs w:val="22"/>
+        </w:rPr>
+        <w:t xml:space="preserve">panels whose dynamic_logic_value matches the option’s value and whose dynamic_logic_attribute matches the option’s parent field name. A renamed or deleted option may break visibility conditions.</w:t>
+      </w:r>
+    </w:p>
+    <w:p>
+      <w:pPr>
+        <w:spacing w:after="160"/>
+      </w:pPr>
+      <w:r>
+        <w:rPr>
+          <w:rFonts w:ascii="Arial" w:cs="Arial" w:eastAsia="Arial" w:hAnsi="Arial"/>
+          <w:b/>
+          <w:bCs/>
+          <w:color w:val="000000"/>
+          <w:sz w:val="22"/>
+          <w:szCs w:val="22"/>
+        </w:rPr>
+        <w:t xml:space="preserve">Field — </w:t>
+      </w:r>
+      <w:r>
+        <w:rPr>
+          <w:rFonts w:ascii="Arial" w:cs="Arial" w:eastAsia="Arial" w:hAnsi="Arial"/>
+          <w:color w:val="000000"/>
+          <w:sz w:val="22"/>
+          <w:szCs w:val="22"/>
+        </w:rPr>
+        <w:t xml:space="preserve">fields whose default_value matches the option’s value on the same parent field. A renamed or deleted option may invalidate the default.</w:t>
+      </w:r>
+    </w:p>
+    <w:p>
+      <w:pPr>
+        <w:pStyle w:val="Heading3"/>
+        <w:spacing w:after="120" w:before="240"/>
+      </w:pPr>
+      <w:r>
+        <w:rPr>
+          <w:rFonts w:ascii="Arial" w:cs="Arial" w:eastAsia="Arial" w:hAnsi="Arial"/>
+          <w:b/>
+          <w:bCs/>
+          <w:color w:val="1F3864"/>
+          <w:sz w:val="22"/>
+          <w:szCs w:val="22"/>
+        </w:rPr>
+        <w:t xml:space="preserve">12.3.4 Process Change</w:t>
+      </w:r>
+    </w:p>
+    <w:p>
+      <w:pPr>
+        <w:spacing w:after="160"/>
+      </w:pPr>
+      <w:r>
+        <w:rPr>
+          <w:rFonts w:ascii="Arial" w:cs="Arial" w:eastAsia="Arial" w:hAnsi="Arial"/>
+          <w:color w:val="000000"/>
+          <w:sz w:val="22"/>
+          <w:szCs w:val="22"/>
+        </w:rPr>
+        <w:t xml:space="preserve">A change to a Process record (name, code, description, triggers, completion criteria, domain assignment, or deletion) triggers queries against:</w:t>
+      </w:r>
+    </w:p>
+    <w:p>
+      <w:pPr>
+        <w:spacing w:after="120"/>
+      </w:pPr>
+      <w:r>
+        <w:rPr>
+          <w:rFonts w:ascii="Arial" w:cs="Arial" w:eastAsia="Arial" w:hAnsi="Arial"/>
+          <w:b/>
+          <w:bCs/>
+          <w:color w:val="000000"/>
+          <w:sz w:val="22"/>
+          <w:szCs w:val="22"/>
+        </w:rPr>
+        <w:t xml:space="preserve">ProcessStep — </w:t>
+      </w:r>
+      <w:r>
+        <w:rPr>
+          <w:rFonts w:ascii="Arial" w:cs="Arial" w:eastAsia="Arial" w:hAnsi="Arial"/>
+          <w:color w:val="000000"/>
+          <w:sz w:val="22"/>
+          <w:szCs w:val="22"/>
+        </w:rPr>
+        <w:t xml:space="preserve">all steps belonging to this process (process_id FK). For deletes, each step is transitively traced through ProcessEntity, ProcessField, and ProcessPersona at the step level.</w:t>
+      </w:r>
+    </w:p>
+    <w:p>
+      <w:pPr>
+        <w:spacing w:after="120"/>
+      </w:pPr>
+      <w:r>
+        <w:rPr>
+          <w:rFonts w:ascii="Arial" w:cs="Arial" w:eastAsia="Arial" w:hAnsi="Arial"/>
+          <w:b/>
+          <w:bCs/>
+          <w:color w:val="000000"/>
+          <w:sz w:val="22"/>
+          <w:szCs w:val="22"/>
+        </w:rPr>
+        <w:t xml:space="preserve">ProcessEntity, ProcessField, ProcessPersona — </w:t>
+      </w:r>
+      <w:r>
+        <w:rPr>
+          <w:rFonts w:ascii="Arial" w:cs="Arial" w:eastAsia="Arial" w:hAnsi="Arial"/>
+          <w:color w:val="000000"/>
+          <w:sz w:val="22"/>
+          <w:szCs w:val="22"/>
+        </w:rPr>
+        <w:t xml:space="preserve">all cross-references for this process (process_id FK). These are direct references, not transitive — the cross-reference records themselves are the affected items.</w:t>
+      </w:r>
+    </w:p>
+    <w:p>
+      <w:pPr>
+        <w:spacing w:after="120"/>
+      </w:pPr>
+      <w:r>
+        <w:rPr>
+          <w:rFonts w:ascii="Arial" w:cs="Arial" w:eastAsia="Arial" w:hAnsi="Arial"/>
+          <w:b/>
+          <w:bCs/>
+          <w:color w:val="000000"/>
+          <w:sz w:val="22"/>
+          <w:szCs w:val="22"/>
+        </w:rPr>
+        <w:t xml:space="preserve">Requirement — </w:t>
+      </w:r>
+      <w:r>
+        <w:rPr>
+          <w:rFonts w:ascii="Arial" w:cs="Arial" w:eastAsia="Arial" w:hAnsi="Arial"/>
+          <w:color w:val="000000"/>
+          <w:sz w:val="22"/>
+          <w:szCs w:val="22"/>
+        </w:rPr>
+        <w:t xml:space="preserve">all requirements belonging to this process (process_id FK). For deletes, each requirement is transitively traced per Section 12.3.8.</w:t>
+      </w:r>
+    </w:p>
+    <w:p>
+      <w:pPr>
+        <w:spacing w:after="120"/>
+      </w:pPr>
+      <w:r>
+        <w:rPr>
+          <w:rFonts w:ascii="Arial" w:cs="Arial" w:eastAsia="Arial" w:hAnsi="Arial"/>
+          <w:b/>
+          <w:bCs/>
+          <w:color w:val="000000"/>
+          <w:sz w:val="22"/>
+          <w:szCs w:val="22"/>
+        </w:rPr>
+        <w:t xml:space="preserve">Decision and OpenIssue — </w:t>
+      </w:r>
+      <w:r>
+        <w:rPr>
+          <w:rFonts w:ascii="Arial" w:cs="Arial" w:eastAsia="Arial" w:hAnsi="Arial"/>
+          <w:color w:val="000000"/>
+          <w:sz w:val="22"/>
+          <w:szCs w:val="22"/>
+        </w:rPr>
+        <w:t xml:space="preserve">items scoped to this process (process_id FK).</w:t>
+      </w:r>
+    </w:p>
+    <w:p>
+      <w:pPr>
+        <w:spacing w:after="160"/>
+      </w:pPr>
+      <w:r>
+        <w:rPr>
+          <w:rFonts w:ascii="Arial" w:cs="Arial" w:eastAsia="Arial" w:hAnsi="Arial"/>
+          <w:b/>
+          <w:bCs/>
+          <w:color w:val="000000"/>
+          <w:sz w:val="22"/>
+          <w:szCs w:val="22"/>
+        </w:rPr>
+        <w:t xml:space="preserve">WorkItem — </w:t>
+      </w:r>
+      <w:r>
+        <w:rPr>
+          <w:rFonts w:ascii="Arial" w:cs="Arial" w:eastAsia="Arial" w:hAnsi="Arial"/>
+          <w:color w:val="000000"/>
+          <w:sz w:val="22"/>
+          <w:szCs w:val="22"/>
+        </w:rPr>
+        <w:t xml:space="preserve">process_definition work items scoped to this process (process_id FK).</w:t>
+      </w:r>
+    </w:p>
+    <w:p>
+      <w:pPr>
+        <w:pStyle w:val="Heading3"/>
+        <w:spacing w:after="120" w:before="240"/>
+      </w:pPr>
+      <w:r>
+        <w:rPr>
+          <w:rFonts w:ascii="Arial" w:cs="Arial" w:eastAsia="Arial" w:hAnsi="Arial"/>
+          <w:b/>
+          <w:bCs/>
+          <w:color w:val="1F3864"/>
+          <w:sz w:val="22"/>
+          <w:szCs w:val="22"/>
+        </w:rPr>
+        <w:t xml:space="preserve">12.3.5 Persona Change</w:t>
+      </w:r>
+    </w:p>
+    <w:p>
+      <w:pPr>
+        <w:spacing w:after="160"/>
+      </w:pPr>
+      <w:r>
+        <w:rPr>
+          <w:rFonts w:ascii="Arial" w:cs="Arial" w:eastAsia="Arial" w:hAnsi="Arial"/>
+          <w:color w:val="000000"/>
+          <w:sz w:val="22"/>
+          <w:szCs w:val="22"/>
+        </w:rPr>
+        <w:t xml:space="preserve">A change to a Persona record (name, code, description, entity/field mapping, or deletion) triggers queries against:</w:t>
+      </w:r>
+    </w:p>
+    <w:p>
+      <w:pPr>
+        <w:spacing w:after="120"/>
+      </w:pPr>
+      <w:r>
+        <w:rPr>
+          <w:rFonts w:ascii="Arial" w:cs="Arial" w:eastAsia="Arial" w:hAnsi="Arial"/>
+          <w:b/>
+          <w:bCs/>
+          <w:color w:val="000000"/>
+          <w:sz w:val="22"/>
+          <w:szCs w:val="22"/>
+        </w:rPr>
+        <w:t xml:space="preserve">ProcessPersona — </w:t>
+      </w:r>
+      <w:r>
+        <w:rPr>
+          <w:rFonts w:ascii="Arial" w:cs="Arial" w:eastAsia="Arial" w:hAnsi="Arial"/>
+          <w:color w:val="000000"/>
+          <w:sz w:val="22"/>
+          <w:szCs w:val="22"/>
+        </w:rPr>
+        <w:t xml:space="preserve">every process referencing this persona (persona_id FK).</w:t>
+      </w:r>
+    </w:p>
+    <w:p>
+      <w:pPr>
+        <w:spacing w:after="160"/>
+      </w:pPr>
+      <w:r>
+        <w:rPr>
+          <w:rFonts w:ascii="Arial" w:cs="Arial" w:eastAsia="Arial" w:hAnsi="Arial"/>
+          <w:b/>
+          <w:bCs/>
+          <w:color w:val="000000"/>
+          <w:sz w:val="22"/>
+          <w:szCs w:val="22"/>
+        </w:rPr>
+        <w:t xml:space="preserve">ProcessStep — </w:t>
+      </w:r>
+      <w:r>
+        <w:rPr>
+          <w:rFonts w:ascii="Arial" w:cs="Arial" w:eastAsia="Arial" w:hAnsi="Arial"/>
+          <w:color w:val="000000"/>
+          <w:sz w:val="22"/>
+          <w:szCs w:val="22"/>
+        </w:rPr>
+        <w:t xml:space="preserve">steps where this persona is the performer (performer_persona_id FK).</w:t>
+      </w:r>
+    </w:p>
+    <w:p>
+      <w:pPr>
+        <w:pStyle w:val="Heading3"/>
+        <w:spacing w:after="120" w:before="240"/>
+      </w:pPr>
+      <w:r>
+        <w:rPr>
+          <w:rFonts w:ascii="Arial" w:cs="Arial" w:eastAsia="Arial" w:hAnsi="Arial"/>
+          <w:b/>
+          <w:bCs/>
+          <w:color w:val="1F3864"/>
+          <w:sz w:val="22"/>
+          <w:szCs w:val="22"/>
+        </w:rPr>
+        <w:t xml:space="preserve">12.3.6 Relationship Change</w:t>
+      </w:r>
+    </w:p>
+    <w:p>
+      <w:pPr>
+        <w:spacing w:after="160"/>
+      </w:pPr>
+      <w:r>
+        <w:rPr>
+          <w:rFonts w:ascii="Arial" w:cs="Arial" w:eastAsia="Arial" w:hAnsi="Arial"/>
+          <w:color w:val="000000"/>
+          <w:sz w:val="22"/>
+          <w:szCs w:val="22"/>
+        </w:rPr>
+        <w:t xml:space="preserve">A change to a Relationship record (link type, link names, labels, or deletion) triggers queries against:</w:t>
+      </w:r>
+    </w:p>
+    <w:p>
+      <w:pPr>
+        <w:spacing w:after="120"/>
+      </w:pPr>
+      <w:r>
+        <w:rPr>
+          <w:rFonts w:ascii="Arial" w:cs="Arial" w:eastAsia="Arial" w:hAnsi="Arial"/>
+          <w:b/>
+          <w:bCs/>
+          <w:color w:val="000000"/>
+          <w:sz w:val="22"/>
+          <w:szCs w:val="22"/>
+        </w:rPr>
+        <w:t xml:space="preserve">LayoutPanel — </w:t>
+      </w:r>
+      <w:r>
+        <w:rPr>
+          <w:rFonts w:ascii="Arial" w:cs="Arial" w:eastAsia="Arial" w:hAnsi="Arial"/>
+          <w:color w:val="000000"/>
+          <w:sz w:val="22"/>
+          <w:szCs w:val="22"/>
+        </w:rPr>
+        <w:t xml:space="preserve">panels on both entities involved in the relationship (entity_id and entity_foreign_id) that may display relationship-linked data.</w:t>
+      </w:r>
+    </w:p>
+    <w:p>
+      <w:pPr>
+        <w:spacing w:after="160"/>
+      </w:pPr>
+      <w:r>
+        <w:rPr>
+          <w:rFonts w:ascii="Arial" w:cs="Arial" w:eastAsia="Arial" w:hAnsi="Arial"/>
+          <w:b/>
+          <w:bCs/>
+          <w:color w:val="000000"/>
+          <w:sz w:val="22"/>
+          <w:szCs w:val="22"/>
+        </w:rPr>
+        <w:t xml:space="preserve">Entity — </w:t>
+      </w:r>
+      <w:r>
+        <w:rPr>
+          <w:rFonts w:ascii="Arial" w:cs="Arial" w:eastAsia="Arial" w:hAnsi="Arial"/>
+          <w:color w:val="000000"/>
+          <w:sz w:val="22"/>
+          <w:szCs w:val="22"/>
+        </w:rPr>
+        <w:t xml:space="preserve">the two entities connected by the relationship are surfaced as informational impacts (their definitions are not changed, but their relationship topology is).</w:t>
+      </w:r>
+    </w:p>
+    <w:p>
+      <w:pPr>
+        <w:pStyle w:val="Heading3"/>
+        <w:spacing w:after="120" w:before="240"/>
+      </w:pPr>
+      <w:r>
+        <w:rPr>
+          <w:rFonts w:ascii="Arial" w:cs="Arial" w:eastAsia="Arial" w:hAnsi="Arial"/>
+          <w:b/>
+          <w:bCs/>
+          <w:color w:val="1F3864"/>
+          <w:sz w:val="22"/>
+          <w:szCs w:val="22"/>
+        </w:rPr>
+        <w:t xml:space="preserve">12.3.7 Domain Change</w:t>
+      </w:r>
+    </w:p>
+    <w:p>
+      <w:pPr>
+        <w:spacing w:after="160"/>
+      </w:pPr>
+      <w:r>
+        <w:rPr>
+          <w:rFonts w:ascii="Arial" w:cs="Arial" w:eastAsia="Arial" w:hAnsi="Arial"/>
+          <w:color w:val="000000"/>
+          <w:sz w:val="22"/>
+          <w:szCs w:val="22"/>
+        </w:rPr>
+        <w:t xml:space="preserve">A change to a Domain record (name, code, description, parent assignment, service flag, or deletion) triggers queries against:</w:t>
+      </w:r>
+    </w:p>
+    <w:p>
+      <w:pPr>
+        <w:spacing w:after="120"/>
+      </w:pPr>
+      <w:r>
+        <w:rPr>
+          <w:rFonts w:ascii="Arial" w:cs="Arial" w:eastAsia="Arial" w:hAnsi="Arial"/>
+          <w:b/>
+          <w:bCs/>
+          <w:color w:val="000000"/>
+          <w:sz w:val="22"/>
+          <w:szCs w:val="22"/>
+        </w:rPr>
+        <w:t xml:space="preserve">Process — </w:t>
+      </w:r>
+      <w:r>
+        <w:rPr>
+          <w:rFonts w:ascii="Arial" w:cs="Arial" w:eastAsia="Arial" w:hAnsi="Arial"/>
+          <w:color w:val="000000"/>
+          <w:sz w:val="22"/>
+          <w:szCs w:val="22"/>
+        </w:rPr>
+        <w:t xml:space="preserve">all processes in this domain (domain_id FK). For deletes, each process is transitively traced per Section 12.3.4.</w:t>
+      </w:r>
+    </w:p>
+    <w:p>
+      <w:pPr>
+        <w:spacing w:after="120"/>
+      </w:pPr>
+      <w:r>
+        <w:rPr>
+          <w:rFonts w:ascii="Arial" w:cs="Arial" w:eastAsia="Arial" w:hAnsi="Arial"/>
+          <w:b/>
+          <w:bCs/>
+          <w:color w:val="000000"/>
+          <w:sz w:val="22"/>
+          <w:szCs w:val="22"/>
+        </w:rPr>
+        <w:t xml:space="preserve">Domain — </w:t>
+      </w:r>
+      <w:r>
+        <w:rPr>
+          <w:rFonts w:ascii="Arial" w:cs="Arial" w:eastAsia="Arial" w:hAnsi="Arial"/>
+          <w:color w:val="000000"/>
+          <w:sz w:val="22"/>
+          <w:szCs w:val="22"/>
+        </w:rPr>
+        <w:t xml:space="preserve">sub-domains whose parent_domain_id references this domain.</w:t>
+      </w:r>
+    </w:p>
+    <w:p>
+      <w:pPr>
+        <w:spacing w:after="120"/>
+      </w:pPr>
+      <w:r>
+        <w:rPr>
+          <w:rFonts w:ascii="Arial" w:cs="Arial" w:eastAsia="Arial" w:hAnsi="Arial"/>
+          <w:b/>
+          <w:bCs/>
+          <w:color w:val="000000"/>
+          <w:sz w:val="22"/>
+          <w:szCs w:val="22"/>
+        </w:rPr>
+        <w:t xml:space="preserve">Entity — </w:t>
+      </w:r>
+      <w:r>
+        <w:rPr>
+          <w:rFonts w:ascii="Arial" w:cs="Arial" w:eastAsia="Arial" w:hAnsi="Arial"/>
+          <w:color w:val="000000"/>
+          <w:sz w:val="22"/>
+          <w:szCs w:val="22"/>
+        </w:rPr>
+        <w:t xml:space="preserve">entities whose primary_domain_id references this domain.</w:t>
+      </w:r>
+    </w:p>
+    <w:p>
+      <w:pPr>
+        <w:spacing w:after="120"/>
+      </w:pPr>
+      <w:r>
+        <w:rPr>
+          <w:rFonts w:ascii="Arial" w:cs="Arial" w:eastAsia="Arial" w:hAnsi="Arial"/>
+          <w:b/>
+          <w:bCs/>
+          <w:color w:val="000000"/>
+          <w:sz w:val="22"/>
+          <w:szCs w:val="22"/>
+        </w:rPr>
+        <w:t xml:space="preserve">WorkItem — </w:t>
+      </w:r>
+      <w:r>
+        <w:rPr>
+          <w:rFonts w:ascii="Arial" w:cs="Arial" w:eastAsia="Arial" w:hAnsi="Arial"/>
+          <w:color w:val="000000"/>
+          <w:sz w:val="22"/>
+          <w:szCs w:val="22"/>
+        </w:rPr>
+        <w:t xml:space="preserve">domain_overview, domain_reconciliation, and yaml_generation work items scoped to this domain (domain_id FK).</w:t>
+      </w:r>
+    </w:p>
+    <w:p>
+      <w:pPr>
+        <w:spacing w:after="160"/>
+      </w:pPr>
+      <w:r>
+        <w:rPr>
+          <w:rFonts w:ascii="Arial" w:cs="Arial" w:eastAsia="Arial" w:hAnsi="Arial"/>
+          <w:b/>
+          <w:bCs/>
+          <w:color w:val="000000"/>
+          <w:sz w:val="22"/>
+          <w:szCs w:val="22"/>
+        </w:rPr>
+        <w:t xml:space="preserve">Decision and OpenIssue — </w:t>
+      </w:r>
+      <w:r>
+        <w:rPr>
+          <w:rFonts w:ascii="Arial" w:cs="Arial" w:eastAsia="Arial" w:hAnsi="Arial"/>
+          <w:color w:val="000000"/>
+          <w:sz w:val="22"/>
+          <w:szCs w:val="22"/>
+        </w:rPr>
+        <w:t xml:space="preserve">items scoped to this domain (domain_id FK).</w:t>
+      </w:r>
+    </w:p>
+    <w:p>
+      <w:pPr>
+        <w:pStyle w:val="Heading3"/>
+        <w:spacing w:after="120" w:before="240"/>
+      </w:pPr>
+      <w:r>
+        <w:rPr>
+          <w:rFonts w:ascii="Arial" w:cs="Arial" w:eastAsia="Arial" w:hAnsi="Arial"/>
+          <w:b/>
+          <w:bCs/>
+          <w:color w:val="1F3864"/>
+          <w:sz w:val="22"/>
+          <w:szCs w:val="22"/>
+        </w:rPr>
+        <w:t xml:space="preserve">12.3.8 Requirement Change</w:t>
+      </w:r>
+    </w:p>
+    <w:p>
+      <w:pPr>
+        <w:spacing w:after="160"/>
+      </w:pPr>
+      <w:r>
+        <w:rPr>
+          <w:rFonts w:ascii="Arial" w:cs="Arial" w:eastAsia="Arial" w:hAnsi="Arial"/>
+          <w:color w:val="000000"/>
+          <w:sz w:val="22"/>
+          <w:szCs w:val="22"/>
+        </w:rPr>
+        <w:t xml:space="preserve">A change to a Requirement record (description, priority, status, or deletion) triggers queries against:</w:t>
+      </w:r>
+    </w:p>
+    <w:p>
+      <w:pPr>
+        <w:spacing w:after="160"/>
+      </w:pPr>
+      <w:r>
+        <w:rPr>
+          <w:rFonts w:ascii="Arial" w:cs="Arial" w:eastAsia="Arial" w:hAnsi="Arial"/>
+          <w:b/>
+          <w:bCs/>
+          <w:color w:val="000000"/>
+          <w:sz w:val="22"/>
+          <w:szCs w:val="22"/>
+        </w:rPr>
+        <w:t xml:space="preserve">Decision and OpenIssue — </w:t>
+      </w:r>
+      <w:r>
+        <w:rPr>
+          <w:rFonts w:ascii="Arial" w:cs="Arial" w:eastAsia="Arial" w:hAnsi="Arial"/>
+          <w:color w:val="000000"/>
+          <w:sz w:val="22"/>
+          <w:szCs w:val="22"/>
+        </w:rPr>
+        <w:t xml:space="preserve">items scoped to this requirement (requirement_id FK).</w:t>
+      </w:r>
+    </w:p>
+    <w:p>
+      <w:pPr>
+        <w:pStyle w:val="Heading3"/>
+        <w:spacing w:after="120" w:before="240"/>
+      </w:pPr>
+      <w:r>
+        <w:rPr>
+          <w:rFonts w:ascii="Arial" w:cs="Arial" w:eastAsia="Arial" w:hAnsi="Arial"/>
+          <w:b/>
+          <w:bCs/>
+          <w:color w:val="1F3864"/>
+          <w:sz w:val="22"/>
+          <w:szCs w:val="22"/>
+        </w:rPr>
+        <w:t xml:space="preserve">12.3.9 ProcessStep Change</w:t>
+      </w:r>
+    </w:p>
+    <w:p>
+      <w:pPr>
+        <w:spacing w:after="160"/>
+      </w:pPr>
+      <w:r>
+        <w:rPr>
+          <w:rFonts w:ascii="Arial" w:cs="Arial" w:eastAsia="Arial" w:hAnsi="Arial"/>
+          <w:color w:val="000000"/>
+          <w:sz w:val="22"/>
+          <w:szCs w:val="22"/>
+        </w:rPr>
+        <w:t xml:space="preserve">A change to a ProcessStep record (name, description, step_type, performer, sort_order, or deletion) triggers queries against:</w:t>
+      </w:r>
+    </w:p>
+    <w:p>
+      <w:pPr>
+        <w:spacing w:after="120"/>
+      </w:pPr>
+      <w:r>
+        <w:rPr>
+          <w:rFonts w:ascii="Arial" w:cs="Arial" w:eastAsia="Arial" w:hAnsi="Arial"/>
+          <w:b/>
+          <w:bCs/>
+          <w:color w:val="000000"/>
+          <w:sz w:val="22"/>
+          <w:szCs w:val="22"/>
+        </w:rPr>
+        <w:t xml:space="preserve">ProcessEntity — </w:t>
+      </w:r>
+      <w:r>
+        <w:rPr>
+          <w:rFonts w:ascii="Arial" w:cs="Arial" w:eastAsia="Arial" w:hAnsi="Arial"/>
+          <w:color w:val="000000"/>
+          <w:sz w:val="22"/>
+          <w:szCs w:val="22"/>
+        </w:rPr>
+        <w:t xml:space="preserve">cross-references at this step level (process_step_id FK).</w:t>
+      </w:r>
+    </w:p>
+    <w:p>
+      <w:pPr>
+        <w:spacing w:after="120"/>
+      </w:pPr>
+      <w:r>
+        <w:rPr>
+          <w:rFonts w:ascii="Arial" w:cs="Arial" w:eastAsia="Arial" w:hAnsi="Arial"/>
+          <w:b/>
+          <w:bCs/>
+          <w:color w:val="000000"/>
+          <w:sz w:val="22"/>
+          <w:szCs w:val="22"/>
+        </w:rPr>
+        <w:t xml:space="preserve">ProcessField — </w:t>
+      </w:r>
+      <w:r>
+        <w:rPr>
+          <w:rFonts w:ascii="Arial" w:cs="Arial" w:eastAsia="Arial" w:hAnsi="Arial"/>
+          <w:color w:val="000000"/>
+          <w:sz w:val="22"/>
+          <w:szCs w:val="22"/>
+        </w:rPr>
+        <w:t xml:space="preserve">cross-references at this step level (process_step_id FK).</w:t>
+      </w:r>
+    </w:p>
+    <w:p>
+      <w:pPr>
+        <w:spacing w:after="160"/>
+      </w:pPr>
+      <w:r>
+        <w:rPr>
+          <w:rFonts w:ascii="Arial" w:cs="Arial" w:eastAsia="Arial" w:hAnsi="Arial"/>
+          <w:b/>
+          <w:bCs/>
+          <w:color w:val="000000"/>
+          <w:sz w:val="22"/>
+          <w:szCs w:val="22"/>
+        </w:rPr>
+        <w:t xml:space="preserve">ProcessPersona — </w:t>
+      </w:r>
+      <w:r>
+        <w:rPr>
+          <w:rFonts w:ascii="Arial" w:cs="Arial" w:eastAsia="Arial" w:hAnsi="Arial"/>
+          <w:color w:val="000000"/>
+          <w:sz w:val="22"/>
+          <w:szCs w:val="22"/>
+        </w:rPr>
+        <w:t xml:space="preserve">cross-references at this step level (process_step_id FK, if step-level persona references are recorded).</w:t>
+      </w:r>
+    </w:p>
+    <w:p>
+      <w:pPr>
+        <w:pStyle w:val="Heading3"/>
+        <w:spacing w:after="120" w:before="240"/>
+      </w:pPr>
+      <w:r>
+        <w:rPr>
+          <w:rFonts w:ascii="Arial" w:cs="Arial" w:eastAsia="Arial" w:hAnsi="Arial"/>
+          <w:b/>
+          <w:bCs/>
+          <w:color w:val="1F3864"/>
+          <w:sz w:val="22"/>
+          <w:szCs w:val="22"/>
+        </w:rPr>
+        <w:t xml:space="preserve">12.3.10 Decision and OpenIssue Changes</w:t>
+      </w:r>
+    </w:p>
+    <w:p>
+      <w:pPr>
+        <w:spacing w:after="160"/>
+      </w:pPr>
+      <w:r>
+        <w:rPr>
+          <w:rFonts w:ascii="Arial" w:cs="Arial" w:eastAsia="Arial" w:hAnsi="Arial"/>
+          <w:color w:val="000000"/>
+          <w:sz w:val="22"/>
+          <w:szCs w:val="22"/>
+        </w:rPr>
+        <w:t xml:space="preserve">Changes to Decision or OpenIssue records do not trigger downstream cross-reference queries. These records are leaf nodes in the reference graph — nothing references them. Their changes are recorded in ChangeLog for audit purposes but produce no ChangeImpact records.</w:t>
+      </w:r>
+    </w:p>
+    <w:p>
+      <w:pPr>
+        <w:pStyle w:val="Heading2"/>
+        <w:spacing w:after="160" w:before="280"/>
+      </w:pPr>
+      <w:r>
+        <w:rPr>
+          <w:rFonts w:ascii="Arial" w:cs="Arial" w:eastAsia="Arial" w:hAnsi="Arial"/>
+          <w:b/>
+          <w:bCs/>
+          <w:color w:val="1F3864"/>
+          <w:sz w:val="24"/>
+          <w:szCs w:val="24"/>
+        </w:rPr>
+        <w:t xml:space="preserve">12.4 ChangeImpact Record Creation</w:t>
+      </w:r>
+    </w:p>
+    <w:p>
+      <w:pPr>
+        <w:spacing w:after="160"/>
+      </w:pPr>
+      <w:r>
+        <w:rPr>
+          <w:rFonts w:ascii="Arial" w:cs="Arial" w:eastAsia="Arial" w:hAnsi="Arial"/>
+          <w:color w:val="000000"/>
+          <w:sz w:val="22"/>
+          <w:szCs w:val="22"/>
+        </w:rPr>
+        <w:t xml:space="preserve">For each affected record identified by the cross-reference query engine (Section 12.3), the engine creates one ChangeImpact record linked to the triggering ChangeLog entry. When a single change affects the same downstream record through multiple query paths, the engine creates one ChangeImpact record with a combined description rather than duplicates.</w:t>
+      </w:r>
+    </w:p>
+    <w:p>
+      <w:pPr>
+        <w:pStyle w:val="Heading3"/>
+        <w:spacing w:after="120" w:before="240"/>
+      </w:pPr>
+      <w:r>
+        <w:rPr>
+          <w:rFonts w:ascii="Arial" w:cs="Arial" w:eastAsia="Arial" w:hAnsi="Arial"/>
+          <w:b/>
+          <w:bCs/>
+          <w:color w:val="1F3864"/>
+          <w:sz w:val="22"/>
+          <w:szCs w:val="22"/>
+        </w:rPr>
+        <w:t xml:space="preserve">12.4.1 Impact Description Format</w:t>
+      </w:r>
+    </w:p>
+    <w:p>
+      <w:pPr>
+        <w:spacing w:after="160"/>
+      </w:pPr>
+      <w:r>
+        <w:rPr>
+          <w:rFonts w:ascii="Arial" w:cs="Arial" w:eastAsia="Arial" w:hAnsi="Arial"/>
+          <w:color w:val="000000"/>
+          <w:sz w:val="22"/>
+          <w:szCs w:val="22"/>
+        </w:rPr>
+        <w:t xml:space="preserve">The impact_description field contains a structured, human-readable sentence identifying the affected record, the relationship to the changed record, and the nature of the concern. The format is:</w:t>
+      </w:r>
+    </w:p>
+    <w:p>
+      <w:pPr>
+        <w:spacing w:after="160"/>
+      </w:pPr>
+      <w:r>
+        <w:rPr>
+          <w:rFonts w:ascii="Arial" w:cs="Arial" w:eastAsia="Arial" w:hAnsi="Arial"/>
+          <w:color w:val="000000"/>
+          <w:sz w:val="22"/>
+          <w:szCs w:val="22"/>
+        </w:rPr>
+        <w:t xml:space="preserve">{Affected record type} ‘{name or identifier}’ {relationship to changed record} — {consequence of the change}.</w:t>
+      </w:r>
+    </w:p>
+    <w:p>
+      <w:pPr>
+        <w:spacing w:after="160"/>
+      </w:pPr>
+      <w:r>
+        <w:rPr>
+          <w:rFonts w:ascii="Arial" w:cs="Arial" w:eastAsia="Arial" w:hAnsi="Arial"/>
+          <w:color w:val="000000"/>
+          <w:sz w:val="22"/>
+          <w:szCs w:val="22"/>
+        </w:rPr>
+        <w:t xml:space="preserve">Examples:</w:t>
+      </w:r>
+    </w:p>
+    <w:p>
+      <w:pPr>
+        <w:spacing w:after="120"/>
+      </w:pPr>
+      <w:r>
+        <w:rPr>
+          <w:rFonts w:ascii="Arial" w:cs="Arial" w:eastAsia="Arial" w:hAnsi="Arial"/>
+          <w:color w:val="000000"/>
+          <w:sz w:val="22"/>
+          <w:szCs w:val="22"/>
+        </w:rPr>
+        <w:t xml:space="preserve">“Process ‘Mentor Onboarding (MR-ONBOARD)’ step ‘Verify Training Completion’ uses field ‘trainingCompleted’ with usage ‘evaluated’ — field type change may affect evaluation logic.”</w:t>
+      </w:r>
+    </w:p>
+    <w:p>
+      <w:pPr>
+        <w:spacing w:after="120"/>
+      </w:pPr>
+      <w:r>
+        <w:rPr>
+          <w:rFonts w:ascii="Arial" w:cs="Arial" w:eastAsia="Arial" w:hAnsi="Arial"/>
+          <w:color w:val="000000"/>
+          <w:sz w:val="22"/>
+          <w:szCs w:val="22"/>
+        </w:rPr>
+        <w:t xml:space="preserve">“Layout row on panel ‘Mentor Details’ displays field ‘mentorStatus’ in cell 1 — field deletion will orphan this layout cell.”</w:t>
+      </w:r>
+    </w:p>
+    <w:p>
+      <w:pPr>
+        <w:spacing w:after="120"/>
+      </w:pPr>
+      <w:r>
+        <w:rPr>
+          <w:rFonts w:ascii="Arial" w:cs="Arial" w:eastAsia="Arial" w:hAnsi="Arial"/>
+          <w:color w:val="000000"/>
+          <w:sz w:val="22"/>
+          <w:szCs w:val="22"/>
+        </w:rPr>
+        <w:t xml:space="preserve">“Persona ‘Volunteer Mentor (MENTOR)’ is discriminated by field ‘contactType’ option ‘Mentor’ — option value rename will invalidate persona mapping.”</w:t>
+      </w:r>
+    </w:p>
+    <w:p>
+      <w:pPr>
+        <w:spacing w:after="160"/>
+      </w:pPr>
+      <w:r>
+        <w:rPr>
+          <w:rFonts w:ascii="Arial" w:cs="Arial" w:eastAsia="Arial" w:hAnsi="Arial"/>
+          <w:color w:val="000000"/>
+          <w:sz w:val="22"/>
+          <w:szCs w:val="22"/>
+        </w:rPr>
+        <w:t xml:space="preserve">“Decision ‘MR-MANAGE-DEC-003’ is scoped to field ‘duesPaidThrough’ — field modification noted for awareness.”</w:t>
+      </w:r>
+    </w:p>
+    <w:p>
+      <w:pPr>
+        <w:spacing w:after="160"/>
+      </w:pPr>
+      <w:r>
+        <w:rPr>
+          <w:rFonts w:ascii="Arial" w:cs="Arial" w:eastAsia="Arial" w:hAnsi="Arial"/>
+          <w:color w:val="000000"/>
+          <w:sz w:val="22"/>
+          <w:szCs w:val="22"/>
+        </w:rPr>
+        <w:t xml:space="preserve">When step-level granularity is available, the description includes the step name. When only process-level cross-references exist, the description references the process without a step.</w:t>
+      </w:r>
+    </w:p>
+    <w:p>
+      <w:pPr>
+        <w:pStyle w:val="Heading3"/>
+        <w:spacing w:after="120" w:before="240"/>
+      </w:pPr>
+      <w:r>
+        <w:rPr>
+          <w:rFonts w:ascii="Arial" w:cs="Arial" w:eastAsia="Arial" w:hAnsi="Arial"/>
+          <w:b/>
+          <w:bCs/>
+          <w:color w:val="1F3864"/>
+          <w:sz w:val="22"/>
+          <w:szCs w:val="22"/>
+        </w:rPr>
+        <w:t xml:space="preserve">12.4.2 Review Determination</w:t>
+      </w:r>
+    </w:p>
+    <w:p>
+      <w:pPr>
+        <w:spacing w:after="160"/>
+      </w:pPr>
+      <w:r>
+        <w:rPr>
+          <w:rFonts w:ascii="Arial" w:cs="Arial" w:eastAsia="Arial" w:hAnsi="Arial"/>
+          <w:color w:val="000000"/>
+          <w:sz w:val="22"/>
+          <w:szCs w:val="22"/>
+        </w:rPr>
+        <w:t xml:space="preserve">The engine sets requires_review based on whether the affected record may need content revision as a result of the change.</w:t>
+      </w:r>
+    </w:p>
+    <w:p>
+      <w:pPr>
+        <w:spacing w:after="160"/>
+      </w:pPr>
+      <w:r>
+        <w:rPr>
+          <w:rFonts w:ascii="Arial" w:cs="Arial" w:eastAsia="Arial" w:hAnsi="Arial"/>
+          <w:b/>
+          <w:bCs/>
+          <w:color w:val="000000"/>
+          <w:sz w:val="22"/>
+          <w:szCs w:val="22"/>
+        </w:rPr>
+        <w:t xml:space="preserve">requires_review = TRUE </w:t>
+      </w:r>
+      <w:r>
+        <w:rPr>
+          <w:rFonts w:ascii="Arial" w:cs="Arial" w:eastAsia="Arial" w:hAnsi="Arial"/>
+          <w:color w:val="000000"/>
+          <w:sz w:val="22"/>
+          <w:szCs w:val="22"/>
+        </w:rPr>
+        <w:t xml:space="preserve">for impacts where the affected record may need modification:</w:t>
+      </w:r>
+    </w:p>
+    <w:p>
+      <w:pPr>
+        <w:spacing w:after="120"/>
+      </w:pPr>
+      <w:r>
+        <w:rPr>
+          <w:rFonts w:ascii="Arial" w:cs="Arial" w:eastAsia="Arial" w:hAnsi="Arial"/>
+          <w:b/>
+          <w:bCs/>
+          <w:color w:val="000000"/>
+          <w:sz w:val="22"/>
+          <w:szCs w:val="22"/>
+        </w:rPr>
+        <w:t xml:space="preserve">Cross-reference impacts — </w:t>
+      </w:r>
+      <w:r>
+        <w:rPr>
+          <w:rFonts w:ascii="Arial" w:cs="Arial" w:eastAsia="Arial" w:hAnsi="Arial"/>
+          <w:color w:val="000000"/>
+          <w:sz w:val="22"/>
+          <w:szCs w:val="22"/>
+        </w:rPr>
+        <w:t xml:space="preserve">a process, step, or persona references the changed record through ProcessEntity, ProcessField, or ProcessPersona. The process document or its underlying data may need revision to reflect the change.</w:t>
+      </w:r>
+    </w:p>
+    <w:p>
+      <w:pPr>
+        <w:spacing w:after="120"/>
+      </w:pPr>
+      <w:r>
+        <w:rPr>
+          <w:rFonts w:ascii="Arial" w:cs="Arial" w:eastAsia="Arial" w:hAnsi="Arial"/>
+          <w:b/>
+          <w:bCs/>
+          <w:color w:val="000000"/>
+          <w:sz w:val="22"/>
+          <w:szCs w:val="22"/>
+        </w:rPr>
+        <w:t xml:space="preserve">Layout impacts — </w:t>
+      </w:r>
+      <w:r>
+        <w:rPr>
+          <w:rFonts w:ascii="Arial" w:cs="Arial" w:eastAsia="Arial" w:hAnsi="Arial"/>
+          <w:color w:val="000000"/>
+          <w:sz w:val="22"/>
+          <w:szCs w:val="22"/>
+        </w:rPr>
+        <w:t xml:space="preserve">a LayoutRow, LayoutPanel, LayoutTab, or ListColumn displays or depends on the changed record. The layout definition may need adjustment.</w:t>
+      </w:r>
+    </w:p>
+    <w:p>
+      <w:pPr>
+        <w:spacing w:after="120"/>
+      </w:pPr>
+      <w:r>
+        <w:rPr>
+          <w:rFonts w:ascii="Arial" w:cs="Arial" w:eastAsia="Arial" w:hAnsi="Arial"/>
+          <w:b/>
+          <w:bCs/>
+          <w:color w:val="000000"/>
+          <w:sz w:val="22"/>
+          <w:szCs w:val="22"/>
+        </w:rPr>
+        <w:t xml:space="preserve">Relationship impacts — </w:t>
+      </w:r>
+      <w:r>
+        <w:rPr>
+          <w:rFonts w:ascii="Arial" w:cs="Arial" w:eastAsia="Arial" w:hAnsi="Arial"/>
+          <w:color w:val="000000"/>
+          <w:sz w:val="22"/>
+          <w:szCs w:val="22"/>
+        </w:rPr>
+        <w:t xml:space="preserve">a Relationship record connects to a modified or deleted entity. The relationship definition may need revision.</w:t>
+      </w:r>
+    </w:p>
+    <w:p>
+      <w:pPr>
+        <w:spacing w:after="120"/>
+      </w:pPr>
+      <w:r>
+        <w:rPr>
+          <w:rFonts w:ascii="Arial" w:cs="Arial" w:eastAsia="Arial" w:hAnsi="Arial"/>
+          <w:b/>
+          <w:bCs/>
+          <w:color w:val="000000"/>
+          <w:sz w:val="22"/>
+          <w:szCs w:val="22"/>
+        </w:rPr>
+        <w:t xml:space="preserve">Persona mapping impacts — </w:t>
+      </w:r>
+      <w:r>
+        <w:rPr>
+          <w:rFonts w:ascii="Arial" w:cs="Arial" w:eastAsia="Arial" w:hAnsi="Arial"/>
+          <w:color w:val="000000"/>
+          <w:sz w:val="22"/>
+          <w:szCs w:val="22"/>
+        </w:rPr>
+        <w:t xml:space="preserve">a Persona record’s discriminator field or value is affected. The persona definition may need correction.</w:t>
+      </w:r>
+    </w:p>
+    <w:p>
+      <w:pPr>
+        <w:spacing w:after="120"/>
+      </w:pPr>
+      <w:r>
+        <w:rPr>
+          <w:rFonts w:ascii="Arial" w:cs="Arial" w:eastAsia="Arial" w:hAnsi="Arial"/>
+          <w:b/>
+          <w:bCs/>
+          <w:color w:val="000000"/>
+          <w:sz w:val="22"/>
+          <w:szCs w:val="22"/>
+        </w:rPr>
+        <w:t xml:space="preserve">Work item impacts — </w:t>
+      </w:r>
+      <w:r>
+        <w:rPr>
+          <w:rFonts w:ascii="Arial" w:cs="Arial" w:eastAsia="Arial" w:hAnsi="Arial"/>
+          <w:color w:val="000000"/>
+          <w:sz w:val="22"/>
+          <w:szCs w:val="22"/>
+        </w:rPr>
+        <w:t xml:space="preserve">a WorkItem scoped to the changed record may need to be reopened for revision.</w:t>
+      </w:r>
+    </w:p>
+    <w:p>
+      <w:pPr>
+        <w:spacing w:after="160"/>
+      </w:pPr>
+      <w:r>
+        <w:rPr>
+          <w:rFonts w:ascii="Arial" w:cs="Arial" w:eastAsia="Arial" w:hAnsi="Arial"/>
+          <w:b/>
+          <w:bCs/>
+          <w:color w:val="000000"/>
+          <w:sz w:val="22"/>
+          <w:szCs w:val="22"/>
+        </w:rPr>
+        <w:t xml:space="preserve">Transitive impacts — </w:t>
+      </w:r>
+      <w:r>
+        <w:rPr>
+          <w:rFonts w:ascii="Arial" w:cs="Arial" w:eastAsia="Arial" w:hAnsi="Arial"/>
+          <w:color w:val="000000"/>
+          <w:sz w:val="22"/>
+          <w:szCs w:val="22"/>
+        </w:rPr>
+        <w:t xml:space="preserve">any record surfaced through transitive delete tracing (Section 12.3) inherits requires_review = TRUE, because a cascading delete has structural consequences.</w:t>
+      </w:r>
+    </w:p>
+    <w:p>
+      <w:pPr>
+        <w:spacing w:after="160"/>
+      </w:pPr>
+      <w:r>
+        <w:rPr>
+          <w:rFonts w:ascii="Arial" w:cs="Arial" w:eastAsia="Arial" w:hAnsi="Arial"/>
+          <w:b/>
+          <w:bCs/>
+          <w:color w:val="000000"/>
+          <w:sz w:val="22"/>
+          <w:szCs w:val="22"/>
+        </w:rPr>
+        <w:t xml:space="preserve">requires_review = FALSE </w:t>
+      </w:r>
+      <w:r>
+        <w:rPr>
+          <w:rFonts w:ascii="Arial" w:cs="Arial" w:eastAsia="Arial" w:hAnsi="Arial"/>
+          <w:color w:val="000000"/>
+          <w:sz w:val="22"/>
+          <w:szCs w:val="22"/>
+        </w:rPr>
+        <w:t xml:space="preserve">for purely informational impacts where awareness is sufficient:</w:t>
+      </w:r>
+    </w:p>
+    <w:p>
+      <w:pPr>
+        <w:spacing w:after="120"/>
+      </w:pPr>
+      <w:r>
+        <w:rPr>
+          <w:rFonts w:ascii="Arial" w:cs="Arial" w:eastAsia="Arial" w:hAnsi="Arial"/>
+          <w:b/>
+          <w:bCs/>
+          <w:color w:val="000000"/>
+          <w:sz w:val="22"/>
+          <w:szCs w:val="22"/>
+        </w:rPr>
+        <w:t xml:space="preserve">Decision and OpenIssue scope references — </w:t>
+      </w:r>
+      <w:r>
+        <w:rPr>
+          <w:rFonts w:ascii="Arial" w:cs="Arial" w:eastAsia="Arial" w:hAnsi="Arial"/>
+          <w:color w:val="000000"/>
+          <w:sz w:val="22"/>
+          <w:szCs w:val="22"/>
+        </w:rPr>
+        <w:t xml:space="preserve">a Decision or OpenIssue is scoped to the changed record. The decision or issue text does not need updating solely because the scoped record changed; the impact is surfaced for awareness.</w:t>
+      </w:r>
+    </w:p>
+    <w:p>
+      <w:pPr>
+        <w:spacing w:after="160"/>
+      </w:pPr>
+      <w:r>
+        <w:rPr>
+          <w:rFonts w:ascii="Arial" w:cs="Arial" w:eastAsia="Arial" w:hAnsi="Arial"/>
+          <w:b/>
+          <w:bCs/>
+          <w:color w:val="000000"/>
+          <w:sz w:val="22"/>
+          <w:szCs w:val="22"/>
+        </w:rPr>
+        <w:t xml:space="preserve">Entity informational references from relationship changes — </w:t>
+      </w:r>
+      <w:r>
+        <w:rPr>
+          <w:rFonts w:ascii="Arial" w:cs="Arial" w:eastAsia="Arial" w:hAnsi="Arial"/>
+          <w:color w:val="000000"/>
+          <w:sz w:val="22"/>
+          <w:szCs w:val="22"/>
+        </w:rPr>
+        <w:t xml:space="preserve">when a Relationship is modified, the two connected entities are surfaced as informational impacts. The entity definitions themselves are not affected.</w:t>
+      </w:r>
+    </w:p>
+    <w:p>
+      <w:pPr>
+        <w:pStyle w:val="Heading3"/>
+        <w:spacing w:after="120" w:before="240"/>
+      </w:pPr>
+      <w:r>
+        <w:rPr>
+          <w:rFonts w:ascii="Arial" w:cs="Arial" w:eastAsia="Arial" w:hAnsi="Arial"/>
+          <w:b/>
+          <w:bCs/>
+          <w:color w:val="1F3864"/>
+          <w:sz w:val="22"/>
+          <w:szCs w:val="22"/>
+        </w:rPr>
+        <w:t xml:space="preserve">12.4.3 Batch Deduplication</w:t>
+      </w:r>
+    </w:p>
+    <w:p>
+      <w:pPr>
+        <w:spacing w:after="160"/>
+      </w:pPr>
+      <w:r>
+        <w:rPr>
+          <w:rFonts w:ascii="Arial" w:cs="Arial" w:eastAsia="Arial" w:hAnsi="Arial"/>
+          <w:color w:val="000000"/>
+          <w:sz w:val="22"/>
+          <w:szCs w:val="22"/>
+        </w:rPr>
+        <w:t xml:space="preserve">An import transaction may produce multiple ChangeLog entries that affect the same downstream record. For example, two field changes in the same import may both affect the same process through ProcessField. The engine deduplicates by (affected_table, affected_record_id) across all ChangeLog entries in the same transaction. Each unique affected record appears once in the ChangeImpact results. The change_log_id on the ChangeImpact record references the first ChangeLog entry that surfaced this impact. The impact_description aggregates all relevant changes — for example, “Process ‘Client Intake (MN-INTAKE)’ uses fields ‘clientStatus’ (type changed) and ‘intakeDate’ (deleted) — process document may need revision.”</w:t>
+      </w:r>
+    </w:p>
+    <w:p>
+      <w:pPr>
+        <w:pStyle w:val="Heading2"/>
+        <w:spacing w:after="160" w:before="280"/>
+      </w:pPr>
+      <w:r>
+        <w:rPr>
+          <w:rFonts w:ascii="Arial" w:cs="Arial" w:eastAsia="Arial" w:hAnsi="Arial"/>
+          <w:b/>
+          <w:bCs/>
+          <w:color w:val="1F3864"/>
+          <w:sz w:val="24"/>
+          <w:szCs w:val="24"/>
+        </w:rPr>
+        <w:t xml:space="preserve">12.5 Pre-Commit Analysis for Direct Edits</w:t>
+      </w:r>
+    </w:p>
+    <w:p>
+      <w:pPr>
+        <w:spacing w:after="160"/>
+      </w:pPr>
+      <w:r>
+        <w:rPr>
+          <w:rFonts w:ascii="Arial" w:cs="Arial" w:eastAsia="Arial" w:hAnsi="Arial"/>
+          <w:color w:val="000000"/>
+          <w:sz w:val="22"/>
+          <w:szCs w:val="22"/>
+        </w:rPr>
+        <w:t xml:space="preserve">When the administrator modifies or deletes a record outside of the import pipeline, the engine runs impact analysis before the change is committed. This ensures the administrator sees the full downstream blast radius and can cancel if the scope of the change is larger than expected.</w:t>
+      </w:r>
+    </w:p>
+    <w:p>
+      <w:pPr>
+        <w:pStyle w:val="Heading3"/>
+        <w:spacing w:after="120" w:before="240"/>
+      </w:pPr>
+      <w:r>
+        <w:rPr>
+          <w:rFonts w:ascii="Arial" w:cs="Arial" w:eastAsia="Arial" w:hAnsi="Arial"/>
+          <w:b/>
+          <w:bCs/>
+          <w:color w:val="1F3864"/>
+          <w:sz w:val="22"/>
+          <w:szCs w:val="22"/>
+        </w:rPr>
+        <w:t xml:space="preserve">12.5.1 Edit Flow</w:t>
+      </w:r>
+    </w:p>
+    <w:p>
+      <w:pPr>
+        <w:spacing w:after="160"/>
+      </w:pPr>
+      <w:r>
+        <w:rPr>
+          <w:rFonts w:ascii="Arial" w:cs="Arial" w:eastAsia="Arial" w:hAnsi="Arial"/>
+          <w:color w:val="000000"/>
+          <w:sz w:val="22"/>
+          <w:szCs w:val="22"/>
+        </w:rPr>
+        <w:t xml:space="preserve">The administrator opens a record in the UI, modifies one or more fields, and initiates a save. The engine intercepts the save and executes the following sequence:</w:t>
+      </w:r>
+    </w:p>
+    <w:p>
+      <w:pPr>
+        <w:spacing w:after="120"/>
+      </w:pPr>
+      <w:r>
+        <w:rPr>
+          <w:rFonts w:ascii="Arial" w:cs="Arial" w:eastAsia="Arial" w:hAnsi="Arial"/>
+          <w:b/>
+          <w:bCs/>
+          <w:color w:val="000000"/>
+          <w:sz w:val="22"/>
+          <w:szCs w:val="22"/>
+        </w:rPr>
+        <w:t xml:space="preserve">1. Construct proposed changes. </w:t>
+      </w:r>
+      <w:r>
+        <w:rPr>
+          <w:rFonts w:ascii="Arial" w:cs="Arial" w:eastAsia="Arial" w:hAnsi="Arial"/>
+          <w:color w:val="000000"/>
+          <w:sz w:val="22"/>
+          <w:szCs w:val="22"/>
+        </w:rPr>
+        <w:t xml:space="preserve">The engine builds a set of proposed ChangeLog entries — one per modified field — capturing table_name, record_id, change_type (update or delete), field_name, old_value, and new_value. These entries are not persisted.</w:t>
+      </w:r>
+    </w:p>
+    <w:p>
+      <w:pPr>
+        <w:spacing w:after="120"/>
+      </w:pPr>
+      <w:r>
+        <w:rPr>
+          <w:rFonts w:ascii="Arial" w:cs="Arial" w:eastAsia="Arial" w:hAnsi="Arial"/>
+          <w:b/>
+          <w:bCs/>
+          <w:color w:val="000000"/>
+          <w:sz w:val="22"/>
+          <w:szCs w:val="22"/>
+        </w:rPr>
+        <w:t xml:space="preserve">2. Run cross-reference queries. </w:t>
+      </w:r>
+      <w:r>
+        <w:rPr>
+          <w:rFonts w:ascii="Arial" w:cs="Arial" w:eastAsia="Arial" w:hAnsi="Arial"/>
+          <w:color w:val="000000"/>
+          <w:sz w:val="22"/>
+          <w:szCs w:val="22"/>
+        </w:rPr>
+        <w:t xml:space="preserve">The engine traces downstream effects using the query paths defined in Section 12.3, operating against the current database state. For updates, the engine evaluates which query paths are relevant based on which fields changed — a field label change traces different paths than a field type change. For deletes, transitive tracing is enabled.</w:t>
+      </w:r>
+    </w:p>
+    <w:p>
+      <w:pPr>
+        <w:spacing w:after="120"/>
+      </w:pPr>
+      <w:r>
+        <w:rPr>
+          <w:rFonts w:ascii="Arial" w:cs="Arial" w:eastAsia="Arial" w:hAnsi="Arial"/>
+          <w:b/>
+          <w:bCs/>
+          <w:color w:val="000000"/>
+          <w:sz w:val="22"/>
+          <w:szCs w:val="22"/>
+        </w:rPr>
+        <w:t xml:space="preserve">3. Evaluate impact set. </w:t>
+      </w:r>
+      <w:r>
+        <w:rPr>
+          <w:rFonts w:ascii="Arial" w:cs="Arial" w:eastAsia="Arial" w:hAnsi="Arial"/>
+          <w:color w:val="000000"/>
+          <w:sz w:val="22"/>
+          <w:szCs w:val="22"/>
+        </w:rPr>
+        <w:t xml:space="preserve">If the impact set is empty (no downstream records are affected), the change proceeds to step 5 with rationale optional. If the impact set is non-empty, the engine proceeds to step 4.</w:t>
+      </w:r>
+    </w:p>
+    <w:p>
+      <w:pPr>
+        <w:spacing w:after="120"/>
+      </w:pPr>
+      <w:r>
+        <w:rPr>
+          <w:rFonts w:ascii="Arial" w:cs="Arial" w:eastAsia="Arial" w:hAnsi="Arial"/>
+          <w:b/>
+          <w:bCs/>
+          <w:color w:val="000000"/>
+          <w:sz w:val="22"/>
+          <w:szCs w:val="22"/>
+        </w:rPr>
+        <w:t xml:space="preserve">4. Present impact and require confirmation. </w:t>
+      </w:r>
+      <w:r>
+        <w:rPr>
+          <w:rFonts w:ascii="Arial" w:cs="Arial" w:eastAsia="Arial" w:hAnsi="Arial"/>
+          <w:color w:val="000000"/>
+          <w:sz w:val="22"/>
+          <w:szCs w:val="22"/>
+        </w:rPr>
+        <w:t xml:space="preserve">The engine presents the impact set to the administrator using the same presentation format described in Section 12.6. The administrator must provide a rationale describing why the change is being made and then confirm or cancel. If the administrator cancels, no data is written and the edit is discarded.</w:t>
+      </w:r>
+    </w:p>
+    <w:p>
+      <w:pPr>
+        <w:spacing w:after="160"/>
+      </w:pPr>
+      <w:r>
+        <w:rPr>
+          <w:rFonts w:ascii="Arial" w:cs="Arial" w:eastAsia="Arial" w:hAnsi="Arial"/>
+          <w:b/>
+          <w:bCs/>
+          <w:color w:val="000000"/>
+          <w:sz w:val="22"/>
+          <w:szCs w:val="22"/>
+        </w:rPr>
+        <w:t xml:space="preserve">5. Commit. </w:t>
+      </w:r>
+      <w:r>
+        <w:rPr>
+          <w:rFonts w:ascii="Arial" w:cs="Arial" w:eastAsia="Arial" w:hAnsi="Arial"/>
+          <w:color w:val="000000"/>
+          <w:sz w:val="22"/>
+          <w:szCs w:val="22"/>
+        </w:rPr>
+        <w:t xml:space="preserve">On confirmation, the engine writes the data change, the ChangeLog entries, and the ChangeImpact records in a single database transaction. The ChangeLog entries have session_id set to null (no AI session) and rationale set to the administrator-provided text. All ChangeLog entries from a single save operation share the same rationale.</w:t>
+      </w:r>
+    </w:p>
+    <w:p>
+      <w:pPr>
+        <w:pStyle w:val="Heading3"/>
+        <w:spacing w:after="120" w:before="240"/>
+      </w:pPr>
+      <w:r>
+        <w:rPr>
+          <w:rFonts w:ascii="Arial" w:cs="Arial" w:eastAsia="Arial" w:hAnsi="Arial"/>
+          <w:b/>
+          <w:bCs/>
+          <w:color w:val="1F3864"/>
+          <w:sz w:val="22"/>
+          <w:szCs w:val="22"/>
+        </w:rPr>
+        <w:t xml:space="preserve">12.5.2 Delete Flow</w:t>
+      </w:r>
+    </w:p>
+    <w:p>
+      <w:pPr>
+        <w:spacing w:after="160"/>
+      </w:pPr>
+      <w:r>
+        <w:rPr>
+          <w:rFonts w:ascii="Arial" w:cs="Arial" w:eastAsia="Arial" w:hAnsi="Arial"/>
+          <w:color w:val="000000"/>
+          <w:sz w:val="22"/>
+          <w:szCs w:val="22"/>
+        </w:rPr>
+        <w:t xml:space="preserve">When the administrator deletes a record, the engine follows the same five-step sequence with change_type set to “delete” on the proposed ChangeLog entry. Transitive tracing is always enabled for deletes (Section 12.3). The impact set for a delete is typically larger than for an update because transitive tracing surfaces the entire downstream reference tree.</w:t>
+      </w:r>
+    </w:p>
+    <w:p>
+      <w:pPr>
+        <w:spacing w:after="160"/>
+      </w:pPr>
+      <w:r>
+        <w:rPr>
+          <w:rFonts w:ascii="Arial" w:cs="Arial" w:eastAsia="Arial" w:hAnsi="Arial"/>
+          <w:color w:val="000000"/>
+          <w:sz w:val="22"/>
+          <w:szCs w:val="22"/>
+        </w:rPr>
+        <w:t xml:space="preserve">The engine does not automatically delete downstream records. It surfaces them as impacts. If a field is deleted, the ProcessField cross-references, LayoutRow cells, and ListColumn entries that point to it become orphaned — the administrator must address these as part of the impact review. The application may enforce referential integrity by preventing the delete until the administrator has resolved orphaned references, but this is a UI concern deferred to Section 14.</w:t>
+      </w:r>
+    </w:p>
+    <w:p>
+      <w:pPr>
+        <w:pStyle w:val="Heading3"/>
+        <w:spacing w:after="120" w:before="240"/>
+      </w:pPr>
+      <w:r>
+        <w:rPr>
+          <w:rFonts w:ascii="Arial" w:cs="Arial" w:eastAsia="Arial" w:hAnsi="Arial"/>
+          <w:b/>
+          <w:bCs/>
+          <w:color w:val="1F3864"/>
+          <w:sz w:val="22"/>
+          <w:szCs w:val="22"/>
+        </w:rPr>
+        <w:t xml:space="preserve">12.5.3 Rationale Requirement</w:t>
+      </w:r>
+    </w:p>
+    <w:p>
+      <w:pPr>
+        <w:spacing w:after="160"/>
+      </w:pPr>
+      <w:r>
+        <w:rPr>
+          <w:rFonts w:ascii="Arial" w:cs="Arial" w:eastAsia="Arial" w:hAnsi="Arial"/>
+          <w:color w:val="000000"/>
+          <w:sz w:val="22"/>
+          <w:szCs w:val="22"/>
+        </w:rPr>
+        <w:t xml:space="preserve">The rationale is required when the impact set is non-empty — the administrator must explain why they are making a change that affects downstream records. When the impact set is empty, the rationale is optional. In both cases, the rationale is stored on all ChangeLog entries produced by the save operation, providing a single coherent explanation for the edit.</w:t>
+      </w:r>
+    </w:p>
+    <w:p>
+      <w:pPr>
+        <w:pStyle w:val="Heading2"/>
+        <w:spacing w:after="160" w:before="280"/>
+      </w:pPr>
+      <w:r>
+        <w:rPr>
+          <w:rFonts w:ascii="Arial" w:cs="Arial" w:eastAsia="Arial" w:hAnsi="Arial"/>
+          <w:b/>
+          <w:bCs/>
+          <w:color w:val="1F3864"/>
+          <w:sz w:val="24"/>
+          <w:szCs w:val="24"/>
+        </w:rPr>
+        <w:t xml:space="preserve">12.6 Impact Presentation</w:t>
+      </w:r>
+    </w:p>
+    <w:p>
+      <w:pPr>
+        <w:spacing w:after="160"/>
+      </w:pPr>
+      <w:r>
+        <w:rPr>
+          <w:rFonts w:ascii="Arial" w:cs="Arial" w:eastAsia="Arial" w:hAnsi="Arial"/>
+          <w:color w:val="000000"/>
+          <w:sz w:val="22"/>
+          <w:szCs w:val="22"/>
+        </w:rPr>
+        <w:t xml:space="preserve">The engine presents impact results to the administrator in a consistent format used for both post-commit review (after imports) and pre-commit confirmation (before direct edits). The presentation provides enough context for the administrator to assess each impact and decide whether action is needed.</w:t>
+      </w:r>
+    </w:p>
+    <w:p>
+      <w:pPr>
+        <w:pStyle w:val="Heading3"/>
+        <w:spacing w:after="120" w:before="240"/>
+      </w:pPr>
+      <w:r>
+        <w:rPr>
+          <w:rFonts w:ascii="Arial" w:cs="Arial" w:eastAsia="Arial" w:hAnsi="Arial"/>
+          <w:b/>
+          <w:bCs/>
+          <w:color w:val="1F3864"/>
+          <w:sz w:val="22"/>
+          <w:szCs w:val="22"/>
+        </w:rPr>
+        <w:t xml:space="preserve">12.6.1 Grouping</w:t>
+      </w:r>
+    </w:p>
+    <w:p>
+      <w:pPr>
+        <w:spacing w:after="160"/>
+      </w:pPr>
+      <w:r>
+        <w:rPr>
+          <w:rFonts w:ascii="Arial" w:cs="Arial" w:eastAsia="Arial" w:hAnsi="Arial"/>
+          <w:color w:val="000000"/>
+          <w:sz w:val="22"/>
+          <w:szCs w:val="22"/>
+        </w:rPr>
+        <w:t xml:space="preserve">Impact results are grouped by affected table, then by record within each table. This organization matches how the administrator reasons about the data — processes, layouts, personas, and work items are distinct concerns addressed through different parts of the application.</w:t>
+      </w:r>
+    </w:p>
+    <w:p>
+      <w:pPr>
+        <w:spacing w:after="160"/>
+      </w:pPr>
+      <w:r>
+        <w:rPr>
+          <w:rFonts w:ascii="Arial" w:cs="Arial" w:eastAsia="Arial" w:hAnsi="Arial"/>
+          <w:color w:val="000000"/>
+          <w:sz w:val="22"/>
+          <w:szCs w:val="22"/>
+        </w:rPr>
+        <w:t xml:space="preserve">Within each table group, impacts are split into two sections:</w:t>
+      </w:r>
+    </w:p>
+    <w:p>
+      <w:pPr>
+        <w:spacing w:after="120"/>
+      </w:pPr>
+      <w:r>
+        <w:rPr>
+          <w:rFonts w:ascii="Arial" w:cs="Arial" w:eastAsia="Arial" w:hAnsi="Arial"/>
+          <w:b/>
+          <w:bCs/>
+          <w:color w:val="000000"/>
+          <w:sz w:val="22"/>
+          <w:szCs w:val="22"/>
+        </w:rPr>
+        <w:t xml:space="preserve">Requires review — </w:t>
+      </w:r>
+      <w:r>
+        <w:rPr>
+          <w:rFonts w:ascii="Arial" w:cs="Arial" w:eastAsia="Arial" w:hAnsi="Arial"/>
+          <w:color w:val="000000"/>
+          <w:sz w:val="22"/>
+          <w:szCs w:val="22"/>
+        </w:rPr>
+        <w:t xml:space="preserve">impacts where requires_review is TRUE. These appear first within the group, as they represent records that may need content revision.</w:t>
+      </w:r>
+    </w:p>
+    <w:p>
+      <w:pPr>
+        <w:spacing w:after="160"/>
+      </w:pPr>
+      <w:r>
+        <w:rPr>
+          <w:rFonts w:ascii="Arial" w:cs="Arial" w:eastAsia="Arial" w:hAnsi="Arial"/>
+          <w:b/>
+          <w:bCs/>
+          <w:color w:val="000000"/>
+          <w:sz w:val="22"/>
+          <w:szCs w:val="22"/>
+        </w:rPr>
+        <w:t xml:space="preserve">Informational — </w:t>
+      </w:r>
+      <w:r>
+        <w:rPr>
+          <w:rFonts w:ascii="Arial" w:cs="Arial" w:eastAsia="Arial" w:hAnsi="Arial"/>
+          <w:color w:val="000000"/>
+          <w:sz w:val="22"/>
+          <w:szCs w:val="22"/>
+        </w:rPr>
+        <w:t xml:space="preserve">impacts where requires_review is FALSE. These appear below the review items and are presented in a visually subdued style to distinguish them from actionable items.</w:t>
+      </w:r>
+    </w:p>
+    <w:p>
+      <w:pPr>
+        <w:pStyle w:val="Heading3"/>
+        <w:spacing w:after="120" w:before="240"/>
+      </w:pPr>
+      <w:r>
+        <w:rPr>
+          <w:rFonts w:ascii="Arial" w:cs="Arial" w:eastAsia="Arial" w:hAnsi="Arial"/>
+          <w:b/>
+          <w:bCs/>
+          <w:color w:val="1F3864"/>
+          <w:sz w:val="22"/>
+          <w:szCs w:val="22"/>
+        </w:rPr>
+        <w:t xml:space="preserve">12.6.2 Impact Row Content</w:t>
+      </w:r>
+    </w:p>
+    <w:p>
+      <w:pPr>
+        <w:spacing w:after="160"/>
+      </w:pPr>
+      <w:r>
+        <w:rPr>
+          <w:rFonts w:ascii="Arial" w:cs="Arial" w:eastAsia="Arial" w:hAnsi="Arial"/>
+          <w:color w:val="000000"/>
+          <w:sz w:val="22"/>
+          <w:szCs w:val="22"/>
+        </w:rPr>
+        <w:t xml:space="preserve">Each impact row displays:</w:t>
+      </w:r>
+    </w:p>
+    <w:p>
+      <w:pPr>
+        <w:spacing w:after="120"/>
+      </w:pPr>
+      <w:r>
+        <w:rPr>
+          <w:rFonts w:ascii="Arial" w:cs="Arial" w:eastAsia="Arial" w:hAnsi="Arial"/>
+          <w:b/>
+          <w:bCs/>
+          <w:color w:val="000000"/>
+          <w:sz w:val="22"/>
+          <w:szCs w:val="22"/>
+        </w:rPr>
+        <w:t xml:space="preserve">Affected record identifier — </w:t>
+      </w:r>
+      <w:r>
+        <w:rPr>
+          <w:rFonts w:ascii="Arial" w:cs="Arial" w:eastAsia="Arial" w:hAnsi="Arial"/>
+          <w:color w:val="000000"/>
+          <w:sz w:val="22"/>
+          <w:szCs w:val="22"/>
+        </w:rPr>
+        <w:t xml:space="preserve">the name, code, or identifier of the affected record (e.g., “Mentor Onboarding (MR-ONBOARD)”, “mentorStatus”, “MR-MANAGE-DEC-003”). This is a navigable link that opens the affected record in the application.</w:t>
+      </w:r>
+    </w:p>
+    <w:p>
+      <w:pPr>
+        <w:spacing w:after="120"/>
+      </w:pPr>
+      <w:r>
+        <w:rPr>
+          <w:rFonts w:ascii="Arial" w:cs="Arial" w:eastAsia="Arial" w:hAnsi="Arial"/>
+          <w:b/>
+          <w:bCs/>
+          <w:color w:val="000000"/>
+          <w:sz w:val="22"/>
+          <w:szCs w:val="22"/>
+        </w:rPr>
+        <w:t xml:space="preserve">Impact description — </w:t>
+      </w:r>
+      <w:r>
+        <w:rPr>
+          <w:rFonts w:ascii="Arial" w:cs="Arial" w:eastAsia="Arial" w:hAnsi="Arial"/>
+          <w:color w:val="000000"/>
+          <w:sz w:val="22"/>
+          <w:szCs w:val="22"/>
+        </w:rPr>
+        <w:t xml:space="preserve">the human-readable description from Section 12.4.1, explaining the relationship to the changed record and the nature of the concern.</w:t>
+      </w:r>
+    </w:p>
+    <w:p>
+      <w:pPr>
+        <w:spacing w:after="120"/>
+      </w:pPr>
+      <w:r>
+        <w:rPr>
+          <w:rFonts w:ascii="Arial" w:cs="Arial" w:eastAsia="Arial" w:hAnsi="Arial"/>
+          <w:b/>
+          <w:bCs/>
+          <w:color w:val="000000"/>
+          <w:sz w:val="22"/>
+          <w:szCs w:val="22"/>
+        </w:rPr>
+        <w:t xml:space="preserve">Source change summary — </w:t>
+      </w:r>
+      <w:r>
+        <w:rPr>
+          <w:rFonts w:ascii="Arial" w:cs="Arial" w:eastAsia="Arial" w:hAnsi="Arial"/>
+          <w:color w:val="000000"/>
+          <w:sz w:val="22"/>
+          <w:szCs w:val="22"/>
+        </w:rPr>
+        <w:t xml:space="preserve">a brief reference to the ChangeLog entry that triggered this impact, identifying what changed (e.g., “Field ‘mentorStatus’ type changed from enum to multiEnum”). For batch-deduplicated impacts (Section 12.4.3), the summary references all contributing changes.</w:t>
+      </w:r>
+    </w:p>
+    <w:p>
+      <w:pPr>
+        <w:spacing w:after="160"/>
+      </w:pPr>
+      <w:r>
+        <w:rPr>
+          <w:rFonts w:ascii="Arial" w:cs="Arial" w:eastAsia="Arial" w:hAnsi="Arial"/>
+          <w:b/>
+          <w:bCs/>
+          <w:color w:val="000000"/>
+          <w:sz w:val="22"/>
+          <w:szCs w:val="22"/>
+        </w:rPr>
+        <w:t xml:space="preserve">Review status — </w:t>
+      </w:r>
+      <w:r>
+        <w:rPr>
+          <w:rFonts w:ascii="Arial" w:cs="Arial" w:eastAsia="Arial" w:hAnsi="Arial"/>
+          <w:color w:val="000000"/>
+          <w:sz w:val="22"/>
+          <w:szCs w:val="22"/>
+        </w:rPr>
+        <w:t xml:space="preserve">for post-commit review, the current review state: unreviewed, reviewed, or flagged for action. For pre-commit confirmation, this column is not shown.</w:t>
+      </w:r>
+    </w:p>
+    <w:p>
+      <w:pPr>
+        <w:pStyle w:val="Heading3"/>
+        <w:spacing w:after="120" w:before="240"/>
+      </w:pPr>
+      <w:r>
+        <w:rPr>
+          <w:rFonts w:ascii="Arial" w:cs="Arial" w:eastAsia="Arial" w:hAnsi="Arial"/>
+          <w:b/>
+          <w:bCs/>
+          <w:color w:val="1F3864"/>
+          <w:sz w:val="22"/>
+          <w:szCs w:val="22"/>
+        </w:rPr>
+        <w:t xml:space="preserve">12.6.3 Summary Header</w:t>
+      </w:r>
+    </w:p>
+    <w:p>
+      <w:pPr>
+        <w:spacing w:after="160"/>
+      </w:pPr>
+      <w:r>
+        <w:rPr>
+          <w:rFonts w:ascii="Arial" w:cs="Arial" w:eastAsia="Arial" w:hAnsi="Arial"/>
+          <w:color w:val="000000"/>
+          <w:sz w:val="22"/>
+          <w:szCs w:val="22"/>
+        </w:rPr>
+        <w:t xml:space="preserve">Above the grouped results, the presentation displays a summary header showing: the total number of ChangeImpact records, the count requiring review, the count informational, and for post-commit review the count already reviewed. This gives the administrator an immediate sense of the change’s scope.</w:t>
+      </w:r>
+    </w:p>
+    <w:p>
+      <w:pPr>
+        <w:pStyle w:val="Heading3"/>
+        <w:spacing w:after="120" w:before="240"/>
+      </w:pPr>
+      <w:r>
+        <w:rPr>
+          <w:rFonts w:ascii="Arial" w:cs="Arial" w:eastAsia="Arial" w:hAnsi="Arial"/>
+          <w:b/>
+          <w:bCs/>
+          <w:color w:val="1F3864"/>
+          <w:sz w:val="22"/>
+          <w:szCs w:val="22"/>
+        </w:rPr>
+        <w:t xml:space="preserve">12.6.4 Pre-Commit Confirmation Variant</w:t>
+      </w:r>
+    </w:p>
+    <w:p>
+      <w:pPr>
+        <w:spacing w:after="160"/>
+      </w:pPr>
+      <w:r>
+        <w:rPr>
+          <w:rFonts w:ascii="Arial" w:cs="Arial" w:eastAsia="Arial" w:hAnsi="Arial"/>
+          <w:color w:val="000000"/>
+          <w:sz w:val="22"/>
+          <w:szCs w:val="22"/>
+        </w:rPr>
+        <w:t xml:space="preserve">When presenting pre-commit analysis for direct edits (Section 12.5), the presentation includes a rationale text field and Confirm/Cancel buttons below the impact set. The review status column is omitted because the impacts have not yet been created — the administrator is deciding whether to proceed. The summary header emphasizes the scope: “This change affects {N} downstream records across {M} tables.”</w:t>
+      </w:r>
+    </w:p>
+    <w:p>
+      <w:pPr>
+        <w:pStyle w:val="Heading3"/>
+        <w:spacing w:after="120" w:before="240"/>
+      </w:pPr>
+      <w:r>
+        <w:rPr>
+          <w:rFonts w:ascii="Arial" w:cs="Arial" w:eastAsia="Arial" w:hAnsi="Arial"/>
+          <w:b/>
+          <w:bCs/>
+          <w:color w:val="1F3864"/>
+          <w:sz w:val="22"/>
+          <w:szCs w:val="22"/>
+        </w:rPr>
+        <w:t xml:space="preserve">12.6.5 Empty Impact Set</w:t>
+      </w:r>
+    </w:p>
+    <w:p>
+      <w:pPr>
+        <w:spacing w:after="160"/>
+      </w:pPr>
+      <w:r>
+        <w:rPr>
+          <w:rFonts w:ascii="Arial" w:cs="Arial" w:eastAsia="Arial" w:hAnsi="Arial"/>
+          <w:color w:val="000000"/>
+          <w:sz w:val="22"/>
+          <w:szCs w:val="22"/>
+        </w:rPr>
+        <w:t xml:space="preserve">When the impact set is empty, the presentation displays a brief confirmation: “No downstream records are affected by this change.” For direct edits, the change proceeds without requiring rationale. For post-commit review, no ChangeImpact records are created and no review action is needed.</w:t>
+      </w:r>
+    </w:p>
+    <w:p>
+      <w:pPr>
+        <w:pStyle w:val="Heading2"/>
+        <w:spacing w:after="160" w:before="280"/>
+      </w:pPr>
+      <w:r>
+        <w:rPr>
+          <w:rFonts w:ascii="Arial" w:cs="Arial" w:eastAsia="Arial" w:hAnsi="Arial"/>
+          <w:b/>
+          <w:bCs/>
+          <w:color w:val="1F3864"/>
+          <w:sz w:val="24"/>
+          <w:szCs w:val="24"/>
+        </w:rPr>
+        <w:t xml:space="preserve">12.7 Review Tracking</w:t>
+      </w:r>
+    </w:p>
+    <w:p>
+      <w:pPr>
+        <w:spacing w:after="160"/>
+      </w:pPr>
+      <w:r>
+        <w:rPr>
+          <w:rFonts w:ascii="Arial" w:cs="Arial" w:eastAsia="Arial" w:hAnsi="Arial"/>
+          <w:color w:val="000000"/>
+          <w:sz w:val="22"/>
+          <w:szCs w:val="22"/>
+        </w:rPr>
+        <w:t xml:space="preserve">After a post-commit import produces ChangeImpact records, the administrator reviews each impact to assess whether the affected record needs revision. The review workflow supports both individual assessment and bulk processing.</w:t>
+      </w:r>
+    </w:p>
+    <w:p>
+      <w:pPr>
+        <w:pStyle w:val="Heading3"/>
+        <w:spacing w:after="120" w:before="240"/>
+      </w:pPr>
+      <w:r>
+        <w:rPr>
+          <w:rFonts w:ascii="Arial" w:cs="Arial" w:eastAsia="Arial" w:hAnsi="Arial"/>
+          <w:b/>
+          <w:bCs/>
+          <w:color w:val="1F3864"/>
+          <w:sz w:val="22"/>
+          <w:szCs w:val="22"/>
+        </w:rPr>
+        <w:t xml:space="preserve">12.7.1 Review Actions</w:t>
+      </w:r>
+    </w:p>
+    <w:p>
+      <w:pPr>
+        <w:spacing w:after="160"/>
+      </w:pPr>
+      <w:r>
+        <w:rPr>
+          <w:rFonts w:ascii="Arial" w:cs="Arial" w:eastAsia="Arial" w:hAnsi="Arial"/>
+          <w:color w:val="000000"/>
+          <w:sz w:val="22"/>
+          <w:szCs w:val="22"/>
+        </w:rPr>
+        <w:t xml:space="preserve">For each ChangeImpact record, the administrator selects one of two review actions:</w:t>
+      </w:r>
+    </w:p>
+    <w:p>
+      <w:pPr>
+        <w:spacing w:after="120"/>
+      </w:pPr>
+      <w:r>
+        <w:rPr>
+          <w:rFonts w:ascii="Arial" w:cs="Arial" w:eastAsia="Arial" w:hAnsi="Arial"/>
+          <w:b/>
+          <w:bCs/>
+          <w:color w:val="000000"/>
+          <w:sz w:val="22"/>
+          <w:szCs w:val="22"/>
+        </w:rPr>
+        <w:t xml:space="preserve">No action needed — </w:t>
+      </w:r>
+      <w:r>
+        <w:rPr>
+          <w:rFonts w:ascii="Arial" w:cs="Arial" w:eastAsia="Arial" w:hAnsi="Arial"/>
+          <w:color w:val="000000"/>
+          <w:sz w:val="22"/>
+          <w:szCs w:val="22"/>
+        </w:rPr>
+        <w:t xml:space="preserve">the administrator has assessed the impact and determined the affected record does not need revision. The engine sets reviewed = TRUE, action_required = FALSE, and reviewed_at to the current timestamp.</w:t>
+      </w:r>
+    </w:p>
+    <w:p>
+      <w:pPr>
+        <w:spacing w:after="160"/>
+      </w:pPr>
+      <w:r>
+        <w:rPr>
+          <w:rFonts w:ascii="Arial" w:cs="Arial" w:eastAsia="Arial" w:hAnsi="Arial"/>
+          <w:b/>
+          <w:bCs/>
+          <w:color w:val="000000"/>
+          <w:sz w:val="22"/>
+          <w:szCs w:val="22"/>
+        </w:rPr>
+        <w:t xml:space="preserve">Flag for revision — </w:t>
+      </w:r>
+      <w:r>
+        <w:rPr>
+          <w:rFonts w:ascii="Arial" w:cs="Arial" w:eastAsia="Arial" w:hAnsi="Arial"/>
+          <w:color w:val="000000"/>
+          <w:sz w:val="22"/>
+          <w:szCs w:val="22"/>
+        </w:rPr>
+        <w:t xml:space="preserve">the administrator has assessed the impact and determined the affected record needs content revision. The engine sets reviewed = TRUE, action_required = TRUE, and reviewed_at to the current timestamp. Flagging does not automatically reopen a work item — the administrator decides when and how to act on flagged items through the revision workflow described in Section 12.8.</w:t>
+      </w:r>
+    </w:p>
+    <w:p>
+      <w:pPr>
+        <w:pStyle w:val="Heading3"/>
+        <w:spacing w:after="120" w:before="240"/>
+      </w:pPr>
+      <w:r>
+        <w:rPr>
+          <w:rFonts w:ascii="Arial" w:cs="Arial" w:eastAsia="Arial" w:hAnsi="Arial"/>
+          <w:b/>
+          <w:bCs/>
+          <w:color w:val="1F3864"/>
+          <w:sz w:val="22"/>
+          <w:szCs w:val="22"/>
+        </w:rPr>
+        <w:t xml:space="preserve">12.7.2 Bulk Review</w:t>
+      </w:r>
+    </w:p>
+    <w:p>
+      <w:pPr>
+        <w:spacing w:after="160"/>
+      </w:pPr>
+      <w:r>
+        <w:rPr>
+          <w:rFonts w:ascii="Arial" w:cs="Arial" w:eastAsia="Arial" w:hAnsi="Arial"/>
+          <w:color w:val="000000"/>
+          <w:sz w:val="22"/>
+          <w:szCs w:val="22"/>
+        </w:rPr>
+        <w:t xml:space="preserve">The administrator can select multiple ChangeImpact records and apply a review action to all of them in a single operation. This is particularly useful for informational impacts (requires_review = FALSE) that the administrator wants to acknowledge without examining individually. Bulk review sets the same reviewed, action_required, and reviewed_at values on all selected records.</w:t>
+      </w:r>
+    </w:p>
+    <w:p>
+      <w:pPr>
+        <w:pStyle w:val="Heading3"/>
+        <w:spacing w:after="120" w:before="240"/>
+      </w:pPr>
+      <w:r>
+        <w:rPr>
+          <w:rFonts w:ascii="Arial" w:cs="Arial" w:eastAsia="Arial" w:hAnsi="Arial"/>
+          <w:b/>
+          <w:bCs/>
+          <w:color w:val="1F3864"/>
+          <w:sz w:val="22"/>
+          <w:szCs w:val="22"/>
+        </w:rPr>
+        <w:t xml:space="preserve">12.7.3 Review Completion</w:t>
+      </w:r>
+    </w:p>
+    <w:p>
+      <w:pPr>
+        <w:spacing w:after="160"/>
+      </w:pPr>
+      <w:r>
+        <w:rPr>
+          <w:rFonts w:ascii="Arial" w:cs="Arial" w:eastAsia="Arial" w:hAnsi="Arial"/>
+          <w:color w:val="000000"/>
+          <w:sz w:val="22"/>
+          <w:szCs w:val="22"/>
+        </w:rPr>
+        <w:t xml:space="preserve">A change is considered fully resolved when every ChangeImpact record linked to the triggering ChangeLog entries has reviewed = TRUE. The application tracks resolution status at the transaction level — all ChangeLog entries produced by a single import commit or a single direct edit are treated as one change set. A change set is fully resolved when all of its ChangeImpact records are reviewed, regardless of their action_required values.</w:t>
+      </w:r>
+    </w:p>
+    <w:p>
+      <w:pPr>
+        <w:spacing w:after="160"/>
+      </w:pPr>
+      <w:r>
+        <w:rPr>
+          <w:rFonts w:ascii="Arial" w:cs="Arial" w:eastAsia="Arial" w:hAnsi="Arial"/>
+          <w:color w:val="000000"/>
+          <w:sz w:val="22"/>
+          <w:szCs w:val="22"/>
+        </w:rPr>
+        <w:t xml:space="preserve">Unresolved change sets — those with one or more unreviewed ChangeImpact records — are available for display in the application’s management views. The specific presentation is deferred to Section 14 (User Interface).</w:t>
+      </w:r>
+    </w:p>
+    <w:p>
+      <w:pPr>
+        <w:pStyle w:val="Heading3"/>
+        <w:spacing w:after="120" w:before="240"/>
+      </w:pPr>
+      <w:r>
+        <w:rPr>
+          <w:rFonts w:ascii="Arial" w:cs="Arial" w:eastAsia="Arial" w:hAnsi="Arial"/>
+          <w:b/>
+          <w:bCs/>
+          <w:color w:val="1F3864"/>
+          <w:sz w:val="22"/>
+          <w:szCs w:val="22"/>
+        </w:rPr>
+        <w:t xml:space="preserve">12.7.4 Schema Changes</w:t>
+      </w:r>
+    </w:p>
+    <w:p>
+      <w:pPr>
+        <w:spacing w:after="160"/>
+      </w:pPr>
+      <w:r>
+        <w:rPr>
+          <w:rFonts w:ascii="Arial" w:cs="Arial" w:eastAsia="Arial" w:hAnsi="Arial"/>
+          <w:color w:val="000000"/>
+          <w:sz w:val="22"/>
+          <w:szCs w:val="22"/>
+        </w:rPr>
+        <w:t xml:space="preserve">This section requires one new column on the ChangeImpact table defined in Section 7.3:</w:t>
+      </w:r>
+    </w:p>
+    <w:p>
+      <w:pPr>
+        <w:spacing w:after="160"/>
+      </w:pPr>
+      <w:r>
+        <w:rPr>
+          <w:rFonts w:ascii="Arial" w:cs="Arial" w:eastAsia="Arial" w:hAnsi="Arial"/>
+          <w:color w:val="000000"/>
+          <w:sz w:val="22"/>
+          <w:szCs w:val="22"/>
+        </w:rPr>
+        <w:t xml:space="preserve">New column: action_required (BOOLEAN, NOT NULL, DEFAULT FALSE). Set to TRUE when the administrator flags an impact for revision, FALSE when the administrator reviews and determines no action is needed. Only meaningful when reviewed is TRUE.</w:t>
+      </w:r>
+    </w:p>
+    <w:p>
+      <w:pPr>
+        <w:pStyle w:val="Heading2"/>
+        <w:spacing w:after="160" w:before="280"/>
+      </w:pPr>
+      <w:r>
+        <w:rPr>
+          <w:rFonts w:ascii="Arial" w:cs="Arial" w:eastAsia="Arial" w:hAnsi="Arial"/>
+          <w:b/>
+          <w:bCs/>
+          <w:color w:val="1F3864"/>
+          <w:sz w:val="24"/>
+          <w:szCs w:val="24"/>
+        </w:rPr>
+        <w:t xml:space="preserve">12.8 Interaction with Revision Workflow</w:t>
+      </w:r>
+    </w:p>
+    <w:p>
+      <w:pPr>
+        <w:spacing w:after="160"/>
+      </w:pPr>
+      <w:r>
+        <w:rPr>
+          <w:rFonts w:ascii="Arial" w:cs="Arial" w:eastAsia="Arial" w:hAnsi="Arial"/>
+          <w:color w:val="000000"/>
+          <w:sz w:val="22"/>
+          <w:szCs w:val="22"/>
+        </w:rPr>
+        <w:t xml:space="preserve">The Impact Analysis Engine surfaces affected records and flags them for revision. The administrator decides which work items to reopen based on the flagged impacts. The engine does not automatically reopen work items — the decision to trigger revision and cascade regression is always the administrator’s.</w:t>
+      </w:r>
+    </w:p>
+    <w:p>
+      <w:pPr>
+        <w:pStyle w:val="Heading3"/>
+        <w:spacing w:after="120" w:before="240"/>
+      </w:pPr>
+      <w:r>
+        <w:rPr>
+          <w:rFonts w:ascii="Arial" w:cs="Arial" w:eastAsia="Arial" w:hAnsi="Arial"/>
+          <w:b/>
+          <w:bCs/>
+          <w:color w:val="1F3864"/>
+          <w:sz w:val="22"/>
+          <w:szCs w:val="22"/>
+        </w:rPr>
+        <w:t xml:space="preserve">12.8.1 Work Item Mapping</w:t>
+      </w:r>
+    </w:p>
+    <w:p>
+      <w:pPr>
+        <w:spacing w:after="160"/>
+      </w:pPr>
+      <w:r>
+        <w:rPr>
+          <w:rFonts w:ascii="Arial" w:cs="Arial" w:eastAsia="Arial" w:hAnsi="Arial"/>
+          <w:color w:val="000000"/>
+          <w:sz w:val="22"/>
+          <w:szCs w:val="22"/>
+        </w:rPr>
+        <w:t xml:space="preserve">The application maps flagged ChangeImpact records to work items using the foreign keys on the affected record. The mapping follows the schema’s scoping structure:</w:t>
+      </w:r>
+    </w:p>
+    <w:p>
+      <w:pPr>
+        <w:spacing w:after="120"/>
+      </w:pPr>
+      <w:r>
+        <w:rPr>
+          <w:rFonts w:ascii="Arial" w:cs="Arial" w:eastAsia="Arial" w:hAnsi="Arial"/>
+          <w:color w:val="000000"/>
+          <w:sz w:val="22"/>
+          <w:szCs w:val="22"/>
+        </w:rPr>
+        <w:t xml:space="preserve">A flagged impact on a Field or FieldOption record maps to the entity_prd work item whose entity_id matches the field’s entity_id.</w:t>
+      </w:r>
+    </w:p>
+    <w:p>
+      <w:pPr>
+        <w:spacing w:after="120"/>
+      </w:pPr>
+      <w:r>
+        <w:rPr>
+          <w:rFonts w:ascii="Arial" w:cs="Arial" w:eastAsia="Arial" w:hAnsi="Arial"/>
+          <w:color w:val="000000"/>
+          <w:sz w:val="22"/>
+          <w:szCs w:val="22"/>
+        </w:rPr>
+        <w:t xml:space="preserve">A flagged impact on a Process, ProcessStep, Requirement, or cross-reference record (ProcessEntity, ProcessField, ProcessPersona) maps to the process_definition work item whose process_id matches.</w:t>
+      </w:r>
+    </w:p>
+    <w:p>
+      <w:pPr>
+        <w:spacing w:after="120"/>
+      </w:pPr>
+      <w:r>
+        <w:rPr>
+          <w:rFonts w:ascii="Arial" w:cs="Arial" w:eastAsia="Arial" w:hAnsi="Arial"/>
+          <w:color w:val="000000"/>
+          <w:sz w:val="22"/>
+          <w:szCs w:val="22"/>
+        </w:rPr>
+        <w:t xml:space="preserve">A flagged impact on a Persona record maps to the master_prd work item (personas are defined at project scope).</w:t>
+      </w:r>
+    </w:p>
+    <w:p>
+      <w:pPr>
+        <w:spacing w:after="120"/>
+      </w:pPr>
+      <w:r>
+        <w:rPr>
+          <w:rFonts w:ascii="Arial" w:cs="Arial" w:eastAsia="Arial" w:hAnsi="Arial"/>
+          <w:color w:val="000000"/>
+          <w:sz w:val="22"/>
+          <w:szCs w:val="22"/>
+        </w:rPr>
+        <w:t xml:space="preserve">A flagged impact on a LayoutPanel, LayoutRow, LayoutTab, or ListColumn record maps to the entity_prd work item whose entity_id matches the layout’s entity_id.</w:t>
+      </w:r>
+    </w:p>
+    <w:p>
+      <w:pPr>
+        <w:spacing w:after="120"/>
+      </w:pPr>
+      <w:r>
+        <w:rPr>
+          <w:rFonts w:ascii="Arial" w:cs="Arial" w:eastAsia="Arial" w:hAnsi="Arial"/>
+          <w:color w:val="000000"/>
+          <w:sz w:val="22"/>
+          <w:szCs w:val="22"/>
+        </w:rPr>
+        <w:t xml:space="preserve">A flagged impact on a Domain record maps to the domain_overview work item whose domain_id matches.</w:t>
+      </w:r>
+    </w:p>
+    <w:p>
+      <w:pPr>
+        <w:spacing w:after="160"/>
+      </w:pPr>
+      <w:r>
+        <w:rPr>
+          <w:rFonts w:ascii="Arial" w:cs="Arial" w:eastAsia="Arial" w:hAnsi="Arial"/>
+          <w:color w:val="000000"/>
+          <w:sz w:val="22"/>
+          <w:szCs w:val="22"/>
+        </w:rPr>
+        <w:t xml:space="preserve">A flagged impact on a Relationship record maps to the entity_prd work items for both entities involved (entity_id and entity_foreign_id).</w:t>
+      </w:r>
+    </w:p>
+    <w:p>
+      <w:pPr>
+        <w:spacing w:after="160"/>
+      </w:pPr>
+      <w:r>
+        <w:rPr>
+          <w:rFonts w:ascii="Arial" w:cs="Arial" w:eastAsia="Arial" w:hAnsi="Arial"/>
+          <w:color w:val="000000"/>
+          <w:sz w:val="22"/>
+          <w:szCs w:val="22"/>
+        </w:rPr>
+        <w:t xml:space="preserve">When multiple flagged impacts map to the same work item, they are grouped — the administrator sees one entry per affected work item with a count and summary of the contributing impacts.</w:t>
+      </w:r>
+    </w:p>
+    <w:p>
+      <w:pPr>
+        <w:pStyle w:val="Heading3"/>
+        <w:spacing w:after="120" w:before="240"/>
+      </w:pPr>
+      <w:r>
+        <w:rPr>
+          <w:rFonts w:ascii="Arial" w:cs="Arial" w:eastAsia="Arial" w:hAnsi="Arial"/>
+          <w:b/>
+          <w:bCs/>
+          <w:color w:val="1F3864"/>
+          <w:sz w:val="22"/>
+          <w:szCs w:val="22"/>
+        </w:rPr>
+        <w:t xml:space="preserve">12.8.2 Revision Eligibility</w:t>
+      </w:r>
+    </w:p>
+    <w:p>
+      <w:pPr>
+        <w:spacing w:after="160"/>
+      </w:pPr>
+      <w:r>
+        <w:rPr>
+          <w:rFonts w:ascii="Arial" w:cs="Arial" w:eastAsia="Arial" w:hAnsi="Arial"/>
+          <w:color w:val="000000"/>
+          <w:sz w:val="22"/>
+          <w:szCs w:val="22"/>
+        </w:rPr>
+        <w:t xml:space="preserve">Only work items in complete status are eligible for revision. The application enforces this constraint:</w:t>
+      </w:r>
+    </w:p>
+    <w:p>
+      <w:pPr>
+        <w:spacing w:after="120"/>
+      </w:pPr>
+      <w:r>
+        <w:rPr>
+          <w:rFonts w:ascii="Arial" w:cs="Arial" w:eastAsia="Arial" w:hAnsi="Arial"/>
+          <w:b/>
+          <w:bCs/>
+          <w:color w:val="000000"/>
+          <w:sz w:val="22"/>
+          <w:szCs w:val="22"/>
+        </w:rPr>
+        <w:t xml:space="preserve">Complete — </w:t>
+      </w:r>
+      <w:r>
+        <w:rPr>
+          <w:rFonts w:ascii="Arial" w:cs="Arial" w:eastAsia="Arial" w:hAnsi="Arial"/>
+          <w:color w:val="000000"/>
+          <w:sz w:val="22"/>
+          <w:szCs w:val="22"/>
+        </w:rPr>
+        <w:t xml:space="preserve">eligible. The administrator can reopen for revision, triggering Section 9.7.2.</w:t>
+      </w:r>
+    </w:p>
+    <w:p>
+      <w:pPr>
+        <w:spacing w:after="120"/>
+      </w:pPr>
+      <w:r>
+        <w:rPr>
+          <w:rFonts w:ascii="Arial" w:cs="Arial" w:eastAsia="Arial" w:hAnsi="Arial"/>
+          <w:b/>
+          <w:bCs/>
+          <w:color w:val="000000"/>
+          <w:sz w:val="22"/>
+          <w:szCs w:val="22"/>
+        </w:rPr>
+        <w:t xml:space="preserve">In-progress — </w:t>
+      </w:r>
+      <w:r>
+        <w:rPr>
+          <w:rFonts w:ascii="Arial" w:cs="Arial" w:eastAsia="Arial" w:hAnsi="Arial"/>
+          <w:color w:val="000000"/>
+          <w:sz w:val="22"/>
+          <w:szCs w:val="22"/>
+        </w:rPr>
+        <w:t xml:space="preserve">not eligible. The work item is already being worked on. The application notes the flagged impacts for inclusion in the current session’s context. When the Prompt Generator assembles the next revision or clarification prompt for this work item, it includes the pending impact descriptions as additional context.</w:t>
+      </w:r>
+    </w:p>
+    <w:p>
+      <w:pPr>
+        <w:spacing w:after="120"/>
+      </w:pPr>
+      <w:r>
+        <w:rPr>
+          <w:rFonts w:ascii="Arial" w:cs="Arial" w:eastAsia="Arial" w:hAnsi="Arial"/>
+          <w:b/>
+          <w:bCs/>
+          <w:color w:val="000000"/>
+          <w:sz w:val="22"/>
+          <w:szCs w:val="22"/>
+        </w:rPr>
+        <w:t xml:space="preserve">Blocked — </w:t>
+      </w:r>
+      <w:r>
+        <w:rPr>
+          <w:rFonts w:ascii="Arial" w:cs="Arial" w:eastAsia="Arial" w:hAnsi="Arial"/>
+          <w:color w:val="000000"/>
+          <w:sz w:val="22"/>
+          <w:szCs w:val="22"/>
+        </w:rPr>
+        <w:t xml:space="preserve">not eligible. The blocking issue must resolve before the work item can be reopened. The application displays the blocked reason alongside the flagged impacts so the administrator understands the dependency.</w:t>
+      </w:r>
+    </w:p>
+    <w:p>
+      <w:pPr>
+        <w:spacing w:after="160"/>
+      </w:pPr>
+      <w:r>
+        <w:rPr>
+          <w:rFonts w:ascii="Arial" w:cs="Arial" w:eastAsia="Arial" w:hAnsi="Arial"/>
+          <w:b/>
+          <w:bCs/>
+          <w:color w:val="000000"/>
+          <w:sz w:val="22"/>
+          <w:szCs w:val="22"/>
+        </w:rPr>
+        <w:t xml:space="preserve">Not started or ready — </w:t>
+      </w:r>
+      <w:r>
+        <w:rPr>
+          <w:rFonts w:ascii="Arial" w:cs="Arial" w:eastAsia="Arial" w:hAnsi="Arial"/>
+          <w:color w:val="000000"/>
+          <w:sz w:val="22"/>
+          <w:szCs w:val="22"/>
+        </w:rPr>
+        <w:t xml:space="preserve">not eligible. The work item has not yet produced content, so there is nothing to revise. The flagged impacts are noted for inclusion when the work item’s initial session is eventually generated.</w:t>
+      </w:r>
+    </w:p>
+    <w:p>
+      <w:pPr>
+        <w:pStyle w:val="Heading3"/>
+        <w:spacing w:after="120" w:before="240"/>
+      </w:pPr>
+      <w:r>
+        <w:rPr>
+          <w:rFonts w:ascii="Arial" w:cs="Arial" w:eastAsia="Arial" w:hAnsi="Arial"/>
+          <w:b/>
+          <w:bCs/>
+          <w:color w:val="1F3864"/>
+          <w:sz w:val="22"/>
+          <w:szCs w:val="22"/>
+        </w:rPr>
+        <w:t xml:space="preserve">12.8.3 Triggering Revision</w:t>
+      </w:r>
+    </w:p>
+    <w:p>
+      <w:pPr>
+        <w:spacing w:after="160"/>
+      </w:pPr>
+      <w:r>
+        <w:rPr>
+          <w:rFonts w:ascii="Arial" w:cs="Arial" w:eastAsia="Arial" w:hAnsi="Arial"/>
+          <w:color w:val="000000"/>
+          <w:sz w:val="22"/>
+          <w:szCs w:val="22"/>
+        </w:rPr>
+        <w:t xml:space="preserve">When the administrator chooses to reopen a work item for revision, the application invokes the Workflow Engine’s revision transition (Section 9.7.2). This clears completed_at, creates a new AISession record with session_type “revision,” and triggers cascade regression on downstream items.</w:t>
+      </w:r>
+    </w:p>
+    <w:p>
+      <w:pPr>
+        <w:spacing w:after="160"/>
+      </w:pPr>
+      <w:r>
+        <w:rPr>
+          <w:rFonts w:ascii="Arial" w:cs="Arial" w:eastAsia="Arial" w:hAnsi="Arial"/>
+          <w:color w:val="000000"/>
+          <w:sz w:val="22"/>
+          <w:szCs w:val="22"/>
+        </w:rPr>
+        <w:t xml:space="preserve">The Prompt Generator (Section 10.6.2) assembles the revision prompt with change context drawn from the ChangeLog entries and ChangeImpact descriptions that motivated the revision. This gives the AI session explicit awareness of what changed and why the revision is needed.</w:t>
+      </w:r>
+    </w:p>
+    <w:p>
+      <w:pPr>
+        <w:pStyle w:val="Heading3"/>
+        <w:spacing w:after="120" w:before="240"/>
+      </w:pPr>
+      <w:r>
+        <w:rPr>
+          <w:rFonts w:ascii="Arial" w:cs="Arial" w:eastAsia="Arial" w:hAnsi="Arial"/>
+          <w:b/>
+          <w:bCs/>
+          <w:color w:val="1F3864"/>
+          <w:sz w:val="22"/>
+          <w:szCs w:val="22"/>
+        </w:rPr>
+        <w:t xml:space="preserve">12.8.4 Partial Revision</w:t>
+      </w:r>
+    </w:p>
+    <w:p>
+      <w:pPr>
+        <w:spacing w:after="160"/>
+      </w:pPr>
+      <w:r>
+        <w:rPr>
+          <w:rFonts w:ascii="Arial" w:cs="Arial" w:eastAsia="Arial" w:hAnsi="Arial"/>
+          <w:color w:val="000000"/>
+          <w:sz w:val="22"/>
+          <w:szCs w:val="22"/>
+        </w:rPr>
+        <w:t xml:space="preserve">The administrator is not required to reopen every affected work item. Some flagged impacts may be deferred — the administrator assesses that the change is minor enough that the affected document can wait until its next natural revision cycle. Flagged impacts remain in the database with action_required = TRUE and reviewed = TRUE regardless of whether the associated work item is reopened. This provides a persistent record of known impacts that have not yet been addressed.</w:t>
+      </w:r>
+    </w:p>
+    <w:p>
+      <w:pPr>
+        <w:pStyle w:val="Heading2"/>
+        <w:spacing w:after="160" w:before="280"/>
+      </w:pPr>
+      <w:r>
+        <w:rPr>
+          <w:rFonts w:ascii="Arial" w:cs="Arial" w:eastAsia="Arial" w:hAnsi="Arial"/>
+          <w:b/>
+          <w:bCs/>
+          <w:color w:val="1F3864"/>
+          <w:sz w:val="24"/>
+          <w:szCs w:val="24"/>
+        </w:rPr>
+        <w:t xml:space="preserve">12.9 Batch Impact Analysis</w:t>
+      </w:r>
+    </w:p>
+    <w:p>
+      <w:pPr>
+        <w:spacing w:after="160"/>
+      </w:pPr>
+      <w:r>
+        <w:rPr>
+          <w:rFonts w:ascii="Arial" w:cs="Arial" w:eastAsia="Arial" w:hAnsi="Arial"/>
+          <w:color w:val="000000"/>
+          <w:sz w:val="22"/>
+          <w:szCs w:val="22"/>
+        </w:rPr>
+        <w:t xml:space="preserve">An import transaction may produce many ChangeLog entries — for example, updating 15 fields across 3 entities in a single commit. The engine processes these entries as a batch rather than triggering independent analysis runs for each entry.</w:t>
+      </w:r>
+    </w:p>
+    <w:p>
+      <w:pPr>
+        <w:pStyle w:val="Heading3"/>
+        <w:spacing w:after="120" w:before="240"/>
+      </w:pPr>
+      <w:r>
+        <w:rPr>
+          <w:rFonts w:ascii="Arial" w:cs="Arial" w:eastAsia="Arial" w:hAnsi="Arial"/>
+          <w:b/>
+          <w:bCs/>
+          <w:color w:val="1F3864"/>
+          <w:sz w:val="22"/>
+          <w:szCs w:val="22"/>
+        </w:rPr>
+        <w:t xml:space="preserve">12.9.1 Batch Scope</w:t>
+      </w:r>
+    </w:p>
+    <w:p>
+      <w:pPr>
+        <w:spacing w:after="160"/>
+      </w:pPr>
+      <w:r>
+        <w:rPr>
+          <w:rFonts w:ascii="Arial" w:cs="Arial" w:eastAsia="Arial" w:hAnsi="Arial"/>
+          <w:color w:val="000000"/>
+          <w:sz w:val="22"/>
+          <w:szCs w:val="22"/>
+        </w:rPr>
+        <w:t xml:space="preserve">A batch is defined by the change source:</w:t>
+      </w:r>
+    </w:p>
+    <w:p>
+      <w:pPr>
+        <w:spacing w:after="120"/>
+      </w:pPr>
+      <w:r>
+        <w:rPr>
+          <w:rFonts w:ascii="Arial" w:cs="Arial" w:eastAsia="Arial" w:hAnsi="Arial"/>
+          <w:color w:val="000000"/>
+          <w:sz w:val="22"/>
+          <w:szCs w:val="22"/>
+        </w:rPr>
+        <w:t xml:space="preserve">For AI session imports, the batch is all ChangeLog entries sharing the same session_id from a single commit operation.</w:t>
+      </w:r>
+    </w:p>
+    <w:p>
+      <w:pPr>
+        <w:spacing w:after="160"/>
+      </w:pPr>
+      <w:r>
+        <w:rPr>
+          <w:rFonts w:ascii="Arial" w:cs="Arial" w:eastAsia="Arial" w:hAnsi="Arial"/>
+          <w:color w:val="000000"/>
+          <w:sz w:val="22"/>
+          <w:szCs w:val="22"/>
+        </w:rPr>
+        <w:t xml:space="preserve">For direct administrator edits, the batch is all ChangeLog entries produced by a single save operation. These share the same changed_at timestamp and have session_id set to null.</w:t>
+      </w:r>
+    </w:p>
+    <w:p>
+      <w:pPr>
+        <w:pStyle w:val="Heading3"/>
+        <w:spacing w:after="120" w:before="240"/>
+      </w:pPr>
+      <w:r>
+        <w:rPr>
+          <w:rFonts w:ascii="Arial" w:cs="Arial" w:eastAsia="Arial" w:hAnsi="Arial"/>
+          <w:b/>
+          <w:bCs/>
+          <w:color w:val="1F3864"/>
+          <w:sz w:val="22"/>
+          <w:szCs w:val="22"/>
+        </w:rPr>
+        <w:t xml:space="preserve">12.9.2 Processing Sequence</w:t>
+      </w:r>
+    </w:p>
+    <w:p>
+      <w:pPr>
+        <w:spacing w:after="160"/>
+      </w:pPr>
+      <w:r>
+        <w:rPr>
+          <w:rFonts w:ascii="Arial" w:cs="Arial" w:eastAsia="Arial" w:hAnsi="Arial"/>
+          <w:color w:val="000000"/>
+          <w:sz w:val="22"/>
+          <w:szCs w:val="22"/>
+        </w:rPr>
+        <w:t xml:space="preserve">The engine processes a batch in three steps:</w:t>
+      </w:r>
+    </w:p>
+    <w:p>
+      <w:pPr>
+        <w:spacing w:after="120"/>
+      </w:pPr>
+      <w:r>
+        <w:rPr>
+          <w:rFonts w:ascii="Arial" w:cs="Arial" w:eastAsia="Arial" w:hAnsi="Arial"/>
+          <w:b/>
+          <w:bCs/>
+          <w:color w:val="000000"/>
+          <w:sz w:val="22"/>
+          <w:szCs w:val="22"/>
+        </w:rPr>
+        <w:t xml:space="preserve">1. Trace each change independently. </w:t>
+      </w:r>
+      <w:r>
+        <w:rPr>
+          <w:rFonts w:ascii="Arial" w:cs="Arial" w:eastAsia="Arial" w:hAnsi="Arial"/>
+          <w:color w:val="000000"/>
+          <w:sz w:val="22"/>
+          <w:szCs w:val="22"/>
+        </w:rPr>
+        <w:t xml:space="preserve">For each ChangeLog entry in the batch, the engine runs the cross-reference queries defined in Section 12.3 to produce a candidate impact set. Each candidate impact is tagged with the ChangeLog entry that surfaced it.</w:t>
+      </w:r>
+    </w:p>
+    <w:p>
+      <w:pPr>
+        <w:spacing w:after="120"/>
+      </w:pPr>
+      <w:r>
+        <w:rPr>
+          <w:rFonts w:ascii="Arial" w:cs="Arial" w:eastAsia="Arial" w:hAnsi="Arial"/>
+          <w:b/>
+          <w:bCs/>
+          <w:color w:val="000000"/>
+          <w:sz w:val="22"/>
+          <w:szCs w:val="22"/>
+        </w:rPr>
+        <w:t xml:space="preserve">2. Deduplicate. </w:t>
+      </w:r>
+      <w:r>
+        <w:rPr>
+          <w:rFonts w:ascii="Arial" w:cs="Arial" w:eastAsia="Arial" w:hAnsi="Arial"/>
+          <w:color w:val="000000"/>
+          <w:sz w:val="22"/>
+          <w:szCs w:val="22"/>
+        </w:rPr>
+        <w:t xml:space="preserve">The engine merges candidate impacts that share the same (affected_table, affected_record_id) pair, per Section 12.4.3. The merged ChangeImpact record references the first ChangeLog entry that surfaced it and combines the impact descriptions from all contributing changes.</w:t>
+      </w:r>
+    </w:p>
+    <w:p>
+      <w:pPr>
+        <w:spacing w:after="160"/>
+      </w:pPr>
+      <w:r>
+        <w:rPr>
+          <w:rFonts w:ascii="Arial" w:cs="Arial" w:eastAsia="Arial" w:hAnsi="Arial"/>
+          <w:b/>
+          <w:bCs/>
+          <w:color w:val="000000"/>
+          <w:sz w:val="22"/>
+          <w:szCs w:val="22"/>
+        </w:rPr>
+        <w:t xml:space="preserve">3. Create ChangeImpact records. </w:t>
+      </w:r>
+      <w:r>
+        <w:rPr>
+          <w:rFonts w:ascii="Arial" w:cs="Arial" w:eastAsia="Arial" w:hAnsi="Arial"/>
+          <w:color w:val="000000"/>
+          <w:sz w:val="22"/>
+          <w:szCs w:val="22"/>
+        </w:rPr>
+        <w:t xml:space="preserve">The deduplicated impact set is written to the database. For post-commit analysis, the records are committed immediately. For pre-commit analysis, the records are held for presentation and committed only if the administrator confirms.</w:t>
+      </w:r>
+    </w:p>
+    <w:p>
+      <w:pPr>
+        <w:pStyle w:val="Heading3"/>
+        <w:spacing w:after="120" w:before="240"/>
+      </w:pPr>
+      <w:r>
+        <w:rPr>
+          <w:rFonts w:ascii="Arial" w:cs="Arial" w:eastAsia="Arial" w:hAnsi="Arial"/>
+          <w:b/>
+          <w:bCs/>
+          <w:color w:val="1F3864"/>
+          <w:sz w:val="22"/>
+          <w:szCs w:val="22"/>
+        </w:rPr>
+        <w:t xml:space="preserve">12.9.3 Query Efficiency</w:t>
+      </w:r>
+    </w:p>
+    <w:p>
+      <w:pPr>
+        <w:spacing w:after="160"/>
+      </w:pPr>
+      <w:r>
+        <w:rPr>
+          <w:rFonts w:ascii="Arial" w:cs="Arial" w:eastAsia="Arial" w:hAnsi="Arial"/>
+          <w:color w:val="000000"/>
+          <w:sz w:val="22"/>
+          <w:szCs w:val="22"/>
+        </w:rPr>
+        <w:t xml:space="preserve">When multiple ChangeLog entries in a batch affect the same table — for example, five field updates on the same entity — the engine should consolidate queries where possible, querying each cross-reference table once per batch with the full set of affected record IDs rather than issuing one query per ChangeLog entry. Implementation details are deferred, but the design supports consolidation because each query path in Section 12.3 is defined by (source table, target table, join column), which can be parameterized across multiple source records.</w:t>
+      </w:r>
+    </w:p>
+    <w:p>
+      <w:pPr>
+        <w:pStyle w:val="Heading2"/>
+        <w:spacing w:after="160" w:before="280"/>
+      </w:pPr>
+      <w:r>
+        <w:rPr>
+          <w:rFonts w:ascii="Arial" w:cs="Arial" w:eastAsia="Arial" w:hAnsi="Arial"/>
+          <w:b/>
+          <w:bCs/>
+          <w:color w:val="1F3864"/>
+          <w:sz w:val="24"/>
+          <w:szCs w:val="24"/>
+        </w:rPr>
+        <w:t xml:space="preserve">12.10 Document Staleness Detection</w:t>
+      </w:r>
+    </w:p>
+    <w:p>
+      <w:pPr>
+        <w:spacing w:after="160"/>
+      </w:pPr>
+      <w:r>
+        <w:rPr>
+          <w:rFonts w:ascii="Arial" w:cs="Arial" w:eastAsia="Arial" w:hAnsi="Arial"/>
+          <w:color w:val="000000"/>
+          <w:sz w:val="22"/>
+          <w:szCs w:val="22"/>
+        </w:rPr>
+        <w:t xml:space="preserve">The Impact Analysis Engine provides the foundation for document staleness detection. When source data changes after a work item’s document was last generated, that document is stale — it no longer reflects the current database state. The engine makes this determination without requiring the Document Generator (Section 13) to be fully specified.</w:t>
+      </w:r>
+    </w:p>
+    <w:p>
+      <w:pPr>
+        <w:spacing w:after="160"/>
+      </w:pPr>
+      <w:r>
+        <w:rPr>
+          <w:rFonts w:ascii="Arial" w:cs="Arial" w:eastAsia="Arial" w:hAnsi="Arial"/>
+          <w:b/>
+          <w:bCs/>
+          <w:color w:val="000000"/>
+          <w:sz w:val="22"/>
+          <w:szCs w:val="22"/>
+        </w:rPr>
+        <w:t xml:space="preserve">Staleness calculation. </w:t>
+      </w:r>
+      <w:r>
+        <w:rPr>
+          <w:rFonts w:ascii="Arial" w:cs="Arial" w:eastAsia="Arial" w:hAnsi="Arial"/>
+          <w:color w:val="000000"/>
+          <w:sz w:val="22"/>
+          <w:szCs w:val="22"/>
+        </w:rPr>
+        <w:t xml:space="preserve">A work item’s document is stale when any ChangeLog entry affects a record owned by that work item and the ChangeLog.changed_at timestamp is later than the WorkItem.completed_at timestamp. The ownership mapping follows the same foreign key structure used in Section 12.8.1 — fields map to entity_prd work items, processes map to process_definition work items, and so on.</w:t>
+      </w:r>
+    </w:p>
+    <w:p>
+      <w:pPr>
+        <w:spacing w:after="160"/>
+      </w:pPr>
+      <w:r>
+        <w:rPr>
+          <w:rFonts w:ascii="Arial" w:cs="Arial" w:eastAsia="Arial" w:hAnsi="Arial"/>
+          <w:b/>
+          <w:bCs/>
+          <w:color w:val="000000"/>
+          <w:sz w:val="22"/>
+          <w:szCs w:val="22"/>
+        </w:rPr>
+        <w:t xml:space="preserve">Scope of staleness. </w:t>
+      </w:r>
+      <w:r>
+        <w:rPr>
+          <w:rFonts w:ascii="Arial" w:cs="Arial" w:eastAsia="Arial" w:hAnsi="Arial"/>
+          <w:color w:val="000000"/>
+          <w:sz w:val="22"/>
+          <w:szCs w:val="22"/>
+        </w:rPr>
+        <w:t xml:space="preserve">Staleness is evaluated per work item. A single data change may make multiple documents stale — for example, changing a shared field on the Contact entity could make the entity_prd document stale and multiple process_definition documents stale (for every process that references the field). The staleness set is a natural byproduct of the ChangeImpact records: any work item that appears in the work item mapping (Section 12.8.1) for an unresolved impact has a potentially stale document.</w:t>
+      </w:r>
+    </w:p>
+    <w:p>
+      <w:pPr>
+        <w:spacing w:after="160"/>
+      </w:pPr>
+      <w:r>
+        <w:rPr>
+          <w:rFonts w:ascii="Arial" w:cs="Arial" w:eastAsia="Arial" w:hAnsi="Arial"/>
+          <w:b/>
+          <w:bCs/>
+          <w:color w:val="000000"/>
+          <w:sz w:val="22"/>
+          <w:szCs w:val="22"/>
+        </w:rPr>
+        <w:t xml:space="preserve">No automatic regeneration. </w:t>
+      </w:r>
+      <w:r>
+        <w:rPr>
+          <w:rFonts w:ascii="Arial" w:cs="Arial" w:eastAsia="Arial" w:hAnsi="Arial"/>
+          <w:color w:val="000000"/>
+          <w:sz w:val="22"/>
+          <w:szCs w:val="22"/>
+        </w:rPr>
+        <w:t xml:space="preserve">The engine identifies stale documents but does not trigger regeneration. The Document Generator (Section 13) will consume this staleness information to present the administrator with a list of documents that should be regenerated. The administrator decides when and in what order to regenerate.</w:t>
+      </w:r>
+    </w:p>
+    <w:p>
+      <w:pPr>
+        <w:spacing w:after="160"/>
+      </w:pPr>
+      <w:r>
+        <w:rPr>
+          <w:rFonts w:ascii="Arial" w:cs="Arial" w:eastAsia="Arial" w:hAnsi="Arial"/>
+          <w:b/>
+          <w:bCs/>
+          <w:color w:val="000000"/>
+          <w:sz w:val="22"/>
+          <w:szCs w:val="22"/>
+        </w:rPr>
+        <w:t xml:space="preserve">Relationship to review tracking. </w:t>
+      </w:r>
+      <w:r>
+        <w:rPr>
+          <w:rFonts w:ascii="Arial" w:cs="Arial" w:eastAsia="Arial" w:hAnsi="Arial"/>
+          <w:color w:val="000000"/>
+          <w:sz w:val="22"/>
+          <w:szCs w:val="22"/>
+        </w:rPr>
+        <w:t xml:space="preserve">A document remains stale until either the work item is reopened for revision and completed again (producing a new document) or the administrator regenerates the document from the current database state. Marking ChangeImpact records as reviewed does not clear staleness — review indicates the administrator has assessed the impact, not that the document has been updated.</w:t>
+      </w:r>
+    </w:p>
+    <w:p>
+      <w:pPr>
+        <w:pStyle w:val="Heading2"/>
+        <w:spacing w:after="160" w:before="280"/>
+      </w:pPr>
+      <w:r>
+        <w:rPr>
+          <w:rFonts w:ascii="Arial" w:cs="Arial" w:eastAsia="Arial" w:hAnsi="Arial"/>
+          <w:b/>
+          <w:bCs/>
+          <w:color w:val="1F3864"/>
+          <w:sz w:val="24"/>
+          <w:szCs w:val="24"/>
+        </w:rPr>
+        <w:t xml:space="preserve">12.11 Schema Changes</w:t>
+      </w:r>
+    </w:p>
+    <w:p>
+      <w:pPr>
+        <w:spacing w:after="160"/>
+      </w:pPr>
+      <w:r>
+        <w:rPr>
+          <w:rFonts w:ascii="Arial" w:cs="Arial" w:eastAsia="Arial" w:hAnsi="Arial"/>
+          <w:color w:val="000000"/>
+          <w:sz w:val="22"/>
+          <w:szCs w:val="22"/>
+        </w:rPr>
+        <w:t xml:space="preserve">This section requires one change to the existing database schema:</w:t>
+      </w:r>
+    </w:p>
+    <w:p>
+      <w:pPr>
+        <w:spacing w:after="160"/>
+      </w:pPr>
+      <w:r>
+        <w:rPr>
+          <w:rFonts w:ascii="Arial" w:cs="Arial" w:eastAsia="Arial" w:hAnsi="Arial"/>
+          <w:b/>
+          <w:bCs/>
+          <w:color w:val="000000"/>
+          <w:sz w:val="22"/>
+          <w:szCs w:val="22"/>
+        </w:rPr>
+        <w:t xml:space="preserve">ChangeImpact table (Section 7.3): </w:t>
+      </w:r>
+      <w:r>
+        <w:rPr>
+          <w:rFonts w:ascii="Arial" w:cs="Arial" w:eastAsia="Arial" w:hAnsi="Arial"/>
+          <w:color w:val="000000"/>
+          <w:sz w:val="22"/>
+          <w:szCs w:val="22"/>
+        </w:rPr>
+        <w:t xml:space="preserve">New column action_required (BOOLEAN, NOT NULL, DEFAULT FALSE). Set to TRUE when the administrator flags an impact for revision during review, FALSE when the administrator determines no action is needed. Only meaningful when reviewed is TRUE.</w:t>
+      </w:r>
+    </w:p>
+    <w:p>
+      <w:pPr>
+        <w:spacing w:after="160"/>
+      </w:pPr>
+      <w:r>
+        <w:rPr>
+          <w:rFonts w:ascii="Arial" w:cs="Arial" w:eastAsia="Arial" w:hAnsi="Arial"/>
+          <w:color w:val="000000"/>
+          <w:sz w:val="22"/>
+          <w:szCs w:val="22"/>
+        </w:rPr>
+        <w:t xml:space="preserve">No new tables are required. The Impact Analysis Engine reads from existing cross-reference tables (ProcessEntity, ProcessField, ProcessPersona), layout tables (LayoutPanel, LayoutRow, LayoutTab, ListColumn), requirements tables (Entity, Field, FieldOption, Process, ProcessStep, Requirement, Relationship, Persona, Domain), and management tables (WorkItem, Decision, OpenIssue). It writes to the existing ChangeImpact table.</w:t>
       </w:r>
     </w:p>
     <w:p>
@@ -37864,6 +41467,37 @@
           <w:szCs w:val="22"/>
         </w:rPr>
         <w:t xml:space="preserve">The Import Processor uses AI-assigned identifiers as-is and does not auto-generate or renumber them. The AI session assigns identifiers with awareness of existing identifiers from the session context. Overriding them would break the correspondence between the AI conversation and the imported records.</w:t>
+      </w:r>
+    </w:p>
+    <w:p>
+      <w:pPr>
+        <w:pStyle w:val="Heading2"/>
+        <w:spacing w:after="160" w:before="280"/>
+      </w:pPr>
+      <w:r>
+        <w:rPr>
+          <w:rFonts w:ascii="Arial" w:cs="Arial" w:eastAsia="Arial" w:hAnsi="Arial"/>
+          <w:b/>
+          <w:bCs/>
+          <w:color w:val="1F3864"/>
+          <w:sz w:val="24"/>
+          <w:szCs w:val="24"/>
+        </w:rPr>
+        <w:t xml:space="preserve">15.39 Post-commit analysis for imports, pre-commit analysis for direct edits (DEC-039)</w:t>
+      </w:r>
+    </w:p>
+    <w:p>
+      <w:pPr>
+        <w:spacing w:after="160"/>
+      </w:pPr>
+      <w:r>
+        <w:rPr>
+          <w:rFonts w:ascii="Arial" w:cs="Arial" w:eastAsia="Arial" w:hAnsi="Arial"/>
+          <w:color w:val="000000"/>
+          <w:sz w:val="22"/>
+          <w:szCs w:val="22"/>
+        </w:rPr>
+        <w:t xml:space="preserve">AI session imports trigger impact analysis after data is committed, as a downstream trigger in the Import Processor’s trigger sequence (Section 11.10.1, step 5). The administrator has already reviewed every proposed record during the import review pipeline, so post-commit analysis serves as a confirmation step for downstream effects. Direct administrator edits trigger impact analysis before data is committed, presenting the full downstream blast radius and requiring confirmation before the change is written. This provides a safety check for the riskier change path, which bypasses the structured import review pipeline.</w:t>
       </w:r>
     </w:p>
     <w:p>
@@ -38223,7 +41857,7 @@
           <w:sz w:val="22"/>
           <w:szCs w:val="22"/>
         </w:rPr>
-        <w:t xml:space="preserve">Design the Impact Analysis Engine (Section 12).</w:t>
+        <w:t xml:space="preserve">Design the Impact Analysis Engine (Section 12). — Complete</w:t>
       </w:r>
     </w:p>
     <w:p>

</xml_diff>

<commit_message>
L2 PRD v1.6: Schema validation findings — 7 resolutions, DEC-053
Findings resolved:
1. Section 6.4: UNIQUE(work_item_id, depends_on_id) on Dependency table
2. No change: existing 'all tables' convention covers timestamps
3. Section 2.3: CHECK constraint convention for enumerated TEXT columns
   Section 8.2: CHECK constraint for at-least-one-cell on LayoutRow
4. Section 4.8: Added tier column (core/important/enhancement) to Process
   Section 15: DEC-053 — process tier for priority classification
5. Section 11.12.3: Process code prefix validated against domain code
6. Section 9.4.3: entity_prd work items use primary_domain_id
7. Section 14.2.3: Phase grouping uses application-level item_type mapping
</commit_message>
<xml_diff>
--- a/PRDs/product/crmbuilder-automation-PRD/crmbuilder-automation-l2-PRD.docx
+++ b/PRDs/product/crmbuilder-automation-PRD/crmbuilder-automation-l2-PRD.docx
@@ -175,7 +175,7 @@
                 <w:sz w:val="18"/>
                 <w:szCs w:val="18"/>
               </w:rPr>
-              <w:t xml:space="preserve">1.5</w:t>
+              <w:t xml:space="preserve">1.6</w:t>
             </w:r>
           </w:p>
         </w:tc>
@@ -363,7 +363,7 @@
                 <w:sz w:val="18"/>
                 <w:szCs w:val="18"/>
               </w:rPr>
-              <w:t xml:space="preserve">04-05-26 21:00</w:t>
+              <w:t xml:space="preserve">04-06-26 17:00</w:t>
             </w:r>
           </w:p>
         </w:tc>
@@ -604,7 +604,7 @@
           <w:sz w:val="22"/>
           <w:szCs w:val="22"/>
         </w:rPr>
-        <w:t xml:space="preserve">All tables follow common conventions. Every table has id (INTEGER PRIMARY KEY auto-increment), created_at, and updated_at timestamps. Tables that are created through AI sessions include a created_by_session_id foreign key linking to the AISession table. All foreign keys use integer IDs referencing the target table’s id column.</w:t>
+        <w:t xml:space="preserve">All tables follow common conventions. Every table has id (INTEGER PRIMARY KEY auto-increment), created_at, and updated_at timestamps. Tables that are created through AI sessions include a created_by_session_id foreign key linking to the AISession table. All foreign keys use integer IDs referencing the target table’s id column. All TEXT columns with enumerated values defined in this document are enforced with CHECK constraints at the database level.</w:t>
       </w:r>
     </w:p>
     <w:p>
@@ -11433,7 +11433,7 @@
                 <w:sz w:val="18"/>
                 <w:szCs w:val="18"/>
               </w:rPr>
-              <w:t xml:space="preserve">created_at</w:t>
+              <w:t xml:space="preserve">tier</w:t>
             </w:r>
           </w:p>
         </w:tc>
@@ -11463,7 +11463,7 @@
                 <w:sz w:val="18"/>
                 <w:szCs w:val="18"/>
               </w:rPr>
-              <w:t xml:space="preserve">TIMESTAMP</w:t>
+              <w:t xml:space="preserve">TEXT</w:t>
             </w:r>
           </w:p>
         </w:tc>
@@ -11493,7 +11493,7 @@
                 <w:sz w:val="18"/>
                 <w:szCs w:val="18"/>
               </w:rPr>
-              <w:t xml:space="preserve">Record creation</w:t>
+              <w:t xml:space="preserve">Priority classification: core, important, enhancement. Nullable.</w:t>
             </w:r>
           </w:p>
         </w:tc>
@@ -11526,7 +11526,7 @@
                 <w:sz w:val="18"/>
                 <w:szCs w:val="18"/>
               </w:rPr>
-              <w:t xml:space="preserve">updated_at</w:t>
+              <w:t xml:space="preserve">created_at</w:t>
             </w:r>
           </w:p>
         </w:tc>
@@ -11584,7 +11584,7 @@
                 <w:sz w:val="18"/>
                 <w:szCs w:val="18"/>
               </w:rPr>
-              <w:t xml:space="preserve">Last modification</w:t>
+              <w:t xml:space="preserve">Record creation</w:t>
             </w:r>
           </w:p>
         </w:tc>
@@ -11618,6 +11618,99 @@
                 <w:sz w:val="18"/>
                 <w:szCs w:val="18"/>
               </w:rPr>
+              <w:t xml:space="preserve">updated_at</w:t>
+            </w:r>
+          </w:p>
+        </w:tc>
+        <w:tc>
+          <w:tcPr>
+            <w:tcW w:type="dxa" w:w="2200"/>
+            <w:tcBorders>
+              <w:top w:val="single" w:color="AAAAAA" w:sz="1"/>
+              <w:left w:val="single" w:color="AAAAAA" w:sz="1"/>
+              <w:bottom w:val="single" w:color="AAAAAA" w:sz="1"/>
+              <w:right w:val="single" w:color="AAAAAA" w:sz="1"/>
+            </w:tcBorders>
+            <w:shd w:fill="F2F7FB" w:val="clear"/>
+            <w:tcMar>
+              <w:top w:type="dxa" w:w="80"/>
+              <w:left w:type="dxa" w:w="120"/>
+              <w:bottom w:type="dxa" w:w="80"/>
+              <w:right w:type="dxa" w:w="120"/>
+            </w:tcMar>
+            <w:vAlign w:val="top"/>
+          </w:tcPr>
+          <w:p>
+            <w:r>
+              <w:rPr>
+                <w:rFonts w:ascii="Arial" w:cs="Arial" w:eastAsia="Arial" w:hAnsi="Arial"/>
+                <w:color w:val="000000"/>
+                <w:sz w:val="18"/>
+                <w:szCs w:val="18"/>
+              </w:rPr>
+              <w:t xml:space="preserve">TIMESTAMP</w:t>
+            </w:r>
+          </w:p>
+        </w:tc>
+        <w:tc>
+          <w:tcPr>
+            <w:tcW w:type="dxa" w:w="4960"/>
+            <w:tcBorders>
+              <w:top w:val="single" w:color="AAAAAA" w:sz="1"/>
+              <w:left w:val="single" w:color="AAAAAA" w:sz="1"/>
+              <w:bottom w:val="single" w:color="AAAAAA" w:sz="1"/>
+              <w:right w:val="single" w:color="AAAAAA" w:sz="1"/>
+            </w:tcBorders>
+            <w:shd w:fill="F2F7FB" w:val="clear"/>
+            <w:tcMar>
+              <w:top w:type="dxa" w:w="80"/>
+              <w:left w:type="dxa" w:w="120"/>
+              <w:bottom w:type="dxa" w:w="80"/>
+              <w:right w:type="dxa" w:w="120"/>
+            </w:tcMar>
+            <w:vAlign w:val="top"/>
+          </w:tcPr>
+          <w:p>
+            <w:r>
+              <w:rPr>
+                <w:rFonts w:ascii="Arial" w:cs="Arial" w:eastAsia="Arial" w:hAnsi="Arial"/>
+                <w:color w:val="000000"/>
+                <w:sz w:val="18"/>
+                <w:szCs w:val="18"/>
+              </w:rPr>
+              <w:t xml:space="preserve">Last modification</w:t>
+            </w:r>
+          </w:p>
+        </w:tc>
+      </w:tr>
+      <w:tr>
+        <w:tc>
+          <w:tcPr>
+            <w:tcW w:type="dxa" w:w="2200"/>
+            <w:tcBorders>
+              <w:top w:val="single" w:color="AAAAAA" w:sz="1"/>
+              <w:left w:val="single" w:color="AAAAAA" w:sz="1"/>
+              <w:bottom w:val="single" w:color="AAAAAA" w:sz="1"/>
+              <w:right w:val="single" w:color="AAAAAA" w:sz="1"/>
+            </w:tcBorders>
+            <w:tcMar>
+              <w:top w:type="dxa" w:w="80"/>
+              <w:left w:type="dxa" w:w="120"/>
+              <w:bottom w:type="dxa" w:w="80"/>
+              <w:right w:type="dxa" w:w="120"/>
+            </w:tcMar>
+            <w:vAlign w:val="top"/>
+          </w:tcPr>
+          <w:p>
+            <w:r>
+              <w:rPr>
+                <w:rFonts w:ascii="Arial" w:cs="Arial" w:eastAsia="Arial" w:hAnsi="Arial"/>
+                <w:b/>
+                <w:bCs/>
+                <w:color w:val="000000"/>
+                <w:sz w:val="18"/>
+                <w:szCs w:val="18"/>
+              </w:rPr>
               <w:t xml:space="preserve">created_by_session_id</w:t>
             </w:r>
           </w:p>
@@ -11631,7 +11724,6 @@
               <w:bottom w:val="single" w:color="AAAAAA" w:sz="1"/>
               <w:right w:val="single" w:color="AAAAAA" w:sz="1"/>
             </w:tcBorders>
-            <w:shd w:fill="F2F7FB" w:val="clear"/>
             <w:tcMar>
               <w:top w:type="dxa" w:w="80"/>
               <w:left w:type="dxa" w:w="120"/>
@@ -11661,7 +11753,6 @@
               <w:bottom w:val="single" w:color="AAAAAA" w:sz="1"/>
               <w:right w:val="single" w:color="AAAAAA" w:sz="1"/>
             </w:tcBorders>
-            <w:shd w:fill="F2F7FB" w:val="clear"/>
             <w:tcMar>
               <w:top w:type="dxa" w:w="80"/>
               <w:left w:type="dxa" w:w="120"/>
@@ -20803,7 +20894,7 @@
           <w:sz w:val="22"/>
           <w:szCs w:val="22"/>
         </w:rPr>
-        <w:t xml:space="preserve">Declares that one work item must complete before another can start. The workflow engine queries this table to calculate which work items are ready.</w:t>
+        <w:t xml:space="preserve">Declares that one work item must complete before another can start. The workflow engine queries this table to calculate which work items are ready. A UNIQUE constraint on (work_item_id, depends_on_id) prevents duplicate dependency declarations.</w:t>
       </w:r>
     </w:p>
     <w:tbl>
@@ -26029,7 +26120,7 @@
           <w:sz w:val="22"/>
           <w:szCs w:val="22"/>
         </w:rPr>
-        <w:t xml:space="preserve">Explicit field placement within a panel. Each row contains up to two fields. Full-width fields span both columns.</w:t>
+        <w:t xml:space="preserve">Explicit field placement within a panel. Each row contains up to two fields. Full-width fields span both columns. A CHECK constraint ensures at least one of cell_1_field_id or cell_2_field_id is non-null, preventing empty rows.</w:t>
       </w:r>
     </w:p>
     <w:tbl>
@@ -28930,7 +29021,7 @@
           <w:sz w:val="22"/>
           <w:szCs w:val="22"/>
         </w:rPr>
-        <w:t xml:space="preserve">One entity_prd work item per Entity record. Each depends on the business_object_discovery work item.</w:t>
+        <w:t xml:space="preserve">One entity_prd work item per Entity record. Each depends on the business_object_discovery work item. The work item’s domain_id is set to the entity’s primary_domain_id, ensuring every work item is associated with a domain for Dashboard grouping.</w:t>
       </w:r>
     </w:p>
     <w:p>
@@ -36524,7 +36615,7 @@
           <w:sz w:val="22"/>
           <w:szCs w:val="22"/>
         </w:rPr>
-        <w:t xml:space="preserve">The Import Processor validates that identifiers follow the expected format patterns: Domain codes are uppercase alphabetic, 2–4 characters. Entity codes are uppercase alphabetic. Process codes are domain code + hyphen + uppercase name. Requirement identifiers are process code + hyphen + REQ + hyphen + sequential number. Decision identifiers are scope code + hyphen + DEC + hyphen + sequential number. Open issue identifiers are scope code + hyphen + ISS + hyphen + sequential number. Persona codes are uppercase alphabetic.</w:t>
+        <w:t xml:space="preserve">The Import Processor validates that identifiers follow the expected format patterns: Domain codes are uppercase alphabetic, 2–4 characters. Entity codes are uppercase alphabetic. Process codes are domain code + hyphen + uppercase name; the Master PRD mapper validates that each process code’s prefix matches the code of the Domain record it is assigned to, catching mismatches at import time. Requirement identifiers are process code + hyphen + REQ + hyphen + sequential number. Decision identifiers are scope code + hyphen + DEC + hyphen + sequential number. Open issue identifiers are scope code + hyphen + ISS + hyphen + sequential number. Persona codes are uppercase alphabetic.</w:t>
       </w:r>
     </w:p>
     <w:p>
@@ -46029,7 +46120,7 @@
           <w:sz w:val="22"/>
           <w:szCs w:val="22"/>
         </w:rPr>
-        <w:t xml:space="preserve">Below the work queue, a collapsible section labeled “All Work Items” shows every work item in the project grouped by phase. Each phase group has a header showing the phase number, phase name, and a completion indicator (for example, “3 of 5 complete”). Within each phase, work items are listed by domain sort_order.</w:t>
+        <w:t xml:space="preserve">Below the work queue, a collapsible section labeled “All Work Items” shows every work item in the project grouped by phase. The application maintains a static mapping from item_type to phase number (for example, entity_prd maps to Phase 2, process_definition maps to Phase 5). This mapping is not stored in the database because it is defined by the methodology and does not vary per client. Each phase group has a header showing the phase number, phase name, and a completion indicator (for example, “3 of 5 complete”). Within each phase, work items are listed by domain sort_order.</w:t>
       </w:r>
     </w:p>
     <w:p>
@@ -51396,6 +51487,37 @@
           <w:szCs w:val="22"/>
         </w:rPr>
         <w:t xml:space="preserve">The Data Browser organizes records in a tree panel following the database’s foreign key relationships: Domains (with processes, steps, requirements, cross-references), Entities (with fields, options, relationships, layouts), Personas, Decisions, and Open Issues. The tree supports search filtering and shows record counts on expandable nodes. This structure mirrors the data model and scales as the database grows.</w:t>
+      </w:r>
+    </w:p>
+    <w:p>
+      <w:pPr>
+        <w:pStyle w:val="Heading2"/>
+        <w:spacing w:after="160" w:before="280"/>
+      </w:pPr>
+      <w:r>
+        <w:rPr>
+          <w:rFonts w:ascii="Arial" w:cs="Arial" w:eastAsia="Arial" w:hAnsi="Arial"/>
+          <w:b/>
+          <w:bCs/>
+          <w:color w:val="1F3864"/>
+          <w:sz w:val="24"/>
+          <w:szCs w:val="24"/>
+        </w:rPr>
+        <w:t xml:space="preserve">15.53 Process table includes tier column for priority classification (DEC-053)</w:t>
+      </w:r>
+    </w:p>
+    <w:p>
+      <w:pPr>
+        <w:spacing w:after="160"/>
+      </w:pPr>
+      <w:r>
+        <w:rPr>
+          <w:rFonts w:ascii="Arial" w:cs="Arial" w:eastAsia="Arial" w:hAnsi="Arial"/>
+          <w:color w:val="000000"/>
+          <w:sz w:val="22"/>
+          <w:szCs w:val="22"/>
+        </w:rPr>
+        <w:t xml:space="preserve">The Process table includes a nullable tier column (TEXT, values: core, important, enhancement) for priority classification. Tier is populated during Master PRD import from stakeholder input and supports dependency ordering, stakeholder review prioritization, and Dashboard display. Within a phase, the Workflow Engine and Project Dashboard surface tier to help the administrator choose which available work item to address first. The sort_order column continues to define dependency sequencing within a domain; tier provides an orthogonal priority signal.</w:t>
       </w:r>
     </w:p>
     <w:p>

</xml_diff>

<commit_message>
L2 PRD: Update Section 17 — mark design complete, add implementation steps
All 8 design steps marked Complete (including schema review and
prototype validation). Added 8 implementation steps: database layer,
Workflow Engine, Prompt Generator, Import Processor, Impact Analysis
Engine, Document Generator, User Interface, and CBM integration testing.
</commit_message>
<xml_diff>
--- a/PRDs/product/crmbuilder-automation-PRD/crmbuilder-automation-l2-PRD.docx
+++ b/PRDs/product/crmbuilder-automation-PRD/crmbuilder-automation-l2-PRD.docx
@@ -51836,7 +51836,7 @@
           <w:sz w:val="22"/>
           <w:szCs w:val="22"/>
         </w:rPr>
-        <w:t xml:space="preserve">Review and approve the database schema (Sections 3–8).</w:t>
+        <w:t xml:space="preserve">Review and approve the database schema (Sections 3–8). — Complete</w:t>
       </w:r>
     </w:p>
     <w:p>
@@ -51854,7 +51854,7 @@
           <w:sz w:val="22"/>
           <w:szCs w:val="22"/>
         </w:rPr>
-        <w:t xml:space="preserve">Design the Workflow Engine (Section 9).</w:t>
+        <w:t xml:space="preserve">Design the Workflow Engine (Section 9). — Complete</w:t>
       </w:r>
     </w:p>
     <w:p>
@@ -51962,7 +51962,151 @@
           <w:sz w:val="22"/>
           <w:szCs w:val="22"/>
         </w:rPr>
-        <w:t xml:space="preserve">Prototype the database schema with CBM data as proof of concept.</w:t>
+        <w:t xml:space="preserve">Prototype the database schema with CBM data as proof of concept. — Complete (findings resolved in v1.6)</w:t>
+      </w:r>
+    </w:p>
+    <w:p>
+      <w:pPr>
+        <w:pStyle w:val="ListParagraph"/>
+        <w:numPr>
+          <w:ilvl w:val="0"/>
+          <w:numId w:val="2"/>
+        </w:numPr>
+        <w:spacing w:after="120"/>
+      </w:pPr>
+      <w:r>
+        <w:rPr>
+          <w:rFonts w:ascii="Arial" w:cs="Arial" w:eastAsia="Arial" w:hAnsi="Arial"/>
+          <w:sz w:val="22"/>
+          <w:szCs w:val="22"/>
+        </w:rPr>
+        <w:t xml:space="preserve">Implement the database layer — master and client SQLite schemas, migration support, connection management.</w:t>
+      </w:r>
+    </w:p>
+    <w:p>
+      <w:pPr>
+        <w:pStyle w:val="ListParagraph"/>
+        <w:numPr>
+          <w:ilvl w:val="0"/>
+          <w:numId w:val="2"/>
+        </w:numPr>
+        <w:spacing w:after="120"/>
+      </w:pPr>
+      <w:r>
+        <w:rPr>
+          <w:rFonts w:ascii="Arial" w:cs="Arial" w:eastAsia="Arial" w:hAnsi="Arial"/>
+          <w:sz w:val="22"/>
+          <w:szCs w:val="22"/>
+        </w:rPr>
+        <w:t xml:space="preserve">Implement the Workflow Engine — status model, dependency graph construction, available work calculation, status transitions.</w:t>
+      </w:r>
+    </w:p>
+    <w:p>
+      <w:pPr>
+        <w:pStyle w:val="ListParagraph"/>
+        <w:numPr>
+          <w:ilvl w:val="0"/>
+          <w:numId w:val="2"/>
+        </w:numPr>
+        <w:spacing w:after="120"/>
+      </w:pPr>
+      <w:r>
+        <w:rPr>
+          <w:rFonts w:ascii="Arial" w:cs="Arial" w:eastAsia="Arial" w:hAnsi="Arial"/>
+          <w:sz w:val="22"/>
+          <w:szCs w:val="22"/>
+        </w:rPr>
+        <w:t xml:space="preserve">Implement the Prompt Generator — context assembly, interview guide selection, template rendering, structured output format.</w:t>
+      </w:r>
+    </w:p>
+    <w:p>
+      <w:pPr>
+        <w:pStyle w:val="ListParagraph"/>
+        <w:numPr>
+          <w:ilvl w:val="0"/>
+          <w:numId w:val="2"/>
+        </w:numPr>
+        <w:spacing w:after="120"/>
+      </w:pPr>
+      <w:r>
+        <w:rPr>
+          <w:rFonts w:ascii="Arial" w:cs="Arial" w:eastAsia="Arial" w:hAnsi="Arial"/>
+          <w:sz w:val="22"/>
+          <w:szCs w:val="22"/>
+        </w:rPr>
+        <w:t xml:space="preserve">Implement the Import Processor — mapper pipeline, conflict detection, commit with downstream triggers, identifier management.</w:t>
+      </w:r>
+    </w:p>
+    <w:p>
+      <w:pPr>
+        <w:pStyle w:val="ListParagraph"/>
+        <w:numPr>
+          <w:ilvl w:val="0"/>
+          <w:numId w:val="2"/>
+        </w:numPr>
+        <w:spacing w:after="120"/>
+      </w:pPr>
+      <w:r>
+        <w:rPr>
+          <w:rFonts w:ascii="Arial" w:cs="Arial" w:eastAsia="Arial" w:hAnsi="Arial"/>
+          <w:sz w:val="22"/>
+          <w:szCs w:val="22"/>
+        </w:rPr>
+        <w:t xml:space="preserve">Implement the Impact Analysis Engine — cross-reference queries, change tracing, deduplication, pre-commit and post-commit modes.</w:t>
+      </w:r>
+    </w:p>
+    <w:p>
+      <w:pPr>
+        <w:pStyle w:val="ListParagraph"/>
+        <w:numPr>
+          <w:ilvl w:val="0"/>
+          <w:numId w:val="2"/>
+        </w:numPr>
+        <w:spacing w:after="120"/>
+      </w:pPr>
+      <w:r>
+        <w:rPr>
+          <w:rFonts w:ascii="Arial" w:cs="Arial" w:eastAsia="Arial" w:hAnsi="Arial"/>
+          <w:sz w:val="22"/>
+          <w:szCs w:val="22"/>
+        </w:rPr>
+        <w:t xml:space="preserve">Implement the Document Generator — Word document generation from database, staleness tracking, regeneration.</w:t>
+      </w:r>
+    </w:p>
+    <w:p>
+      <w:pPr>
+        <w:pStyle w:val="ListParagraph"/>
+        <w:numPr>
+          <w:ilvl w:val="0"/>
+          <w:numId w:val="2"/>
+        </w:numPr>
+        <w:spacing w:after="120"/>
+      </w:pPr>
+      <w:r>
+        <w:rPr>
+          <w:rFonts w:ascii="Arial" w:cs="Arial" w:eastAsia="Arial" w:hAnsi="Arial"/>
+          <w:sz w:val="22"/>
+          <w:szCs w:val="22"/>
+        </w:rPr>
+        <w:t xml:space="preserve">Implement the User Interface — Requirements mode, Project Dashboard, Work Item Detail, sidebars, Data Browser.</w:t>
+      </w:r>
+    </w:p>
+    <w:p>
+      <w:pPr>
+        <w:pStyle w:val="ListParagraph"/>
+        <w:numPr>
+          <w:ilvl w:val="0"/>
+          <w:numId w:val="2"/>
+        </w:numPr>
+        <w:spacing w:after="120"/>
+      </w:pPr>
+      <w:r>
+        <w:rPr>
+          <w:rFonts w:ascii="Arial" w:cs="Arial" w:eastAsia="Arial" w:hAnsi="Arial"/>
+          <w:sz w:val="22"/>
+          <w:szCs w:val="22"/>
+        </w:rPr>
+        <w:t xml:space="preserve">Integration testing with CBM data — end-to-end validation using Cleveland Business Mentors as the proof-of-concept client.</w:t>
       </w:r>
     </w:p>
     <w:sectPr>

</xml_diff>